<commit_message>
§11.4.142 — Universal code-review mandate (every change reviewed, always, no exception)
User mandate 2026-06-09 (verbatim): "ALL changes we do MUST pass through the code review step!!! ALWAYS!!!"
Strengthens §11.4.125 to the ABSOLUTE form: EVERY change (source/fixes/tests/gates/mutations/docs/
doc-tooling/build-CI/config/governance/conductor-edits/sub-agent-output/refactors/one-liners) passes an
INDEPENDENT review before acceptance/commit/build; independence load-bearing; anti-bluff; iterates to
clean GO (§11.4.134). Composes §11.4.1/.4/.5/.6/.20/.40/.69/.70/.92/.108/.110/.125/.134/§107/§1.1.
Gates CM-COVENANT-114-142-PROPAGATION + CM-EVERY-CHANGE-REVIEWED (gate-code = separate work item).
Classification: universal (§11.4.17). Propagated to constitution trio + QWEN.
Independently reviewed → CLEAN GO (docs/research/1_2_0_dev_d3_findings/REVIEW_ANCHOR_114142.md).

Co-Authored-By: Claude Opus 4.8 (1M context) <noreply@anthropic.com>
</commit_message>
<xml_diff>
--- a/AGENTS.docx
+++ b/AGENTS.docx
@@ -2,7 +2,7 @@
 <file path=word/document.xml><?xml version="1.0" encoding="utf-8"?>
 <w:document xmlns:w="http://schemas.openxmlformats.org/wordprocessingml/2006/main" xmlns:m="http://schemas.openxmlformats.org/officeDocument/2006/math" xmlns:r="http://schemas.openxmlformats.org/officeDocument/2006/relationships" xmlns:o="urn:schemas-microsoft-com:office:office" xmlns:v="urn:schemas-microsoft-com:vml" xmlns:w10="urn:schemas-microsoft-com:office:word" xmlns:a="http://schemas.openxmlformats.org/drawingml/2006/main" xmlns:pic="http://schemas.openxmlformats.org/drawingml/2006/picture" xmlns:wp="http://schemas.openxmlformats.org/drawingml/2006/wordprocessingDrawing">
   <w:body>
-    <w:bookmarkStart w:id="109" w:name="helix-constitution--universal-agentsmd"/>
+    <w:bookmarkStart w:id="117" w:name="helix-constitution--universal-agentsmd"/>
     <w:p>
       <w:pPr>
         <w:pStyle w:val="Heading1"/>
@@ -67,7 +67,7 @@
               <w:pStyle w:val="Compact"/>
             </w:pPr>
             <w:r>
-              <w:t xml:space="preserve">21</w:t>
+              <w:t xml:space="preserve">24</w:t>
             </w:r>
           </w:p>
         </w:tc>
@@ -115,7 +115,7 @@
               <w:pStyle w:val="Compact"/>
             </w:pPr>
             <w:r>
-              <w:t xml:space="preserve">2026-06-04T18:00:00Z</w:t>
+              <w:t xml:space="preserve">2026-06-09T14:00:00Z</w:t>
             </w:r>
           </w:p>
         </w:tc>
@@ -163,7 +163,7 @@
               <w:pStyle w:val="Compact"/>
             </w:pPr>
             <w:r>
-              <w:t xml:space="preserve">Added §11.4.126 mirror — Default autonomous-loop working mode from first prompt (User mandate 2026-06-04): the endless fully-autonomous loop is the DEFAULT working mode, engaged automatically the moment the operator sends the FIRST request/prompt of a session — no per-session activation handshake; the loop continues until EITHER (A) a new fully-validated-and-verified version (tag) is created AND published across all owned submodules + main repo to all remotes (per §2.1/§11.4.40/§11.4.113), OR (B) for non-release main-stream work that work is fully completed AND all side work streams done AND nothing is left in the working queue for the current scope; STOPS ONLY on explicit operator STOP, empty current-scope queue, or §12 host-safety; goal ABSOLUTE EFFICIENCY; mimicking/imitation/false-results/bluff of ANY kind ABSOLUTELY FORBIDDEN (composes the §11.4 anti-bluff covenant — actually perform the work, never narrate/pretend it); §11.4.126 is the CAPSTONE promoting §11.4.87 from opt-in to always-on. Composes §11.4.87/.94/.97/.101/.103/.66/.6/.40/.42/.72/.113 + §2.1 + §12. Classification: universal (§11.4.17). Prior round: Added §11.4.125 mirror — Code-review-agent gate before pre-build + main build (mandatory multi-layer review) (User mandate 2026-06-04): after all batch fixes/changes/implementations are done and BEFORE the pre-build test sweep + main (artifact) build, the agent MUST dispatch dedicated code-review agent(s) (subagent-driven per §11.4.70/.20) that analyze all batch work + all existing data/facts/captured-evidence + the existing codebase (blast radius) + current git history, determine quality + safety + will-it-REALLY-work, and validate+verify every covering test genuinely exercises the work-under-test and catches its negation with ZERO false-result/bluff possibility; any finding (defect / error-prone change / safety risk / will-not-work / bluff-capable test / coverage gap) MUST be fixed+polished+improved+test-covered (four-layer §11.4.4(b), TDD-RED-first §11.4.43/.115) BEFORE the build proceeds; review iterates until no blocking findings; one of MULTIPLE STRONG LAYERS complementing (never replacing) the pre-build sweep + §11.4.92 multi-pass (author-side) + §11.4.108 + §11.4.110. Composes §11.4/.1/.4/.6/.40/.43/.50/.70/.20/.92/.102/.107/.108/.110. Classification: universal (§11.4.17). Prior round: Added §11.4.124 mirror — Dead/unwired-code investigate-before-remove mandate (User mandate 2026-06-04): "zero importers ⇒ dead ⇒ delete" is a guess (§11.4.6), never a finding — before removing ANY seemingly-dead element (zero-importer / never-called / unwired function/type/file/module/package/asset/config/build-target) the agent MUST FIRST investigate via git history (</w:t>
+              <w:t xml:space="preserve">Added §11.4.142 mirror — Universal code-review mandate — every change reviewed, always, no exception (User mandate 2026-06-09, verbatim "ALL changes we do MUST pass through the code review step!!! ALWAYS!!!"): EVERY change to ANY governed repository — no exception (source/fixes/tests/gates/mutations/docs/doc-tooling/build-CI/config/governance/conductor-edits/sub-agent-output/refactors/one-liners) — MUST pass an INDEPENDENT code-review step BEFORE acceptance/commit/build; the ABSOLUTE form of §11.4.125 (no "just a doc edit"/"just a one-liner"/"self-review §11.4.92 suffices"/"trivial change" carve-out); independence load-bearing (reviewer structurally separated from author per §11.4.70/.20, §11.4.92 self-review PRECEDES never satisfies); anti-bluff (§11.4/.1, conclusions captured-evidence §11.4.5/.69) + iterates to clean GO per §11.4.134; honest boundary §11.4.6 — does NOT replace §11.4.108/.40, it is the FIRST of MULTIPLE STRONG LAYERS. Composes §11.4.1/.4/.5/.6/.20/.40/.69/.70/.92/.108/.110/.125/.134/§107/§1.1. Classification: universal (§11.4.17). Prior round: Added §11.4.132 mirror — Risk-ordered validation priority mandate (User mandate 2026-06-07): tests/validations/verifications MUST run in RISK-DESCENDING order — highest-risk set FIRST (closed factors: (a) most-recently-worked, (b) historically most-problematic, (c) highest crash/break/regress likelihood, (d) most-reopened per §11.4.55), each GREEN with real (physical) captured evidence (§11.4.5/.69/.107, no bluff §11.4.6), and ONLY AFTER that set is GREEN does the rest of the suite run; arbitrary-order or lower-risk-before-highest-risk-GREEN = §11.4.132 violation; REFINES/STRENGTHENS §11.4.130 + §11.4.46 + §11.4.42 by adding explicit risk-ordering to VALIDATION. Composes §11.4.4/.5/.6/.7/.40/.42/.46/.50/.55/.69/.107/.130. Classification: universal (§11.4.17). Prior round: Added §11.4.131 mirror — Standing session-resumption file mandate (User mandate 2026-06-07): every project MUST maintain a SINGLE canonical always-current session-resumption FILE at a fixed project-declared standard path (declared once per §11.4.35, never moved without a §11.4.66 operator decision) — the OUT-OF-THE-BOX entry point for any fresh session; promotes §11.4.127 (PREPARE-on-demand) into a STANDING version-controlled ARTIFACT, ALWAYS present + in sync, SHORT+FULL variants + live-state anchors + §11.4.65 export + §11.4.44 revision header. Composes §12.10/.127/.65/.44/.6/.66/.126. Classification: universal (§11.4.17). Prior round: Added §11.4.127 mirror — Session-handoff resumption-prompt mandate (User mandate 2026-06-06): when a fresh session is needed (context limits/degradation) OR the operator asks whether a new session is needed, the agent MUST ALWAYS prepare + proactively provide a ready-to-paste resumption prompt valid for that EXACT moment + project phase (SHORT first-sentence + FULL block on demand) pointing to the live handoff docs (.remember/remember.md if present + docs/CONTINUATION.md §12.10, read FIRST + git fetch --all), stating PHASE + NEXT action + terminal goal, embedding exact live-state anchors (build IDs/MD5, device serials, HEAD, in-flight PIDs+logs, evidence paths) + binding constraints (anti-bluff §11.4, no-force-push §11.4.113, exact version/naming, hardware gotchas); MUST be moment-valid never generic; handoff docs current BEFORE the prompt; missing/stale/generic = §11.4.127 violation. Composes §12.10/.6/.66/.87/.103/.126. Classification: universal (§11.4.17). Prior round: Added §11.4.126 mirror — Default autonomous-loop working mode from first prompt (User mandate 2026-06-04): the endless fully-autonomous loop is the DEFAULT working mode, engaged automatically the moment the operator sends the FIRST request/prompt of a session — no per-session activation handshake; the loop continues until EITHER (A) a new fully-validated-and-verified version (tag) is created AND published across all owned submodules + main repo to all remotes (per §2.1/§11.4.40/§11.4.113), OR (B) for non-release main-stream work that work is fully completed AND all side work streams done AND nothing is left in the working queue for the current scope; STOPS ONLY on explicit operator STOP, empty current-scope queue, or §12 host-safety; goal ABSOLUTE EFFICIENCY; mimicking/imitation/false-results/bluff of ANY kind ABSOLUTELY FORBIDDEN (composes the §11.4 anti-bluff covenant — actually perform the work, never narrate/pretend it); §11.4.126 is the CAPSTONE promoting §11.4.87 from opt-in to always-on. Composes §11.4.87/.94/.97/.101/.103/.66/.6/.40/.42/.72/.113 + §2.1 + §12. Classification: universal (§11.4.17). Prior round: Added §11.4.125 mirror — Code-review-agent gate before pre-build + main build (mandatory multi-layer review) (User mandate 2026-06-04): after all batch fixes/changes/implementations are done and BEFORE the pre-build test sweep + main (artifact) build, the agent MUST dispatch dedicated code-review agent(s) (subagent-driven per §11.4.70/.20) that analyze all batch work + all existing data/facts/captured-evidence + the existing codebase (blast radius) + current git history, determine quality + safety + will-it-REALLY-work, and validate+verify every covering test genuinely exercises the work-under-test and catches its negation with ZERO false-result/bluff possibility; any finding (defect / error-prone change / safety risk / will-not-work / bluff-capable test / coverage gap) MUST be fixed+polished+improved+test-covered (four-layer §11.4.4(b), TDD-RED-first §11.4.43/.115) BEFORE the build proceeds; review iterates until no blocking findings; one of MULTIPLE STRONG LAYERS complementing (never replacing) the pre-build sweep + §11.4.92 multi-pass (author-side) + §11.4.108 + §11.4.110. Composes §11.4/.1/.4/.6/.40/.43/.50/.70/.20/.92/.102/.107/.108/.110. Classification: universal (§11.4.17). Prior round: Added §11.4.124 mirror — Dead/unwired-code investigate-before-remove mandate (User mandate 2026-06-04): "zero importers ⇒ dead ⇒ delete" is a guess (§11.4.6), never a finding — before removing ANY seemingly-dead element (zero-importer / never-called / unwired function/type/file/module/package/asset/config/build-target) the agent MUST FIRST investigate via git history (</w:t>
             </w:r>
             <w:r>
               <w:rPr>
@@ -14107,7 +14107,7 @@
       </w:r>
     </w:p>
     <w:bookmarkEnd w:id="67"/>
-    <w:bookmarkStart w:id="108" w:name="when-stuck"/>
+    <w:bookmarkStart w:id="116" w:name="when-stuck"/>
     <w:p>
       <w:pPr>
         <w:pStyle w:val="Heading2"/>
@@ -25120,7 +25120,88 @@
         <w:pStyle w:val="BodyText"/>
       </w:pPr>
       <w:r>
-        <w:t xml:space="preserve">Composes with §11.4 + §11.4.1..§11.4.16 / §11.4.6 / §11.4.28 / §11.4.80 / §9.2 / §11.4.50 / §11.4.69 / §11.4.5 / §1.1, plus the sync anchors it mechanizes (§11.4.12/.53/.45/.56/.57/.59/.60/.65/.86/.93/.95/.44, §12.10). Classification: universal (§11.4.17); projects with no derived-export/DB-sync surface inherit it latently (binds the moment they ship one, §11.4.96 pattern). Status (§11.4.6): engine Phases 1–3 IMPLEMENTED+tested; CLI/YAML loader (Phase 4) + submodule distribution (Phase 6) PLANNED + OPERATOR-GATED — wire as phases land, claim no unshipped behaviour. Propagation gate</w:t>
+        <w:t xml:space="preserve">Composes with §11.4 + §11.4.1..§11.4.16 / §11.4.6 / §11.4.28 / §11.4.80 / §9.2 / §11.4.50 / §11.4.69 / §11.4.5 / §1.1, plus the sync anchors it mechanizes (§11.4.12/.53/.45/.56/.57/.59/.60/.65/.86/.93/.95/.44, §12.10). Classification: universal (§11.4.17); projects with no derived-export/DB-sync surface inherit it latently (binds the moment they ship one, §11.4.96 pattern). Status (§11.4.6): engine Phases 1–3 AND the CLI/YAML loader (Phase 4) IMPLEMENTED+tested —</w:t>
+      </w:r>
+      <w:r>
+        <w:t xml:space="preserve"> </w:t>
+      </w:r>
+      <w:r>
+        <w:rPr>
+          <w:rStyle w:val="VerbatimChar"/>
+        </w:rPr>
+        <w:t xml:space="preserve">cmd/docs_chain/main.go</w:t>
+      </w:r>
+      <w:r>
+        <w:t xml:space="preserve"> </w:t>
+      </w:r>
+      <w:r>
+        <w:t xml:space="preserve">registers</w:t>
+      </w:r>
+      <w:r>
+        <w:t xml:space="preserve"> </w:t>
+      </w:r>
+      <w:r>
+        <w:rPr>
+          <w:rStyle w:val="VerbatimChar"/>
+        </w:rPr>
+        <w:t xml:space="preserve">sync</w:t>
+      </w:r>
+      <w:r>
+        <w:t xml:space="preserve">/</w:t>
+      </w:r>
+      <w:r>
+        <w:rPr>
+          <w:rStyle w:val="VerbatimChar"/>
+        </w:rPr>
+        <w:t xml:space="preserve">verify</w:t>
+      </w:r>
+      <w:r>
+        <w:t xml:space="preserve">/</w:t>
+      </w:r>
+      <w:r>
+        <w:rPr>
+          <w:rStyle w:val="VerbatimChar"/>
+        </w:rPr>
+        <w:t xml:space="preserve">diff</w:t>
+      </w:r>
+      <w:r>
+        <w:t xml:space="preserve">(alias)/</w:t>
+      </w:r>
+      <w:r>
+        <w:rPr>
+          <w:rStyle w:val="VerbatimChar"/>
+        </w:rPr>
+        <w:t xml:space="preserve">doctor</w:t>
+      </w:r>
+      <w:r>
+        <w:t xml:space="preserve">,</w:t>
+      </w:r>
+      <w:r>
+        <w:t xml:space="preserve"> </w:t>
+      </w:r>
+      <w:r>
+        <w:rPr>
+          <w:rStyle w:val="VerbatimChar"/>
+        </w:rPr>
+        <w:t xml:space="preserve">go test -count=1 ./...</w:t>
+      </w:r>
+      <w:r>
+        <w:t xml:space="preserve"> </w:t>
+      </w:r>
+      <w:r>
+        <w:t xml:space="preserve">GREEN 7/7 packages; this CLI/loader is in the working tree but UNTRACKED and the engine is NOT yet a registered git submodule (in-tree at</w:t>
+      </w:r>
+      <w:r>
+        <w:t xml:space="preserve"> </w:t>
+      </w:r>
+      <w:r>
+        <w:rPr>
+          <w:rStyle w:val="VerbatimChar"/>
+        </w:rPr>
+        <w:t xml:space="preserve">./docs_chain</w:t>
+      </w:r>
+      <w:r>
+        <w:t xml:space="preserve">, HEAD = parent HEAD); only submodule distribution (Phase 6) remains PLANNED + OPERATOR-GATED — wire as phases land, claim no unshipped behaviour. Propagation gate</w:t>
       </w:r>
       <w:r>
         <w:t xml:space="preserve"> </w:t>
@@ -29708,8 +29789,4212 @@
       </w:r>
     </w:p>
     <w:bookmarkEnd w:id="107"/>
+    <w:bookmarkStart w:id="108" w:name="X00e45f6f25c8b0c4e9d89bbb58cadec22e33de6"/>
+    <w:p>
+      <w:pPr>
+        <w:pStyle w:val="Heading3"/>
+      </w:pPr>
+      <w:r>
+        <w:t xml:space="preserve">§11.4.127 — Session-handoff resumption-prompt mandate (User mandate, 2026-06-06)</w:t>
+      </w:r>
+    </w:p>
+    <w:p>
+      <w:pPr>
+        <w:pStyle w:val="FirstParagraph"/>
+      </w:pPr>
+      <w:r>
+        <w:rPr>
+          <w:b/>
+          <w:bCs/>
+        </w:rPr>
+        <w:t xml:space="preserve">Forensic anchor — verbatim user mandate (2026-06-06):</w:t>
+      </w:r>
+      <w:r>
+        <w:t xml:space="preserve"> </w:t>
+      </w:r>
+      <w:r>
+        <w:t xml:space="preserve">"make sure that in situations like this now when new session is needed you ALWAYS prepera such sentence - which will be valid for particular moment and the phase of the project and enough for work to continue."</w:t>
+      </w:r>
+    </w:p>
+    <w:p>
+      <w:pPr>
+        <w:pStyle w:val="BodyText"/>
+      </w:pPr>
+      <w:r>
+        <w:t xml:space="preserve">When a fresh session is needed (context limits / degradation) OR the operator asks whether a new session is needed / requests a handoff, the agent MUST ALWAYS prepare + proactively provide a ready-to-paste</w:t>
+      </w:r>
+      <w:r>
+        <w:t xml:space="preserve"> </w:t>
+      </w:r>
+      <w:r>
+        <w:rPr>
+          <w:b/>
+          <w:bCs/>
+        </w:rPr>
+        <w:t xml:space="preserve">resumption prompt valid for that EXACT moment + project phase</w:t>
+      </w:r>
+      <w:r>
+        <w:t xml:space="preserve"> </w:t>
+      </w:r>
+      <w:r>
+        <w:t xml:space="preserve">— self-contained for ZERO-loss resume. Two variants: SHORT first-sentence ("Read</w:t>
+      </w:r>
+      <w:r>
+        <w:t xml:space="preserve"> </w:t>
+      </w:r>
+      <w:r>
+        <w:rPr>
+          <w:rStyle w:val="VerbatimChar"/>
+        </w:rPr>
+        <w:t xml:space="preserve">&lt;handoff docs&gt;</w:t>
+      </w:r>
+      <w:r>
+        <w:t xml:space="preserve">, then continue</w:t>
+      </w:r>
+      <w:r>
+        <w:t xml:space="preserve"> </w:t>
+      </w:r>
+      <w:r>
+        <w:rPr>
+          <w:rStyle w:val="VerbatimChar"/>
+        </w:rPr>
+        <w:t xml:space="preserve">&lt;goal&gt;</w:t>
+      </w:r>
+      <w:r>
+        <w:t xml:space="preserve"> </w:t>
+      </w:r>
+      <w:r>
+        <w:t xml:space="preserve">…") + FULL block on demand. MUST (1) point to live handoff docs (</w:t>
+      </w:r>
+      <w:r>
+        <w:rPr>
+          <w:rStyle w:val="VerbatimChar"/>
+        </w:rPr>
+        <w:t xml:space="preserve">.remember/remember.md</w:t>
+      </w:r>
+      <w:r>
+        <w:t xml:space="preserve"> </w:t>
+      </w:r>
+      <w:r>
+        <w:t xml:space="preserve">if present +</w:t>
+      </w:r>
+      <w:r>
+        <w:t xml:space="preserve"> </w:t>
+      </w:r>
+      <w:r>
+        <w:rPr>
+          <w:rStyle w:val="VerbatimChar"/>
+        </w:rPr>
+        <w:t xml:space="preserve">docs/CONTINUATION.md</w:t>
+      </w:r>
+      <w:r>
+        <w:t xml:space="preserve"> </w:t>
+      </w:r>
+      <w:r>
+        <w:t xml:space="preserve">§12.10, read FIRST +</w:t>
+      </w:r>
+      <w:r>
+        <w:t xml:space="preserve"> </w:t>
+      </w:r>
+      <w:r>
+        <w:rPr>
+          <w:rStyle w:val="VerbatimChar"/>
+        </w:rPr>
+        <w:t xml:space="preserve">git fetch --all</w:t>
+      </w:r>
+      <w:r>
+        <w:t xml:space="preserve">); (2) state PHASE + NEXT action + terminal goal; (3) embed exact live-state anchors (build IDs/MD5, device/target serials, commit HEAD, in-flight PIDs+log paths, captured-evidence paths); (4) restate binding constraints (anti-bluff §11.4, no-force-push §11.4.113, exact version/naming, hardware/target gotchas); (5) be MOMENT-VALID never generic. Handoff docs current BEFORE the prompt (§12.10). Missing/stale/generic = §11.4.127 violation. Composes §12.10 / §11.4.6 / §11.4.66 / §11.4.87 / §11.4.103 / §11.4.126. Classification: universal (§11.4.17). Gate</w:t>
+      </w:r>
+      <w:r>
+        <w:t xml:space="preserve"> </w:t>
+      </w:r>
+      <w:r>
+        <w:rPr>
+          <w:rStyle w:val="VerbatimChar"/>
+        </w:rPr>
+        <w:t xml:space="preserve">CM-COVENANT-114-127-PROPAGATION</w:t>
+      </w:r>
+      <w:r>
+        <w:t xml:space="preserve"> </w:t>
+      </w:r>
+      <w:r>
+        <w:t xml:space="preserve">(literal</w:t>
+      </w:r>
+      <w:r>
+        <w:t xml:space="preserve"> </w:t>
+      </w:r>
+      <w:r>
+        <w:rPr>
+          <w:rStyle w:val="VerbatimChar"/>
+        </w:rPr>
+        <w:t xml:space="preserve">11.4.127</w:t>
+      </w:r>
+      <w:r>
+        <w:t xml:space="preserve">) + paired §1.1 mutation.</w:t>
+      </w:r>
+    </w:p>
+    <w:p>
+      <w:pPr>
+        <w:pStyle w:val="BodyText"/>
+      </w:pPr>
+      <w:r>
+        <w:rPr>
+          <w:b/>
+          <w:bCs/>
+        </w:rPr>
+        <w:t xml:space="preserve">Canonical authority:</w:t>
+      </w:r>
+      <w:r>
+        <w:t xml:space="preserve"> </w:t>
+      </w:r>
+      <w:hyperlink r:id="rId70">
+        <w:r>
+          <w:rPr>
+            <w:rStyle w:val="VerbatimChar"/>
+          </w:rPr>
+          <w:t xml:space="preserve">Constitution.md</w:t>
+        </w:r>
+      </w:hyperlink>
+      <w:r>
+        <w:t xml:space="preserve"> </w:t>
+      </w:r>
+      <w:r>
+        <w:t xml:space="preserve">§11.4.127. Release blocker. No</w:t>
+      </w:r>
+      <w:r>
+        <w:t xml:space="preserve"> </w:t>
+      </w:r>
+      <w:r>
+        <w:rPr>
+          <w:rStyle w:val="VerbatimChar"/>
+        </w:rPr>
+        <w:t xml:space="preserve">--skip-handoff-prompt</w:t>
+      </w:r>
+      <w:r>
+        <w:t xml:space="preserve"> </w:t>
+      </w:r>
+      <w:r>
+        <w:t xml:space="preserve">/</w:t>
+      </w:r>
+      <w:r>
+        <w:t xml:space="preserve"> </w:t>
+      </w:r>
+      <w:r>
+        <w:rPr>
+          <w:rStyle w:val="VerbatimChar"/>
+        </w:rPr>
+        <w:t xml:space="preserve">--generic-prompt-OK</w:t>
+      </w:r>
+      <w:r>
+        <w:t xml:space="preserve"> </w:t>
+      </w:r>
+      <w:r>
+        <w:t xml:space="preserve">/</w:t>
+      </w:r>
+      <w:r>
+        <w:t xml:space="preserve"> </w:t>
+      </w:r>
+      <w:r>
+        <w:rPr>
+          <w:rStyle w:val="VerbatimChar"/>
+        </w:rPr>
+        <w:t xml:space="preserve">--no-resumption-sentence</w:t>
+      </w:r>
+      <w:r>
+        <w:t xml:space="preserve"> </w:t>
+      </w:r>
+      <w:r>
+        <w:t xml:space="preserve">/</w:t>
+      </w:r>
+      <w:r>
+        <w:t xml:space="preserve"> </w:t>
+      </w:r>
+      <w:r>
+        <w:rPr>
+          <w:rStyle w:val="VerbatimChar"/>
+        </w:rPr>
+        <w:t xml:space="preserve">--handoff-without-state</w:t>
+      </w:r>
+      <w:r>
+        <w:t xml:space="preserve"> </w:t>
+      </w:r>
+      <w:r>
+        <w:t xml:space="preserve">escape.</w:t>
+      </w:r>
+    </w:p>
     <w:bookmarkEnd w:id="108"/>
+    <w:bookmarkStart w:id="109" w:name="Xe08f5b59fcadc8cf7f4099e0ed71ed283e21f75"/>
+    <w:p>
+      <w:pPr>
+        <w:pStyle w:val="Heading3"/>
+      </w:pPr>
+      <w:r>
+        <w:t xml:space="preserve">§11.4.128 — Always-on device-recording mandate (User mandate, 2026-06-06)</w:t>
+      </w:r>
+    </w:p>
+    <w:p>
+      <w:pPr>
+        <w:pStyle w:val="FirstParagraph"/>
+      </w:pPr>
+      <w:r>
+        <w:rPr>
+          <w:b/>
+          <w:bCs/>
+        </w:rPr>
+        <w:t xml:space="preserve">Forensic anchor — direct user mandate (2026-06-06):</w:t>
+      </w:r>
+      <w:r>
+        <w:t xml:space="preserve"> </w:t>
+      </w:r>
+      <w:r>
+        <w:t xml:space="preserve">ALWAYS live-record all available data from all test/manual-testing devices, EXTRA carefully (never harm device / performance / no side effects); raw NOT processed without need (token-conscious); raw ALWAYS git-ignored + code-intelligence-excluded; only curated evidence committed, only at release prep.</w:t>
+      </w:r>
+    </w:p>
+    <w:p>
+      <w:pPr>
+        <w:pStyle w:val="BodyText"/>
+      </w:pPr>
+      <w:r>
+        <w:t xml:space="preserve">For EVERY test/debug device + every device under known manual testing, across EVERY transport (USB / wireless ADB / SSH / serial / network introspection API), ALWAYS live-record all analysable data: activities, all logs, perf metrics (CPU/mem/I/O/thermal/load), every sink-side report (§11.4.13), any live-changeable param. (1)</w:t>
+      </w:r>
+      <w:r>
+        <w:t xml:space="preserve"> </w:t>
+      </w:r>
+      <w:r>
+        <w:rPr>
+          <w:b/>
+          <w:bCs/>
+        </w:rPr>
+        <w:t xml:space="preserve">Side-effect-free</w:t>
+      </w:r>
+      <w:r>
+        <w:t xml:space="preserve"> </w:t>
+      </w:r>
+      <w:r>
+        <w:t xml:space="preserve">— non-invasive read-only probes, bounded sampling + write-volume, observer-effect budget; a perturbing recorder = §11.4.128 violation. (2)</w:t>
+      </w:r>
+      <w:r>
+        <w:t xml:space="preserve"> </w:t>
+      </w:r>
+      <w:r>
+        <w:rPr>
+          <w:b/>
+          <w:bCs/>
+        </w:rPr>
+        <w:t xml:space="preserve">Background + parallel + subagent-driven</w:t>
+      </w:r>
+      <w:r>
+        <w:t xml:space="preserve"> </w:t>
+      </w:r>
+      <w:r>
+        <w:t xml:space="preserve">(§11.4.103 + §11.4.70) — never blocks main stream. (3)</w:t>
+      </w:r>
+      <w:r>
+        <w:t xml:space="preserve"> </w:t>
+      </w:r>
+      <w:r>
+        <w:rPr>
+          <w:b/>
+          <w:bCs/>
+        </w:rPr>
+        <w:t xml:space="preserve">Token-conscious record-now-analyse-later</w:t>
+      </w:r>
+      <w:r>
+        <w:t xml:space="preserve"> </w:t>
+      </w:r>
+      <w:r>
+        <w:t xml:space="preserve">— raw NOT processed without need; only analyse-trigger = release-tag prep (§11.4.40/§11.4.42) OR explicit operator ask. (4)</w:t>
+      </w:r>
+      <w:r>
+        <w:t xml:space="preserve"> </w:t>
+      </w:r>
+      <w:r>
+        <w:rPr>
+          <w:b/>
+          <w:bCs/>
+        </w:rPr>
+        <w:t xml:space="preserve">Raw git-ignored (w/ §11.4.77 regen declaration) + code-intelligence-excluded (§11.4.78/.79)</w:t>
+      </w:r>
+      <w:r>
+        <w:t xml:space="preserve"> </w:t>
+      </w:r>
+      <w:r>
+        <w:t xml:space="preserve">— only curated evidence committed, only at release prep under</w:t>
+      </w:r>
+      <w:r>
+        <w:t xml:space="preserve"> </w:t>
+      </w:r>
+      <w:r>
+        <w:rPr>
+          <w:rStyle w:val="VerbatimChar"/>
+        </w:rPr>
+        <w:t xml:space="preserve">docs/qa/&lt;run-id&gt;/</w:t>
+      </w:r>
+      <w:r>
+        <w:t xml:space="preserve"> </w:t>
+      </w:r>
+      <w:r>
+        <w:t xml:space="preserve">(§11.4.83). (5)</w:t>
+      </w:r>
+      <w:r>
+        <w:t xml:space="preserve"> </w:t>
+      </w:r>
+      <w:r>
+        <w:rPr>
+          <w:b/>
+          <w:bCs/>
+        </w:rPr>
+        <w:t xml:space="preserve">Layout</w:t>
+      </w:r>
+      <w:r>
+        <w:t xml:space="preserve"> </w:t>
+      </w:r>
+      <w:r>
+        <w:rPr>
+          <w:rStyle w:val="VerbatimChar"/>
+        </w:rPr>
+        <w:t xml:space="preserve">&lt;recording-root&gt;/YYYY-MM-DD/&lt;combined main+submodules hash&gt;/&lt;DEVICE&gt;_&lt;SERIAL&gt;/recording_NNN/&lt;files&gt;</w:t>
+      </w:r>
+      <w:r>
+        <w:t xml:space="preserve">. (6)</w:t>
+      </w:r>
+      <w:r>
+        <w:t xml:space="preserve"> </w:t>
+      </w:r>
+      <w:r>
+        <w:rPr>
+          <w:b/>
+          <w:bCs/>
+        </w:rPr>
+        <w:t xml:space="preserve">Anti-bluff</w:t>
+      </w:r>
+      <w:r>
+        <w:t xml:space="preserve"> </w:t>
+      </w:r>
+      <w:r>
+        <w:t xml:space="preserve">— recorder-running-but-no-growing-corpus = §11.4 bluff; curated findings trace to real raw paths; recorder health = captured evidence (§11.4.5/.69). Composes §11.4.2/.5/.13/.69/.40/.42/.70/.77/.78/.79/.83/.103/.119. Classification: universal (§11.4.17). Gate</w:t>
+      </w:r>
+      <w:r>
+        <w:t xml:space="preserve"> </w:t>
+      </w:r>
+      <w:r>
+        <w:rPr>
+          <w:rStyle w:val="VerbatimChar"/>
+        </w:rPr>
+        <w:t xml:space="preserve">CM-COVENANT-114-128-PROPAGATION</w:t>
+      </w:r>
+      <w:r>
+        <w:t xml:space="preserve"> </w:t>
+      </w:r>
+      <w:r>
+        <w:t xml:space="preserve">(literal</w:t>
+      </w:r>
+      <w:r>
+        <w:t xml:space="preserve"> </w:t>
+      </w:r>
+      <w:r>
+        <w:rPr>
+          <w:rStyle w:val="VerbatimChar"/>
+        </w:rPr>
+        <w:t xml:space="preserve">11.4.128</w:t>
+      </w:r>
+      <w:r>
+        <w:t xml:space="preserve">) + rec. gate</w:t>
+      </w:r>
+      <w:r>
+        <w:t xml:space="preserve"> </w:t>
+      </w:r>
+      <w:r>
+        <w:rPr>
+          <w:rStyle w:val="VerbatimChar"/>
+        </w:rPr>
+        <w:t xml:space="preserve">CM-DEVICE-RECORDING-ALWAYS-ON</w:t>
+      </w:r>
+      <w:r>
+        <w:t xml:space="preserve"> </w:t>
+      </w:r>
+      <w:r>
+        <w:t xml:space="preserve">+ paired §1.1 mutation.</w:t>
+      </w:r>
+    </w:p>
+    <w:p>
+      <w:pPr>
+        <w:pStyle w:val="BodyText"/>
+      </w:pPr>
+      <w:r>
+        <w:rPr>
+          <w:b/>
+          <w:bCs/>
+        </w:rPr>
+        <w:t xml:space="preserve">Canonical authority:</w:t>
+      </w:r>
+      <w:r>
+        <w:t xml:space="preserve"> </w:t>
+      </w:r>
+      <w:hyperlink r:id="rId70">
+        <w:r>
+          <w:rPr>
+            <w:rStyle w:val="VerbatimChar"/>
+          </w:rPr>
+          <w:t xml:space="preserve">Constitution.md</w:t>
+        </w:r>
+      </w:hyperlink>
+      <w:r>
+        <w:t xml:space="preserve"> </w:t>
+      </w:r>
+      <w:r>
+        <w:t xml:space="preserve">§11.4.128. Release blocker. No</w:t>
+      </w:r>
+      <w:r>
+        <w:t xml:space="preserve"> </w:t>
+      </w:r>
+      <w:r>
+        <w:rPr>
+          <w:rStyle w:val="VerbatimChar"/>
+        </w:rPr>
+        <w:t xml:space="preserve">--skip-recording</w:t>
+      </w:r>
+      <w:r>
+        <w:t xml:space="preserve"> </w:t>
+      </w:r>
+      <w:r>
+        <w:t xml:space="preserve">/</w:t>
+      </w:r>
+      <w:r>
+        <w:t xml:space="preserve"> </w:t>
+      </w:r>
+      <w:r>
+        <w:rPr>
+          <w:rStyle w:val="VerbatimChar"/>
+        </w:rPr>
+        <w:t xml:space="preserve">--record-without-layout</w:t>
+      </w:r>
+      <w:r>
+        <w:t xml:space="preserve"> </w:t>
+      </w:r>
+      <w:r>
+        <w:t xml:space="preserve">/</w:t>
+      </w:r>
+      <w:r>
+        <w:t xml:space="preserve"> </w:t>
+      </w:r>
+      <w:r>
+        <w:rPr>
+          <w:rStyle w:val="VerbatimChar"/>
+        </w:rPr>
+        <w:t xml:space="preserve">--commit-raw-corpus</w:t>
+      </w:r>
+      <w:r>
+        <w:t xml:space="preserve"> </w:t>
+      </w:r>
+      <w:r>
+        <w:t xml:space="preserve">/</w:t>
+      </w:r>
+      <w:r>
+        <w:t xml:space="preserve"> </w:t>
+      </w:r>
+      <w:r>
+        <w:rPr>
+          <w:rStyle w:val="VerbatimChar"/>
+        </w:rPr>
+        <w:t xml:space="preserve">--index-raw-corpus</w:t>
+      </w:r>
+      <w:r>
+        <w:t xml:space="preserve"> </w:t>
+      </w:r>
+      <w:r>
+        <w:t xml:space="preserve">/</w:t>
+      </w:r>
+      <w:r>
+        <w:t xml:space="preserve"> </w:t>
+      </w:r>
+      <w:r>
+        <w:rPr>
+          <w:rStyle w:val="VerbatimChar"/>
+        </w:rPr>
+        <w:t xml:space="preserve">--analyse-corpus-always</w:t>
+      </w:r>
+      <w:r>
+        <w:t xml:space="preserve"> </w:t>
+      </w:r>
+      <w:r>
+        <w:t xml:space="preserve">/</w:t>
+      </w:r>
+      <w:r>
+        <w:t xml:space="preserve"> </w:t>
+      </w:r>
+      <w:r>
+        <w:rPr>
+          <w:rStyle w:val="VerbatimChar"/>
+        </w:rPr>
+        <w:t xml:space="preserve">--invasive-probe-OK</w:t>
+      </w:r>
+      <w:r>
+        <w:t xml:space="preserve"> </w:t>
+      </w:r>
+      <w:r>
+        <w:t xml:space="preserve">escape.</w:t>
+      </w:r>
+    </w:p>
     <w:bookmarkEnd w:id="109"/>
+    <w:bookmarkStart w:id="110" w:name="Xd381f83f80f24e3c2d2f73135e5592d9e5af0f5"/>
+    <w:p>
+      <w:pPr>
+        <w:pStyle w:val="Heading3"/>
+      </w:pPr>
+      <w:r>
+        <w:t xml:space="preserve">§11.4.129 — Huge-blocker release protocol (User mandate, 2026-06-06)</w:t>
+      </w:r>
+    </w:p>
+    <w:p>
+      <w:pPr>
+        <w:pStyle w:val="FirstParagraph"/>
+      </w:pPr>
+      <w:r>
+        <w:rPr>
+          <w:b/>
+          <w:bCs/>
+        </w:rPr>
+        <w:t xml:space="preserve">Forensic anchor — direct user mandate (2026-06-06):</w:t>
+      </w:r>
+      <w:r>
+        <w:t xml:space="preserve"> </w:t>
+      </w:r>
+      <w:r>
+        <w:t xml:space="preserve">on a huge blocker during release validation: STOP all testing → fix ALL discovered issues → process all recorded data from last session → land rock-solid fixes → author NEW validation+verification tests of ALL supported test types → rebuild → reflash → RESTART full validation+verification of every fix/change from the last release tag to now — both devices in parallel, recorded, real physical proofs, no bluff.</w:t>
+      </w:r>
+    </w:p>
+    <w:p>
+      <w:pPr>
+        <w:pStyle w:val="BodyText"/>
+      </w:pPr>
+      <w:r>
+        <w:t xml:space="preserve">On a HUGE BLOCKER (release-blocking-severity: core capability broken / regression invalidating the cycle / blast radius reaching the batch's other fixes), in order, NO shortcut: (1) STOP all testing every device (§11.4.4 STOP at release granularity). (2) Fix ALL discovered issues (not just the blocker) — root-cause §11.4.102 + isolate against last known-good tag §11.4.114. (3) Process all recorded data from last session (the §11.4.128(3) release-prep analyse-trigger). (4) Land rock-solid fixes §11.4.123 + §11.4.43/.115 + §11.4.9. (5) Author NEW tests of ALL supported types §11.4.27 + §11.4.85, anti-bluff + paired §1.1 mutation. (6) Rebuild (full, not module-only) + reflash CLEAN target §11.4.108. (7) RESTART full validation from last tag to now §11.4.40 — RESTART not resume — both/all devices parallel §11.4.103/.119, recorded §11.4.128, real physical proofs §11.4.5/.69/.107, no bluff. BINDS the existing release anchors for the huge-blocker case (STOP→fix-all→process-recordings→new-tests-all-types→rebuild→reflash→full-restart + restart-not-resume), citing not duplicating. Composes §11.4.4/.40/.42/.9/.27/.85/.102/.108/.114/.115/.123/.128/.103/.119. Classification: universal (§11.4.17). Gate</w:t>
+      </w:r>
+      <w:r>
+        <w:t xml:space="preserve"> </w:t>
+      </w:r>
+      <w:r>
+        <w:rPr>
+          <w:rStyle w:val="VerbatimChar"/>
+        </w:rPr>
+        <w:t xml:space="preserve">CM-COVENANT-114-129-PROPAGATION</w:t>
+      </w:r>
+      <w:r>
+        <w:t xml:space="preserve"> </w:t>
+      </w:r>
+      <w:r>
+        <w:t xml:space="preserve">(literal</w:t>
+      </w:r>
+      <w:r>
+        <w:t xml:space="preserve"> </w:t>
+      </w:r>
+      <w:r>
+        <w:rPr>
+          <w:rStyle w:val="VerbatimChar"/>
+        </w:rPr>
+        <w:t xml:space="preserve">11.4.129</w:t>
+      </w:r>
+      <w:r>
+        <w:t xml:space="preserve">) + rec. gate</w:t>
+      </w:r>
+      <w:r>
+        <w:t xml:space="preserve"> </w:t>
+      </w:r>
+      <w:r>
+        <w:rPr>
+          <w:rStyle w:val="VerbatimChar"/>
+        </w:rPr>
+        <w:t xml:space="preserve">CM-HUGE-BLOCKER-FULL-RESTART</w:t>
+      </w:r>
+      <w:r>
+        <w:t xml:space="preserve"> </w:t>
+      </w:r>
+      <w:r>
+        <w:t xml:space="preserve">+ paired §1.1 mutation.</w:t>
+      </w:r>
+    </w:p>
+    <w:p>
+      <w:pPr>
+        <w:pStyle w:val="BodyText"/>
+      </w:pPr>
+      <w:r>
+        <w:rPr>
+          <w:b/>
+          <w:bCs/>
+        </w:rPr>
+        <w:t xml:space="preserve">Canonical authority:</w:t>
+      </w:r>
+      <w:r>
+        <w:t xml:space="preserve"> </w:t>
+      </w:r>
+      <w:hyperlink r:id="rId70">
+        <w:r>
+          <w:rPr>
+            <w:rStyle w:val="VerbatimChar"/>
+          </w:rPr>
+          <w:t xml:space="preserve">Constitution.md</w:t>
+        </w:r>
+      </w:hyperlink>
+      <w:r>
+        <w:t xml:space="preserve"> </w:t>
+      </w:r>
+      <w:r>
+        <w:t xml:space="preserve">§11.4.129. Release blocker. No</w:t>
+      </w:r>
+      <w:r>
+        <w:t xml:space="preserve"> </w:t>
+      </w:r>
+      <w:r>
+        <w:rPr>
+          <w:rStyle w:val="VerbatimChar"/>
+        </w:rPr>
+        <w:t xml:space="preserve">--resume-after-blocker</w:t>
+      </w:r>
+      <w:r>
+        <w:t xml:space="preserve"> </w:t>
+      </w:r>
+      <w:r>
+        <w:t xml:space="preserve">/</w:t>
+      </w:r>
+      <w:r>
+        <w:t xml:space="preserve"> </w:t>
+      </w:r>
+      <w:r>
+        <w:rPr>
+          <w:rStyle w:val="VerbatimChar"/>
+        </w:rPr>
+        <w:t xml:space="preserve">--spot-validate-after-fix</w:t>
+      </w:r>
+      <w:r>
+        <w:t xml:space="preserve"> </w:t>
+      </w:r>
+      <w:r>
+        <w:t xml:space="preserve">/</w:t>
+      </w:r>
+      <w:r>
+        <w:t xml:space="preserve"> </w:t>
+      </w:r>
+      <w:r>
+        <w:rPr>
+          <w:rStyle w:val="VerbatimChar"/>
+        </w:rPr>
+        <w:t xml:space="preserve">--skip-recording-analysis</w:t>
+      </w:r>
+      <w:r>
+        <w:t xml:space="preserve"> </w:t>
+      </w:r>
+      <w:r>
+        <w:t xml:space="preserve">/</w:t>
+      </w:r>
+      <w:r>
+        <w:t xml:space="preserve"> </w:t>
+      </w:r>
+      <w:r>
+        <w:rPr>
+          <w:rStyle w:val="VerbatimChar"/>
+        </w:rPr>
+        <w:t xml:space="preserve">--skip-new-tests</w:t>
+      </w:r>
+      <w:r>
+        <w:t xml:space="preserve"> </w:t>
+      </w:r>
+      <w:r>
+        <w:t xml:space="preserve">/</w:t>
+      </w:r>
+      <w:r>
+        <w:t xml:space="preserve"> </w:t>
+      </w:r>
+      <w:r>
+        <w:rPr>
+          <w:rStyle w:val="VerbatimChar"/>
+        </w:rPr>
+        <w:t xml:space="preserve">--module-only-after-blocker</w:t>
+      </w:r>
+      <w:r>
+        <w:t xml:space="preserve"> </w:t>
+      </w:r>
+      <w:r>
+        <w:t xml:space="preserve">/</w:t>
+      </w:r>
+      <w:r>
+        <w:t xml:space="preserve"> </w:t>
+      </w:r>
+      <w:r>
+        <w:rPr>
+          <w:rStyle w:val="VerbatimChar"/>
+        </w:rPr>
+        <w:t xml:space="preserve">--single-device-restart</w:t>
+      </w:r>
+      <w:r>
+        <w:t xml:space="preserve"> </w:t>
+      </w:r>
+      <w:r>
+        <w:t xml:space="preserve">escape.</w:t>
+      </w:r>
+    </w:p>
+    <w:bookmarkEnd w:id="110"/>
+    <w:bookmarkStart w:id="111" w:name="X6e011ed1a28729797e5dd058ecef6545c7b5e16"/>
+    <w:p>
+      <w:pPr>
+        <w:pStyle w:val="Heading3"/>
+      </w:pPr>
+      <w:r>
+        <w:t xml:space="preserve">§11.4.130 — Post-remediation validate-the-fix-FIRST-after-redeploy (User mandate, 2026-06-06)</w:t>
+      </w:r>
+    </w:p>
+    <w:p>
+      <w:pPr>
+        <w:pStyle w:val="FirstParagraph"/>
+      </w:pPr>
+      <w:r>
+        <w:rPr>
+          <w:b/>
+          <w:bCs/>
+        </w:rPr>
+        <w:t xml:space="preserve">Forensic anchor — direct user mandate (2026-06-06):</w:t>
+      </w:r>
+      <w:r>
+        <w:t xml:space="preserve"> </w:t>
+      </w:r>
+      <w:r>
+        <w:t xml:space="preserve">when a blocker found during release validation is fixed and a new artifact (rebuild / new flashing image / redeploy) is produced + the target reflashed, FIRST re-test the SPECIFIC last-failing features + validate the just-incorporated fixes BEFORE the broader / full validation.</w:t>
+      </w:r>
+    </w:p>
+    <w:p>
+      <w:pPr>
+        <w:pStyle w:val="BodyText"/>
+      </w:pPr>
+      <w:r>
+        <w:t xml:space="preserve">When a blocker / critical failure found during release validation is FIXED and a new artifact is produced + the target reflashed / redistributed / updated, in order, NO shortcut: (1) re-test the SPECIFIC last-failing features FIRST (targeted guard tests for exactly the defects this fix addressed) BEFORE any broader / full-suite validation; (2) validate the just-incorporated fixes with real captured evidence — the §11.4.115 RED test flips GREEN at</w:t>
+      </w:r>
+      <w:r>
+        <w:t xml:space="preserve"> </w:t>
+      </w:r>
+      <w:r>
+        <w:rPr>
+          <w:rStyle w:val="VerbatimChar"/>
+        </w:rPr>
+        <w:t xml:space="preserve">RED_MODE=0</w:t>
+      </w:r>
+      <w:r>
+        <w:t xml:space="preserve"> </w:t>
+      </w:r>
+      <w:r>
+        <w:t xml:space="preserve">on the new artifact AND the §11.4.108 runtime-signature verifies on the CLEAN target the redeploy produced (metadata-only/config-only/absence-of-error/grep-without-runtime PASS forbidden §11.4/.1; proof §11.4.5/.69/.107/.123); (3) ONLY after the targeted fix is CONFIRMED working proceed to the §11.4.40 full retest from last tag to now. Rationale: a first fix attempt may not work / be incomplete / regress again under the new artifact — confirming FIRST catches fix-did-not-take immediately instead of hours later at the END of a full cycle (then restarting §11.4.129); cheap-confirmation-first is §11.4.82 applied to the post-blocker reflash. This is §11.4.46 specialised for the post-blocker-reflash case + the targeted-confirmation phase that GATES §11.4.129's step-7 full-restart. Honest boundary §11.4.6: "probably took" ≠ "took"; a still-FAILing targeted re-test re-enters the §11.4.114/.115 isolate→RED→fix loop, never proceeds to the full cycle on a still-broken fix. Composes §11.4.4/.40/.46/.108/.114/.115/.123/.129/.82. Classification: universal (§11.4.17). Gate</w:t>
+      </w:r>
+      <w:r>
+        <w:t xml:space="preserve"> </w:t>
+      </w:r>
+      <w:r>
+        <w:rPr>
+          <w:rStyle w:val="VerbatimChar"/>
+        </w:rPr>
+        <w:t xml:space="preserve">CM-COVENANT-114-130-PROPAGATION</w:t>
+      </w:r>
+      <w:r>
+        <w:t xml:space="preserve"> </w:t>
+      </w:r>
+      <w:r>
+        <w:t xml:space="preserve">(literal</w:t>
+      </w:r>
+      <w:r>
+        <w:t xml:space="preserve"> </w:t>
+      </w:r>
+      <w:r>
+        <w:rPr>
+          <w:rStyle w:val="VerbatimChar"/>
+        </w:rPr>
+        <w:t xml:space="preserve">11.4.130</w:t>
+      </w:r>
+      <w:r>
+        <w:t xml:space="preserve">) + rec. gate</w:t>
+      </w:r>
+      <w:r>
+        <w:t xml:space="preserve"> </w:t>
+      </w:r>
+      <w:r>
+        <w:rPr>
+          <w:rStyle w:val="VerbatimChar"/>
+        </w:rPr>
+        <w:t xml:space="preserve">CM-FIX-FIRST-AFTER-REDEPLOY</w:t>
+      </w:r>
+      <w:r>
+        <w:t xml:space="preserve"> </w:t>
+      </w:r>
+      <w:r>
+        <w:t xml:space="preserve">+ paired §1.1 mutation.</w:t>
+      </w:r>
+    </w:p>
+    <w:p>
+      <w:pPr>
+        <w:pStyle w:val="BodyText"/>
+      </w:pPr>
+      <w:r>
+        <w:rPr>
+          <w:b/>
+          <w:bCs/>
+        </w:rPr>
+        <w:t xml:space="preserve">Canonical authority:</w:t>
+      </w:r>
+      <w:r>
+        <w:t xml:space="preserve"> </w:t>
+      </w:r>
+      <w:hyperlink r:id="rId70">
+        <w:r>
+          <w:rPr>
+            <w:rStyle w:val="VerbatimChar"/>
+          </w:rPr>
+          <w:t xml:space="preserve">Constitution.md</w:t>
+        </w:r>
+      </w:hyperlink>
+      <w:r>
+        <w:t xml:space="preserve"> </w:t>
+      </w:r>
+      <w:r>
+        <w:t xml:space="preserve">§11.4.130. Release blocker. No</w:t>
+      </w:r>
+      <w:r>
+        <w:t xml:space="preserve"> </w:t>
+      </w:r>
+      <w:r>
+        <w:rPr>
+          <w:rStyle w:val="VerbatimChar"/>
+        </w:rPr>
+        <w:t xml:space="preserve">--skip-targeted-retest</w:t>
+      </w:r>
+      <w:r>
+        <w:t xml:space="preserve"> </w:t>
+      </w:r>
+      <w:r>
+        <w:t xml:space="preserve">/</w:t>
+      </w:r>
+      <w:r>
+        <w:t xml:space="preserve"> </w:t>
+      </w:r>
+      <w:r>
+        <w:rPr>
+          <w:rStyle w:val="VerbatimChar"/>
+        </w:rPr>
+        <w:t xml:space="preserve">--full-cycle-first</w:t>
+      </w:r>
+      <w:r>
+        <w:t xml:space="preserve"> </w:t>
+      </w:r>
+      <w:r>
+        <w:t xml:space="preserve">/</w:t>
+      </w:r>
+      <w:r>
+        <w:t xml:space="preserve"> </w:t>
+      </w:r>
+      <w:r>
+        <w:rPr>
+          <w:rStyle w:val="VerbatimChar"/>
+        </w:rPr>
+        <w:t xml:space="preserve">--assume-fix-took</w:t>
+      </w:r>
+      <w:r>
+        <w:t xml:space="preserve"> </w:t>
+      </w:r>
+      <w:r>
+        <w:t xml:space="preserve">/</w:t>
+      </w:r>
+      <w:r>
+        <w:t xml:space="preserve"> </w:t>
+      </w:r>
+      <w:r>
+        <w:rPr>
+          <w:rStyle w:val="VerbatimChar"/>
+        </w:rPr>
+        <w:t xml:space="preserve">--validate-fix-at-end</w:t>
+      </w:r>
+      <w:r>
+        <w:t xml:space="preserve"> </w:t>
+      </w:r>
+      <w:r>
+        <w:t xml:space="preserve">/</w:t>
+      </w:r>
+      <w:r>
+        <w:t xml:space="preserve"> </w:t>
+      </w:r>
+      <w:r>
+        <w:rPr>
+          <w:rStyle w:val="VerbatimChar"/>
+        </w:rPr>
+        <w:t xml:space="preserve">--skip-red-green-flip-on-new-artifact</w:t>
+      </w:r>
+      <w:r>
+        <w:t xml:space="preserve"> </w:t>
+      </w:r>
+      <w:r>
+        <w:t xml:space="preserve">escape.</w:t>
+      </w:r>
+    </w:p>
+    <w:bookmarkEnd w:id="111"/>
+    <w:bookmarkStart w:id="112" w:name="X43e35b136d4993396fc36ec874822634cdd7496"/>
+    <w:p>
+      <w:pPr>
+        <w:pStyle w:val="Heading3"/>
+      </w:pPr>
+      <w:r>
+        <w:t xml:space="preserve">§11.4.131 — Standing session-resumption file mandate (User mandate, 2026-06-07)</w:t>
+      </w:r>
+    </w:p>
+    <w:p>
+      <w:pPr>
+        <w:pStyle w:val="FirstParagraph"/>
+      </w:pPr>
+      <w:r>
+        <w:rPr>
+          <w:b/>
+          <w:bCs/>
+        </w:rPr>
+        <w:t xml:space="preserve">Forensic anchor — verbatim user mandate (2026-06-07):</w:t>
+      </w:r>
+      <w:r>
+        <w:t xml:space="preserve"> </w:t>
+      </w:r>
+      <w:r>
+        <w:t xml:space="preserve">"Make this markdown a standard file which will be written EVERY TIME when we need fresh session out of the box! It MUST BE always up to date and in sync so whenever new session is created all we have to do is just point to it!"</w:t>
+      </w:r>
+    </w:p>
+    <w:p>
+      <w:pPr>
+        <w:pStyle w:val="BodyText"/>
+      </w:pPr>
+      <w:r>
+        <w:t xml:space="preserve">Every project MUST maintain a SINGLE canonical, always-current</w:t>
+      </w:r>
+      <w:r>
+        <w:t xml:space="preserve"> </w:t>
+      </w:r>
+      <w:r>
+        <w:rPr>
+          <w:b/>
+          <w:bCs/>
+        </w:rPr>
+        <w:t xml:space="preserve">session-resumption file</w:t>
+      </w:r>
+      <w:r>
+        <w:t xml:space="preserve"> </w:t>
+      </w:r>
+      <w:r>
+        <w:t xml:space="preserve">at a fixed, project-declared standard path (declared once per §11.4.35, never moved without a §11.4.66 operator decision) — the OUT-OF-THE-BOX entry point for any fresh session (creating a new session = ONLY point the new agent at this one file). §11.4.131 promotes §11.4.127 (PREPARE-on-demand) into a STANDING, version-controlled ARTIFACT, ALWAYS present + ALWAYS in sync. (A) Exists at the declared path at all times (literal path per §11.4.35, never silently moved). (B) (Re)written whenever a fresh session is needed OR the live state materially changes (new HEAD / build-artifact id / phase / device state / in-flight job / blocking decision) — the §12.10 trigger set; a stale file = §11.4.131 violation (same class as a §12.10 stale-CONTINUATION). (C) Carries SHORT + FULL §11.4.127 variants; points to</w:t>
+      </w:r>
+      <w:r>
+        <w:t xml:space="preserve"> </w:t>
+      </w:r>
+      <w:r>
+        <w:rPr>
+          <w:rStyle w:val="VerbatimChar"/>
+        </w:rPr>
+        <w:t xml:space="preserve">.remember/remember.md</w:t>
+      </w:r>
+      <w:r>
+        <w:t xml:space="preserve"> </w:t>
+      </w:r>
+      <w:r>
+        <w:t xml:space="preserve">+</w:t>
+      </w:r>
+      <w:r>
+        <w:t xml:space="preserve"> </w:t>
+      </w:r>
+      <w:r>
+        <w:rPr>
+          <w:rStyle w:val="VerbatimChar"/>
+        </w:rPr>
+        <w:t xml:space="preserve">docs/CONTINUATION.md</w:t>
+      </w:r>
+      <w:r>
+        <w:t xml:space="preserve"> </w:t>
+      </w:r>
+      <w:r>
+        <w:t xml:space="preserve">read FIRST +</w:t>
+      </w:r>
+      <w:r>
+        <w:t xml:space="preserve"> </w:t>
+      </w:r>
+      <w:r>
+        <w:rPr>
+          <w:rStyle w:val="VerbatimChar"/>
+        </w:rPr>
+        <w:t xml:space="preserve">git fetch</w:t>
+      </w:r>
+      <w:r>
+        <w:t xml:space="preserve">; embeds exact live-state anchors (HEAD, artifact checksums, device serials, in-flight PIDs+logs, evidence paths); states PHASE + NEXT + terminal goal; restates binding constraints (anti-bluff §11.4, no-force-push §11.4.113, exact version/naming, hardware gotchas); MOMENT-VALID never generic (§11.4.6). (D) §11.4.65 export (</w:t>
+      </w:r>
+      <w:r>
+        <w:rPr>
+          <w:rStyle w:val="VerbatimChar"/>
+        </w:rPr>
+        <w:t xml:space="preserve">.html</w:t>
+      </w:r>
+      <w:r>
+        <w:t xml:space="preserve">/</w:t>
+      </w:r>
+      <w:r>
+        <w:rPr>
+          <w:rStyle w:val="VerbatimChar"/>
+        </w:rPr>
+        <w:t xml:space="preserve">.pdf</w:t>
+      </w:r>
+      <w:r>
+        <w:t xml:space="preserve"> </w:t>
+      </w:r>
+      <w:r>
+        <w:t xml:space="preserve">siblings) + §11.4.44 revision header. (E) Given ONLY this file's path a fresh session fully resumes with zero additional context. Composes §12.10/.127/.65/.44/.6/.66/.126. Classification: universal (§11.4.17). Gate</w:t>
+      </w:r>
+      <w:r>
+        <w:t xml:space="preserve"> </w:t>
+      </w:r>
+      <w:r>
+        <w:rPr>
+          <w:rStyle w:val="VerbatimChar"/>
+        </w:rPr>
+        <w:t xml:space="preserve">CM-COVENANT-114-131-PROPAGATION</w:t>
+      </w:r>
+      <w:r>
+        <w:t xml:space="preserve"> </w:t>
+      </w:r>
+      <w:r>
+        <w:t xml:space="preserve">(literal</w:t>
+      </w:r>
+      <w:r>
+        <w:t xml:space="preserve"> </w:t>
+      </w:r>
+      <w:r>
+        <w:rPr>
+          <w:rStyle w:val="VerbatimChar"/>
+        </w:rPr>
+        <w:t xml:space="preserve">11.4.131</w:t>
+      </w:r>
+      <w:r>
+        <w:t xml:space="preserve">) + rec. gate</w:t>
+      </w:r>
+      <w:r>
+        <w:t xml:space="preserve"> </w:t>
+      </w:r>
+      <w:r>
+        <w:rPr>
+          <w:rStyle w:val="VerbatimChar"/>
+        </w:rPr>
+        <w:t xml:space="preserve">CM-SESSION-RESUMPTION-FILE-PRESENT</w:t>
+      </w:r>
+      <w:r>
+        <w:t xml:space="preserve"> </w:t>
+      </w:r>
+      <w:r>
+        <w:t xml:space="preserve">+ paired §1.1 mutation.</w:t>
+      </w:r>
+    </w:p>
+    <w:p>
+      <w:pPr>
+        <w:pStyle w:val="BodyText"/>
+      </w:pPr>
+      <w:r>
+        <w:rPr>
+          <w:b/>
+          <w:bCs/>
+        </w:rPr>
+        <w:t xml:space="preserve">Canonical authority:</w:t>
+      </w:r>
+      <w:r>
+        <w:t xml:space="preserve"> </w:t>
+      </w:r>
+      <w:hyperlink r:id="rId70">
+        <w:r>
+          <w:rPr>
+            <w:rStyle w:val="VerbatimChar"/>
+          </w:rPr>
+          <w:t xml:space="preserve">Constitution.md</w:t>
+        </w:r>
+      </w:hyperlink>
+      <w:r>
+        <w:t xml:space="preserve"> </w:t>
+      </w:r>
+      <w:r>
+        <w:t xml:space="preserve">§11.4.131. Release blocker. No</w:t>
+      </w:r>
+      <w:r>
+        <w:t xml:space="preserve"> </w:t>
+      </w:r>
+      <w:r>
+        <w:rPr>
+          <w:rStyle w:val="VerbatimChar"/>
+        </w:rPr>
+        <w:t xml:space="preserve">--skip-resumption-file</w:t>
+      </w:r>
+      <w:r>
+        <w:t xml:space="preserve"> </w:t>
+      </w:r>
+      <w:r>
+        <w:t xml:space="preserve">/</w:t>
+      </w:r>
+      <w:r>
+        <w:t xml:space="preserve"> </w:t>
+      </w:r>
+      <w:r>
+        <w:rPr>
+          <w:rStyle w:val="VerbatimChar"/>
+        </w:rPr>
+        <w:t xml:space="preserve">--ephemeral-prompt-only</w:t>
+      </w:r>
+      <w:r>
+        <w:t xml:space="preserve"> </w:t>
+      </w:r>
+      <w:r>
+        <w:t xml:space="preserve">/</w:t>
+      </w:r>
+      <w:r>
+        <w:t xml:space="preserve"> </w:t>
+      </w:r>
+      <w:r>
+        <w:rPr>
+          <w:rStyle w:val="VerbatimChar"/>
+        </w:rPr>
+        <w:t xml:space="preserve">--stale-resumption-OK</w:t>
+      </w:r>
+      <w:r>
+        <w:t xml:space="preserve"> </w:t>
+      </w:r>
+      <w:r>
+        <w:t xml:space="preserve">/</w:t>
+      </w:r>
+      <w:r>
+        <w:t xml:space="preserve"> </w:t>
+      </w:r>
+      <w:r>
+        <w:rPr>
+          <w:rStyle w:val="VerbatimChar"/>
+        </w:rPr>
+        <w:t xml:space="preserve">--generic-template-OK</w:t>
+      </w:r>
+      <w:r>
+        <w:t xml:space="preserve"> </w:t>
+      </w:r>
+      <w:r>
+        <w:t xml:space="preserve">escape.</w:t>
+      </w:r>
+    </w:p>
+    <w:bookmarkEnd w:id="112"/>
+    <w:bookmarkStart w:id="113" w:name="Xbb90d69de159c42e58b29b31ff4aee8d49d905d"/>
+    <w:p>
+      <w:pPr>
+        <w:pStyle w:val="Heading3"/>
+      </w:pPr>
+      <w:r>
+        <w:t xml:space="preserve">§11.4.132 — Risk-ordered validation priority mandate (User mandate, 2026-06-07)</w:t>
+      </w:r>
+    </w:p>
+    <w:p>
+      <w:pPr>
+        <w:pStyle w:val="FirstParagraph"/>
+      </w:pPr>
+      <w:r>
+        <w:rPr>
+          <w:b/>
+          <w:bCs/>
+        </w:rPr>
+        <w:t xml:space="preserve">Forensic anchor — verbatim user mandate (2026-06-07):</w:t>
+      </w:r>
+      <w:r>
+        <w:t xml:space="preserve"> </w:t>
+      </w:r>
+      <w:r>
+        <w:t xml:space="preserve">"We MUST ALWAYS first test and validate features, functionalities and fixes/changes that have been worked most recently, the ones which were most problematic, which have the most chance to crash or break again, the ones which have been re-opened the most times! Then, after we validate and verify all this with real (physical) proofs and hard evidence, with no false results and bluffs of any kind, we continue with all other existing tests in the test suites! This IS MANDATORY."</w:t>
+      </w:r>
+    </w:p>
+    <w:p>
+      <w:pPr>
+        <w:pStyle w:val="BodyText"/>
+      </w:pPr>
+      <w:r>
+        <w:t xml:space="preserve">Tests / validations / verifications MUST run in RISK-DESCENDING order — the highest-risk set FIRST, and ONLY AFTER that set is fully GREEN with real (physical) captured evidence does the remainder of the suite run. Closed risk factors, highest-first: (a) most-recently-worked; (b) historically most-problematic (longest defect history, most prior fixes/failures); (c) highest crash/break/regress likelihood (greatest blast radius/complexity/dependency surface); (d) most-reopened per §11.4.55 reopens-count. Each highest-risk item MUST pass with real (physical) captured evidence per §11.4.5/§11.4.69/§11.4.107 — no metadata-only / config-only / absence-of-error / grep-without-runtime PASS (§11.4/§11.4.1), no false results, no bluff (§11.4.6). ONLY AFTER the entire highest-risk set is GREEN with captured proof does the rest of the suite run; arbitrary-order or lower-risk-before-highest-risk-GREEN = §11.4.132 violation. REFINES/STRENGTHENS §11.4.130 (generalises "validate-just-fixed-first" to the full risk-ordered set) + §11.4.46 (adds explicit risk-ordering) + §11.4.42 (applies implementation-priority discipline to VALIDATION ordering). Classification: universal (§11.4.17) — consuming project supplies its recency/problematic-history/reopen-count sources (e.g. §11.4.93 DB</w:t>
+      </w:r>
+      <w:r>
+        <w:t xml:space="preserve"> </w:t>
+      </w:r>
+      <w:r>
+        <w:rPr>
+          <w:rStyle w:val="VerbatimChar"/>
+        </w:rPr>
+        <w:t xml:space="preserve">reopens_count</w:t>
+      </w:r>
+      <w:r>
+        <w:t xml:space="preserve">+</w:t>
+      </w:r>
+      <w:r>
+        <w:rPr>
+          <w:rStyle w:val="VerbatimChar"/>
+        </w:rPr>
+        <w:t xml:space="preserve">last_modified</w:t>
+      </w:r>
+      <w:r>
+        <w:t xml:space="preserve">) per §11.4.35. Composes §11.4.4/.5/.6/.7/.40/.42/.46/.50/.55/.69/.107/.130. Gate</w:t>
+      </w:r>
+      <w:r>
+        <w:t xml:space="preserve"> </w:t>
+      </w:r>
+      <w:r>
+        <w:rPr>
+          <w:rStyle w:val="VerbatimChar"/>
+        </w:rPr>
+        <w:t xml:space="preserve">CM-COVENANT-114-132-PROPAGATION</w:t>
+      </w:r>
+      <w:r>
+        <w:t xml:space="preserve"> </w:t>
+      </w:r>
+      <w:r>
+        <w:t xml:space="preserve">(literal</w:t>
+      </w:r>
+      <w:r>
+        <w:t xml:space="preserve"> </w:t>
+      </w:r>
+      <w:r>
+        <w:rPr>
+          <w:rStyle w:val="VerbatimChar"/>
+        </w:rPr>
+        <w:t xml:space="preserve">11.4.132</w:t>
+      </w:r>
+      <w:r>
+        <w:t xml:space="preserve">) + rec. gate</w:t>
+      </w:r>
+      <w:r>
+        <w:t xml:space="preserve"> </w:t>
+      </w:r>
+      <w:r>
+        <w:rPr>
+          <w:rStyle w:val="VerbatimChar"/>
+        </w:rPr>
+        <w:t xml:space="preserve">CM-RISK-ORDERED-VALIDATION-PRIORITY</w:t>
+      </w:r>
+      <w:r>
+        <w:t xml:space="preserve"> </w:t>
+      </w:r>
+      <w:r>
+        <w:t xml:space="preserve">+ paired §1.1 mutation.</w:t>
+      </w:r>
+    </w:p>
+    <w:p>
+      <w:pPr>
+        <w:pStyle w:val="BodyText"/>
+      </w:pPr>
+      <w:r>
+        <w:rPr>
+          <w:b/>
+          <w:bCs/>
+        </w:rPr>
+        <w:t xml:space="preserve">Canonical authority:</w:t>
+      </w:r>
+      <w:r>
+        <w:t xml:space="preserve"> </w:t>
+      </w:r>
+      <w:hyperlink r:id="rId70">
+        <w:r>
+          <w:rPr>
+            <w:rStyle w:val="VerbatimChar"/>
+          </w:rPr>
+          <w:t xml:space="preserve">Constitution.md</w:t>
+        </w:r>
+      </w:hyperlink>
+      <w:r>
+        <w:t xml:space="preserve"> </w:t>
+      </w:r>
+      <w:r>
+        <w:t xml:space="preserve">§11.4.132. Release blocker. No</w:t>
+      </w:r>
+      <w:r>
+        <w:t xml:space="preserve"> </w:t>
+      </w:r>
+      <w:r>
+        <w:rPr>
+          <w:rStyle w:val="VerbatimChar"/>
+        </w:rPr>
+        <w:t xml:space="preserve">--skip-risk-ordering</w:t>
+      </w:r>
+      <w:r>
+        <w:t xml:space="preserve"> </w:t>
+      </w:r>
+      <w:r>
+        <w:t xml:space="preserve">/</w:t>
+      </w:r>
+      <w:r>
+        <w:t xml:space="preserve"> </w:t>
+      </w:r>
+      <w:r>
+        <w:rPr>
+          <w:rStyle w:val="VerbatimChar"/>
+        </w:rPr>
+        <w:t xml:space="preserve">--any-order-OK</w:t>
+      </w:r>
+      <w:r>
+        <w:t xml:space="preserve"> </w:t>
+      </w:r>
+      <w:r>
+        <w:t xml:space="preserve">/</w:t>
+      </w:r>
+      <w:r>
+        <w:t xml:space="preserve"> </w:t>
+      </w:r>
+      <w:r>
+        <w:rPr>
+          <w:rStyle w:val="VerbatimChar"/>
+        </w:rPr>
+        <w:t xml:space="preserve">--suite-order-fixed</w:t>
+      </w:r>
+      <w:r>
+        <w:t xml:space="preserve"> </w:t>
+      </w:r>
+      <w:r>
+        <w:t xml:space="preserve">escape.</w:t>
+      </w:r>
+    </w:p>
+    <w:bookmarkEnd w:id="113"/>
+    <w:bookmarkStart w:id="114" w:name="Xc021f58120e0446b1440410dca07a2f26184d23"/>
+    <w:p>
+      <w:pPr>
+        <w:pStyle w:val="Heading3"/>
+      </w:pPr>
+      <w:r>
+        <w:t xml:space="preserve">§11.4.133 — Target-System + hardware safety mandate (User mandate, 2026-06-08)</w:t>
+      </w:r>
+    </w:p>
+    <w:p>
+      <w:pPr>
+        <w:pStyle w:val="FirstParagraph"/>
+      </w:pPr>
+      <w:r>
+        <w:rPr>
+          <w:b/>
+          <w:bCs/>
+        </w:rPr>
+        <w:t xml:space="preserve">Forensic anchor — verbatim user mandate (2026-06-08):</w:t>
+      </w:r>
+      <w:r>
+        <w:t xml:space="preserve"> </w:t>
+      </w:r>
+      <w:r>
+        <w:t xml:space="preserve">"Make sure that all changes we do to the System are ALWAYS safe for the System itself and for the hardware the system runs on! This is MANDATORY."</w:t>
+      </w:r>
+    </w:p>
+    <w:p>
+      <w:pPr>
+        <w:pStyle w:val="BodyText"/>
+      </w:pPr>
+      <w:r>
+        <w:t xml:space="preserve">Every change to the TARGET system (firmware, kernel, init/boot scripts, drivers, sysfs/devfreq/voltage/clock/thermal/regulator register writes, partition/bootloader/U-Boot, HAL, framework, prebuilts, device config) MUST ALWAYS be safe for BOTH (a) the target System itself — MUST NOT brick, boot-loop, corrupt data, or render the device unrecoverable — AND (b) the hardware it runs on — MUST NOT exceed safe electrical/thermal/voltage/clock limits or damage panels/storage/radios/regulators. Concrete obligations: (1) reversible-first — verify irreversible high-blast-radius changes (bootloader/U-Boot MD5, partition layout) against known-good values + capture a pre-op backup (§9.2) BEFORE applying; (2) NO unverified hardware-control writes — never write an unverified value to a voltage/clock/regulator/thermal-throttle/current-limit sysfs node or register that could exceed datasheet limits, the safe range established as FACT (§11.4.6), never guessed; (3) thermal/perf changes (forcing a performance governor, pinning the top OPP, disabling thermal management) MUST respect the device's cooling design, validated by captured thermal evidence; (4) flashing MUST use the sanctioned tool + a freshly-built integrity-verified image — never an ad-hoc partition write or stale/unverified artifact; (5) unprovable-safety ⇒ blocked — a change whose target/hardware safety cannot be established from captured evidence is treated as UNSAFE and blocked (§11.4.6 + §11.4.101 reversible-first + §11.4.123 rock-solid-proof). DISTINCT from §12 host-session safety: §12 protects the DEVELOPER's HOST + session; §11.4.133 protects the TARGET device + its hardware — both apply, neither weakens the other. Classification: universal (§11.4.17) — consuming project supplies its concrete hardware-control surfaces, datasheet-safe ranges, known-good bootloader/image hashes, and sanctioned flashing tool per §11.4.35. Composes §12 / §11.4.6 / §11.4.101 / §11.4.108 / §11.4.123. Gate</w:t>
+      </w:r>
+      <w:r>
+        <w:t xml:space="preserve"> </w:t>
+      </w:r>
+      <w:r>
+        <w:rPr>
+          <w:rStyle w:val="VerbatimChar"/>
+        </w:rPr>
+        <w:t xml:space="preserve">CM-COVENANT-114-133-PROPAGATION</w:t>
+      </w:r>
+      <w:r>
+        <w:t xml:space="preserve"> </w:t>
+      </w:r>
+      <w:r>
+        <w:t xml:space="preserve">(literal</w:t>
+      </w:r>
+      <w:r>
+        <w:t xml:space="preserve"> </w:t>
+      </w:r>
+      <w:r>
+        <w:rPr>
+          <w:rStyle w:val="VerbatimChar"/>
+        </w:rPr>
+        <w:t xml:space="preserve">11.4.133</w:t>
+      </w:r>
+      <w:r>
+        <w:t xml:space="preserve">) + rec. gate</w:t>
+      </w:r>
+      <w:r>
+        <w:t xml:space="preserve"> </w:t>
+      </w:r>
+      <w:r>
+        <w:rPr>
+          <w:rStyle w:val="VerbatimChar"/>
+        </w:rPr>
+        <w:t xml:space="preserve">CM-TARGET-HARDWARE-SAFETY</w:t>
+      </w:r>
+      <w:r>
+        <w:t xml:space="preserve"> </w:t>
+      </w:r>
+      <w:r>
+        <w:t xml:space="preserve">+ paired §1.1 mutation.</w:t>
+      </w:r>
+    </w:p>
+    <w:p>
+      <w:pPr>
+        <w:pStyle w:val="BodyText"/>
+      </w:pPr>
+      <w:r>
+        <w:rPr>
+          <w:b/>
+          <w:bCs/>
+        </w:rPr>
+        <w:t xml:space="preserve">Canonical authority:</w:t>
+      </w:r>
+      <w:r>
+        <w:t xml:space="preserve"> </w:t>
+      </w:r>
+      <w:hyperlink r:id="rId70">
+        <w:r>
+          <w:rPr>
+            <w:rStyle w:val="VerbatimChar"/>
+          </w:rPr>
+          <w:t xml:space="preserve">Constitution.md</w:t>
+        </w:r>
+      </w:hyperlink>
+      <w:r>
+        <w:t xml:space="preserve"> </w:t>
+      </w:r>
+      <w:r>
+        <w:t xml:space="preserve">§11.4.133. Release blocker. No</w:t>
+      </w:r>
+      <w:r>
+        <w:t xml:space="preserve"> </w:t>
+      </w:r>
+      <w:r>
+        <w:rPr>
+          <w:rStyle w:val="VerbatimChar"/>
+        </w:rPr>
+        <w:t xml:space="preserve">--unsafe-hardware-write</w:t>
+      </w:r>
+      <w:r>
+        <w:t xml:space="preserve"> </w:t>
+      </w:r>
+      <w:r>
+        <w:t xml:space="preserve">/</w:t>
+      </w:r>
+      <w:r>
+        <w:t xml:space="preserve"> </w:t>
+      </w:r>
+      <w:r>
+        <w:rPr>
+          <w:rStyle w:val="VerbatimChar"/>
+        </w:rPr>
+        <w:t xml:space="preserve">--skip-system-safety</w:t>
+      </w:r>
+      <w:r>
+        <w:t xml:space="preserve"> </w:t>
+      </w:r>
+      <w:r>
+        <w:t xml:space="preserve">/</w:t>
+      </w:r>
+      <w:r>
+        <w:t xml:space="preserve"> </w:t>
+      </w:r>
+      <w:r>
+        <w:rPr>
+          <w:rStyle w:val="VerbatimChar"/>
+        </w:rPr>
+        <w:t xml:space="preserve">--brick-risk-accepted</w:t>
+      </w:r>
+      <w:r>
+        <w:t xml:space="preserve"> </w:t>
+      </w:r>
+      <w:r>
+        <w:t xml:space="preserve">escape.</w:t>
+      </w:r>
+    </w:p>
+    <w:bookmarkEnd w:id="114"/>
+    <w:bookmarkStart w:id="115" w:name="X958b61bfbef36d2ac3ae857dce996a2579366ea"/>
+    <w:p>
+      <w:pPr>
+        <w:pStyle w:val="Heading3"/>
+      </w:pPr>
+      <w:r>
+        <w:t xml:space="preserve">§11.4.134 — Code-review iterate-until-GO + rock-solid-evidence mandate (User mandate, 2026-06-08)</w:t>
+      </w:r>
+    </w:p>
+    <w:p>
+      <w:pPr>
+        <w:pStyle w:val="FirstParagraph"/>
+      </w:pPr>
+      <w:r>
+        <w:rPr>
+          <w:b/>
+          <w:bCs/>
+        </w:rPr>
+        <w:t xml:space="preserve">Forensic anchor — verbatim user mandate (2026-06-08):</w:t>
+      </w:r>
+      <w:r>
+        <w:t xml:space="preserve"> </w:t>
+      </w:r>
+      <w:r>
+        <w:t xml:space="preserve">"For any fixes/changes given back to us for re-work by the code-review process, once we fix/improve everything per the code-review's requests, we MUST RE-RUN code-review AGAIN until we get a GO from it with NO new issues reported or warnings of any kind! All results produced by this whole process MUST ALWAYS give us rock-solid PHYSICAL evidence that the fixed/improved codebase really works now as expected, with no false results and no bluff(s) of any kind."</w:t>
+      </w:r>
+    </w:p>
+    <w:p>
+      <w:pPr>
+        <w:pStyle w:val="BodyText"/>
+      </w:pPr>
+      <w:r>
+        <w:t xml:space="preserve">When the §11.4.125 code-review returns ANY finding (BLOCKING, nit, or warning) and the author fixes/improves per that review, the code review MUST BE RE-RUN — and KEEP being re-run after each remediation round — until a clean GO with ZERO new issues AND ZERO warnings. A single "addressed the findings" pass is NOT sufficient: the corrected batch MUST pass a FRESH adversarial review (a re-review can surface NEW findings introduced by the fixes — the §11.4.1 fix-A-creates-B mode). The loop terminates ONLY on a clean GO; a residual warning is itself a finding that re-arms the loop. Every round's verdict AND every fix's validation MUST carry rock-solid PHYSICAL captured evidence per §11.4.5 / §11.4.69 / §11.4.107 (captured audio / video / sysfs / dumpsys / sink-side / runtime-signature) proving the fixed codebase REALLY works — never metadata-only / config-only / absence-of-error / grep-without-runtime; no false results, no bluff; a GO unbacked by physical evidence is a §11.4 PASS-bluff at the review-loop layer. REFINES / STRENGTHENS §11.4.125 (iterate-until-no-blocking): makes the loop EXPLICIT, raises termination to ZERO findings AND ZERO warnings, BINDS physical evidence to every round. Classification: universal (§11.4.17). Composes §11.4.125 / §11.4.1 / §11.4.4 / §11.4.5 / §11.4.6 / §11.4.69 / §11.4.107 / §11.4.50 / §11.4.108 / §11.4.123. Gate</w:t>
+      </w:r>
+      <w:r>
+        <w:t xml:space="preserve"> </w:t>
+      </w:r>
+      <w:r>
+        <w:rPr>
+          <w:rStyle w:val="VerbatimChar"/>
+        </w:rPr>
+        <w:t xml:space="preserve">CM-COVENANT-114-134-PROPAGATION</w:t>
+      </w:r>
+      <w:r>
+        <w:t xml:space="preserve"> </w:t>
+      </w:r>
+      <w:r>
+        <w:t xml:space="preserve">(literal</w:t>
+      </w:r>
+      <w:r>
+        <w:t xml:space="preserve"> </w:t>
+      </w:r>
+      <w:r>
+        <w:rPr>
+          <w:rStyle w:val="VerbatimChar"/>
+        </w:rPr>
+        <w:t xml:space="preserve">11.4.134</w:t>
+      </w:r>
+      <w:r>
+        <w:t xml:space="preserve">) + rec. gate</w:t>
+      </w:r>
+      <w:r>
+        <w:t xml:space="preserve"> </w:t>
+      </w:r>
+      <w:r>
+        <w:rPr>
+          <w:rStyle w:val="VerbatimChar"/>
+        </w:rPr>
+        <w:t xml:space="preserve">CM-CODE-REVIEW-ITERATE-UNTIL-GO</w:t>
+      </w:r>
+      <w:r>
+        <w:t xml:space="preserve"> </w:t>
+      </w:r>
+      <w:r>
+        <w:t xml:space="preserve">+ paired §1.1 mutation.</w:t>
+      </w:r>
+    </w:p>
+    <w:p>
+      <w:pPr>
+        <w:pStyle w:val="BodyText"/>
+      </w:pPr>
+      <w:r>
+        <w:rPr>
+          <w:b/>
+          <w:bCs/>
+        </w:rPr>
+        <w:t xml:space="preserve">Canonical authority:</w:t>
+      </w:r>
+      <w:r>
+        <w:t xml:space="preserve"> </w:t>
+      </w:r>
+      <w:hyperlink r:id="rId70">
+        <w:r>
+          <w:rPr>
+            <w:rStyle w:val="VerbatimChar"/>
+          </w:rPr>
+          <w:t xml:space="preserve">Constitution.md</w:t>
+        </w:r>
+      </w:hyperlink>
+      <w:r>
+        <w:t xml:space="preserve"> </w:t>
+      </w:r>
+      <w:r>
+        <w:t xml:space="preserve">§11.4.134. Release blocker. No</w:t>
+      </w:r>
+      <w:r>
+        <w:t xml:space="preserve"> </w:t>
+      </w:r>
+      <w:r>
+        <w:rPr>
+          <w:rStyle w:val="VerbatimChar"/>
+        </w:rPr>
+        <w:t xml:space="preserve">--skip-rereview</w:t>
+      </w:r>
+      <w:r>
+        <w:t xml:space="preserve"> </w:t>
+      </w:r>
+      <w:r>
+        <w:t xml:space="preserve">/</w:t>
+      </w:r>
+      <w:r>
+        <w:t xml:space="preserve"> </w:t>
+      </w:r>
+      <w:r>
+        <w:rPr>
+          <w:rStyle w:val="VerbatimChar"/>
+        </w:rPr>
+        <w:t xml:space="preserve">--single-review-pass</w:t>
+      </w:r>
+      <w:r>
+        <w:t xml:space="preserve"> </w:t>
+      </w:r>
+      <w:r>
+        <w:t xml:space="preserve">/</w:t>
+      </w:r>
+      <w:r>
+        <w:t xml:space="preserve"> </w:t>
+      </w:r>
+      <w:r>
+        <w:rPr>
+          <w:rStyle w:val="VerbatimChar"/>
+        </w:rPr>
+        <w:t xml:space="preserve">--warnings-ok</w:t>
+      </w:r>
+      <w:r>
+        <w:t xml:space="preserve"> </w:t>
+      </w:r>
+      <w:r>
+        <w:t xml:space="preserve">/</w:t>
+      </w:r>
+      <w:r>
+        <w:t xml:space="preserve"> </w:t>
+      </w:r>
+      <w:r>
+        <w:rPr>
+          <w:rStyle w:val="VerbatimChar"/>
+        </w:rPr>
+        <w:t xml:space="preserve">--evidence-optional</w:t>
+      </w:r>
+      <w:r>
+        <w:t xml:space="preserve"> </w:t>
+      </w:r>
+      <w:r>
+        <w:t xml:space="preserve">escape.</w:t>
+      </w:r>
+    </w:p>
+    <w:p>
+      <w:pPr>
+        <w:pStyle w:val="BodyText"/>
+      </w:pPr>
+      <w:r>
+        <w:rPr>
+          <w:b/>
+          <w:bCs/>
+        </w:rPr>
+        <w:t xml:space="preserve">§11.4.135 — Standing regression-guard suite + every-fixed-defect-gets-a-permanent-regression-test (User mandate, 2026-06-08).</w:t>
+      </w:r>
+      <w:r>
+        <w:t xml:space="preserve"> </w:t>
+      </w:r>
+      <w:r>
+        <w:t xml:space="preserve">Every project MUST maintain a STANDING regression-guard suite that runs on EVERY build+deploy and BLOCKS the release tag on any failure. Every closed defect (stable ticket id, e.g. ATM-NNN) MUST, in the SAME commit as its fix (extending the §11.4.43 DOCUMENT step), register a permanent §11.4.115 RED-on-broken-artifact regression test into the suite —</w:t>
+      </w:r>
+      <w:r>
+        <w:t xml:space="preserve"> </w:t>
+      </w:r>
+      <w:r>
+        <w:rPr>
+          <w:rStyle w:val="VerbatimChar"/>
+        </w:rPr>
+        <w:t xml:space="preserve">RED_MODE=1</w:t>
+      </w:r>
+      <w:r>
+        <w:t xml:space="preserve"> </w:t>
+      </w:r>
+      <w:r>
+        <w:t xml:space="preserve">capturing the historical defect on a pre-fix artifact (the proof the guard is real),</w:t>
+      </w:r>
+      <w:r>
+        <w:t xml:space="preserve"> </w:t>
+      </w:r>
+      <w:r>
+        <w:rPr>
+          <w:rStyle w:val="VerbatimChar"/>
+        </w:rPr>
+        <w:t xml:space="preserve">RED_MODE=0</w:t>
+      </w:r>
+      <w:r>
+        <w:t xml:space="preserve"> </w:t>
+      </w:r>
+      <w:r>
+        <w:t xml:space="preserve">the standing GREEN guard asserting the defect is ABSENT. A closure without a registered guard is a §11.4.123 violation. The suite runs FIRST in the post-deploy cycle (highest-risk set per §11.4.132) and is a §11.4.40 release-gate blocker. Forensic anchor (FACT): the wrong-subtitle-on-2nd-display defect was "fixed" via a source-side</w:t>
+      </w:r>
+      <w:r>
+        <w:t xml:space="preserve"> </w:t>
+      </w:r>
+      <w:r>
+        <w:rPr>
+          <w:rStyle w:val="VerbatimChar"/>
+        </w:rPr>
+        <w:t xml:space="preserve">CONTROL_MENU_LABEL_DENYLIST</w:t>
+      </w:r>
+      <w:r>
+        <w:t xml:space="preserve"> </w:t>
+      </w:r>
+      <w:r>
+        <w:t xml:space="preserve">that NO test mirrored or re-ran, so the NEXT chrome class recurred silently while the GREEN suite passed. Industry-standard bug-driven testing (Google content-driven testing; AOSP CTS/Tradefed) made mechanical + enforced. Composes §11.4.4 / §11.4.40 / §11.4.43 / §11.4.46 / §11.4.50 / §11.4.107 / §11.4.108 / §11.4.115 / §11.4.118 / §11.4.123 / §11.4.124 / §11.4.130 / §11.4.132. Classification: universal (§11.4.17). Propagation gate</w:t>
+      </w:r>
+      <w:r>
+        <w:t xml:space="preserve"> </w:t>
+      </w:r>
+      <w:r>
+        <w:rPr>
+          <w:rStyle w:val="VerbatimChar"/>
+        </w:rPr>
+        <w:t xml:space="preserve">CM-COVENANT-114-135-PROPAGATION</w:t>
+      </w:r>
+      <w:r>
+        <w:t xml:space="preserve"> </w:t>
+      </w:r>
+      <w:r>
+        <w:t xml:space="preserve">(literal</w:t>
+      </w:r>
+      <w:r>
+        <w:t xml:space="preserve"> </w:t>
+      </w:r>
+      <w:r>
+        <w:rPr>
+          <w:rStyle w:val="VerbatimChar"/>
+        </w:rPr>
+        <w:t xml:space="preserve">11.4.135</w:t>
+      </w:r>
+      <w:r>
+        <w:t xml:space="preserve">) + recommended gates</w:t>
+      </w:r>
+      <w:r>
+        <w:t xml:space="preserve"> </w:t>
+      </w:r>
+      <w:r>
+        <w:rPr>
+          <w:rStyle w:val="VerbatimChar"/>
+        </w:rPr>
+        <w:t xml:space="preserve">CM-REGRESSION-GUARD-REGISTERED</w:t>
+      </w:r>
+      <w:r>
+        <w:t xml:space="preserve"> </w:t>
+      </w:r>
+      <w:r>
+        <w:t xml:space="preserve">/</w:t>
+      </w:r>
+      <w:r>
+        <w:t xml:space="preserve"> </w:t>
+      </w:r>
+      <w:r>
+        <w:rPr>
+          <w:rStyle w:val="VerbatimChar"/>
+        </w:rPr>
+        <w:t xml:space="preserve">CM-REGRESSION-GUARD-SUITE-WIRED</w:t>
+      </w:r>
+      <w:r>
+        <w:t xml:space="preserve"> </w:t>
+      </w:r>
+      <w:r>
+        <w:t xml:space="preserve">+ paired §1.1 mutation.</w:t>
+      </w:r>
+      <w:r>
+        <w:t xml:space="preserve"> </w:t>
+      </w:r>
+      <w:r>
+        <w:rPr>
+          <w:b/>
+          <w:bCs/>
+        </w:rPr>
+        <w:t xml:space="preserve">Canonical authority:</w:t>
+      </w:r>
+      <w:r>
+        <w:t xml:space="preserve"> </w:t>
+      </w:r>
+      <w:r>
+        <w:t xml:space="preserve">constitution submodule</w:t>
+      </w:r>
+      <w:r>
+        <w:t xml:space="preserve"> </w:t>
+      </w:r>
+      <w:hyperlink r:id="rId68">
+        <w:r>
+          <w:rPr>
+            <w:rStyle w:val="VerbatimChar"/>
+          </w:rPr>
+          <w:t xml:space="preserve">Constitution.md</w:t>
+        </w:r>
+      </w:hyperlink>
+      <w:r>
+        <w:t xml:space="preserve"> </w:t>
+      </w:r>
+      <w:r>
+        <w:t xml:space="preserve">§11.4.135. Non-compliance is a release blocker. No escape hatch — no</w:t>
+      </w:r>
+      <w:r>
+        <w:t xml:space="preserve"> </w:t>
+      </w:r>
+      <w:r>
+        <w:rPr>
+          <w:rStyle w:val="VerbatimChar"/>
+        </w:rPr>
+        <w:t xml:space="preserve">--skip-regression-guard</w:t>
+      </w:r>
+      <w:r>
+        <w:t xml:space="preserve">,</w:t>
+      </w:r>
+      <w:r>
+        <w:t xml:space="preserve"> </w:t>
+      </w:r>
+      <w:r>
+        <w:rPr>
+          <w:rStyle w:val="VerbatimChar"/>
+        </w:rPr>
+        <w:t xml:space="preserve">--no-guard-on-close</w:t>
+      </w:r>
+      <w:r>
+        <w:t xml:space="preserve">,</w:t>
+      </w:r>
+      <w:r>
+        <w:t xml:space="preserve"> </w:t>
+      </w:r>
+      <w:r>
+        <w:rPr>
+          <w:rStyle w:val="VerbatimChar"/>
+        </w:rPr>
+        <w:t xml:space="preserve">--guard-optional</w:t>
+      </w:r>
+      <w:r>
+        <w:t xml:space="preserve"> </w:t>
+      </w:r>
+      <w:r>
+        <w:t xml:space="preserve">flag.</w:t>
+      </w:r>
+    </w:p>
+    <w:p>
+      <w:pPr>
+        <w:pStyle w:val="BodyText"/>
+      </w:pPr>
+      <w:r>
+        <w:rPr>
+          <w:b/>
+          <w:bCs/>
+        </w:rPr>
+        <w:t xml:space="preserve">§11.4.136 — Real-content end-to-end playback-test mandate (User mandate, 2026-06-08).</w:t>
+      </w:r>
+      <w:r>
+        <w:t xml:space="preserve"> </w:t>
+      </w:r>
+      <w:r>
+        <w:t xml:space="preserve">Refines/strengthens §11.4.107. Any test asserting media playback works MUST drive REAL content (catalog stream or offline reference clip) through the user's path (§11.4.48 UI-driven → §11.4.117 CV/OCR fallback) and assert it genuinely PLAYS via the §11.4.107 liveness battery PLUS a decoder-health census — a numeric drop-buffer budget, no buffer-timestamp re-order/discard, no codec-reject (cite Android/Media3 ExoPlayer OEM pre-OTA playback-test mandate: "too many dropped buffers" &gt;25, "unexpected presentation timestamp", "test timed out"). Metadata-only / launch-only / registration-only / single-frame / config-only PASS is forbidden (§11.4 / §11.4.1). A golden/reference clip corpus (BBC ExoPlayer testing samples) is the offline ground-truth. Composes §11.4.5 / §11.4.48 / §11.4.50 / §11.4.107 / §11.4.117 / §11.4.123 / §11.4.13 / §11.4.69. Classification: universal (§11.4.17). Propagation gate</w:t>
+      </w:r>
+      <w:r>
+        <w:t xml:space="preserve"> </w:t>
+      </w:r>
+      <w:r>
+        <w:rPr>
+          <w:rStyle w:val="VerbatimChar"/>
+        </w:rPr>
+        <w:t xml:space="preserve">CM-COVENANT-114-136-PROPAGATION</w:t>
+      </w:r>
+      <w:r>
+        <w:t xml:space="preserve"> </w:t>
+      </w:r>
+      <w:r>
+        <w:t xml:space="preserve">(literal</w:t>
+      </w:r>
+      <w:r>
+        <w:t xml:space="preserve"> </w:t>
+      </w:r>
+      <w:r>
+        <w:rPr>
+          <w:rStyle w:val="VerbatimChar"/>
+        </w:rPr>
+        <w:t xml:space="preserve">11.4.136</w:t>
+      </w:r>
+      <w:r>
+        <w:t xml:space="preserve">) + recommended gate</w:t>
+      </w:r>
+      <w:r>
+        <w:t xml:space="preserve"> </w:t>
+      </w:r>
+      <w:r>
+        <w:rPr>
+          <w:rStyle w:val="VerbatimChar"/>
+        </w:rPr>
+        <w:t xml:space="preserve">CM-REAL-CONTENT-PLAYBACK-TEST</w:t>
+      </w:r>
+      <w:r>
+        <w:t xml:space="preserve"> </w:t>
+      </w:r>
+      <w:r>
+        <w:t xml:space="preserve">+ paired §1.1 mutation.</w:t>
+      </w:r>
+      <w:r>
+        <w:t xml:space="preserve"> </w:t>
+      </w:r>
+      <w:r>
+        <w:rPr>
+          <w:b/>
+          <w:bCs/>
+        </w:rPr>
+        <w:t xml:space="preserve">Canonical authority:</w:t>
+      </w:r>
+      <w:r>
+        <w:t xml:space="preserve"> </w:t>
+      </w:r>
+      <w:r>
+        <w:t xml:space="preserve">constitution submodule</w:t>
+      </w:r>
+      <w:r>
+        <w:t xml:space="preserve"> </w:t>
+      </w:r>
+      <w:hyperlink r:id="rId68">
+        <w:r>
+          <w:rPr>
+            <w:rStyle w:val="VerbatimChar"/>
+          </w:rPr>
+          <w:t xml:space="preserve">Constitution.md</w:t>
+        </w:r>
+      </w:hyperlink>
+      <w:r>
+        <w:t xml:space="preserve"> </w:t>
+      </w:r>
+      <w:r>
+        <w:t xml:space="preserve">§11.4.136. Non-compliance is a release blocker. No escape hatch — no</w:t>
+      </w:r>
+      <w:r>
+        <w:t xml:space="preserve"> </w:t>
+      </w:r>
+      <w:r>
+        <w:rPr>
+          <w:rStyle w:val="VerbatimChar"/>
+        </w:rPr>
+        <w:t xml:space="preserve">--launch-proves-playback</w:t>
+      </w:r>
+      <w:r>
+        <w:t xml:space="preserve">,</w:t>
+      </w:r>
+      <w:r>
+        <w:t xml:space="preserve"> </w:t>
+      </w:r>
+      <w:r>
+        <w:rPr>
+          <w:rStyle w:val="VerbatimChar"/>
+        </w:rPr>
+        <w:t xml:space="preserve">--skip-decoder-health</w:t>
+      </w:r>
+      <w:r>
+        <w:t xml:space="preserve">,</w:t>
+      </w:r>
+      <w:r>
+        <w:t xml:space="preserve"> </w:t>
+      </w:r>
+      <w:r>
+        <w:rPr>
+          <w:rStyle w:val="VerbatimChar"/>
+        </w:rPr>
+        <w:t xml:space="preserve">--metadata-playback-pass-suffices</w:t>
+      </w:r>
+      <w:r>
+        <w:t xml:space="preserve"> </w:t>
+      </w:r>
+      <w:r>
+        <w:t xml:space="preserve">flag.</w:t>
+      </w:r>
+    </w:p>
+    <w:p>
+      <w:pPr>
+        <w:pStyle w:val="BodyText"/>
+      </w:pPr>
+      <w:r>
+        <w:rPr>
+          <w:b/>
+          <w:bCs/>
+        </w:rPr>
+        <w:t xml:space="preserve">§11.4.137 — Subtitle/caption content-correctness oracle + secure-display-proxy-honesty mandate (User mandate, 2026-06-08).</w:t>
+      </w:r>
+      <w:r>
+        <w:t xml:space="preserve"> </w:t>
+      </w:r>
+      <w:r>
+        <w:t xml:space="preserve">Refines §11.4.117 + §11.4.107 + §11.4.112. Forensic anchor (FACT): tests tasked to "physically verify the 2nd-display subtitle" PASSed GREEN while subtitles did NOT show / showed WRONG — the streaming player surface is FLAG_SECURE so</w:t>
+      </w:r>
+      <w:r>
+        <w:t xml:space="preserve"> </w:t>
+      </w:r>
+      <w:r>
+        <w:rPr>
+          <w:rStyle w:val="VerbatimChar"/>
+        </w:rPr>
+        <w:t xml:space="preserve">screencap -d &lt;secondary&gt;</w:t>
+      </w:r>
+      <w:r>
+        <w:t xml:space="preserve"> </w:t>
+      </w:r>
+      <w:r>
+        <w:t xml:space="preserve">returns BLACK (autonomous PIXEL verification structurally impossible per §11.4.112), so the test fell back to the accessibility-scraped/</w:t>
+      </w:r>
+      <w:r>
+        <w:rPr>
+          <w:rStyle w:val="VerbatimChar"/>
+        </w:rPr>
+        <w:t xml:space="preserve">persist.atmosphere.subdebug</w:t>
+      </w:r>
+      <w:r>
+        <w:t xml:space="preserve"> </w:t>
+      </w:r>
+      <w:r>
+        <w:t xml:space="preserve">proxy, and the proxy accepted a chrome/menu LABEL (</w:t>
+      </w:r>
+      <w:r>
+        <w:rPr>
+          <w:rStyle w:val="VerbatimChar"/>
+        </w:rPr>
+        <w:t xml:space="preserve">Аудио и субтитры</w:t>
+      </w:r>
+      <w:r>
+        <w:t xml:space="preserve">) as a valid subtitle because the prose floor accepted any multibyte prose and NO menu-label denylist + NO position/cadence check existed. The mandate: a subtitle-correctness test MUST classify the cue's</w:t>
+      </w:r>
+      <w:r>
+        <w:t xml:space="preserve"> </w:t>
+      </w:r>
+      <w:r>
+        <w:rPr>
+          <w:i/>
+          <w:iCs/>
+        </w:rPr>
+        <w:t xml:space="preserve">content class</w:t>
+      </w:r>
+      <w:r>
+        <w:t xml:space="preserve"> </w:t>
+      </w:r>
+      <w:r>
+        <w:t xml:space="preserve">— a present cue is NOT a correct cue. CHROME (FAIL) if a known control/menu label (closed multilingual deny-list MIRRORED from source, case-folded incl. non-ASCII), time/numeric chrome, not prose, OUTSIDE the lower safe-title band (CEA-708 9-anchor grid), OR STATIC across the window (real subtitle changes → ≥2 distinct prose cues, a metamorphic relation). DIALOGUE (PASS) only when prose + not-denied + not-chrome + position-ok + cadence ≥2 OR fuzzy-matches the SOURCE-extracted cue via normalized edit distance (§11.4.123 host ground truth). The oracle MUST be self-validated golden-good/golden-bad (§11.4.107(10)) and the deny-list MUST be verified present in the SHIPPED artifact (§11.4.108) — a source-green denylist with no test mirror + no artifact check is the exact recurrence pattern forbidden here. Secure-display honesty (§11.4.112): where FLAG_SECURE makes pixel verification impossible, the rock-solid autonomous proof is the player's caption telemetry + source-track presence + content-class oracle — NEVER a faked pixel "physical" pass; human-eye pixel confirmation is</w:t>
+      </w:r>
+      <w:r>
+        <w:t xml:space="preserve"> </w:t>
+      </w:r>
+      <w:r>
+        <w:rPr>
+          <w:rStyle w:val="VerbatimChar"/>
+        </w:rPr>
+        <w:t xml:space="preserve">operator_attended</w:t>
+      </w:r>
+      <w:r>
+        <w:t xml:space="preserve"> </w:t>
+      </w:r>
+      <w:r>
+        <w:t xml:space="preserve">(§11.4.52) with a tracked migration item. App-agnostic (keys off content class). Composes §11.4.3 / §11.4.5 / §11.4.6 / §11.4.107 / §11.4.108 / §11.4.112 / §11.4.115 / §11.4.117 / §11.4.123 / §11.4.13 / §11.4.69. Classification: universal (§11.4.17). Propagation gate</w:t>
+      </w:r>
+      <w:r>
+        <w:t xml:space="preserve"> </w:t>
+      </w:r>
+      <w:r>
+        <w:rPr>
+          <w:rStyle w:val="VerbatimChar"/>
+        </w:rPr>
+        <w:t xml:space="preserve">CM-COVENANT-114-137-PROPAGATION</w:t>
+      </w:r>
+      <w:r>
+        <w:t xml:space="preserve"> </w:t>
+      </w:r>
+      <w:r>
+        <w:t xml:space="preserve">(literal</w:t>
+      </w:r>
+      <w:r>
+        <w:t xml:space="preserve"> </w:t>
+      </w:r>
+      <w:r>
+        <w:rPr>
+          <w:rStyle w:val="VerbatimChar"/>
+        </w:rPr>
+        <w:t xml:space="preserve">11.4.137</w:t>
+      </w:r>
+      <w:r>
+        <w:t xml:space="preserve">) + recommended gate</w:t>
+      </w:r>
+      <w:r>
+        <w:t xml:space="preserve"> </w:t>
+      </w:r>
+      <w:r>
+        <w:rPr>
+          <w:rStyle w:val="VerbatimChar"/>
+        </w:rPr>
+        <w:t xml:space="preserve">CM-SUBTITLE-CONTENT-CORRECTNESS-ORACLE</w:t>
+      </w:r>
+      <w:r>
+        <w:t xml:space="preserve"> </w:t>
+      </w:r>
+      <w:r>
+        <w:t xml:space="preserve">+ paired §1.1 mutation (strip the denylist/position/cadence check → golden-bad</w:t>
+      </w:r>
+      <w:r>
+        <w:t xml:space="preserve"> </w:t>
+      </w:r>
+      <w:r>
+        <w:rPr>
+          <w:rStyle w:val="VerbatimChar"/>
+        </w:rPr>
+        <w:t xml:space="preserve">Аудио и субтитры</w:t>
+      </w:r>
+      <w:r>
+        <w:t xml:space="preserve"> </w:t>
+      </w:r>
+      <w:r>
+        <w:t xml:space="preserve">PASSes → gate FAILs).</w:t>
+      </w:r>
+      <w:r>
+        <w:t xml:space="preserve"> </w:t>
+      </w:r>
+      <w:r>
+        <w:rPr>
+          <w:b/>
+          <w:bCs/>
+        </w:rPr>
+        <w:t xml:space="preserve">Canonical authority:</w:t>
+      </w:r>
+      <w:r>
+        <w:t xml:space="preserve"> </w:t>
+      </w:r>
+      <w:r>
+        <w:t xml:space="preserve">constitution submodule</w:t>
+      </w:r>
+      <w:r>
+        <w:t xml:space="preserve"> </w:t>
+      </w:r>
+      <w:hyperlink r:id="rId68">
+        <w:r>
+          <w:rPr>
+            <w:rStyle w:val="VerbatimChar"/>
+          </w:rPr>
+          <w:t xml:space="preserve">Constitution.md</w:t>
+        </w:r>
+      </w:hyperlink>
+      <w:r>
+        <w:t xml:space="preserve"> </w:t>
+      </w:r>
+      <w:r>
+        <w:t xml:space="preserve">§11.4.137. Non-compliance is a release blocker. No escape hatch — no</w:t>
+      </w:r>
+      <w:r>
+        <w:t xml:space="preserve"> </w:t>
+      </w:r>
+      <w:r>
+        <w:rPr>
+          <w:rStyle w:val="VerbatimChar"/>
+        </w:rPr>
+        <w:t xml:space="preserve">--present-cue-is-correct</w:t>
+      </w:r>
+      <w:r>
+        <w:t xml:space="preserve">,</w:t>
+      </w:r>
+      <w:r>
+        <w:t xml:space="preserve"> </w:t>
+      </w:r>
+      <w:r>
+        <w:rPr>
+          <w:rStyle w:val="VerbatimChar"/>
+        </w:rPr>
+        <w:t xml:space="preserve">--skip-chrome-oracle</w:t>
+      </w:r>
+      <w:r>
+        <w:t xml:space="preserve">,</w:t>
+      </w:r>
+      <w:r>
+        <w:t xml:space="preserve"> </w:t>
+      </w:r>
+      <w:r>
+        <w:rPr>
+          <w:rStyle w:val="VerbatimChar"/>
+        </w:rPr>
+        <w:t xml:space="preserve">--length-heuristic-suffices</w:t>
+      </w:r>
+      <w:r>
+        <w:t xml:space="preserve">,</w:t>
+      </w:r>
+      <w:r>
+        <w:t xml:space="preserve"> </w:t>
+      </w:r>
+      <w:r>
+        <w:rPr>
+          <w:rStyle w:val="VerbatimChar"/>
+        </w:rPr>
+        <w:t xml:space="preserve">--pixel-pass-on-secure-display</w:t>
+      </w:r>
+      <w:r>
+        <w:t xml:space="preserve">,</w:t>
+      </w:r>
+      <w:r>
+        <w:t xml:space="preserve"> </w:t>
+      </w:r>
+      <w:r>
+        <w:rPr>
+          <w:rStyle w:val="VerbatimChar"/>
+        </w:rPr>
+        <w:t xml:space="preserve">--skip-position-check</w:t>
+      </w:r>
+      <w:r>
+        <w:t xml:space="preserve">,</w:t>
+      </w:r>
+      <w:r>
+        <w:t xml:space="preserve"> </w:t>
+      </w:r>
+      <w:r>
+        <w:rPr>
+          <w:rStyle w:val="VerbatimChar"/>
+        </w:rPr>
+        <w:t xml:space="preserve">--skip-cadence-check</w:t>
+      </w:r>
+      <w:r>
+        <w:t xml:space="preserve"> </w:t>
+      </w:r>
+      <w:r>
+        <w:t xml:space="preserve">flag.</w:t>
+      </w:r>
+    </w:p>
+    <w:p>
+      <w:pPr>
+        <w:pStyle w:val="BodyText"/>
+      </w:pPr>
+      <w:r>
+        <w:rPr>
+          <w:b/>
+          <w:bCs/>
+        </w:rPr>
+        <w:t xml:space="preserve">§11.4.138 — Operator-escape =&gt; mandatory bluff-audit + permanent guard (User mandate, 2026-06-08).</w:t>
+      </w:r>
+      <w:r>
+        <w:t xml:space="preserve"> </w:t>
+      </w:r>
+      <w:r>
+        <w:t xml:space="preserve">When the operator (or any out-of-band channel) finds a defect that the GREEN test suite passed, this is by definition a §11.4 PASS-bluff — it MUST trigger, before the fix is closed: (1) a §11.4.102 systematic-debugging pass to FACT-root-cause; (2) a bluff-audit identifying the EXACT assertion that should have caught it but didn't, cited to</w:t>
+      </w:r>
+      <w:r>
+        <w:t xml:space="preserve"> </w:t>
+      </w:r>
+      <w:r>
+        <w:rPr>
+          <w:rStyle w:val="VerbatimChar"/>
+        </w:rPr>
+        <w:t xml:space="preserve">file:line</w:t>
+      </w:r>
+      <w:r>
+        <w:t xml:space="preserve"> </w:t>
+      </w:r>
+      <w:r>
+        <w:t xml:space="preserve">(canonical example:</w:t>
+      </w:r>
+      <w:r>
+        <w:t xml:space="preserve"> </w:t>
+      </w:r>
+      <w:r>
+        <w:rPr>
+          <w:rStyle w:val="VerbatimChar"/>
+        </w:rPr>
+        <w:t xml:space="preserve">lib/subtitle_content_validation.sh:sub_is_prose()</w:t>
+      </w:r>
+      <w:r>
+        <w:t xml:space="preserve"> </w:t>
+      </w:r>
+      <w:r>
+        <w:t xml:space="preserve">returning TRUE for</w:t>
+      </w:r>
+      <w:r>
+        <w:t xml:space="preserve"> </w:t>
+      </w:r>
+      <w:r>
+        <w:rPr>
+          <w:rStyle w:val="VerbatimChar"/>
+        </w:rPr>
+        <w:t xml:space="preserve">Аудио и субтитры</w:t>
+      </w:r>
+      <w:r>
+        <w:t xml:space="preserve">); (3) a permanent §11.4.135 regression guard registered in the SAME commit as the fix, with its §11.4.115 RED capturing the operator-found defect; (4) the bluff-audit committed under</w:t>
+      </w:r>
+      <w:r>
+        <w:t xml:space="preserve"> </w:t>
+      </w:r>
+      <w:r>
+        <w:rPr>
+          <w:rStyle w:val="VerbatimChar"/>
+        </w:rPr>
+        <w:t xml:space="preserve">docs/research/&lt;scope&gt;/&lt;defect&gt;_bluff_audit/</w:t>
+      </w:r>
+      <w:r>
+        <w:t xml:space="preserve">. Closing an operator-found defect WITHOUT the bluff-audit + permanent guard is itself a §11.4 violation (the bluff that let it through is still live and the defect will recur). Composes §11.4 / §11.4.1 / §11.4.102 / §11.4.108 / §11.4.115 / §11.4.118 / §11.4.123 / §11.4.135. Classification: universal (§11.4.17). Propagation gate</w:t>
+      </w:r>
+      <w:r>
+        <w:t xml:space="preserve"> </w:t>
+      </w:r>
+      <w:r>
+        <w:rPr>
+          <w:rStyle w:val="VerbatimChar"/>
+        </w:rPr>
+        <w:t xml:space="preserve">CM-COVENANT-114-138-PROPAGATION</w:t>
+      </w:r>
+      <w:r>
+        <w:t xml:space="preserve"> </w:t>
+      </w:r>
+      <w:r>
+        <w:t xml:space="preserve">(literal</w:t>
+      </w:r>
+      <w:r>
+        <w:t xml:space="preserve"> </w:t>
+      </w:r>
+      <w:r>
+        <w:rPr>
+          <w:rStyle w:val="VerbatimChar"/>
+        </w:rPr>
+        <w:t xml:space="preserve">11.4.138</w:t>
+      </w:r>
+      <w:r>
+        <w:t xml:space="preserve">) + recommended gate</w:t>
+      </w:r>
+      <w:r>
+        <w:t xml:space="preserve"> </w:t>
+      </w:r>
+      <w:r>
+        <w:rPr>
+          <w:rStyle w:val="VerbatimChar"/>
+        </w:rPr>
+        <w:t xml:space="preserve">CM-OPERATOR-ESCAPE-BLUFF-AUDIT</w:t>
+      </w:r>
+      <w:r>
+        <w:t xml:space="preserve"> </w:t>
+      </w:r>
+      <w:r>
+        <w:t xml:space="preserve">+ paired §1.1 mutation.</w:t>
+      </w:r>
+      <w:r>
+        <w:t xml:space="preserve"> </w:t>
+      </w:r>
+      <w:r>
+        <w:rPr>
+          <w:b/>
+          <w:bCs/>
+        </w:rPr>
+        <w:t xml:space="preserve">Canonical authority:</w:t>
+      </w:r>
+      <w:r>
+        <w:t xml:space="preserve"> </w:t>
+      </w:r>
+      <w:r>
+        <w:t xml:space="preserve">constitution submodule</w:t>
+      </w:r>
+      <w:r>
+        <w:t xml:space="preserve"> </w:t>
+      </w:r>
+      <w:hyperlink r:id="rId68">
+        <w:r>
+          <w:rPr>
+            <w:rStyle w:val="VerbatimChar"/>
+          </w:rPr>
+          <w:t xml:space="preserve">Constitution.md</w:t>
+        </w:r>
+      </w:hyperlink>
+      <w:r>
+        <w:t xml:space="preserve"> </w:t>
+      </w:r>
+      <w:r>
+        <w:t xml:space="preserve">§11.4.138. Non-compliance is a release blocker. No escape hatch — no</w:t>
+      </w:r>
+      <w:r>
+        <w:t xml:space="preserve"> </w:t>
+      </w:r>
+      <w:r>
+        <w:rPr>
+          <w:rStyle w:val="VerbatimChar"/>
+        </w:rPr>
+        <w:t xml:space="preserve">--close-without-bluff-audit</w:t>
+      </w:r>
+      <w:r>
+        <w:t xml:space="preserve">,</w:t>
+      </w:r>
+      <w:r>
+        <w:t xml:space="preserve"> </w:t>
+      </w:r>
+      <w:r>
+        <w:rPr>
+          <w:rStyle w:val="VerbatimChar"/>
+        </w:rPr>
+        <w:t xml:space="preserve">--operator-find-is-just-a-bug</w:t>
+      </w:r>
+      <w:r>
+        <w:t xml:space="preserve">,</w:t>
+      </w:r>
+      <w:r>
+        <w:t xml:space="preserve"> </w:t>
+      </w:r>
+      <w:r>
+        <w:rPr>
+          <w:rStyle w:val="VerbatimChar"/>
+        </w:rPr>
+        <w:t xml:space="preserve">--skip-permanent-guard</w:t>
+      </w:r>
+      <w:r>
+        <w:t xml:space="preserve"> </w:t>
+      </w:r>
+      <w:r>
+        <w:t xml:space="preserve">flag.</w:t>
+      </w:r>
+    </w:p>
+    <w:p>
+      <w:pPr>
+        <w:pStyle w:val="BodyText"/>
+      </w:pPr>
+      <w:r>
+        <w:rPr>
+          <w:b/>
+          <w:bCs/>
+        </w:rPr>
+        <w:t xml:space="preserve">§11.4.139 — Fresh-process clean-artifact runtime-signature mandate (User mandate, 2026-06-08).</w:t>
+      </w:r>
+      <w:r>
+        <w:t xml:space="preserve"> </w:t>
+      </w:r>
+      <w:r>
+        <w:t xml:space="preserve">Refines §11.4.108. Before any post-deploy validation — ESPECIALLY a non-pixel proxy verification (the subdebug/accessibility-cue channel used for FLAG_SECURE displays) — the harness MUST assert running-artifact == built-artifact: the deploy yielded a CLEAN target (mutable-overlay/userdata wiped) OR a pre-validation check proves no stale overlay shadows the deployed code (e.g. every guarded package — incl. the Presenter that emits the subtitle cue — resolves to the system partition, no per-user override). A stale shadow of the cue-emitting component (e.g. a Presenter APK predating the denylist) makes the proxy report on code that was never deployed — any PASS is a §11.4 PASS-bluff. Each fix declares ONE machine-checkable runtime signature verified on the clean target (the §11.4.108 registry IS the definition of done); for the subtitle class the signature is "the shipped Presenter APK contains the denylist literal (case-insensitive) AND the subdebug channel emits</w:t>
+      </w:r>
+      <w:r>
+        <w:t xml:space="preserve"> </w:t>
+      </w:r>
+      <w:r>
+        <w:rPr>
+          <w:rStyle w:val="VerbatimChar"/>
+        </w:rPr>
+        <w:t xml:space="preserve">candidate REJECTED reason=chrome-label</w:t>
+      </w:r>
+      <w:r>
+        <w:t xml:space="preserve"> </w:t>
+      </w:r>
+      <w:r>
+        <w:t xml:space="preserve">for a menu label." Composes §11.4.46 / §11.4.108 / §11.4.130 / §11.4.135 / §11.4.137. Classification: universal (§11.4.17). Propagation gate</w:t>
+      </w:r>
+      <w:r>
+        <w:t xml:space="preserve"> </w:t>
+      </w:r>
+      <w:r>
+        <w:rPr>
+          <w:rStyle w:val="VerbatimChar"/>
+        </w:rPr>
+        <w:t xml:space="preserve">CM-COVENANT-114-139-PROPAGATION</w:t>
+      </w:r>
+      <w:r>
+        <w:t xml:space="preserve"> </w:t>
+      </w:r>
+      <w:r>
+        <w:t xml:space="preserve">(literal</w:t>
+      </w:r>
+      <w:r>
+        <w:t xml:space="preserve"> </w:t>
+      </w:r>
+      <w:r>
+        <w:rPr>
+          <w:rStyle w:val="VerbatimChar"/>
+        </w:rPr>
+        <w:t xml:space="preserve">11.4.139</w:t>
+      </w:r>
+      <w:r>
+        <w:t xml:space="preserve">) + recommended gate</w:t>
+      </w:r>
+      <w:r>
+        <w:t xml:space="preserve"> </w:t>
+      </w:r>
+      <w:r>
+        <w:rPr>
+          <w:rStyle w:val="VerbatimChar"/>
+        </w:rPr>
+        <w:t xml:space="preserve">CM-CLEAN-ARTIFACT-RUNTIME-SIGNATURE</w:t>
+      </w:r>
+      <w:r>
+        <w:t xml:space="preserve"> </w:t>
+      </w:r>
+      <w:r>
+        <w:t xml:space="preserve">+ paired §1.1 mutation.</w:t>
+      </w:r>
+      <w:r>
+        <w:t xml:space="preserve"> </w:t>
+      </w:r>
+      <w:r>
+        <w:rPr>
+          <w:b/>
+          <w:bCs/>
+        </w:rPr>
+        <w:t xml:space="preserve">Canonical authority:</w:t>
+      </w:r>
+      <w:r>
+        <w:t xml:space="preserve"> </w:t>
+      </w:r>
+      <w:r>
+        <w:t xml:space="preserve">constitution submodule</w:t>
+      </w:r>
+      <w:r>
+        <w:t xml:space="preserve"> </w:t>
+      </w:r>
+      <w:hyperlink r:id="rId68">
+        <w:r>
+          <w:rPr>
+            <w:rStyle w:val="VerbatimChar"/>
+          </w:rPr>
+          <w:t xml:space="preserve">Constitution.md</w:t>
+        </w:r>
+      </w:hyperlink>
+      <w:r>
+        <w:t xml:space="preserve"> </w:t>
+      </w:r>
+      <w:r>
+        <w:t xml:space="preserve">§11.4.139. Non-compliance is a release blocker. No escape hatch — no</w:t>
+      </w:r>
+      <w:r>
+        <w:t xml:space="preserve"> </w:t>
+      </w:r>
+      <w:r>
+        <w:rPr>
+          <w:rStyle w:val="VerbatimChar"/>
+        </w:rPr>
+        <w:t xml:space="preserve">--validate-against-running-state</w:t>
+      </w:r>
+      <w:r>
+        <w:t xml:space="preserve">,</w:t>
+      </w:r>
+      <w:r>
+        <w:t xml:space="preserve"> </w:t>
+      </w:r>
+      <w:r>
+        <w:rPr>
+          <w:rStyle w:val="VerbatimChar"/>
+        </w:rPr>
+        <w:t xml:space="preserve">--skip-clean-precondition</w:t>
+      </w:r>
+      <w:r>
+        <w:t xml:space="preserve">,</w:t>
+      </w:r>
+      <w:r>
+        <w:t xml:space="preserve"> </w:t>
+      </w:r>
+      <w:r>
+        <w:rPr>
+          <w:rStyle w:val="VerbatimChar"/>
+        </w:rPr>
+        <w:t xml:space="preserve">--shadow-OK</w:t>
+      </w:r>
+      <w:r>
+        <w:t xml:space="preserve"> </w:t>
+      </w:r>
+      <w:r>
+        <w:t xml:space="preserve">flag.</w:t>
+      </w:r>
+    </w:p>
+    <w:p>
+      <w:pPr>
+        <w:pStyle w:val="BlockText"/>
+      </w:pPr>
+      <w:r>
+        <w:rPr>
+          <w:b/>
+          <w:bCs/>
+        </w:rPr>
+        <w:t xml:space="preserve">§11.4.140 — Universal action-prefix system (</w:t>
+      </w:r>
+      <w:r>
+        <w:rPr>
+          <w:rStyle w:val="VerbatimChar"/>
+          <w:b/>
+          <w:bCs/>
+        </w:rPr>
+        <w:t xml:space="preserve">ACTION_NAME ::</w:t>
+      </w:r>
+      <w:r>
+        <w:rPr>
+          <w:b/>
+          <w:bCs/>
+        </w:rPr>
+        <w:t xml:space="preserve">) (User mandate,</w:t>
+      </w:r>
+      <w:r>
+        <w:rPr>
+          <w:b/>
+          <w:bCs/>
+        </w:rPr>
+        <w:t xml:space="preserve"> </w:t>
+      </w:r>
+      <w:r>
+        <w:rPr>
+          <w:b/>
+          <w:bCs/>
+        </w:rPr>
+        <w:t xml:space="preserve">2026-06-09; GRAMMAR_ADDENDUM 2026-06-09).</w:t>
+      </w:r>
+      <w:r>
+        <w:t xml:space="preserve"> </w:t>
+      </w:r>
+      <w:r>
+        <w:t xml:space="preserve">When a user prompt's FIRST</w:t>
+      </w:r>
+      <w:r>
+        <w:t xml:space="preserve"> </w:t>
+      </w:r>
+      <w:r>
+        <w:t xml:space="preserve">non-blank line starts with a recognised action prefix, you MUST: (1) look the</w:t>
+      </w:r>
+      <w:r>
+        <w:t xml:space="preserve"> </w:t>
+      </w:r>
+      <w:r>
+        <w:t xml:space="preserve">action token up in the action registry</w:t>
+      </w:r>
+      <w:r>
+        <w:t xml:space="preserve"> </w:t>
+      </w:r>
+      <w:r>
+        <w:rPr>
+          <w:rStyle w:val="VerbatimChar"/>
+        </w:rPr>
+        <w:t xml:space="preserve">constitution/actions/registry.yaml</w:t>
+      </w:r>
+      <w:r>
+        <w:t xml:space="preserve"> </w:t>
+      </w:r>
+      <w:r>
+        <w:t xml:space="preserve">(or</w:t>
+      </w:r>
+      <w:r>
+        <w:t xml:space="preserve"> </w:t>
+      </w:r>
+      <w:r>
+        <w:rPr>
+          <w:rStyle w:val="VerbatimChar"/>
+        </w:rPr>
+        <w:t xml:space="preserve">$HELIX_ACTION_REGISTRY</w:t>
+      </w:r>
+      <w:r>
+        <w:t xml:space="preserve">);</w:t>
+      </w:r>
+      <w:r>
+        <w:t xml:space="preserve"> </w:t>
+      </w:r>
+      <w:r>
+        <w:t xml:space="preserve">(2) if it is a registered action, REPLACE the prefix with that action's</w:t>
+      </w:r>
+      <w:r>
+        <w:t xml:space="preserve"> </w:t>
+      </w:r>
+      <w:r>
+        <w:rPr>
+          <w:rStyle w:val="VerbatimChar"/>
+        </w:rPr>
+        <w:t xml:space="preserve">expansion</w:t>
+      </w:r>
+      <w:r>
+        <w:t xml:space="preserve"> </w:t>
+      </w:r>
+      <w:r>
+        <w:t xml:space="preserve">text and apply its</w:t>
+      </w:r>
+      <w:r>
+        <w:t xml:space="preserve"> </w:t>
+      </w:r>
+      <w:r>
+        <w:rPr>
+          <w:rStyle w:val="VerbatimChar"/>
+        </w:rPr>
+        <w:t xml:space="preserve">rules</w:t>
+      </w:r>
+      <w:r>
+        <w:t xml:space="preserve">; (3) execute the remainder of the prompt</w:t>
+      </w:r>
+      <w:r>
+        <w:t xml:space="preserve"> </w:t>
+      </w:r>
+      <w:r>
+        <w:t xml:space="preserve">under the expanded instruction.</w:t>
+      </w:r>
+      <w:r>
+        <w:t xml:space="preserve"> </w:t>
+      </w:r>
+      <w:r>
+        <w:rPr>
+          <w:b/>
+          <w:bCs/>
+        </w:rPr>
+        <w:t xml:space="preserve">Four EQUIVALENT forms</w:t>
+      </w:r>
+      <w:r>
+        <w:t xml:space="preserve"> </w:t>
+      </w:r>
+      <w:r>
+        <w:t xml:space="preserve">— same action, same</w:t>
+      </w:r>
+      <w:r>
+        <w:t xml:space="preserve"> </w:t>
+      </w:r>
+      <w:r>
+        <w:t xml:space="preserve">expansion, same execution: (1)</w:t>
+      </w:r>
+      <w:r>
+        <w:t xml:space="preserve"> </w:t>
+      </w:r>
+      <w:r>
+        <w:rPr>
+          <w:rStyle w:val="VerbatimChar"/>
+        </w:rPr>
+        <w:t xml:space="preserve">ACTION_NAME :: &lt;rest&gt;</w:t>
+      </w:r>
+      <w:r>
+        <w:t xml:space="preserve"> </w:t>
+      </w:r>
+      <w:r>
+        <w:t xml:space="preserve">(bare</w:t>
+      </w:r>
+      <w:r>
+        <w:t xml:space="preserve"> </w:t>
+      </w:r>
+      <w:r>
+        <w:rPr>
+          <w:rStyle w:val="VerbatimChar"/>
+        </w:rPr>
+        <w:t xml:space="preserve">::</w:t>
+      </w:r>
+      <w:r>
+        <w:t xml:space="preserve">),</w:t>
+      </w:r>
+      <w:r>
+        <w:t xml:space="preserve"> </w:t>
+      </w:r>
+      <w:r>
+        <w:t xml:space="preserve">(2)</w:t>
+      </w:r>
+      <w:r>
+        <w:t xml:space="preserve"> </w:t>
+      </w:r>
+      <w:r>
+        <w:rPr>
+          <w:rStyle w:val="VerbatimChar"/>
+        </w:rPr>
+        <w:t xml:space="preserve">PREFIX::ACTION_NAME :: &lt;rest&gt;</w:t>
+      </w:r>
+      <w:r>
+        <w:t xml:space="preserve"> </w:t>
+      </w:r>
+      <w:r>
+        <w:t xml:space="preserve">(namespaced</w:t>
+      </w:r>
+      <w:r>
+        <w:t xml:space="preserve"> </w:t>
+      </w:r>
+      <w:r>
+        <w:rPr>
+          <w:rStyle w:val="VerbatimChar"/>
+        </w:rPr>
+        <w:t xml:space="preserve">::</w:t>
+      </w:r>
+      <w:r>
+        <w:t xml:space="preserve">), (3)</w:t>
+      </w:r>
+      <w:r>
+        <w:t xml:space="preserve"> </w:t>
+      </w:r>
+      <w:r>
+        <w:rPr>
+          <w:rStyle w:val="VerbatimChar"/>
+        </w:rPr>
+        <w:t xml:space="preserve">/ACTION_NAME &lt;rest&gt;</w:t>
+      </w:r>
+      <w:r>
+        <w:t xml:space="preserve"> </w:t>
+      </w:r>
+      <w:r>
+        <w:t xml:space="preserve">(bare slash), (4)</w:t>
+      </w:r>
+      <w:r>
+        <w:t xml:space="preserve"> </w:t>
+      </w:r>
+      <w:r>
+        <w:rPr>
+          <w:rStyle w:val="VerbatimChar"/>
+        </w:rPr>
+        <w:t xml:space="preserve">/PREFIX::ACTION_NAME &lt;rest&gt;</w:t>
+      </w:r>
+      <w:r>
+        <w:t xml:space="preserve"> </w:t>
+      </w:r>
+      <w:r>
+        <w:t xml:space="preserve">(namespaced slash). Thus</w:t>
+      </w:r>
+      <w:r>
+        <w:t xml:space="preserve"> </w:t>
+      </w:r>
+      <w:r>
+        <w:rPr>
+          <w:rStyle w:val="VerbatimChar"/>
+        </w:rPr>
+        <w:t xml:space="preserve">BACKGROUND :: x</w:t>
+      </w:r>
+      <w:r>
+        <w:t xml:space="preserve"> </w:t>
+      </w:r>
+      <w:r>
+        <w:t xml:space="preserve">≡</w:t>
+      </w:r>
+      <w:r>
+        <w:t xml:space="preserve"> </w:t>
+      </w:r>
+      <w:r>
+        <w:rPr>
+          <w:rStyle w:val="VerbatimChar"/>
+        </w:rPr>
+        <w:t xml:space="preserve">DEFAULT::BACKGROUND :: x</w:t>
+      </w:r>
+      <w:r>
+        <w:t xml:space="preserve"> </w:t>
+      </w:r>
+      <w:r>
+        <w:t xml:space="preserve">≡</w:t>
+      </w:r>
+      <w:r>
+        <w:t xml:space="preserve"> </w:t>
+      </w:r>
+      <w:r>
+        <w:rPr>
+          <w:rStyle w:val="VerbatimChar"/>
+        </w:rPr>
+        <w:t xml:space="preserve">/BACKGROUND x</w:t>
+      </w:r>
+      <w:r>
+        <w:t xml:space="preserve"> </w:t>
+      </w:r>
+      <w:r>
+        <w:t xml:space="preserve">≡</w:t>
+      </w:r>
+      <w:r>
+        <w:t xml:space="preserve"> </w:t>
+      </w:r>
+      <w:r>
+        <w:rPr>
+          <w:rStyle w:val="VerbatimChar"/>
+        </w:rPr>
+        <w:t xml:space="preserve">/DEFAULT::BACKGROUND x</w:t>
+      </w:r>
+      <w:r>
+        <w:t xml:space="preserve">.</w:t>
+      </w:r>
+      <w:r>
+        <w:t xml:space="preserve"> </w:t>
+      </w:r>
+      <w:r>
+        <w:rPr>
+          <w:rStyle w:val="VerbatimChar"/>
+        </w:rPr>
+        <w:t xml:space="preserve">PREFIX</w:t>
+      </w:r>
+      <w:r>
+        <w:t xml:space="preserve"> </w:t>
+      </w:r>
+      <w:r>
+        <w:t xml:space="preserve">is an action NAMESPACE; the reserved default</w:t>
+      </w:r>
+      <w:r>
+        <w:t xml:space="preserve"> </w:t>
+      </w:r>
+      <w:r>
+        <w:t xml:space="preserve">namespace is</w:t>
+      </w:r>
+      <w:r>
+        <w:t xml:space="preserve"> </w:t>
+      </w:r>
+      <w:r>
+        <w:rPr>
+          <w:rStyle w:val="VerbatimChar"/>
+          <w:b/>
+          <w:bCs/>
+        </w:rPr>
+        <w:t xml:space="preserve">DEFAULT</w:t>
+      </w:r>
+      <w:r>
+        <w:t xml:space="preserve">, and an action runs WITH or WITHOUT the prefix.</w:t>
+      </w:r>
+      <w:r>
+        <w:t xml:space="preserve"> </w:t>
+      </w:r>
+      <w:r>
+        <w:t xml:space="preserve">Grammar (all hold): anchored at the FIRST non-blank line only (mid-prose tokens</w:t>
+      </w:r>
+      <w:r>
+        <w:t xml:space="preserve"> </w:t>
+      </w:r>
+      <w:r>
+        <w:t xml:space="preserve">never match); the action token AND the namespace are UPPERCASE-only</w:t>
+      </w:r>
+      <w:r>
+        <w:t xml:space="preserve"> </w:t>
+      </w:r>
+      <w:r>
+        <w:rPr>
+          <w:rStyle w:val="VerbatimChar"/>
+        </w:rPr>
+        <w:t xml:space="preserve">[A-Z][A-Z0-9_]*</w:t>
+      </w:r>
+      <w:r>
+        <w:t xml:space="preserve"> </w:t>
+      </w:r>
+      <w:r>
+        <w:t xml:space="preserve">(lowercase never matches); the namespace separator</w:t>
+      </w:r>
+      <w:r>
+        <w:t xml:space="preserve"> </w:t>
+      </w:r>
+      <w:r>
+        <w:rPr>
+          <w:rStyle w:val="VerbatimChar"/>
+        </w:rPr>
+        <w:t xml:space="preserve">::</w:t>
+      </w:r>
+      <w:r>
+        <w:t xml:space="preserve"> </w:t>
+      </w:r>
+      <w:r>
+        <w:t xml:space="preserve">inside the token carries NO surrounding spaces (</w:t>
+      </w:r>
+      <w:r>
+        <w:rPr>
+          <w:rStyle w:val="VerbatimChar"/>
+        </w:rPr>
+        <w:t xml:space="preserve">PREFIX::ACTION_NAME</w:t>
+      </w:r>
+      <w:r>
+        <w:t xml:space="preserve">), DISTINCT</w:t>
+      </w:r>
+      <w:r>
+        <w:t xml:space="preserve"> </w:t>
+      </w:r>
+      <w:r>
+        <w:t xml:space="preserve">from the action-body separator</w:t>
+      </w:r>
+      <w:r>
+        <w:t xml:space="preserve"> </w:t>
+      </w:r>
+      <w:r>
+        <w:rPr>
+          <w:rStyle w:val="VerbatimChar"/>
+        </w:rPr>
+        <w:t xml:space="preserve">" :: "</w:t>
+      </w:r>
+      <w:r>
+        <w:t xml:space="preserve"> </w:t>
+      </w:r>
+      <w:r>
+        <w:t xml:space="preserve">(one ASCII space on each side of</w:t>
+      </w:r>
+      <w:r>
+        <w:t xml:space="preserve"> </w:t>
+      </w:r>
+      <w:r>
+        <w:rPr>
+          <w:rStyle w:val="VerbatimChar"/>
+        </w:rPr>
+        <w:t xml:space="preserve">::</w:t>
+      </w:r>
+      <w:r>
+        <w:t xml:space="preserve"> </w:t>
+      </w:r>
+      <w:r>
+        <w:t xml:space="preserve">—</w:t>
+      </w:r>
+      <w:r>
+        <w:t xml:space="preserve"> </w:t>
+      </w:r>
+      <w:r>
+        <w:t xml:space="preserve">avoids C++</w:t>
+      </w:r>
+      <w:r>
+        <w:t xml:space="preserve"> </w:t>
+      </w:r>
+      <w:r>
+        <w:rPr>
+          <w:rStyle w:val="VerbatimChar"/>
+        </w:rPr>
+        <w:t xml:space="preserve">Foo::Bar</w:t>
+      </w:r>
+      <w:r>
+        <w:t xml:space="preserve">, YAML</w:t>
+      </w:r>
+      <w:r>
+        <w:t xml:space="preserve"> </w:t>
+      </w:r>
+      <w:r>
+        <w:rPr>
+          <w:rStyle w:val="VerbatimChar"/>
+        </w:rPr>
+        <w:t xml:space="preserve">key: value</w:t>
+      </w:r>
+      <w:r>
+        <w:t xml:space="preserve">, URLs) in forms 1/2 and the slash-body</w:t>
+      </w:r>
+      <w:r>
+        <w:t xml:space="preserve"> </w:t>
+      </w:r>
+      <w:r>
+        <w:t xml:space="preserve">separator (one space) in forms 3/4; stacked prefixes (</w:t>
+      </w:r>
+      <w:r>
+        <w:rPr>
+          <w:rStyle w:val="VerbatimChar"/>
+        </w:rPr>
+        <w:t xml:space="preserve">A :: B :: rest</w:t>
+      </w:r>
+      <w:r>
+        <w:t xml:space="preserve">) apply</w:t>
+      </w:r>
+      <w:r>
+        <w:t xml:space="preserve"> </w:t>
+      </w:r>
+      <w:r>
+        <w:t xml:space="preserve">outer-to-inner, left-to-right (expand</w:t>
+      </w:r>
+      <w:r>
+        <w:t xml:space="preserve"> </w:t>
+      </w:r>
+      <w:r>
+        <w:rPr>
+          <w:rStyle w:val="VerbatimChar"/>
+        </w:rPr>
+        <w:t xml:space="preserve">A</w:t>
+      </w:r>
+      <w:r>
+        <w:t xml:space="preserve">, re-scan, expand</w:t>
+      </w:r>
+      <w:r>
+        <w:t xml:space="preserve"> </w:t>
+      </w:r>
+      <w:r>
+        <w:rPr>
+          <w:rStyle w:val="VerbatimChar"/>
+        </w:rPr>
+        <w:t xml:space="preserve">B</w:t>
+      </w:r>
+      <w:r>
+        <w:t xml:space="preserve">, then the</w:t>
+      </w:r>
+      <w:r>
+        <w:t xml:space="preserve"> </w:t>
+      </w:r>
+      <w:r>
+        <w:t xml:space="preserve">residual is the task); a leading</w:t>
+      </w:r>
+      <w:r>
+        <w:t xml:space="preserve"> </w:t>
+      </w:r>
+      <w:r>
+        <w:rPr>
+          <w:rStyle w:val="VerbatimChar"/>
+        </w:rPr>
+        <w:t xml:space="preserve">\</w:t>
+      </w:r>
+      <w:r>
+        <w:t xml:space="preserve"> </w:t>
+      </w:r>
+      <w:r>
+        <w:t xml:space="preserve">escapes the prefix for BOTH the</w:t>
+      </w:r>
+      <w:r>
+        <w:t xml:space="preserve"> </w:t>
+      </w:r>
+      <w:r>
+        <w:rPr>
+          <w:rStyle w:val="VerbatimChar"/>
+        </w:rPr>
+        <w:t xml:space="preserve">::</w:t>
+      </w:r>
+      <w:r>
+        <w:t xml:space="preserve"> </w:t>
+      </w:r>
+      <w:r>
+        <w:t xml:space="preserve">and</w:t>
+      </w:r>
+      <w:r>
+        <w:t xml:space="preserve"> </w:t>
+      </w:r>
+      <w:r>
+        <w:t xml:space="preserve">the slash form (</w:t>
+      </w:r>
+      <w:r>
+        <w:rPr>
+          <w:rStyle w:val="VerbatimChar"/>
+        </w:rPr>
+        <w:t xml:space="preserve">\BACKGROUND :: x</w:t>
+      </w:r>
+      <w:r>
+        <w:t xml:space="preserve">,</w:t>
+      </w:r>
+      <w:r>
+        <w:t xml:space="preserve"> </w:t>
+      </w:r>
+      <w:r>
+        <w:rPr>
+          <w:rStyle w:val="VerbatimChar"/>
+        </w:rPr>
+        <w:t xml:space="preserve">\/BACKGROUND x</w:t>
+      </w:r>
+      <w:r>
+        <w:t xml:space="preserve"> </w:t>
+      </w:r>
+      <w:r>
+        <w:t xml:space="preserve">— treat literally, strip</w:t>
+      </w:r>
+      <w:r>
+        <w:t xml:space="preserve"> </w:t>
+      </w:r>
+      <w:r>
+        <w:t xml:space="preserve">the backslash, NO expansion) so action names can be discussed.</w:t>
+      </w:r>
+      <w:r>
+        <w:t xml:space="preserve"> </w:t>
+      </w:r>
+      <w:r>
+        <w:rPr>
+          <w:b/>
+          <w:bCs/>
+        </w:rPr>
+        <w:t xml:space="preserve">Conflict rule</w:t>
+      </w:r>
+      <w:r>
+        <w:rPr>
+          <w:b/>
+          <w:bCs/>
+        </w:rPr>
+        <w:t xml:space="preserve"> </w:t>
+      </w:r>
+      <w:r>
+        <w:rPr>
+          <w:b/>
+          <w:bCs/>
+        </w:rPr>
+        <w:t xml:space="preserve">(slash form):</w:t>
+      </w:r>
+      <w:r>
+        <w:t xml:space="preserve"> </w:t>
+      </w:r>
+      <w:r>
+        <w:rPr>
+          <w:rStyle w:val="VerbatimChar"/>
+        </w:rPr>
+        <w:t xml:space="preserve">/ACTION_NAME</w:t>
+      </w:r>
+      <w:r>
+        <w:t xml:space="preserve"> </w:t>
+      </w:r>
+      <w:r>
+        <w:t xml:space="preserve">(form 3) is honored as the action ONLY when</w:t>
+      </w:r>
+      <w:r>
+        <w:t xml:space="preserve"> </w:t>
+      </w:r>
+      <w:r>
+        <w:rPr>
+          <w:rStyle w:val="VerbatimChar"/>
+        </w:rPr>
+        <w:t xml:space="preserve">ACTION_NAME</w:t>
+      </w:r>
+      <w:r>
+        <w:t xml:space="preserve"> </w:t>
+      </w:r>
+      <w:r>
+        <w:t xml:space="preserve">(case-folded) does not collide with a built-in/host slash command</w:t>
+      </w:r>
+      <w:r>
+        <w:t xml:space="preserve"> </w:t>
+      </w:r>
+      <w:r>
+        <w:t xml:space="preserve">(registry</w:t>
+      </w:r>
+      <w:r>
+        <w:t xml:space="preserve"> </w:t>
+      </w:r>
+      <w:r>
+        <w:rPr>
+          <w:rStyle w:val="VerbatimChar"/>
+        </w:rPr>
+        <w:t xml:space="preserve">slash_bare: auto</w:t>
+      </w:r>
+      <w:r>
+        <w:t xml:space="preserve"> </w:t>
+      </w:r>
+      <w:r>
+        <w:t xml:space="preserve">+</w:t>
+      </w:r>
+      <w:r>
+        <w:t xml:space="preserve"> </w:t>
+      </w:r>
+      <w:r>
+        <w:rPr>
+          <w:rStyle w:val="VerbatimChar"/>
+        </w:rPr>
+        <w:t xml:space="preserve">slash_conflicts: [..]</w:t>
+      </w:r>
+      <w:r>
+        <w:t xml:space="preserve">); form 4</w:t>
+      </w:r>
+      <w:r>
+        <w:t xml:space="preserve"> </w:t>
+      </w:r>
+      <w:r>
+        <w:t xml:space="preserve">(</w:t>
+      </w:r>
+      <w:r>
+        <w:rPr>
+          <w:rStyle w:val="VerbatimChar"/>
+        </w:rPr>
+        <w:t xml:space="preserve">/PREFIX::ACTION_NAME</w:t>
+      </w:r>
+      <w:r>
+        <w:t xml:space="preserve">) is ALWAYS unambiguous and always honored. An unknown</w:t>
+      </w:r>
+      <w:r>
+        <w:t xml:space="preserve"> </w:t>
+      </w:r>
+      <w:r>
+        <w:t xml:space="preserve">token that matches the grammar shape (any of the 4 forms) but is NOT registered</w:t>
+      </w:r>
+      <w:r>
+        <w:t xml:space="preserve"> </w:t>
+      </w:r>
+      <w:r>
+        <w:t xml:space="preserve">is NEVER silently expanded or silently dropped — ask which registered action</w:t>
+      </w:r>
+      <w:r>
+        <w:t xml:space="preserve"> </w:t>
+      </w:r>
+      <w:r>
+        <w:t xml:space="preserve">was meant (§11.4.66 / §11.4.105) or treat it as a literal prompt, NEVER invent</w:t>
+      </w:r>
+      <w:r>
+        <w:t xml:space="preserve"> </w:t>
+      </w:r>
+      <w:r>
+        <w:t xml:space="preserve">an expansion (§11.4.6); any prompt not satisfying the grammar is an ordinary</w:t>
+      </w:r>
+      <w:r>
+        <w:t xml:space="preserve"> </w:t>
+      </w:r>
+      <w:r>
+        <w:t xml:space="preserve">prompt and the system is a no-op. The registered action</w:t>
+      </w:r>
+      <w:r>
+        <w:t xml:space="preserve"> </w:t>
+      </w:r>
+      <w:r>
+        <w:rPr>
+          <w:rStyle w:val="VerbatimChar"/>
+          <w:b/>
+          <w:bCs/>
+        </w:rPr>
+        <w:t xml:space="preserve">BACKGROUND</w:t>
+      </w:r>
+      <w:r>
+        <w:t xml:space="preserve"> </w:t>
+      </w:r>
+      <w:r>
+        <w:t xml:space="preserve">expands</w:t>
+      </w:r>
+      <w:r>
+        <w:t xml:space="preserve"> </w:t>
+      </w:r>
+      <w:r>
+        <w:t xml:space="preserve">to:</w:t>
+      </w:r>
+      <w:r>
+        <w:t xml:space="preserve"> </w:t>
+      </w:r>
+      <w:r>
+        <w:rPr>
+          <w:i/>
+          <w:iCs/>
+        </w:rPr>
+        <w:t xml:space="preserve">"The following prompt that we will provide MUST BE executed in background</w:t>
+      </w:r>
+      <w:r>
+        <w:rPr>
+          <w:i/>
+          <w:iCs/>
+        </w:rPr>
+        <w:t xml:space="preserve"> </w:t>
+      </w:r>
+      <w:r>
+        <w:rPr>
+          <w:i/>
+          <w:iCs/>
+        </w:rPr>
+        <w:t xml:space="preserve">in parallel with all main work streams using the subagents-driven development</w:t>
+      </w:r>
+      <w:r>
+        <w:rPr>
+          <w:i/>
+          <w:iCs/>
+        </w:rPr>
+        <w:t xml:space="preserve"> </w:t>
+      </w:r>
+      <w:r>
+        <w:rPr>
+          <w:i/>
+          <w:iCs/>
+        </w:rPr>
+        <w:t xml:space="preserve">approach! All work done MUST PRODUCE rock solid evidence covered with hard</w:t>
+      </w:r>
+      <w:r>
+        <w:rPr>
+          <w:i/>
+          <w:iCs/>
+        </w:rPr>
+        <w:t xml:space="preserve"> </w:t>
+      </w:r>
+      <w:r>
+        <w:rPr>
+          <w:i/>
+          <w:iCs/>
+        </w:rPr>
+        <w:t xml:space="preserve">physical proof(s) that all done is working as expected and as specified without</w:t>
+      </w:r>
+      <w:r>
+        <w:rPr>
+          <w:i/>
+          <w:iCs/>
+        </w:rPr>
+        <w:t xml:space="preserve"> </w:t>
+      </w:r>
+      <w:r>
+        <w:rPr>
+          <w:i/>
+          <w:iCs/>
+        </w:rPr>
+        <w:t xml:space="preserve">any false results and without any bluff!"</w:t>
+      </w:r>
+      <w:r>
+        <w:t xml:space="preserve"> </w:t>
+      </w:r>
+      <w:r>
+        <w:t xml:space="preserve">(composes §11.4.20 / §11.4.70</w:t>
+      </w:r>
+      <w:r>
+        <w:t xml:space="preserve"> </w:t>
+      </w:r>
+      <w:r>
+        <w:t xml:space="preserve">subagent-driven, §11.4.58 / §11.4.103 parallel streams, §11.4.89 background</w:t>
+      </w:r>
+      <w:r>
+        <w:t xml:space="preserve"> </w:t>
+      </w:r>
+      <w:r>
+        <w:t xml:space="preserve">execution, §11.4.5 / §11.4.69 / §11.4.107 captured physical evidence, §11.4</w:t>
+      </w:r>
+      <w:r>
+        <w:t xml:space="preserve"> </w:t>
+      </w:r>
+      <w:r>
+        <w:t xml:space="preserve">anti-bluff). The system is UNIVERSAL (every CLI agent reads this block via its</w:t>
+      </w:r>
+      <w:r>
+        <w:t xml:space="preserve"> </w:t>
+      </w:r>
+      <w:r>
+        <w:t xml:space="preserve">context carrier per §11.4.35), extensible (new action = new registry row),</w:t>
+      </w:r>
+      <w:r>
+        <w:t xml:space="preserve"> </w:t>
+      </w:r>
+      <w:r>
+        <w:t xml:space="preserve">decoupled + reusable (§11.4.28), and loads out-of-the-box. Classification:</w:t>
+      </w:r>
+      <w:r>
+        <w:t xml:space="preserve"> </w:t>
+      </w:r>
+      <w:r>
+        <w:t xml:space="preserve">universal (§11.4.17).</w:t>
+      </w:r>
+      <w:r>
+        <w:t xml:space="preserve"> </w:t>
+      </w:r>
+      <w:r>
+        <w:rPr>
+          <w:b/>
+          <w:bCs/>
+        </w:rPr>
+        <w:t xml:space="preserve">Canonical authority:</w:t>
+      </w:r>
+      <w:r>
+        <w:t xml:space="preserve"> </w:t>
+      </w:r>
+      <w:r>
+        <w:t xml:space="preserve">constitution submodule</w:t>
+      </w:r>
+      <w:r>
+        <w:t xml:space="preserve"> </w:t>
+      </w:r>
+      <w:hyperlink r:id="rId70">
+        <w:r>
+          <w:rPr>
+            <w:rStyle w:val="VerbatimChar"/>
+          </w:rPr>
+          <w:t xml:space="preserve">Constitution.md</w:t>
+        </w:r>
+      </w:hyperlink>
+      <w:r>
+        <w:t xml:space="preserve"> </w:t>
+      </w:r>
+      <w:r>
+        <w:t xml:space="preserve">§11.4.140. Non-compliance is a release</w:t>
+      </w:r>
+      <w:r>
+        <w:t xml:space="preserve"> </w:t>
+      </w:r>
+      <w:r>
+        <w:t xml:space="preserve">blocker. No escape hatch — no</w:t>
+      </w:r>
+      <w:r>
+        <w:t xml:space="preserve"> </w:t>
+      </w:r>
+      <w:r>
+        <w:rPr>
+          <w:rStyle w:val="VerbatimChar"/>
+        </w:rPr>
+        <w:t xml:space="preserve">--skip-action-prefix</w:t>
+      </w:r>
+      <w:r>
+        <w:t xml:space="preserve">,</w:t>
+      </w:r>
+      <w:r>
+        <w:t xml:space="preserve"> </w:t>
+      </w:r>
+      <w:r>
+        <w:rPr>
+          <w:rStyle w:val="VerbatimChar"/>
+        </w:rPr>
+        <w:t xml:space="preserve">--ignore-prefix</w:t>
+      </w:r>
+      <w:r>
+        <w:t xml:space="preserve">,</w:t>
+      </w:r>
+      <w:r>
+        <w:t xml:space="preserve"> </w:t>
+      </w:r>
+      <w:r>
+        <w:rPr>
+          <w:rStyle w:val="VerbatimChar"/>
+        </w:rPr>
+        <w:t xml:space="preserve">--no-registry</w:t>
+      </w:r>
+      <w:r>
+        <w:t xml:space="preserve">,</w:t>
+      </w:r>
+      <w:r>
+        <w:t xml:space="preserve"> </w:t>
+      </w:r>
+      <w:r>
+        <w:rPr>
+          <w:rStyle w:val="VerbatimChar"/>
+        </w:rPr>
+        <w:t xml:space="preserve">--invent-expansion-OK</w:t>
+      </w:r>
+      <w:r>
+        <w:t xml:space="preserve">,</w:t>
+      </w:r>
+      <w:r>
+        <w:t xml:space="preserve"> </w:t>
+      </w:r>
+      <w:r>
+        <w:rPr>
+          <w:rStyle w:val="VerbatimChar"/>
+        </w:rPr>
+        <w:t xml:space="preserve">--single-layer-only</w:t>
+      </w:r>
+      <w:r>
+        <w:t xml:space="preserve"> </w:t>
+      </w:r>
+      <w:r>
+        <w:t xml:space="preserve">flag.</w:t>
+      </w:r>
+    </w:p>
+    <w:p>
+      <w:pPr>
+        <w:pStyle w:val="FirstParagraph"/>
+      </w:pPr>
+      <w:r>
+        <w:rPr>
+          <w:b/>
+          <w:bCs/>
+        </w:rPr>
+        <w:t xml:space="preserve">§11.4.141 — Token-efficiency mandate (research-derived + operator mandate, 2026-06-09).</w:t>
+      </w:r>
+      <w:r>
+        <w:t xml:space="preserve"> </w:t>
+      </w:r>
+      <w:r>
+        <w:t xml:space="preserve">Every project worked on by AI coding agents MUST cut token spend (input AND output) toward</w:t>
+      </w:r>
+      <w:r>
+        <w:t xml:space="preserve"> </w:t>
+      </w:r>
+      <w:r>
+        <w:rPr>
+          <w:b/>
+          <w:bCs/>
+        </w:rPr>
+        <w:t xml:space="preserve">30–40% of current (a 60–70% reduction)</w:t>
+      </w:r>
+      <w:r>
+        <w:t xml:space="preserve"> </w:t>
+      </w:r>
+      <w:r>
+        <w:t xml:space="preserve">WITHOUT degrading quality/performance/safety or breaking any existing mechanism, via a composable, safety-ranked measure set: (1)</w:t>
+      </w:r>
+      <w:r>
+        <w:t xml:space="preserve"> </w:t>
+      </w:r>
+      <w:r>
+        <w:rPr>
+          <w:b/>
+          <w:bCs/>
+        </w:rPr>
+        <w:t xml:space="preserve">prompt-cache the static governance prefix</w:t>
+      </w:r>
+      <w:r>
+        <w:t xml:space="preserve"> </w:t>
+      </w:r>
+      <w:r>
+        <w:t xml:space="preserve">— the always-loaded governance forms a byte-stable cache-breakpointed prefix with no volatile bytes ahead of it; cache reads cost ~0.1× base input (the dominant cost driver — measured ~170K tokens of governance re-sent every turn, externally corroborated by Claude Code issue #24147); caching is transparent so it removes no rule, weakens no gate, changes no verdict — only billing (PRIMARY, biggest + safest lever); (2)</w:t>
+      </w:r>
+      <w:r>
+        <w:t xml:space="preserve"> </w:t>
+      </w:r>
+      <w:r>
+        <w:rPr>
+          <w:b/>
+          <w:bCs/>
+        </w:rPr>
+        <w:t xml:space="preserve">subagent model-tiering + output-to-file</w:t>
+      </w:r>
+      <w:r>
+        <w:t xml:space="preserve"> </w:t>
+      </w:r>
+      <w:r>
+        <w:t xml:space="preserve">— mechanical non-judgment work (search/grep/status/doc-export/read-only probes) to a Haiku-class model, the strong model RESERVED for all reasoning/verdicts/fix-design (§11.4.102)/code-review (§11.4.125)/demotion (§11.4.7), large output persisted to a file not an inline 350–520K-token transcript; the cheap model never emits a PASS so §11.4.50 + anti-bluff are untouched; (3)</w:t>
+      </w:r>
+      <w:r>
+        <w:t xml:space="preserve"> </w:t>
+      </w:r>
+      <w:r>
+        <w:rPr>
+          <w:b/>
+          <w:bCs/>
+        </w:rPr>
+        <w:t xml:space="preserve">thin always-loaded INDEX + on-demand detail</w:t>
+      </w:r>
+      <w:r>
+        <w:t xml:space="preserve"> </w:t>
+      </w:r>
+      <w:r>
+        <w:t xml:space="preserve">— concise index (one line per fix/anchor, EACH carrying the literal</w:t>
+      </w:r>
+      <w:r>
+        <w:t xml:space="preserve"> </w:t>
+      </w:r>
+      <w:r>
+        <w:rPr>
+          <w:rStyle w:val="VerbatimChar"/>
+        </w:rPr>
+        <w:t xml:space="preserve">11.4.N</w:t>
+      </w:r>
+      <w:r>
+        <w:t xml:space="preserve"> </w:t>
+      </w:r>
+      <w:r>
+        <w:t xml:space="preserve">token so propagation gates pass) with the canonical full text kept gate-scanned in</w:t>
+      </w:r>
+      <w:r>
+        <w:t xml:space="preserve"> </w:t>
+      </w:r>
+      <w:r>
+        <w:rPr>
+          <w:rStyle w:val="VerbatimChar"/>
+        </w:rPr>
+        <w:t xml:space="preserve">constitution/Constitution.md</w:t>
+      </w:r>
+      <w:r>
+        <w:t xml:space="preserve"> </w:t>
+      </w:r>
+      <w:r>
+        <w:t xml:space="preserve">and reachable in one hop — a de-duplication realising §11.4.35, never a deletion; (4)</w:t>
+      </w:r>
+      <w:r>
+        <w:t xml:space="preserve"> </w:t>
+      </w:r>
+      <w:r>
+        <w:rPr>
+          <w:b/>
+          <w:bCs/>
+        </w:rPr>
+        <w:t xml:space="preserve">CodeGraph/retrieval-first over full-file loading</w:t>
+      </w:r>
+      <w:r>
+        <w:t xml:space="preserve"> </w:t>
+      </w:r>
+      <w:r>
+        <w:t xml:space="preserve">(§11.4.78/§11.4.79); (5)</w:t>
+      </w:r>
+      <w:r>
+        <w:t xml:space="preserve"> </w:t>
+      </w:r>
+      <w:r>
+        <w:rPr>
+          <w:b/>
+          <w:bCs/>
+        </w:rPr>
+        <w:t xml:space="preserve">output-token reduction</w:t>
+      </w:r>
+      <w:r>
+        <w:t xml:space="preserve"> </w:t>
+      </w:r>
+      <w:r>
+        <w:t xml:space="preserve">— terse status +</w:t>
+      </w:r>
+      <w:r>
+        <w:t xml:space="preserve"> </w:t>
+      </w:r>
+      <w:r>
+        <w:rPr>
+          <w:rStyle w:val="VerbatimChar"/>
+        </w:rPr>
+        <w:t xml:space="preserve">effort:"low"</w:t>
+      </w:r>
+      <w:r>
+        <w:t xml:space="preserve"> </w:t>
+      </w:r>
+      <w:r>
+        <w:t xml:space="preserve">on the mechanical allowlist only; (6)</w:t>
+      </w:r>
+      <w:r>
+        <w:t xml:space="preserve"> </w:t>
+      </w:r>
+      <w:r>
+        <w:rPr>
+          <w:b/>
+          <w:bCs/>
+        </w:rPr>
+        <w:t xml:space="preserve">tool-call batching + no re-reads</w:t>
+      </w:r>
+      <w:r>
+        <w:t xml:space="preserve">; (7)</w:t>
+      </w:r>
+      <w:r>
+        <w:t xml:space="preserve"> </w:t>
+      </w:r>
+      <w:r>
+        <w:rPr>
+          <w:b/>
+          <w:bCs/>
+        </w:rPr>
+        <w:t xml:space="preserve">compaction/context-editing for long sessions</w:t>
+      </w:r>
+      <w:r>
+        <w:t xml:space="preserve">.</w:t>
+      </w:r>
+      <w:r>
+        <w:t xml:space="preserve"> </w:t>
+      </w:r>
+      <w:r>
+        <w:rPr>
+          <w:b/>
+          <w:bCs/>
+        </w:rPr>
+        <w:t xml:space="preserve">Mandatory measured proof:</w:t>
+      </w:r>
+      <w:r>
+        <w:t xml:space="preserve"> </w:t>
+      </w:r>
+      <w:r>
+        <w:t xml:space="preserve">a token-accounting harness measures tokens-per-development-cycle BEFORE vs AFTER on a frozen deterministic workload from the authoritative</w:t>
+      </w:r>
+      <w:r>
+        <w:t xml:space="preserve"> </w:t>
+      </w:r>
+      <w:r>
+        <w:rPr>
+          <w:rStyle w:val="VerbatimChar"/>
+        </w:rPr>
+        <w:t xml:space="preserve">usage</w:t>
+      </w:r>
+      <w:r>
+        <w:t xml:space="preserve"> </w:t>
+      </w:r>
+      <w:r>
+        <w:t xml:space="preserve">object (input/cache_read/cache_creation/output split; NEVER</w:t>
+      </w:r>
+      <w:r>
+        <w:t xml:space="preserve"> </w:t>
+      </w:r>
+      <w:r>
+        <w:rPr>
+          <w:rStyle w:val="VerbatimChar"/>
+        </w:rPr>
+        <w:t xml:space="preserve">tiktoken</w:t>
+      </w:r>
+      <w:r>
+        <w:t xml:space="preserve">, NEVER the client-side cost estimate), reproduced N times (§11.4.50), pass = AFTER ≤ 40% of BEFORE OR the measured best-safe reduction with a cited cold-cache reason; the AFTER run MUST show ZERO regression on the pre-build sweep + meta-test mutation sweep + propagation gates + a strong-model reasoning probe + a cache-warm proof (</w:t>
+      </w:r>
+      <w:r>
+        <w:rPr>
+          <w:rStyle w:val="VerbatimChar"/>
+        </w:rPr>
+        <w:t xml:space="preserve">cache_read_input_tokens &gt; 0</w:t>
+      </w:r>
+      <w:r>
+        <w:t xml:space="preserve">) — cost reduction with quality regression is a §11.4 FAIL. The headline number is the</w:t>
+      </w:r>
+      <w:r>
+        <w:t xml:space="preserve"> </w:t>
+      </w:r>
+      <w:r>
+        <w:rPr>
+          <w:i/>
+          <w:iCs/>
+        </w:rPr>
+        <w:t xml:space="preserve">measured</w:t>
+      </w:r>
+      <w:r>
+        <w:t xml:space="preserve"> </w:t>
+      </w:r>
+      <w:r>
+        <w:t xml:space="preserve">reduction, never the design estimate (§11.4.6/§11.4.123). No measure may break/degrade any existing mechanism, and the rule is structured so none can. Composes §11.4.5/.6/.20/.40/.50/.58/.69/.70/.78/.79/.80/.103/.106/.123/.125/.128/§12.6/§1.1. Classification: universal (§11.4.17). Propagation gate</w:t>
+      </w:r>
+      <w:r>
+        <w:t xml:space="preserve"> </w:t>
+      </w:r>
+      <w:r>
+        <w:rPr>
+          <w:rStyle w:val="VerbatimChar"/>
+        </w:rPr>
+        <w:t xml:space="preserve">CM-COVENANT-114-141-PROPAGATION</w:t>
+      </w:r>
+      <w:r>
+        <w:t xml:space="preserve"> </w:t>
+      </w:r>
+      <w:r>
+        <w:t xml:space="preserve">(literal</w:t>
+      </w:r>
+      <w:r>
+        <w:t xml:space="preserve"> </w:t>
+      </w:r>
+      <w:r>
+        <w:rPr>
+          <w:rStyle w:val="VerbatimChar"/>
+        </w:rPr>
+        <w:t xml:space="preserve">11.4.141</w:t>
+      </w:r>
+      <w:r>
+        <w:t xml:space="preserve">) + recommended gate</w:t>
+      </w:r>
+      <w:r>
+        <w:t xml:space="preserve"> </w:t>
+      </w:r>
+      <w:r>
+        <w:rPr>
+          <w:rStyle w:val="VerbatimChar"/>
+        </w:rPr>
+        <w:t xml:space="preserve">CM-TOKEN-EFFICIENCY</w:t>
+      </w:r>
+      <w:r>
+        <w:t xml:space="preserve"> </w:t>
+      </w:r>
+      <w:r>
+        <w:t xml:space="preserve">+ paired §1.1 mutation (inject a pre-breakpoint volatile token → cache collapses → measured reduction falls below bar → gate FAILs).</w:t>
+      </w:r>
+      <w:r>
+        <w:t xml:space="preserve"> </w:t>
+      </w:r>
+      <w:r>
+        <w:rPr>
+          <w:b/>
+          <w:bCs/>
+        </w:rPr>
+        <w:t xml:space="preserve">Canonical authority:</w:t>
+      </w:r>
+      <w:r>
+        <w:t xml:space="preserve"> </w:t>
+      </w:r>
+      <w:r>
+        <w:t xml:space="preserve">constitution submodule</w:t>
+      </w:r>
+      <w:r>
+        <w:t xml:space="preserve"> </w:t>
+      </w:r>
+      <w:hyperlink r:id="rId68">
+        <w:r>
+          <w:rPr>
+            <w:rStyle w:val="VerbatimChar"/>
+          </w:rPr>
+          <w:t xml:space="preserve">Constitution.md</w:t>
+        </w:r>
+      </w:hyperlink>
+      <w:r>
+        <w:t xml:space="preserve"> </w:t>
+      </w:r>
+      <w:r>
+        <w:t xml:space="preserve">§11.4.141.</w:t>
+      </w:r>
+      <w:r>
+        <w:t xml:space="preserve"> </w:t>
+      </w:r>
+      <w:r>
+        <w:rPr>
+          <w:b/>
+          <w:bCs/>
+        </w:rPr>
+        <w:t xml:space="preserve">Project instantiation (§11.4.35):</w:t>
+      </w:r>
+      <w:r>
+        <w:t xml:space="preserve"> </w:t>
+      </w:r>
+      <w:r>
+        <w:t xml:space="preserve">[ATMOSphere consumer fills in: confirm the Claude Code governance-prefix cache is warm + free of pre-breakpoint volatiles; tier the §11.4.96-SAFE mechanical subagents (search/grep/status/doc-export) to Haiku with output-to-file under</w:t>
+      </w:r>
+      <w:r>
+        <w:t xml:space="preserve"> </w:t>
+      </w:r>
+      <w:r>
+        <w:rPr>
+          <w:rStyle w:val="VerbatimChar"/>
+        </w:rPr>
+        <w:t xml:space="preserve">qa-results/</w:t>
+      </w:r>
+      <w:r>
+        <w:t xml:space="preserve">; replace the consumer</w:t>
+      </w:r>
+      <w:r>
+        <w:t xml:space="preserve"> </w:t>
+      </w:r>
+      <w:r>
+        <w:rPr>
+          <w:rStyle w:val="VerbatimChar"/>
+        </w:rPr>
+        <w:t xml:space="preserve">CLAUDE.md</w:t>
+      </w:r>
+      <w:r>
+        <w:t xml:space="preserve"> </w:t>
+      </w:r>
+      <w:r>
+        <w:t xml:space="preserve">112-row Applied-Fixes inline table + verbatim anchor restatements with a literal-anchor index pointing at</w:t>
+      </w:r>
+      <w:r>
+        <w:t xml:space="preserve"> </w:t>
+      </w:r>
+      <w:r>
+        <w:rPr>
+          <w:rStyle w:val="VerbatimChar"/>
+        </w:rPr>
+        <w:t xml:space="preserve">constitution/Constitution.md</w:t>
+      </w:r>
+      <w:r>
+        <w:t xml:space="preserve">; keep CodeGraph/lumen-first navigation; run the harness BEFORE/AFTER to prove the measured reduction.] Non-compliance is a release blocker. No escape hatch — no</w:t>
+      </w:r>
+      <w:r>
+        <w:t xml:space="preserve"> </w:t>
+      </w:r>
+      <w:r>
+        <w:rPr>
+          <w:rStyle w:val="VerbatimChar"/>
+        </w:rPr>
+        <w:t xml:space="preserve">--skip-token-efficiency</w:t>
+      </w:r>
+      <w:r>
+        <w:t xml:space="preserve">,</w:t>
+      </w:r>
+      <w:r>
+        <w:t xml:space="preserve"> </w:t>
+      </w:r>
+      <w:r>
+        <w:rPr>
+          <w:rStyle w:val="VerbatimChar"/>
+        </w:rPr>
+        <w:t xml:space="preserve">--no-cache-governance</w:t>
+      </w:r>
+      <w:r>
+        <w:t xml:space="preserve">,</w:t>
+      </w:r>
+      <w:r>
+        <w:t xml:space="preserve"> </w:t>
+      </w:r>
+      <w:r>
+        <w:rPr>
+          <w:rStyle w:val="VerbatimChar"/>
+        </w:rPr>
+        <w:t xml:space="preserve">--assert-reduction-without-measuring</w:t>
+      </w:r>
+      <w:r>
+        <w:t xml:space="preserve">,</w:t>
+      </w:r>
+      <w:r>
+        <w:t xml:space="preserve"> </w:t>
+      </w:r>
+      <w:r>
+        <w:rPr>
+          <w:rStyle w:val="VerbatimChar"/>
+        </w:rPr>
+        <w:t xml:space="preserve">--tier-down-reasoning</w:t>
+      </w:r>
+      <w:r>
+        <w:t xml:space="preserve">,</w:t>
+      </w:r>
+      <w:r>
+        <w:t xml:space="preserve"> </w:t>
+      </w:r>
+      <w:r>
+        <w:rPr>
+          <w:rStyle w:val="VerbatimChar"/>
+        </w:rPr>
+        <w:t xml:space="preserve">--inline-all-governance</w:t>
+      </w:r>
+      <w:r>
+        <w:t xml:space="preserve">,</w:t>
+      </w:r>
+      <w:r>
+        <w:t xml:space="preserve"> </w:t>
+      </w:r>
+      <w:r>
+        <w:rPr>
+          <w:rStyle w:val="VerbatimChar"/>
+        </w:rPr>
+        <w:t xml:space="preserve">--tiktoken-estimate-OK</w:t>
+      </w:r>
+      <w:r>
+        <w:t xml:space="preserve"> </w:t>
+      </w:r>
+      <w:r>
+        <w:t xml:space="preserve">flag.</w:t>
+      </w:r>
+    </w:p>
+    <w:p>
+      <w:pPr>
+        <w:pStyle w:val="BodyText"/>
+      </w:pPr>
+      <w:r>
+        <w:rPr>
+          <w:b/>
+          <w:bCs/>
+        </w:rPr>
+        <w:t xml:space="preserve">§11.4.142 — Universal code-review mandate — every change reviewed, always, no exception (User mandate, 2026-06-09).</w:t>
+      </w:r>
+      <w:r>
+        <w:t xml:space="preserve"> </w:t>
+      </w:r>
+      <w:r>
+        <w:t xml:space="preserve">Verbatim operator mandate: "ALL changes we do MUST pass through the code review step!!! ALWAYS!!!" EVERY change made to ANY repository this Constitution governs — without exception — MUST pass through an INDEPENDENT code-review step BEFORE it is accepted, committed, or built. NO change class is exempt: source code, fixes, tests, gates, meta-test mutations, documentation, doc-tooling, build/CI scripts, configuration, governance files (Constitution / CLAUDE / AGENTS / QWEN), conductor main-stream edits, sub-agent output, refactors, single-line edits — if a diff exists, it gets an independent review. This is the ABSOLUTE form of §11.4.125 (code-review agent gate after a batch, before pre-build sweep + main build): §11.4.142 strips every implicit scoping §11.4.125's "after all fixes/changes/implementations are done" phrasing could leave open — no "just a doc edit", no "just a one-liner", no "the author already self-reviewed (§11.4.92)", no "trivial change" carve-out.</w:t>
+      </w:r>
+      <w:r>
+        <w:t xml:space="preserve"> </w:t>
+      </w:r>
+      <w:r>
+        <w:rPr>
+          <w:b/>
+          <w:bCs/>
+        </w:rPr>
+        <w:t xml:space="preserve">Independence is load-bearing</w:t>
+      </w:r>
+      <w:r>
+        <w:t xml:space="preserve"> </w:t>
+      </w:r>
+      <w:r>
+        <w:t xml:space="preserve">— the reviewer MUST be structurally separated from the author (a dedicated code-review agent, subagent-driven by default per §11.4.70 / §11.4.20, or a distinct human), NEVER the author re-reading their own work; §11.4.92's multi-pass self-evaluation is the AUTHOR-side discipline and PRECEDES (never satisfies) §11.4.142.</w:t>
+      </w:r>
+      <w:r>
+        <w:t xml:space="preserve"> </w:t>
+      </w:r>
+      <w:r>
+        <w:rPr>
+          <w:b/>
+          <w:bCs/>
+        </w:rPr>
+        <w:t xml:space="preserve">The review is itself anti-bluff</w:t>
+      </w:r>
+      <w:r>
+        <w:t xml:space="preserve"> </w:t>
+      </w:r>
+      <w:r>
+        <w:t xml:space="preserve">(§11.4 / §11.4.1) — a rubber-stamp "looks good" is not a review; it MUST genuinely analyse correctness, safety (no host §12 / data §9 / target-hardware §11.4.133 regression), will-it-really-work (no solve-A-create-B), end-user behaviour (§11.4 / §107), and test-genuineness (§1.1), its conclusions captured evidence per §11.4.5 / §11.4.69, and</w:t>
+      </w:r>
+      <w:r>
+        <w:t xml:space="preserve"> </w:t>
+      </w:r>
+      <w:r>
+        <w:rPr>
+          <w:b/>
+          <w:bCs/>
+        </w:rPr>
+        <w:t xml:space="preserve">it iterates to a clean GO per §11.4.134</w:t>
+      </w:r>
+      <w:r>
+        <w:t xml:space="preserve"> </w:t>
+      </w:r>
+      <w:r>
+        <w:t xml:space="preserve">— any finding (BLOCKING / nit / warning) re-arms the loop, acceptance only on ZERO new findings + ZERO warnings with rock-solid physical evidence. Honest boundary (§11.4.6): a passing review does NOT replace §11.4.108 four-layer runtime-signature verification nor the §11.4.40 full-suite retest — it is one of MULTIPLE STRONG LAYERS, and the FIRST one every change crosses. Composes §11.4.1 / §11.4.4 / §11.4.5 / §11.4.6 / §11.4.20 / §11.4.40 / §11.4.69 / §11.4.70 / §11.4.92 / §11.4.108 / §11.4.110 / §11.4.125 / §11.4.134 / §107 / §1.1. Classification: universal (§11.4.17) — the consuming project supplies its reviewer-dispatch mechanism + change-acceptance seam (commit wrapper / merge queue / PR gate) per §11.4.35. Propagation gate</w:t>
+      </w:r>
+      <w:r>
+        <w:t xml:space="preserve"> </w:t>
+      </w:r>
+      <w:r>
+        <w:rPr>
+          <w:rStyle w:val="VerbatimChar"/>
+        </w:rPr>
+        <w:t xml:space="preserve">CM-COVENANT-114-142-PROPAGATION</w:t>
+      </w:r>
+      <w:r>
+        <w:t xml:space="preserve"> </w:t>
+      </w:r>
+      <w:r>
+        <w:t xml:space="preserve">(literal</w:t>
+      </w:r>
+      <w:r>
+        <w:t xml:space="preserve"> </w:t>
+      </w:r>
+      <w:r>
+        <w:rPr>
+          <w:rStyle w:val="VerbatimChar"/>
+        </w:rPr>
+        <w:t xml:space="preserve">11.4.142</w:t>
+      </w:r>
+      <w:r>
+        <w:t xml:space="preserve">) + recommended gate</w:t>
+      </w:r>
+      <w:r>
+        <w:t xml:space="preserve"> </w:t>
+      </w:r>
+      <w:r>
+        <w:rPr>
+          <w:rStyle w:val="VerbatimChar"/>
+        </w:rPr>
+        <w:t xml:space="preserve">CM-EVERY-CHANGE-REVIEWED</w:t>
+      </w:r>
+      <w:r>
+        <w:t xml:space="preserve"> </w:t>
+      </w:r>
+      <w:r>
+        <w:t xml:space="preserve">(every accepted change carries a fresh independent-review-completed marker for its diff, produced by a reviewer distinct from the author, before acceptance/commit/build) + paired §1.1 mutation (strip the literal → propagation gate FAILs; accept a diff with no independent-review marker →</w:t>
+      </w:r>
+      <w:r>
+        <w:t xml:space="preserve"> </w:t>
+      </w:r>
+      <w:r>
+        <w:rPr>
+          <w:rStyle w:val="VerbatimChar"/>
+        </w:rPr>
+        <w:t xml:space="preserve">CM-EVERY-CHANGE-REVIEWED</w:t>
+      </w:r>
+      <w:r>
+        <w:t xml:space="preserve"> </w:t>
+      </w:r>
+      <w:r>
+        <w:t xml:space="preserve">FAILs).</w:t>
+      </w:r>
+      <w:r>
+        <w:t xml:space="preserve"> </w:t>
+      </w:r>
+      <w:r>
+        <w:rPr>
+          <w:b/>
+          <w:bCs/>
+        </w:rPr>
+        <w:t xml:space="preserve">Canonical authority:</w:t>
+      </w:r>
+      <w:r>
+        <w:t xml:space="preserve"> </w:t>
+      </w:r>
+      <w:r>
+        <w:t xml:space="preserve">constitution submodule</w:t>
+      </w:r>
+      <w:r>
+        <w:t xml:space="preserve"> </w:t>
+      </w:r>
+      <w:hyperlink r:id="rId68">
+        <w:r>
+          <w:rPr>
+            <w:rStyle w:val="VerbatimChar"/>
+          </w:rPr>
+          <w:t xml:space="preserve">Constitution.md</w:t>
+        </w:r>
+      </w:hyperlink>
+      <w:r>
+        <w:t xml:space="preserve"> </w:t>
+      </w:r>
+      <w:r>
+        <w:t xml:space="preserve">§11.4.142. Non-compliance is a release blocker. No escape hatch — no</w:t>
+      </w:r>
+      <w:r>
+        <w:t xml:space="preserve"> </w:t>
+      </w:r>
+      <w:r>
+        <w:rPr>
+          <w:rStyle w:val="VerbatimChar"/>
+        </w:rPr>
+        <w:t xml:space="preserve">--skip-review</w:t>
+      </w:r>
+      <w:r>
+        <w:t xml:space="preserve">,</w:t>
+      </w:r>
+      <w:r>
+        <w:t xml:space="preserve"> </w:t>
+      </w:r>
+      <w:r>
+        <w:rPr>
+          <w:rStyle w:val="VerbatimChar"/>
+        </w:rPr>
+        <w:t xml:space="preserve">--no-review</w:t>
+      </w:r>
+      <w:r>
+        <w:t xml:space="preserve">,</w:t>
+      </w:r>
+      <w:r>
+        <w:t xml:space="preserve"> </w:t>
+      </w:r>
+      <w:r>
+        <w:rPr>
+          <w:rStyle w:val="VerbatimChar"/>
+        </w:rPr>
+        <w:t xml:space="preserve">--trivial-change-exempt</w:t>
+      </w:r>
+      <w:r>
+        <w:t xml:space="preserve">,</w:t>
+      </w:r>
+      <w:r>
+        <w:t xml:space="preserve"> </w:t>
+      </w:r>
+      <w:r>
+        <w:rPr>
+          <w:rStyle w:val="VerbatimChar"/>
+        </w:rPr>
+        <w:t xml:space="preserve">--doc-edit-exempt</w:t>
+      </w:r>
+      <w:r>
+        <w:t xml:space="preserve">,</w:t>
+      </w:r>
+      <w:r>
+        <w:t xml:space="preserve"> </w:t>
+      </w:r>
+      <w:r>
+        <w:rPr>
+          <w:rStyle w:val="VerbatimChar"/>
+        </w:rPr>
+        <w:t xml:space="preserve">--self-review-suffices</w:t>
+      </w:r>
+      <w:r>
+        <w:t xml:space="preserve">,</w:t>
+      </w:r>
+      <w:r>
+        <w:t xml:space="preserve"> </w:t>
+      </w:r>
+      <w:r>
+        <w:rPr>
+          <w:rStyle w:val="VerbatimChar"/>
+        </w:rPr>
+        <w:t xml:space="preserve">--review-after-commit</w:t>
+      </w:r>
+      <w:r>
+        <w:t xml:space="preserve"> </w:t>
+      </w:r>
+      <w:r>
+        <w:t xml:space="preserve">flag.</w:t>
+      </w:r>
+    </w:p>
+    <w:bookmarkEnd w:id="115"/>
+    <w:bookmarkEnd w:id="116"/>
+    <w:bookmarkEnd w:id="117"/>
     <w:sectPr>
       <w:footnotePr>
         <w:numRestart w:val="eachSect"/>

</xml_diff>

<commit_message>
feat(§11.4.155): project-name-prefixed feature/QA recording filenames (User mandate 2026-06-15)
Classification: universal (§11.4.17). Composes §11.4.151/§11.4.128/§11.4.153/§11.4.154/§11.4.83/§11.4.111.

Co-Authored-By: Claude Opus 4.8 <noreply@anthropic.com>
</commit_message>
<xml_diff>
--- a/AGENTS.docx
+++ b/AGENTS.docx
@@ -39869,6 +39869,550 @@
           <w:rStyle w:val="VerbatimChar"/>
         </w:rPr>
         <w:t xml:space="preserve">--allow-feature-ledger-drift</w:t>
+      </w:r>
+      <w:r>
+        <w:t xml:space="preserve"> </w:t>
+      </w:r>
+      <w:r>
+        <w:t xml:space="preserve">flag.</w:t>
+      </w:r>
+    </w:p>
+    <w:p>
+      <w:pPr>
+        <w:pStyle w:val="BodyText"/>
+      </w:pPr>
+      <w:r>
+        <w:rPr>
+          <w:b/>
+          <w:bCs/>
+        </w:rPr>
+        <w:t xml:space="preserve">§11.4.154 — Window-scoped capture + fresh-corpus rotation for feature/QA recordings (User mandate, 2026-06-15).</w:t>
+      </w:r>
+      <w:r>
+        <w:t xml:space="preserve"> </w:t>
+      </w:r>
+      <w:r>
+        <w:t xml:space="preserve">Verbatim:</w:t>
+      </w:r>
+      <w:r>
+        <w:t xml:space="preserve"> </w:t>
+      </w:r>
+      <w:r>
+        <w:t xml:space="preserve">“recording you perform does record the window containing apps and services, not the whole desktop or monitor screen!”</w:t>
+      </w:r>
+      <w:r>
+        <w:t xml:space="preserve"> </w:t>
+      </w:r>
+      <w:r>
+        <w:t xml:space="preserve">+</w:t>
+      </w:r>
+      <w:r>
+        <w:t xml:space="preserve"> </w:t>
+      </w:r>
+      <w:r>
+        <w:t xml:space="preserve">“All old recording files MUST BE removed when new one starts!”</w:t>
+      </w:r>
+      <w:r>
+        <w:t xml:space="preserve"> </w:t>
+      </w:r>
+      <w:r>
+        <w:t xml:space="preserve">Refines §11.4.2/.5/.107/.153 recording discipline with two capture-hygiene invariants.</w:t>
+      </w:r>
+      <w:r>
+        <w:t xml:space="preserve"> </w:t>
+      </w:r>
+      <w:r>
+        <w:rPr>
+          <w:b/>
+          <w:bCs/>
+        </w:rPr>
+        <w:t xml:space="preserve">(A) Window-scoped, NOT whole-screen</w:t>
+      </w:r>
+      <w:r>
+        <w:t xml:space="preserve"> </w:t>
+      </w:r>
+      <w:r>
+        <w:t xml:space="preserve">— every feature/QA video MUST capture ONLY the window/surface of the app/service under test (GUI window / CLI-TUI terminal pane / web tab-viewport / device-emulator-simulator frame), NEVER the whole desktop/monitor or unrelated windows; whole-desktop capture leaks operator-private content (§11.4.10/.83), dilutes the §11.4.107 liveness/freeze oracle, and breaks the §11.4.137 OCR/ROI content oracle. Target the window/region by stable identity (window id/title, device serial, browser context, tmux target) per §11.4.111 — never a fixed full-screen device index. Platform genuinely cannot capture below whole-screen ⇒ honest §11.4.3 SKIP + tracked migration item, never a whole-screen pass-off.</w:t>
+      </w:r>
+      <w:r>
+        <w:t xml:space="preserve"> </w:t>
+      </w:r>
+      <w:r>
+        <w:rPr>
+          <w:b/>
+          <w:bCs/>
+        </w:rPr>
+        <w:t xml:space="preserve">(B) Fresh-corpus rotation</w:t>
+      </w:r>
+      <w:r>
+        <w:t xml:space="preserve"> </w:t>
+      </w:r>
+      <w:r>
+        <w:t xml:space="preserve">— when a new recording run for a scope begins, the agent’s OWN prior in-scope stale recordings at the raw recording path MUST be removed FIRST so the live corpus reflects the current run (§11.4.107 not-stale + §11.4.86 roster-freshness). Honest boundary (§11.4.6 + §9.2):</w:t>
+      </w:r>
+      <w:r>
+        <w:t xml:space="preserve"> </w:t>
+      </w:r>
+      <w:r>
+        <w:t xml:space="preserve">“remove old”</w:t>
+      </w:r>
+      <w:r>
+        <w:t xml:space="preserve"> </w:t>
+      </w:r>
+      <w:r>
+        <w:t xml:space="preserve">= the agent’s own prior recordings for the SAME scope/project ONLY — NEVER another project’s/scope’s/operator-authored files; uncertain ⇒ surface, don’t delete (§11.4.122); committed</w:t>
+      </w:r>
+      <w:r>
+        <w:t xml:space="preserve"> </w:t>
+      </w:r>
+      <w:r>
+        <w:rPr>
+          <w:rStyle w:val="VerbatimChar"/>
+        </w:rPr>
+        <w:t xml:space="preserve">docs/qa/&lt;run-id&gt;/</w:t>
+      </w:r>
+      <w:r>
+        <w:t xml:space="preserve"> </w:t>
+      </w:r>
+      <w:r>
+        <w:t xml:space="preserve">evidence (§11.4.83) is the durable record, NOT rotated. Classification: universal (§11.4.17). Composes §11.4.2/.5/.10/.83/.86/.107/.111/.122/.128/.137/.153/§9.2/.6. Propagation gate</w:t>
+      </w:r>
+      <w:r>
+        <w:t xml:space="preserve"> </w:t>
+      </w:r>
+      <w:r>
+        <w:rPr>
+          <w:rStyle w:val="VerbatimChar"/>
+        </w:rPr>
+        <w:t xml:space="preserve">CM-COVENANT-114-154-PROPAGATION</w:t>
+      </w:r>
+      <w:r>
+        <w:t xml:space="preserve"> </w:t>
+      </w:r>
+      <w:r>
+        <w:t xml:space="preserve">(literal</w:t>
+      </w:r>
+      <w:r>
+        <w:t xml:space="preserve"> </w:t>
+      </w:r>
+      <w:r>
+        <w:rPr>
+          <w:rStyle w:val="VerbatimChar"/>
+        </w:rPr>
+        <w:t xml:space="preserve">11.4.154</w:t>
+      </w:r>
+      <w:r>
+        <w:t xml:space="preserve">) + recommended gate</w:t>
+      </w:r>
+      <w:r>
+        <w:t xml:space="preserve"> </w:t>
+      </w:r>
+      <w:r>
+        <w:rPr>
+          <w:rStyle w:val="VerbatimChar"/>
+        </w:rPr>
+        <w:t xml:space="preserve">CM-WINDOW-SCOPED-FRESH-CORPUS-RECORDING</w:t>
+      </w:r>
+      <w:r>
+        <w:t xml:space="preserve"> </w:t>
+      </w:r>
+      <w:r>
+        <w:t xml:space="preserve">+ paired §1.1 mutation.</w:t>
+      </w:r>
+    </w:p>
+    <w:p>
+      <w:pPr>
+        <w:pStyle w:val="BodyText"/>
+      </w:pPr>
+      <w:r>
+        <w:rPr>
+          <w:b/>
+          <w:bCs/>
+        </w:rPr>
+        <w:t xml:space="preserve">Canonical authority:</w:t>
+      </w:r>
+      <w:r>
+        <w:t xml:space="preserve"> </w:t>
+      </w:r>
+      <w:r>
+        <w:t xml:space="preserve">constitution submodule</w:t>
+      </w:r>
+      <w:r>
+        <w:t xml:space="preserve"> </w:t>
+      </w:r>
+      <w:hyperlink r:id="rId67">
+        <w:r>
+          <w:rPr>
+            <w:rStyle w:val="VerbatimChar"/>
+          </w:rPr>
+          <w:t xml:space="preserve">Constitution.md</w:t>
+        </w:r>
+      </w:hyperlink>
+      <w:r>
+        <w:t xml:space="preserve"> </w:t>
+      </w:r>
+      <w:r>
+        <w:t xml:space="preserve">§11.4.154. Non-compliance is a release blocker. No escape hatch — no</w:t>
+      </w:r>
+      <w:r>
+        <w:t xml:space="preserve"> </w:t>
+      </w:r>
+      <w:r>
+        <w:rPr>
+          <w:rStyle w:val="VerbatimChar"/>
+        </w:rPr>
+        <w:t xml:space="preserve">--whole-screen-capture-OK</w:t>
+      </w:r>
+      <w:r>
+        <w:t xml:space="preserve">,</w:t>
+      </w:r>
+      <w:r>
+        <w:t xml:space="preserve"> </w:t>
+      </w:r>
+      <w:r>
+        <w:rPr>
+          <w:rStyle w:val="VerbatimChar"/>
+        </w:rPr>
+        <w:t xml:space="preserve">--skip-window-scope</w:t>
+      </w:r>
+      <w:r>
+        <w:t xml:space="preserve">,</w:t>
+      </w:r>
+      <w:r>
+        <w:t xml:space="preserve"> </w:t>
+      </w:r>
+      <w:r>
+        <w:rPr>
+          <w:rStyle w:val="VerbatimChar"/>
+        </w:rPr>
+        <w:t xml:space="preserve">--keep-stale-recordings</w:t>
+      </w:r>
+      <w:r>
+        <w:t xml:space="preserve">,</w:t>
+      </w:r>
+      <w:r>
+        <w:t xml:space="preserve"> </w:t>
+      </w:r>
+      <w:r>
+        <w:rPr>
+          <w:rStyle w:val="VerbatimChar"/>
+        </w:rPr>
+        <w:t xml:space="preserve">--no-corpus-rotation</w:t>
+      </w:r>
+      <w:r>
+        <w:t xml:space="preserve">,</w:t>
+      </w:r>
+      <w:r>
+        <w:t xml:space="preserve"> </w:t>
+      </w:r>
+      <w:r>
+        <w:rPr>
+          <w:rStyle w:val="VerbatimChar"/>
+        </w:rPr>
+        <w:t xml:space="preserve">--full-desktop-recording</w:t>
+      </w:r>
+      <w:r>
+        <w:t xml:space="preserve"> </w:t>
+      </w:r>
+      <w:r>
+        <w:t xml:space="preserve">flag.</w:t>
+      </w:r>
+    </w:p>
+    <w:p>
+      <w:pPr>
+        <w:pStyle w:val="BodyText"/>
+      </w:pPr>
+      <w:r>
+        <w:rPr>
+          <w:b/>
+          <w:bCs/>
+        </w:rPr>
+        <w:t xml:space="preserve">§11.4.155 — Project-name-prefixed feature/QA recording filenames (User mandate, 2026-06-15).</w:t>
+      </w:r>
+      <w:r>
+        <w:t xml:space="preserve"> </w:t>
+      </w:r>
+      <w:r>
+        <w:t xml:space="preserve">Verbatim:</w:t>
+      </w:r>
+      <w:r>
+        <w:t xml:space="preserve"> </w:t>
+      </w:r>
+      <w:r>
+        <w:t xml:space="preserve">“All recorded videos MUST START with prefix: the PROJECT NAME (ALWAYS USE THE PROJECT NAME). Project name MUST be obtained according to the constitution’s own project-name resolution.”</w:t>
+      </w:r>
+      <w:r>
+        <w:t xml:space="preserve"> </w:t>
+      </w:r>
+      <w:r>
+        <w:t xml:space="preserve">Every recorded video the project produces — every feature/QA real-use recording (§11.4.153), every window-scoped capture (§11.4.154), every always-on device recording (§11.4.128), every raw or curated artefact at the project-declared recording path (§11.4.35) + the committed</w:t>
+      </w:r>
+      <w:r>
+        <w:t xml:space="preserve"> </w:t>
+      </w:r>
+      <w:r>
+        <w:rPr>
+          <w:rStyle w:val="VerbatimChar"/>
+        </w:rPr>
+        <w:t xml:space="preserve">docs/qa/&lt;run-id&gt;/</w:t>
+      </w:r>
+      <w:r>
+        <w:t xml:space="preserve"> </w:t>
+      </w:r>
+      <w:r>
+        <w:t xml:space="preserve">trail (§11.4.83) — MUST have a filename that STARTS WITH the PROJECT-NAME prefix, ALWAYS; an unprefixed recording is a §11.4.155 violation (a multi-project/scope corpus on one host per §11.4.128/.103 becomes un-greppable + un-attributable — the §11.4.151 identify-and-grep failure on the recording-corpus axis).</w:t>
+      </w:r>
+      <w:r>
+        <w:t xml:space="preserve"> </w:t>
+      </w:r>
+      <w:r>
+        <w:rPr>
+          <w:b/>
+          <w:bCs/>
+        </w:rPr>
+        <w:t xml:space="preserve">Prefix resolution (closed-set, deterministic — §11.4.6, IDENTICAL to §11.4.151):</w:t>
+      </w:r>
+      <w:r>
+        <w:t xml:space="preserve"> </w:t>
+      </w:r>
+      <w:r>
+        <w:t xml:space="preserve">(1)</w:t>
+      </w:r>
+      <w:r>
+        <w:t xml:space="preserve"> </w:t>
+      </w:r>
+      <w:r>
+        <w:rPr>
+          <w:rStyle w:val="VerbatimChar"/>
+        </w:rPr>
+        <w:t xml:space="preserve">HELIX_RELEASE_PREFIX</w:t>
+      </w:r>
+      <w:r>
+        <w:t xml:space="preserve"> </w:t>
+      </w:r>
+      <w:r>
+        <w:t xml:space="preserve">from</w:t>
+      </w:r>
+      <w:r>
+        <w:t xml:space="preserve"> </w:t>
+      </w:r>
+      <w:r>
+        <w:rPr>
+          <w:rStyle w:val="VerbatimChar"/>
+        </w:rPr>
+        <w:t xml:space="preserve">.env</w:t>
+      </w:r>
+      <w:r>
+        <w:t xml:space="preserve"> </w:t>
+      </w:r>
+      <w:r>
+        <w:t xml:space="preserve">(authoritative, git-ignored §11.4.30, documented in tracked</w:t>
+      </w:r>
+      <w:r>
+        <w:t xml:space="preserve"> </w:t>
+      </w:r>
+      <w:r>
+        <w:rPr>
+          <w:rStyle w:val="VerbatimChar"/>
+        </w:rPr>
+        <w:t xml:space="preserve">.env.example</w:t>
+      </w:r>
+      <w:r>
+        <w:t xml:space="preserve"> </w:t>
+      </w:r>
+      <w:r>
+        <w:t xml:space="preserve">§11.4.77) else (2) lowercased snake_case project-root dir name §11.4.29 — ALWAYS resolvable, zero operator input. SAME prefix for EVERY recording in a checkout so</w:t>
+      </w:r>
+      <w:r>
+        <w:t xml:space="preserve"> </w:t>
+      </w:r>
+      <w:r>
+        <w:rPr>
+          <w:rStyle w:val="VerbatimChar"/>
+        </w:rPr>
+        <w:t xml:space="preserve">ls '&lt;PREFIX&gt;---'*</w:t>
+      </w:r>
+      <w:r>
+        <w:t xml:space="preserve"> </w:t>
+      </w:r>
+      <w:r>
+        <w:t xml:space="preserve">enumerates the corpus; canonical form</w:t>
+      </w:r>
+      <w:r>
+        <w:t xml:space="preserve"> </w:t>
+      </w:r>
+      <w:r>
+        <w:rPr>
+          <w:rStyle w:val="VerbatimChar"/>
+        </w:rPr>
+        <w:t xml:space="preserve">&lt;PREFIX&gt;---&lt;feature-or-scope&gt;---&lt;run-id&gt;.&lt;ext&gt;</w:t>
+      </w:r>
+      <w:r>
+        <w:t xml:space="preserve"> </w:t>
+      </w:r>
+      <w:r>
+        <w:t xml:space="preserve">(</w:t>
+      </w:r>
+      <w:r>
+        <w:rPr>
+          <w:rStyle w:val="VerbatimChar"/>
+        </w:rPr>
+        <w:t xml:space="preserve">---</w:t>
+      </w:r>
+      <w:r>
+        <w:t xml:space="preserve"> </w:t>
+      </w:r>
+      <w:r>
+        <w:t xml:space="preserve">delimits the prefix unambiguously); MUST equal the §11.4.151-resolved release-tag prefix (divergence is itself a §11.4.155 violation — one project, one name). Honest boundary (§11.4.6): the prefix guarantees attribution + greppability, NOT content validity (still §11.4.107/.137/.153) and does NOT relax §11.4.154’s window-scope/rotation (rotation removes the agent’s OWN</w:t>
+      </w:r>
+      <w:r>
+        <w:t xml:space="preserve"> </w:t>
+      </w:r>
+      <w:r>
+        <w:rPr>
+          <w:rStyle w:val="VerbatimChar"/>
+        </w:rPr>
+        <w:t xml:space="preserve">&lt;PREFIX&gt;---*</w:t>
+      </w:r>
+      <w:r>
+        <w:t xml:space="preserve"> </w:t>
+      </w:r>
+      <w:r>
+        <w:t xml:space="preserve">only; foreign/operator files surfaced not deleted §11.4.122/§9.2). Classification: universal (§11.4.17). Composes §11.4.151/.128/.153/.154/.111/.83/.6/.29/.30/.35/.77/.86/§1.1. Propagation gate</w:t>
+      </w:r>
+      <w:r>
+        <w:t xml:space="preserve"> </w:t>
+      </w:r>
+      <w:r>
+        <w:rPr>
+          <w:rStyle w:val="VerbatimChar"/>
+        </w:rPr>
+        <w:t xml:space="preserve">CM-COVENANT-114-155-PROPAGATION</w:t>
+      </w:r>
+      <w:r>
+        <w:t xml:space="preserve"> </w:t>
+      </w:r>
+      <w:r>
+        <w:t xml:space="preserve">(literal</w:t>
+      </w:r>
+      <w:r>
+        <w:t xml:space="preserve"> </w:t>
+      </w:r>
+      <w:r>
+        <w:rPr>
+          <w:rStyle w:val="VerbatimChar"/>
+        </w:rPr>
+        <w:t xml:space="preserve">11.4.155</w:t>
+      </w:r>
+      <w:r>
+        <w:t xml:space="preserve">) + recommended gate</w:t>
+      </w:r>
+      <w:r>
+        <w:t xml:space="preserve"> </w:t>
+      </w:r>
+      <w:r>
+        <w:rPr>
+          <w:rStyle w:val="VerbatimChar"/>
+        </w:rPr>
+        <w:t xml:space="preserve">CM-RECORDING-PROJECT-NAME-PREFIX</w:t>
+      </w:r>
+      <w:r>
+        <w:t xml:space="preserve"> </w:t>
+      </w:r>
+      <w:r>
+        <w:t xml:space="preserve">+ paired §1.1 mutation.</w:t>
+      </w:r>
+    </w:p>
+    <w:p>
+      <w:pPr>
+        <w:pStyle w:val="BodyText"/>
+      </w:pPr>
+      <w:r>
+        <w:rPr>
+          <w:b/>
+          <w:bCs/>
+        </w:rPr>
+        <w:t xml:space="preserve">Canonical authority:</w:t>
+      </w:r>
+      <w:r>
+        <w:t xml:space="preserve"> </w:t>
+      </w:r>
+      <w:r>
+        <w:t xml:space="preserve">constitution submodule</w:t>
+      </w:r>
+      <w:r>
+        <w:t xml:space="preserve"> </w:t>
+      </w:r>
+      <w:hyperlink r:id="rId67">
+        <w:r>
+          <w:rPr>
+            <w:rStyle w:val="VerbatimChar"/>
+          </w:rPr>
+          <w:t xml:space="preserve">Constitution.md</w:t>
+        </w:r>
+      </w:hyperlink>
+      <w:r>
+        <w:t xml:space="preserve"> </w:t>
+      </w:r>
+      <w:r>
+        <w:t xml:space="preserve">§11.4.155. Non-compliance is a release blocker. No escape hatch — no</w:t>
+      </w:r>
+      <w:r>
+        <w:t xml:space="preserve"> </w:t>
+      </w:r>
+      <w:r>
+        <w:rPr>
+          <w:rStyle w:val="VerbatimChar"/>
+        </w:rPr>
+        <w:t xml:space="preserve">--no-recording-prefix</w:t>
+      </w:r>
+      <w:r>
+        <w:t xml:space="preserve">,</w:t>
+      </w:r>
+      <w:r>
+        <w:t xml:space="preserve"> </w:t>
+      </w:r>
+      <w:r>
+        <w:rPr>
+          <w:rStyle w:val="VerbatimChar"/>
+        </w:rPr>
+        <w:t xml:space="preserve">--recording-without-project-name</w:t>
+      </w:r>
+      <w:r>
+        <w:t xml:space="preserve">,</w:t>
+      </w:r>
+      <w:r>
+        <w:t xml:space="preserve"> </w:t>
+      </w:r>
+      <w:r>
+        <w:rPr>
+          <w:rStyle w:val="VerbatimChar"/>
+        </w:rPr>
+        <w:t xml:space="preserve">--unprefixed-recording</w:t>
+      </w:r>
+      <w:r>
+        <w:t xml:space="preserve">,</w:t>
+      </w:r>
+      <w:r>
+        <w:t xml:space="preserve"> </w:t>
+      </w:r>
+      <w:r>
+        <w:rPr>
+          <w:rStyle w:val="VerbatimChar"/>
+        </w:rPr>
+        <w:t xml:space="preserve">--prefix-optional-for-recording</w:t>
+      </w:r>
+      <w:r>
+        <w:t xml:space="preserve">,</w:t>
+      </w:r>
+      <w:r>
+        <w:t xml:space="preserve"> </w:t>
+      </w:r>
+      <w:r>
+        <w:rPr>
+          <w:rStyle w:val="VerbatimChar"/>
+        </w:rPr>
+        <w:t xml:space="preserve">--differing-recording-prefix</w:t>
       </w:r>
       <w:r>
         <w:t xml:space="preserve"> </w:t>

</xml_diff>

<commit_message>
feat(§11.4.158): intensive all-feature/flow/edge-case video-recording + read-the-screen content-verification mandate (HelixQA-driven), default $HOME/Downloads (User mandate 2026-06-16)
Classification: universal (§11.4.17)

Co-Authored-By: Claude Opus 4.8 <noreply@anthropic.com>
</commit_message>
<xml_diff>
--- a/AGENTS.docx
+++ b/AGENTS.docx
@@ -2,14 +2,6 @@
 <file path=word/document.xml><?xml version="1.0" encoding="utf-8"?>
 <w:document xmlns:w="http://schemas.openxmlformats.org/wordprocessingml/2006/main" xmlns:m="http://schemas.openxmlformats.org/officeDocument/2006/math" xmlns:r="http://schemas.openxmlformats.org/officeDocument/2006/relationships" xmlns:o="urn:schemas-microsoft-com:office:office" xmlns:v="urn:schemas-microsoft-com:vml" xmlns:w10="urn:schemas-microsoft-com:office:word" xmlns:a="http://schemas.openxmlformats.org/drawingml/2006/main" xmlns:pic="http://schemas.openxmlformats.org/drawingml/2006/picture" xmlns:wp="http://schemas.openxmlformats.org/drawingml/2006/wordprocessingDrawing">
   <w:body>
-    <w:p>
-      <w:pPr>
-        <w:pStyle w:val="Title"/>
-      </w:pPr>
-      <w:r>
-        <w:t xml:space="preserve">AGENTS</w:t>
-      </w:r>
-    </w:p>
     <w:bookmarkStart w:id="117" w:name="helix-constitution--universal-agentsmd"/>
     <w:p>
       <w:pPr>
@@ -39323,6 +39315,204 @@
         <w:t xml:space="preserve">flag.</w:t>
       </w:r>
     </w:p>
+    <w:p>
+      <w:pPr>
+        <w:pStyle w:val="BodyText"/>
+      </w:pPr>
+      <w:r>
+        <w:rPr>
+          <w:b/>
+          <w:bCs/>
+        </w:rPr>
+        <w:t xml:space="preserve">§11.4.158 — Intensive all-feature/flow/edge-case video-recording + read-the-screen content-verification mandate (User mandate, 2026-06-16).</w:t>
+      </w:r>
+      <w:r>
+        <w:t xml:space="preserve"> </w:t>
+      </w:r>
+      <w:r>
+        <w:t xml:space="preserve">Every project MUST be covered by intensive automated testing that exercises + RECORDS every feature/flow/use-case/edge-case (valid/invalid/boundary/concurrent/failure-injection §11.4.85), each recording showing the feature GENUINELY WORKING with REAL results (real prompts→real responses→real outputs §11.4.153) and NO false/simulated/stale/frozen result (§11.4.2/.5/.107) — a recording showing an error/bluff/non-working feature is a FINDING (→§11.4.153(4)/§11.4.4 fix→retest→re-record), never a confirmation. The testing System MUST ACTUALLY READ every shown log line / message / UI label / dialog / toast / status text and VERIFY it is a genuine working result (OCR/ROI §11.4.117/.137 + confidence floor for pixel surfaces; direct capture for terminal/log; §11.4.107(10) self-validated golden-good/golden-bad analyzer) — "a video was produced" is NOT evidence, "the System read the screen + confirmed a genuine result" is. HelixQA (§11.4.27) MUST drive this exercise→record→read→score pass, PASS only on a read-confirmed genuine result + captured artefact path (§11.4.69). Default recording save path =</w:t>
+      </w:r>
+      <w:r>
+        <w:t xml:space="preserve"> </w:t>
+      </w:r>
+      <w:r>
+        <w:rPr>
+          <w:rStyle w:val="VerbatimChar"/>
+        </w:rPr>
+        <w:t xml:space="preserve">$HOME/Downloads</w:t>
+      </w:r>
+      <w:r>
+        <w:t xml:space="preserve"> </w:t>
+      </w:r>
+      <w:r>
+        <w:t xml:space="preserve">(host user's home Downloads, resolved at runtime never hardcoded) unless a project declares an override per §11.4.35; §11.4.155 project-prefix + §11.4.154 window-scope/rotation + §11.4.128 git-ignored raw corpus + §11.4.83 curated docs/qa evidence apply. Composes §11.4.2/.5/.25/.27/.52/.69/.83/.85/.107/.108/.117/.118/.128/.137/.138/.153/.154/.155/§1.1. Classification: universal (§11.4.17). Propagation gate</w:t>
+      </w:r>
+      <w:r>
+        <w:t xml:space="preserve"> </w:t>
+      </w:r>
+      <w:r>
+        <w:rPr>
+          <w:rStyle w:val="VerbatimChar"/>
+        </w:rPr>
+        <w:t xml:space="preserve">CM-COVENANT-114-158-PROPAGATION</w:t>
+      </w:r>
+      <w:r>
+        <w:t xml:space="preserve"> </w:t>
+      </w:r>
+      <w:r>
+        <w:t xml:space="preserve">(literal</w:t>
+      </w:r>
+      <w:r>
+        <w:t xml:space="preserve"> </w:t>
+      </w:r>
+      <w:r>
+        <w:rPr>
+          <w:rStyle w:val="VerbatimChar"/>
+        </w:rPr>
+        <w:t xml:space="preserve">11.4.158</w:t>
+      </w:r>
+      <w:r>
+        <w:t xml:space="preserve">) + recommended gates</w:t>
+      </w:r>
+      <w:r>
+        <w:t xml:space="preserve"> </w:t>
+      </w:r>
+      <w:r>
+        <w:rPr>
+          <w:rStyle w:val="VerbatimChar"/>
+        </w:rPr>
+        <w:t xml:space="preserve">CM-INTENSIVE-RECORDING-COVERAGE</w:t>
+      </w:r>
+      <w:r>
+        <w:t xml:space="preserve"> </w:t>
+      </w:r>
+      <w:r>
+        <w:t xml:space="preserve">+</w:t>
+      </w:r>
+      <w:r>
+        <w:t xml:space="preserve"> </w:t>
+      </w:r>
+      <w:r>
+        <w:rPr>
+          <w:rStyle w:val="VerbatimChar"/>
+        </w:rPr>
+        <w:t xml:space="preserve">CM-RECORDING-CONTENT-READ-VERIFIED</w:t>
+      </w:r>
+      <w:r>
+        <w:t xml:space="preserve"> </w:t>
+      </w:r>
+      <w:r>
+        <w:t xml:space="preserve">+ paired §1.1 mutation.</w:t>
+      </w:r>
+      <w:r>
+        <w:t xml:space="preserve"> </w:t>
+      </w:r>
+      <w:r>
+        <w:rPr>
+          <w:b/>
+          <w:bCs/>
+        </w:rPr>
+        <w:t xml:space="preserve">Canonical authority:</w:t>
+      </w:r>
+      <w:r>
+        <w:t xml:space="preserve"> </w:t>
+      </w:r>
+      <w:r>
+        <w:t xml:space="preserve">constitution submodule</w:t>
+      </w:r>
+      <w:r>
+        <w:t xml:space="preserve"> </w:t>
+      </w:r>
+      <w:hyperlink r:id="rId68">
+        <w:r>
+          <w:rPr>
+            <w:rStyle w:val="VerbatimChar"/>
+          </w:rPr>
+          <w:t xml:space="preserve">Constitution.md</w:t>
+        </w:r>
+      </w:hyperlink>
+      <w:r>
+        <w:t xml:space="preserve"> </w:t>
+      </w:r>
+      <w:r>
+        <w:t xml:space="preserve">§11.4.158. Non-compliance is a release blocker. No escape hatch — no</w:t>
+      </w:r>
+      <w:r>
+        <w:t xml:space="preserve"> </w:t>
+      </w:r>
+      <w:r>
+        <w:rPr>
+          <w:rStyle w:val="VerbatimChar"/>
+        </w:rPr>
+        <w:t xml:space="preserve">--skip-recording-coverage</w:t>
+      </w:r>
+      <w:r>
+        <w:t xml:space="preserve">,</w:t>
+      </w:r>
+      <w:r>
+        <w:t xml:space="preserve"> </w:t>
+      </w:r>
+      <w:r>
+        <w:rPr>
+          <w:rStyle w:val="VerbatimChar"/>
+        </w:rPr>
+        <w:t xml:space="preserve">--video-without-content-read</w:t>
+      </w:r>
+      <w:r>
+        <w:t xml:space="preserve">,</w:t>
+      </w:r>
+      <w:r>
+        <w:t xml:space="preserve"> </w:t>
+      </w:r>
+      <w:r>
+        <w:rPr>
+          <w:rStyle w:val="VerbatimChar"/>
+        </w:rPr>
+        <w:t xml:space="preserve">--happy-path-recording-suffices</w:t>
+      </w:r>
+      <w:r>
+        <w:t xml:space="preserve">,</w:t>
+      </w:r>
+      <w:r>
+        <w:t xml:space="preserve"> </w:t>
+      </w:r>
+      <w:r>
+        <w:rPr>
+          <w:rStyle w:val="VerbatimChar"/>
+        </w:rPr>
+        <w:t xml:space="preserve">--recording-path-anywhere</w:t>
+      </w:r>
+      <w:r>
+        <w:t xml:space="preserve">,</w:t>
+      </w:r>
+      <w:r>
+        <w:t xml:space="preserve"> </w:t>
+      </w:r>
+      <w:r>
+        <w:rPr>
+          <w:rStyle w:val="VerbatimChar"/>
+        </w:rPr>
+        <w:t xml:space="preserve">--unread-recording-OK</w:t>
+      </w:r>
+      <w:r>
+        <w:t xml:space="preserve">,</w:t>
+      </w:r>
+      <w:r>
+        <w:t xml:space="preserve"> </w:t>
+      </w:r>
+      <w:r>
+        <w:rPr>
+          <w:rStyle w:val="VerbatimChar"/>
+        </w:rPr>
+        <w:t xml:space="preserve">--skip-helixqa-read</w:t>
+      </w:r>
+      <w:r>
+        <w:t xml:space="preserve"> </w:t>
+      </w:r>
+      <w:r>
+        <w:t xml:space="preserve">flag.</w:t>
+      </w:r>
+    </w:p>
     <w:bookmarkEnd w:id="115"/>
     <w:bookmarkEnd w:id="116"/>
     <w:bookmarkEnd w:id="117"/>
@@ -39836,7 +40026,7 @@
         <w:rFonts w:asciiTheme="minorHAnsi" w:cstheme="minorBidi" w:eastAsiaTheme="minorEastAsia" w:hAnsiTheme="minorHAnsi"/>
         <w:sz w:val="24"/>
         <w:szCs w:val="24"/>
-        <w:lang w:bidi="ar-SA" w:eastAsia="zh-CN" w:val="en"/>
+        <w:lang w:bidi="ar-SA" w:eastAsia="zh-CN" w:val="en-US"/>
       </w:rPr>
     </w:rPrDefault>
     <w:pPrDefault>

</xml_diff>

<commit_message>
Decouple shared constitution from specific consuming projects
Generalize foreign-project NAME references (ATMOSphere, Lava, HelixAgent,
HelixCode, HelixPlay, HelixTrack, MeTube, Yole, HelixFlow) to project-neutral
terms ("a consuming project" / "the project") across all 5 carriers
(Constitution/CLAUDE/AGENTS/GEMINI/QWEN .md) with synced .html/.pdf/.docx
exports (§11.4.12/§11.4.60/§11.4.65/§11.4.157). Forensic-anchor structure +
§/CONST anchor numbers + the §11.4.28 owned-ORG membership list + source URLs
+ the §11.4 forensic-anchor sentinel line are all preserved verbatim.

Validated: inheritance gate PASS + paired §1.1 meta-test PASS (gate FAILs on
stripped anchor); Constitution.md sentinel byte-identical.

Classification: universal (§11.4.17) — removes project-specific coupling from
the shared universal constitution; no project-specific content added.

Co-Authored-By: Claude Opus 4.8 (1M context) <noreply@anthropic.com>
</commit_message>
<xml_diff>
--- a/AGENTS.docx
+++ b/AGENTS.docx
@@ -209,7 +209,7 @@
               <w:t xml:space="preserve">pkg/health</w:t>
             </w:r>
             <w:r>
-              <w:t xml:space="preserve">; missing capabilities extend the container Submodule upstream per §11.4.74; integration tests boot infra on-demand via the Submodule. Classification: universal (§11.4.17). Prior round: Added §11.4.160 mirror — Vision-verified recording + HelixQA bridge mandate (User mandate 2026-06-21): every video recording for feature/QA evidence MUST be processed through a vision/OCR pipeline that reads on-screen content and confirms expected results BEFORE acceptance; the recording system MUST provide a bridge feeding captured frames to HelixQA’s test infrastructure (or equivalent) for content verification — automated read-the-screen against specified expected patterns; the bridge MUST capture frames at ≤5s intervals, run OCR/vision analysis with self-validated analyzer (§11.4.107(10)), compare against SPECIFY-phase patterns, produce per-frame PASS/FAIL with evidence path, surface failures immediately for re-record per §11.4.159(L). Honest boundary: vision verification confirms on-screen content — does NOT replace §11.4.5 quality analysis nor §11.4.108 runtime-signature; FLAG_SECURE surfaces use the §11.4.117 proxy oracle. Classification: universal (§11.4.17). Prior round: Added §11.4.153 mirror — Crashlytics-recorded-data continuous monitoring + systematic-debug + regression-test-coverage mandate (User mandate 2026-06-13): every project with Firebase Crashlytics enabled/wired MUST continuously monitor ALL four recorded surfaces (fatal crashes, ANRs, performance traces, AND non-fatals), systematic-debug each (reproduce-before-fix §11.4.102/.115), fix/improve, and cover every closure with a permanent §11.4.135 regression guard (RED-on-broken→GREEN-on-fixed) + a closure log citing the console issue id/URL + the validation/verification test paths; regular cadence (the §11.4.47 five-trigger set), no false results, no bluff — a console-resolved Crashlytics issue with no falsifiable regression test is FORBIDDEN (the silent-recurrence vector). STRENGTHENS+COMPLETES §11.4.47 (review/dedup finds it; §11.4.152 fixes it + proves it stays fixed). Project-level reference instantiation = the Lava client’s §6.O + §6.AC. Composes §11.4/.1/.5/.6/.9/.34/.40/.43/.47/.69/.90/.102/.107/.108/.115/.118/.123/.130/.135/.138/.150/§1.1. Propagation gate</w:t>
+              <w:t xml:space="preserve">; missing capabilities extend the container Submodule upstream per §11.4.74; integration tests boot infra on-demand via the Submodule. Classification: universal (§11.4.17). Prior round: Added §11.4.160 mirror — Vision-verified recording + HelixQA bridge mandate (User mandate 2026-06-21): every video recording for feature/QA evidence MUST be processed through a vision/OCR pipeline that reads on-screen content and confirms expected results BEFORE acceptance; the recording system MUST provide a bridge feeding captured frames to HelixQA’s test infrastructure (or equivalent) for content verification — automated read-the-screen against specified expected patterns; the bridge MUST capture frames at ≤5s intervals, run OCR/vision analysis with self-validated analyzer (§11.4.107(10)), compare against SPECIFY-phase patterns, produce per-frame PASS/FAIL with evidence path, surface failures immediately for re-record per §11.4.159(L). Honest boundary: vision verification confirms on-screen content — does NOT replace §11.4.5 quality analysis nor §11.4.108 runtime-signature; FLAG_SECURE surfaces use the §11.4.117 proxy oracle. Classification: universal (§11.4.17). Prior round: Added §11.4.153 mirror — Crashlytics-recorded-data continuous monitoring + systematic-debug + regression-test-coverage mandate (User mandate 2026-06-13): every project with Firebase Crashlytics enabled/wired MUST continuously monitor ALL four recorded surfaces (fatal crashes, ANRs, performance traces, AND non-fatals), systematic-debug each (reproduce-before-fix §11.4.102/.115), fix/improve, and cover every closure with a permanent §11.4.135 regression guard (RED-on-broken→GREEN-on-fixed) + a closure log citing the console issue id/URL + the validation/verification test paths; regular cadence (the §11.4.47 five-trigger set), no false results, no bluff — a console-resolved Crashlytics issue with no falsifiable regression test is FORBIDDEN (the silent-recurrence vector). STRENGTHENS+COMPLETES §11.4.47 (review/dedup finds it; §11.4.152 fixes it + proves it stays fixed). Project-level reference instantiation = a consuming project’s §6.O + §6.AC. Composes §11.4/.1/.5/.6/.9/.34/.40/.43/.47/.69/.90/.102/.107/.108/.115/.118/.123/.130/.135/.138/.150/§1.1. Propagation gate</w:t>
             </w:r>
             <w:r>
               <w:t xml:space="preserve"> </w:t>
@@ -19240,7 +19240,7 @@
         <w:t xml:space="preserve"> </w:t>
       </w:r>
       <w:r>
-        <w:t xml:space="preserve">2026-05-20T15:00Z: ATMOSphere parent’s audio Tier 1</w:t>
+        <w:t xml:space="preserve">2026-05-20T15:00Z: a consuming project’s audio Tier 1</w:t>
       </w:r>
       <w:r>
         <w:t xml:space="preserve"> </w:t>
@@ -24357,7 +24357,7 @@
         <w:t xml:space="preserve"> </w:t>
       </w:r>
       <w:r>
-        <w:t xml:space="preserve">Demoted to consumer project (ATMOSphere video-color/visual-quality fidelity) per §11.4.17/§11.4.35 — project-specific (RK3588/MPV/Arvus), not universal. See the consuming project’s Constitution/CLAUDE/AGENTS/QWEN.</w:t>
+        <w:t xml:space="preserve">Demoted to consumer project (a consuming project’s video-color/visual-quality fidelity) per §11.4.17/§11.4.35 — project-specific (RK3588/MPV/Arvus), not universal. See the consuming project’s Constitution/CLAUDE/AGENTS/QWEN.</w:t>
       </w:r>
     </w:p>
     <w:bookmarkEnd w:id="80"/>
@@ -35345,7 +35345,7 @@
         <w:t xml:space="preserve"> </w:t>
       </w:r>
       <w:r>
-        <w:t xml:space="preserve">[ATMOSphere consumer fills in: confirm the Claude Code governance-prefix cache is warm + free of pre-breakpoint volatiles; tier the §11.4.96-SAFE mechanical subagents (search/grep/status/doc-export) to Haiku with output-to-file under</w:t>
+        <w:t xml:space="preserve">[the consuming project fills in: confirm the Claude Code governance-prefix cache is warm + free of pre-breakpoint volatiles; tier the §11.4.96-SAFE mechanical subagents (search/grep/status/doc-export) to Haiku with output-to-file under</w:t>
       </w:r>
       <w:r>
         <w:t xml:space="preserve"> </w:t>
@@ -35789,7 +35789,7 @@
         <w:t xml:space="preserve"> </w:t>
       </w:r>
       <w:r>
-        <w:t xml:space="preserve">“All video streaming apps … require to choose some title and to press proper UI button to start or resume playing! Proper UI interaction to play exact show with proper content and subtitles is MANDATORY! Without it we just eventually play on 2nd display sample, and that’s it mostly! THIS MUST BE ADDED as MANDATORY RULE regarding testing of any video streaming app in general with full automation tests! Universal in root constitution + ATMOSphere project extensions.”</w:t>
+        <w:t xml:space="preserve">“All video streaming apps … require to choose some title and to press proper UI button to start or resume playing! Proper UI interaction to play exact show with proper content and subtitles is MANDATORY! Without it we just eventually play on 2nd display sample, and that’s it mostly! THIS MUST BE ADDED as MANDATORY RULE regarding testing of any video streaming app in general with full automation tests! Universal in root constitution + a consuming project’s extensions.”</w:t>
       </w:r>
       <w:r>
         <w:t xml:space="preserve"> </w:t>
@@ -39512,7 +39512,7 @@
         <w:t xml:space="preserve"> </w:t>
       </w:r>
       <w:r>
-        <w:t xml:space="preserve">only when its guard is GREEN on a clean artifact, never when the console mark is flipped. Classification: universal (§11.4.17) — the consuming project supplies its Crashlytics handle, console-access credential (§11.4.10, never logged), severity table, and per-issue closure-log path per §11.4.35; the reference project-level instantiation is the Lava client’s §6.O (Crashlytics-Resolved Issue Coverage — per-issue validation test + Challenge test +</w:t>
+        <w:t xml:space="preserve">only when its guard is GREEN on a clean artifact, never when the console mark is flipped. Classification: universal (§11.4.17) — the consuming project supplies its Crashlytics handle, console-access credential (§11.4.10, never logged), severity table, and per-issue closure-log path per §11.4.35; the reference project-level instantiation is a consuming project’s §6.O (Crashlytics-Resolved Issue Coverage — per-issue validation test + Challenge test +</w:t>
       </w:r>
       <w:r>
         <w:t xml:space="preserve"> </w:t>

</xml_diff>

<commit_message>
docs(§11.4.65/§11.4.73): regenerate constitution carrier siblings (html/pdf/docx) with default CSS — sibling-freshness debt after b2a7948
Co-Authored-By: Claude Opus 4.8 (1M context) <noreply@anthropic.com>
</commit_message>
<xml_diff>
--- a/AGENTS.docx
+++ b/AGENTS.docx
@@ -42849,6 +42849,661 @@
       </w:r>
       <w:r>
         <w:t xml:space="preserve">§11.4.166.</w:t>
+      </w:r>
+    </w:p>
+    <w:p>
+      <w:pPr>
+        <w:pStyle w:val="BodyText"/>
+      </w:pPr>
+      <w:r>
+        <w:rPr>
+          <w:b/>
+          <w:bCs/>
+        </w:rPr>
+        <w:t xml:space="preserve">§11.4.167 — Big-work-item feature work-stream lifecycle (User mandate, 2026-06-23).</w:t>
+      </w:r>
+      <w:r>
+        <w:t xml:space="preserve"> </w:t>
+      </w:r>
+      <w:r>
+        <w:t xml:space="preserve">Compact summary: every BIG work item (new feature OR drastic/large fix) MUST be developed as its own isolated</w:t>
+      </w:r>
+      <w:r>
+        <w:t xml:space="preserve"> </w:t>
+      </w:r>
+      <w:r>
+        <w:rPr>
+          <w:b/>
+          <w:bCs/>
+        </w:rPr>
+        <w:t xml:space="preserve">feature work-stream</w:t>
+      </w:r>
+      <w:r>
+        <w:t xml:space="preserve"> </w:t>
+      </w:r>
+      <w:r>
+        <w:t xml:space="preserve">— its OWN full project copy in a sibling directory, its OWN</w:t>
+      </w:r>
+      <w:r>
+        <w:t xml:space="preserve"> </w:t>
+      </w:r>
+      <w:r>
+        <w:rPr>
+          <w:rStyle w:val="VerbatimChar"/>
+        </w:rPr>
+        <w:t xml:space="preserve">feature/&lt;slug&gt;</w:t>
+      </w:r>
+      <w:r>
+        <w:t xml:space="preserve"> </w:t>
+      </w:r>
+      <w:r>
+        <w:t xml:space="preserve">branch, its OWN per-feature flashable builds + feature release tags, kept SEPARATE from the trunk until the operator manually approves after testing, with the trunk regularly merged INTO every feature stream. (A) one big item = one feature work-stream in a sibling project copy (</w:t>
+      </w:r>
+      <w:r>
+        <w:rPr>
+          <w:rStyle w:val="VerbatimChar"/>
+        </w:rPr>
+        <w:t xml:space="preserve">&lt;project&gt;_&lt;slug&gt;</w:t>
+      </w:r>
+      <w:r>
+        <w:t xml:space="preserve">, §11.4.29 slug); small changes stay on the trunk. (B) disk-feasible duplication MANDATORY, naive deep copies FORBIDDEN — a CoW/reflink clone (</w:t>
+      </w:r>
+      <w:r>
+        <w:rPr>
+          <w:rStyle w:val="VerbatimChar"/>
+        </w:rPr>
+        <w:t xml:space="preserve">cp -a --reflink=auto</w:t>
+      </w:r>
+      <w:r>
+        <w:t xml:space="preserve"> </w:t>
+      </w:r>
+      <w:r>
+        <w:t xml:space="preserve">/ FS snapshot) on btrfs/XFS/ZFS/APFS, else a shared-object-store mechanism (</w:t>
+      </w:r>
+      <w:r>
+        <w:rPr>
+          <w:rStyle w:val="VerbatimChar"/>
+        </w:rPr>
+        <w:t xml:space="preserve">git worktree</w:t>
+      </w:r>
+      <w:r>
+        <w:t xml:space="preserve"> </w:t>
+      </w:r>
+      <w:r>
+        <w:t xml:space="preserve">+ externalized build output); per-stream</w:t>
+      </w:r>
+      <w:r>
+        <w:t xml:space="preserve"> </w:t>
+      </w:r>
+      <w:r>
+        <w:rPr>
+          <w:rStyle w:val="VerbatimChar"/>
+        </w:rPr>
+        <w:t xml:space="preserve">out/</w:t>
+      </w:r>
+      <w:r>
+        <w:t xml:space="preserve"> </w:t>
+      </w:r>
+      <w:r>
+        <w:t xml:space="preserve">excluded from the clone + one shared ccache; ~0-disk-per-fresh-stream verified by captured evidence (§11.4.69) before relied on (§11.4.6 no-guessing). (C) own branch + own tags greppable per §11.4.151 (</w:t>
+      </w:r>
+      <w:r>
+        <w:rPr>
+          <w:rStyle w:val="VerbatimChar"/>
+        </w:rPr>
+        <w:t xml:space="preserve">&lt;base&gt;-feat-&lt;slug&gt;[-&lt;iter&gt;]</w:t>
+      </w:r>
+      <w:r>
+        <w:t xml:space="preserve">), NEVER merged to trunk until §11.4.40 full retest GREEN on a clean target → §11.4.41 merge-first → §11.4.113 ff-only (no-force) merge. (D) trunk merged INTO every live stream FREQUENTLY (per trunk tag / daily,</w:t>
+      </w:r>
+      <w:r>
+        <w:t xml:space="preserve"> </w:t>
+      </w:r>
+      <w:r>
+        <w:rPr>
+          <w:rStyle w:val="VerbatimChar"/>
+        </w:rPr>
+        <w:t xml:space="preserve">git merge</w:t>
+      </w:r>
+      <w:r>
+        <w:t xml:space="preserve"> </w:t>
+      </w:r>
+      <w:r>
+        <w:t xml:space="preserve">never rebase a shared/tagged branch); a stale stream is flagged. (E) feature branch + mirrored feature tag cascades to EVERY touched submodule the moment a submodule is modified (§11.4.113 + tag-cascade); untouched submodules stay trunk-pinned. (F) single-builder build QUEUE (FIFO + advisory lock, §11.4.58 L1 / §12.7 / §12.8) + finite-device test queue (§11.4.119 per-device exclusive ownership); idle streams’ regenerable build output GC’d (§11.4.77). (G) every change crosses the full quality gauntlet (§11.4.142/.125/.134 review + §11.4.145 impact research + §11.4 / .5 / .69 / .107 anti-bluff testing) — a feature stream is NOT a quality carve-out. (H) resumable, data-safe lifecycle — a stream registry (§11.4.116 / §11.4.147) tracks branch/base-tag/out-state/last-trunk-merge/merge-approval; atomic</w:t>
+      </w:r>
+      <w:r>
+        <w:t xml:space="preserve"> </w:t>
+      </w:r>
+      <w:r>
+        <w:rPr>
+          <w:rStyle w:val="VerbatimChar"/>
+        </w:rPr>
+        <w:t xml:space="preserve">.partial</w:t>
+      </w:r>
+      <w:r>
+        <w:t xml:space="preserve">→rename create + §11.4.84 quiescence resume; retire only after merged/approved + §9.2 backup; bounded by §12 / §12.6. Honest boundary (§11.4.6): guarantees ISOLATION + disk-feasibility + greppable identity + controlled trunk↔feature merge — NOT that any stream’s work is correct (still crosses §11.4.108 + §11.4.40). Classification: universal (§11.4.17) — consumer supplies its CoW mechanism, sibling-dir + tag naming, build/device-queue counts, big-item threshold per §11.4.35. Propagation gate</w:t>
+      </w:r>
+      <w:r>
+        <w:t xml:space="preserve"> </w:t>
+      </w:r>
+      <w:r>
+        <w:rPr>
+          <w:rStyle w:val="VerbatimChar"/>
+        </w:rPr>
+        <w:t xml:space="preserve">CM-COVENANT-114-167-PROPAGATION</w:t>
+      </w:r>
+      <w:r>
+        <w:t xml:space="preserve"> </w:t>
+      </w:r>
+      <w:r>
+        <w:t xml:space="preserve">(literal</w:t>
+      </w:r>
+      <w:r>
+        <w:t xml:space="preserve"> </w:t>
+      </w:r>
+      <w:r>
+        <w:rPr>
+          <w:rStyle w:val="VerbatimChar"/>
+        </w:rPr>
+        <w:t xml:space="preserve">11.4.167</w:t>
+      </w:r>
+      <w:r>
+        <w:t xml:space="preserve">) + recommended gates</w:t>
+      </w:r>
+      <w:r>
+        <w:t xml:space="preserve"> </w:t>
+      </w:r>
+      <w:r>
+        <w:rPr>
+          <w:rStyle w:val="VerbatimChar"/>
+        </w:rPr>
+        <w:t xml:space="preserve">CM-FEATURE-WORKSTREAM-COW-CLONE</w:t>
+      </w:r>
+      <w:r>
+        <w:t xml:space="preserve"> </w:t>
+      </w:r>
+      <w:r>
+        <w:t xml:space="preserve">/</w:t>
+      </w:r>
+      <w:r>
+        <w:t xml:space="preserve"> </w:t>
+      </w:r>
+      <w:r>
+        <w:rPr>
+          <w:rStyle w:val="VerbatimChar"/>
+        </w:rPr>
+        <w:t xml:space="preserve">CM-FEATURE-WORKSTREAM-NO-MERGE-UNTIL-APPROVED</w:t>
+      </w:r>
+      <w:r>
+        <w:t xml:space="preserve"> </w:t>
+      </w:r>
+      <w:r>
+        <w:t xml:space="preserve">/</w:t>
+      </w:r>
+      <w:r>
+        <w:t xml:space="preserve"> </w:t>
+      </w:r>
+      <w:r>
+        <w:rPr>
+          <w:rStyle w:val="VerbatimChar"/>
+        </w:rPr>
+        <w:t xml:space="preserve">CM-FEATURE-WORKSTREAM-TRUNK-SYNC-CADENCE</w:t>
+      </w:r>
+      <w:r>
+        <w:t xml:space="preserve"> </w:t>
+      </w:r>
+      <w:r>
+        <w:t xml:space="preserve">/</w:t>
+      </w:r>
+      <w:r>
+        <w:t xml:space="preserve"> </w:t>
+      </w:r>
+      <w:r>
+        <w:rPr>
+          <w:rStyle w:val="VerbatimChar"/>
+        </w:rPr>
+        <w:t xml:space="preserve">CM-FEATURE-WORKSTREAM-SUBMODULE-CASCADE</w:t>
+      </w:r>
+      <w:r>
+        <w:t xml:space="preserve"> </w:t>
+      </w:r>
+      <w:r>
+        <w:t xml:space="preserve">+ paired §1.1 mutations.</w:t>
+      </w:r>
+      <w:r>
+        <w:t xml:space="preserve"> </w:t>
+      </w:r>
+      <w:r>
+        <w:rPr>
+          <w:b/>
+          <w:bCs/>
+        </w:rPr>
+        <w:t xml:space="preserve">Canonical authority:</w:t>
+      </w:r>
+      <w:r>
+        <w:t xml:space="preserve"> </w:t>
+      </w:r>
+      <w:r>
+        <w:t xml:space="preserve">constitution submodule</w:t>
+      </w:r>
+      <w:r>
+        <w:t xml:space="preserve"> </w:t>
+      </w:r>
+      <w:hyperlink r:id="rId69">
+        <w:r>
+          <w:rPr>
+            <w:rStyle w:val="VerbatimChar"/>
+          </w:rPr>
+          <w:t xml:space="preserve">Constitution.md</w:t>
+        </w:r>
+      </w:hyperlink>
+      <w:r>
+        <w:t xml:space="preserve"> </w:t>
+      </w:r>
+      <w:r>
+        <w:t xml:space="preserve">§11.4.167. Non-compliance is a release blocker. No escape hatch — no</w:t>
+      </w:r>
+      <w:r>
+        <w:t xml:space="preserve"> </w:t>
+      </w:r>
+      <w:r>
+        <w:rPr>
+          <w:rStyle w:val="VerbatimChar"/>
+        </w:rPr>
+        <w:t xml:space="preserve">--full-clone-per-feature</w:t>
+      </w:r>
+      <w:r>
+        <w:t xml:space="preserve">,</w:t>
+      </w:r>
+      <w:r>
+        <w:t xml:space="preserve"> </w:t>
+      </w:r>
+      <w:r>
+        <w:rPr>
+          <w:rStyle w:val="VerbatimChar"/>
+        </w:rPr>
+        <w:t xml:space="preserve">--deep-copy-stream</w:t>
+      </w:r>
+      <w:r>
+        <w:t xml:space="preserve">,</w:t>
+      </w:r>
+      <w:r>
+        <w:t xml:space="preserve"> </w:t>
+      </w:r>
+      <w:r>
+        <w:rPr>
+          <w:rStyle w:val="VerbatimChar"/>
+        </w:rPr>
+        <w:t xml:space="preserve">--skip-cow-clone</w:t>
+      </w:r>
+      <w:r>
+        <w:t xml:space="preserve">,</w:t>
+      </w:r>
+      <w:r>
+        <w:t xml:space="preserve"> </w:t>
+      </w:r>
+      <w:r>
+        <w:rPr>
+          <w:rStyle w:val="VerbatimChar"/>
+        </w:rPr>
+        <w:t xml:space="preserve">--merge-feature-without-approval</w:t>
+      </w:r>
+      <w:r>
+        <w:t xml:space="preserve">,</w:t>
+      </w:r>
+      <w:r>
+        <w:t xml:space="preserve"> </w:t>
+      </w:r>
+      <w:r>
+        <w:rPr>
+          <w:rStyle w:val="VerbatimChar"/>
+        </w:rPr>
+        <w:t xml:space="preserve">--no-trunk-sync</w:t>
+      </w:r>
+      <w:r>
+        <w:t xml:space="preserve">,</w:t>
+      </w:r>
+      <w:r>
+        <w:t xml:space="preserve"> </w:t>
+      </w:r>
+      <w:r>
+        <w:rPr>
+          <w:rStyle w:val="VerbatimChar"/>
+        </w:rPr>
+        <w:t xml:space="preserve">--skip-submodule-cascade</w:t>
+      </w:r>
+      <w:r>
+        <w:t xml:space="preserve">,</w:t>
+      </w:r>
+      <w:r>
+        <w:t xml:space="preserve"> </w:t>
+      </w:r>
+      <w:r>
+        <w:rPr>
+          <w:rStyle w:val="VerbatimChar"/>
+        </w:rPr>
+        <w:t xml:space="preserve">--unbounded-parallel-builds</w:t>
+      </w:r>
+      <w:r>
+        <w:t xml:space="preserve">,</w:t>
+      </w:r>
+      <w:r>
+        <w:t xml:space="preserve"> </w:t>
+      </w:r>
+      <w:r>
+        <w:rPr>
+          <w:rStyle w:val="VerbatimChar"/>
+        </w:rPr>
+        <w:t xml:space="preserve">--shared-device-no-lock</w:t>
+      </w:r>
+      <w:r>
+        <w:t xml:space="preserve">,</w:t>
+      </w:r>
+      <w:r>
+        <w:t xml:space="preserve"> </w:t>
+      </w:r>
+      <w:r>
+        <w:rPr>
+          <w:rStyle w:val="VerbatimChar"/>
+        </w:rPr>
+        <w:t xml:space="preserve">--retire-unmerged-stream</w:t>
+      </w:r>
+      <w:r>
+        <w:t xml:space="preserve">,</w:t>
+      </w:r>
+      <w:r>
+        <w:t xml:space="preserve"> </w:t>
+      </w:r>
+      <w:r>
+        <w:rPr>
+          <w:rStyle w:val="VerbatimChar"/>
+        </w:rPr>
+        <w:t xml:space="preserve">--feature-stream-quality-carveout</w:t>
+      </w:r>
+      <w:r>
+        <w:t xml:space="preserve"> </w:t>
+      </w:r>
+      <w:r>
+        <w:t xml:space="preserve">flag.</w:t>
+      </w:r>
+    </w:p>
+    <w:p>
+      <w:pPr>
+        <w:pStyle w:val="BodyText"/>
+      </w:pPr>
+      <w:r>
+        <w:rPr>
+          <w:b/>
+          <w:bCs/>
+        </w:rPr>
+        <w:t xml:space="preserve">§11.4.168 — Exported-document independent content + textual + full-visual validation mandate (User mandate, 2026-06-23).</w:t>
+      </w:r>
+      <w:r>
+        <w:t xml:space="preserve"> </w:t>
+      </w:r>
+      <w:r>
+        <w:t xml:space="preserve">Compact summary: every generated/exported document (HTML / PDF / DOCX / any format in the §11.4.65 export scope) MUST pass INDEPENDENT validation by a review agent structurally separate from the generator (§11.4.70/§11.4.142, NEVER the author self-checking), on BOTH the source AND every exported artifact, ALWAYS, across THREE layers: (1) CONTENT — the export faithfully carries the source’s intent + data, nothing dropped/truncated/garbled; (2) TEXTUAL — human-readable, NO raw markup / diagram-source (Mermaid</w:t>
+      </w:r>
+      <w:r>
+        <w:t xml:space="preserve"> </w:t>
+      </w:r>
+      <w:r>
+        <w:rPr>
+          <w:rStyle w:val="VerbatimChar"/>
+        </w:rPr>
+        <w:t xml:space="preserve">gantt</w:t>
+      </w:r>
+      <w:r>
+        <w:t xml:space="preserve">/</w:t>
+      </w:r>
+      <w:r>
+        <w:rPr>
+          <w:rStyle w:val="VerbatimChar"/>
+        </w:rPr>
+        <w:t xml:space="preserve">graph</w:t>
+      </w:r>
+      <w:r>
+        <w:t xml:space="preserve">/</w:t>
+      </w:r>
+      <w:r>
+        <w:rPr>
+          <w:rStyle w:val="VerbatimChar"/>
+        </w:rPr>
+        <w:t xml:space="preserve">flowchart</w:t>
+      </w:r>
+      <w:r>
+        <w:t xml:space="preserve">/</w:t>
+      </w:r>
+      <w:r>
+        <w:rPr>
+          <w:rStyle w:val="VerbatimChar"/>
+        </w:rPr>
+        <w:t xml:space="preserve">sequenceDiagram</w:t>
+      </w:r>
+      <w:r>
+        <w:t xml:space="preserve"> </w:t>
+      </w:r>
+      <w:r>
+        <w:t xml:space="preserve">etc.) / unrendered code-fence leaking as body text (the exact 2026-06-23 raw-gantt-in-PDF failure); (3) FULL VISUAL — embedded diagrams render as IMAGES not source, layout intact, no overlap/cut-off/garble/collapse, verified by RENDERING the export (</w:t>
+      </w:r>
+      <w:r>
+        <w:rPr>
+          <w:rStyle w:val="VerbatimChar"/>
+        </w:rPr>
+        <w:t xml:space="preserve">pdftotext</w:t>
+      </w:r>
+      <w:r>
+        <w:t xml:space="preserve"> </w:t>
+      </w:r>
+      <w:r>
+        <w:t xml:space="preserve">catches raw source as text +</w:t>
+      </w:r>
+      <w:r>
+        <w:t xml:space="preserve"> </w:t>
+      </w:r>
+      <w:r>
+        <w:rPr>
+          <w:rStyle w:val="VerbatimChar"/>
+        </w:rPr>
+        <w:t xml:space="preserve">pdfimages</w:t>
+      </w:r>
+      <w:r>
+        <w:t xml:space="preserve"> </w:t>
+      </w:r>
+      <w:r>
+        <w:t xml:space="preserve">confirms rendered images +</w:t>
+      </w:r>
+      <w:r>
+        <w:t xml:space="preserve"> </w:t>
+      </w:r>
+      <w:r>
+        <w:rPr>
+          <w:rStyle w:val="VerbatimChar"/>
+        </w:rPr>
+        <w:t xml:space="preserve">pdftoppm</w:t>
+      </w:r>
+      <w:r>
+        <w:t xml:space="preserve">→OCR confirms human-readable visual content) with captured evidence per §11.4.5/§11.4.69/§11.4.107. Anti-bluff: a rubber-stamp is not validation; the analyzer is self-validated golden-good/golden-bad per §11.4.107(10) (a golden-bad export seeded with raw</w:t>
+      </w:r>
+      <w:r>
+        <w:t xml:space="preserve"> </w:t>
+      </w:r>
+      <w:r>
+        <w:rPr>
+          <w:rStyle w:val="VerbatimChar"/>
+        </w:rPr>
+        <w:t xml:space="preserve">gantt</w:t>
+      </w:r>
+      <w:r>
+        <w:t xml:space="preserve"> </w:t>
+      </w:r>
+      <w:r>
+        <w:t xml:space="preserve">source MUST FAIL); iterate to a clean GO per §11.4.134. Forensic FACT (2026-06-23): a</w:t>
+      </w:r>
+      <w:r>
+        <w:t xml:space="preserve"> </w:t>
+      </w:r>
+      <w:r>
+        <w:t xml:space="preserve">“green”</w:t>
+      </w:r>
+      <w:r>
+        <w:t xml:space="preserve"> </w:t>
+      </w:r>
+      <w:r>
+        <w:t xml:space="preserve">Mermaid fix shipped raw gantt source as readable text into user-facing PDFs because validation grepped the HTML for</w:t>
+      </w:r>
+      <w:r>
+        <w:t xml:space="preserve"> </w:t>
+      </w:r>
+      <w:r>
+        <w:rPr>
+          <w:rStyle w:val="VerbatimChar"/>
+        </w:rPr>
+        <w:t xml:space="preserve">class="mermaid"</w:t>
+      </w:r>
+      <w:r>
+        <w:t xml:space="preserve"> </w:t>
+      </w:r>
+      <w:r>
+        <w:t xml:space="preserve">and NEVER checked the exported PDF — operator caught it (§11.4.138). A generated doc shipping without this content+textual+visual validation, or containing raw diagram source / unreadable garble, is a §11.4 PASS-bluff at the documentation layer. Honest boundary (§11.4.6): confirms the exported artifact a reader opens is faithful/readable/visually-rendered — does NOT prove the source content is correct (§11.4.142/§11.4.135) nor replace the §11.4.65 mtime-parity freshness gate (this is the READABILITY/FIDELITY layer the mtime gate cannot see); FLAG_SECURE/un-rasterisable surfaces document the gap per §11.4.112 + §11.4.117 proxy oracle, never a faked visual PASS. Classification: universal (§11.4.17). Composes §11.4.65/.73/.107/.117/.135/.138/.142/.159/.163/.165/§1.1. Propagation gate</w:t>
+      </w:r>
+      <w:r>
+        <w:t xml:space="preserve"> </w:t>
+      </w:r>
+      <w:r>
+        <w:rPr>
+          <w:rStyle w:val="VerbatimChar"/>
+        </w:rPr>
+        <w:t xml:space="preserve">CM-COVENANT-114-168-PROPAGATION</w:t>
+      </w:r>
+      <w:r>
+        <w:t xml:space="preserve"> </w:t>
+      </w:r>
+      <w:r>
+        <w:t xml:space="preserve">(literal</w:t>
+      </w:r>
+      <w:r>
+        <w:t xml:space="preserve"> </w:t>
+      </w:r>
+      <w:r>
+        <w:rPr>
+          <w:rStyle w:val="VerbatimChar"/>
+        </w:rPr>
+        <w:t xml:space="preserve">11.4.168</w:t>
+      </w:r>
+      <w:r>
+        <w:t xml:space="preserve">) + recommended gate</w:t>
+      </w:r>
+      <w:r>
+        <w:t xml:space="preserve"> </w:t>
+      </w:r>
+      <w:r>
+        <w:rPr>
+          <w:rStyle w:val="VerbatimChar"/>
+        </w:rPr>
+        <w:t xml:space="preserve">CM-EXPORTED-DOC-VISUALLY-VALIDATED</w:t>
+      </w:r>
+      <w:r>
+        <w:t xml:space="preserve"> </w:t>
+      </w:r>
+      <w:r>
+        <w:t xml:space="preserve">+ paired §1.1 mutation (a PDF/HTML/DOCX containing raw diagram source as body text → gate FAILs).</w:t>
+      </w:r>
+      <w:r>
+        <w:t xml:space="preserve"> </w:t>
+      </w:r>
+      <w:r>
+        <w:rPr>
+          <w:b/>
+          <w:bCs/>
+        </w:rPr>
+        <w:t xml:space="preserve">Canonical authority:</w:t>
+      </w:r>
+      <w:r>
+        <w:t xml:space="preserve"> </w:t>
+      </w:r>
+      <w:r>
+        <w:t xml:space="preserve">constitution submodule</w:t>
+      </w:r>
+      <w:r>
+        <w:t xml:space="preserve"> </w:t>
+      </w:r>
+      <w:hyperlink r:id="rId69">
+        <w:r>
+          <w:rPr>
+            <w:rStyle w:val="VerbatimChar"/>
+          </w:rPr>
+          <w:t xml:space="preserve">Constitution.md</w:t>
+        </w:r>
+      </w:hyperlink>
+      <w:r>
+        <w:t xml:space="preserve"> </w:t>
+      </w:r>
+      <w:r>
+        <w:t xml:space="preserve">§11.4.168. Non-compliance is a release blocker. No escape hatch — no</w:t>
+      </w:r>
+      <w:r>
+        <w:t xml:space="preserve"> </w:t>
+      </w:r>
+      <w:r>
+        <w:rPr>
+          <w:rStyle w:val="VerbatimChar"/>
+        </w:rPr>
+        <w:t xml:space="preserve">--skip-visual-validation</w:t>
+      </w:r>
+      <w:r>
+        <w:t xml:space="preserve">,</w:t>
+      </w:r>
+      <w:r>
+        <w:t xml:space="preserve"> </w:t>
+      </w:r>
+      <w:r>
+        <w:rPr>
+          <w:rStyle w:val="VerbatimChar"/>
+        </w:rPr>
+        <w:t xml:space="preserve">--raw-source-in-pdf-ok</w:t>
+      </w:r>
+      <w:r>
+        <w:t xml:space="preserve">,</w:t>
+      </w:r>
+      <w:r>
+        <w:t xml:space="preserve"> </w:t>
+      </w:r>
+      <w:r>
+        <w:rPr>
+          <w:rStyle w:val="VerbatimChar"/>
+        </w:rPr>
+        <w:t xml:space="preserve">--textual-check-suffices</w:t>
+      </w:r>
+      <w:r>
+        <w:t xml:space="preserve">,</w:t>
+      </w:r>
+      <w:r>
+        <w:t xml:space="preserve"> </w:t>
+      </w:r>
+      <w:r>
+        <w:rPr>
+          <w:rStyle w:val="VerbatimChar"/>
+        </w:rPr>
+        <w:t xml:space="preserve">--self-validate-export</w:t>
+      </w:r>
+      <w:r>
+        <w:t xml:space="preserve">,</w:t>
+      </w:r>
+      <w:r>
+        <w:t xml:space="preserve"> </w:t>
+      </w:r>
+      <w:r>
+        <w:rPr>
+          <w:rStyle w:val="VerbatimChar"/>
+        </w:rPr>
+        <w:t xml:space="preserve">--diagram-source-as-text-ok</w:t>
+      </w:r>
+      <w:r>
+        <w:t xml:space="preserve"> </w:t>
+      </w:r>
+      <w:r>
+        <w:t xml:space="preserve">flag.</w:t>
       </w:r>
     </w:p>
     <w:bookmarkEnd w:id="114"/>

</xml_diff>

<commit_message>
gov: nest reusable engine token_optimizer @0ca0987 into constitution/submodules/ (§11.4.28(C) depth-1 carve-out — helix-deps.yaml present + zero nested submodules verified; universal §11.4.17) + sync amendment governance exports (§11.4.65 — a2fc127 .md html/pdf/docx siblings)
</commit_message>
<xml_diff>
--- a/AGENTS.docx
+++ b/AGENTS.docx
@@ -44705,22 +44705,22 @@
         <w:rPr>
           <w:rStyle w:val="VerbatimChar"/>
         </w:rPr>
-        <w:t xml:space="preserve">(T&lt;N&gt;/&lt;branch&gt;)</w:t>
-      </w:r>
-      <w:r>
-        <w:t xml:space="preserve"> </w:t>
-      </w:r>
-      <w:r>
-        <w:t xml:space="preserve">prefix identifying the track + git branch (e.g.</w:t>
-      </w:r>
-      <w:r>
-        <w:t xml:space="preserve"> </w:t>
-      </w:r>
-      <w:r>
-        <w:rPr>
-          <w:rStyle w:val="VerbatimChar"/>
-        </w:rPr>
-        <w:t xml:space="preserve">(T1/main) ATM-312 MPV drm_prime investigation</w:t>
+        <w:t xml:space="preserve">(T&lt;N&gt;/&lt;branch&gt; - &lt;alias&gt;)</w:t>
+      </w:r>
+      <w:r>
+        <w:t xml:space="preserve"> </w:t>
+      </w:r>
+      <w:r>
+        <w:t xml:space="preserve">prefix identifying the track + git branch + the claude-toolkit alias in use (e.g.</w:t>
+      </w:r>
+      <w:r>
+        <w:t xml:space="preserve"> </w:t>
+      </w:r>
+      <w:r>
+        <w:rPr>
+          <w:rStyle w:val="VerbatimChar"/>
+        </w:rPr>
+        <w:t xml:space="preserve">(T1/main - claude1) ATM-312 MPV drm_prime investigation</w:t>
       </w:r>
       <w:r>
         <w:t xml:space="preserve">,</w:t>
@@ -44732,7 +44732,7 @@
         <w:rPr>
           <w:rStyle w:val="VerbatimChar"/>
         </w:rPr>
-        <w:t xml:space="preserve">(T2/feature/mistiq-vader) SPK-XXX ...</w:t>
+        <w:t xml:space="preserve">(T2/feature/mistiq-vader - deepseek) SPK-XXX ...</w:t>
       </w:r>
       <w:r>
         <w:t xml:space="preserve">) so parallel-track work (</w:t>
@@ -44744,7 +44744,7 @@
         <w:t xml:space="preserve">/mnt/track1..4</w:t>
       </w:r>
       <w:r>
-        <w:t xml:space="preserve">, each on its own branch) is never ambiguous; (1) universal label form on every agent-dispatch description, status report, resume/handoff doc, progress line; (2) DETERMINISTIC derivation never guessed (§11.4.6) —</w:t>
+        <w:t xml:space="preserve">, each on its own branch, each driven by a distinct toolkit alias) is never ambiguous; (1) universal label form on every agent-dispatch description, status report, resume/handoff doc, progress line; (2) DETERMINISTIC derivation never guessed (§11.4.6) —</w:t>
       </w:r>
       <w:r>
         <w:t xml:space="preserve"> </w:t>
@@ -44816,10 +44816,82 @@
         <w:t xml:space="preserve">git rev-parse --abbrev-ref HEAD</w:t>
       </w:r>
       <w:r>
-        <w:t xml:space="preserve"> </w:t>
-      </w:r>
-      <w:r>
-        <w:t xml:space="preserve">(reference labeler</w:t>
+        <w:t xml:space="preserve">,</w:t>
+      </w:r>
+      <w:r>
+        <w:t xml:space="preserve"> </w:t>
+      </w:r>
+      <w:r>
+        <w:rPr>
+          <w:rStyle w:val="VerbatimChar"/>
+        </w:rPr>
+        <w:t xml:space="preserve">&lt;alias&gt;</w:t>
+      </w:r>
+      <w:r>
+        <w:t xml:space="preserve"> </w:t>
+      </w:r>
+      <w:r>
+        <w:t xml:space="preserve">from</w:t>
+      </w:r>
+      <w:r>
+        <w:t xml:space="preserve"> </w:t>
+      </w:r>
+      <w:r>
+        <w:rPr>
+          <w:rStyle w:val="VerbatimChar"/>
+        </w:rPr>
+        <w:t xml:space="preserve">CLAUDE_CONFIG_DIR</w:t>
+      </w:r>
+      <w:r>
+        <w:t xml:space="preserve"> </w:t>
+      </w:r>
+      <w:r>
+        <w:t xml:space="preserve">basename</w:t>
+      </w:r>
+      <w:r>
+        <w:t xml:space="preserve"> </w:t>
+      </w:r>
+      <w:r>
+        <w:rPr>
+          <w:rStyle w:val="VerbatimChar"/>
+        </w:rPr>
+        <w:t xml:space="preserve">.claude-&lt;alias&gt;</w:t>
+      </w:r>
+      <w:r>
+        <w:t xml:space="preserve"> </w:t>
+      </w:r>
+      <w:r>
+        <w:t xml:space="preserve">→</w:t>
+      </w:r>
+      <w:r>
+        <w:t xml:space="preserve"> </w:t>
+      </w:r>
+      <w:r>
+        <w:rPr>
+          <w:rStyle w:val="VerbatimChar"/>
+        </w:rPr>
+        <w:t xml:space="preserve">&lt;alias&gt;</w:t>
+      </w:r>
+      <w:r>
+        <w:t xml:space="preserve"> </w:t>
+      </w:r>
+      <w:r>
+        <w:t xml:space="preserve">(honest</w:t>
+      </w:r>
+      <w:r>
+        <w:t xml:space="preserve"> </w:t>
+      </w:r>
+      <w:r>
+        <w:rPr>
+          <w:rStyle w:val="VerbatimChar"/>
+        </w:rPr>
+        <w:t xml:space="preserve">?</w:t>
+      </w:r>
+      <w:r>
+        <w:t xml:space="preserve"> </w:t>
+      </w:r>
+      <w:r>
+        <w:t xml:space="preserve">when unset/non-matching, never a guessed name) (reference labeler</w:t>
       </w:r>
       <w:r>
         <w:t xml:space="preserve"> </w:t>
@@ -44939,7 +45011,7 @@
         <w:t xml:space="preserve"> </w:t>
       </w:r>
       <w:r>
-        <w:t xml:space="preserve">field is a valid honest label, never a bluff, and the enforced numeric-track format surfaces (blocks) an off-track dispatch rather than mislabeling it. Classification: universal (§11.4.17). Composes §11.4.178 (track-qualified identity — the label-prefix instantiation applied to every agent/subagent label + operator-facing reference) / §11.4.29 / §11.4.75 / §11.4.109 / §11.4.177 / §11.4.6 / §11.4.58 / §11.4.103 / §11.4.119 / §11.4.116 / §11.4.147. Propagation gate</w:t>
+        <w:t xml:space="preserve">in the track OR the alias field is a valid honest label, never a bluff, and the enforced numeric-track format surfaces (blocks) an off-track dispatch rather than mislabeling it. Classification: universal (§11.4.17). Composes §11.4.178 (track-qualified identity — the label-prefix instantiation applied to every agent/subagent label + operator-facing reference) / §11.4.29 / §11.4.75 / §11.4.109 / §11.4.177 / §11.4.6 / §11.4.58 / §11.4.103 / §11.4.119 / §11.4.116 / §11.4.147. Propagation gate</w:t>
       </w:r>
       <w:r>
         <w:t xml:space="preserve"> </w:t>

</xml_diff>

<commit_message>
docs(§11.4.65 export-sync): §11.4.184 governance exports + gitignore golden-fixture renders
Completes the export-sync for the §11.4.184 SonarQube mandate (sources landed at
b816e66; the 5 governance docs' .docx/.html/.pdf renders were regenerated-but-
uncommitted — all verified to contain 11.4.184). Plus §11.4.30/§11.4.65-EXCLUDED
.gitignore for stray golden-fixture plan.{docx,html,pdf} renders a broad export
sweep wrongly produced under scripts/doc_integrity/internal/selfcheck/golden/.
No .md source touched (governance rules unchanged). Classification: universal.

Co-Authored-By: Claude Opus 4.8 <noreply@anthropic.com>
</commit_message>
<xml_diff>
--- a/AGENTS.docx
+++ b/AGENTS.docx
@@ -46263,6 +46263,408 @@
           <w:rStyle w:val="VerbatimChar"/>
         </w:rPr>
         <w:t xml:space="preserve">--autonomous-only-completion</w:t>
+      </w:r>
+      <w:r>
+        <w:t xml:space="preserve"> </w:t>
+      </w:r>
+      <w:r>
+        <w:t xml:space="preserve">flag.</w:t>
+      </w:r>
+    </w:p>
+    <w:p>
+      <w:pPr>
+        <w:pStyle w:val="BodyText"/>
+      </w:pPr>
+      <w:r>
+        <w:rPr>
+          <w:b/>
+          <w:bCs/>
+        </w:rPr>
+        <w:t xml:space="preserve">§11.4.186 — Anti-divergence enforcement: cross-document consistency is a mandatory-before-export/commit gate, never an after-the-fact audit (research-derived, 2026-07-08).</w:t>
+      </w:r>
+      <w:r>
+        <w:t xml:space="preserve"> </w:t>
+      </w:r>
+      <w:r>
+        <w:t xml:space="preserve">Compact summary: any project maintaining more than one representation of the same tracked data (a delivery plan + its MVP brief + a workable-items DB + their summaries +</w:t>
+      </w:r>
+      <w:r>
+        <w:t xml:space="preserve"> </w:t>
+      </w:r>
+      <w:r>
+        <w:rPr>
+          <w:rStyle w:val="VerbatimChar"/>
+        </w:rPr>
+        <w:t xml:space="preserve">.md</w:t>
+      </w:r>
+      <w:r>
+        <w:t xml:space="preserve">/</w:t>
+      </w:r>
+      <w:r>
+        <w:rPr>
+          <w:rStyle w:val="VerbatimChar"/>
+        </w:rPr>
+        <w:t xml:space="preserve">.html</w:t>
+      </w:r>
+      <w:r>
+        <w:t xml:space="preserve">/</w:t>
+      </w:r>
+      <w:r>
+        <w:rPr>
+          <w:rStyle w:val="VerbatimChar"/>
+        </w:rPr>
+        <w:t xml:space="preserve">.pdf</w:t>
+      </w:r>
+      <w:r>
+        <w:t xml:space="preserve">/</w:t>
+      </w:r>
+      <w:r>
+        <w:rPr>
+          <w:rStyle w:val="VerbatimChar"/>
+        </w:rPr>
+        <w:t xml:space="preserve">.docx</w:t>
+      </w:r>
+      <w:r>
+        <w:t xml:space="preserve"> </w:t>
+      </w:r>
+      <w:r>
+        <w:t xml:space="preserve">exports) MUST enforce cross-document CONSISTENCY as a deterministic gate that runs BEFORE any export render, any doc/DB sync</w:t>
+      </w:r>
+      <w:r>
+        <w:t xml:space="preserve"> </w:t>
+      </w:r>
+      <w:r>
+        <w:rPr>
+          <w:rStyle w:val="VerbatimChar"/>
+        </w:rPr>
+        <w:t xml:space="preserve">verify</w:t>
+      </w:r>
+      <w:r>
+        <w:t xml:space="preserve">, and any doc-set commit — NEVER as an after-the-fact human audit that runs only when an operator happens to ask (the forensic FACT: the same NanoKVM/phone-as-screen feature appeared in three plan clusters — one shared ticket SPK-596 across SIX rows split over TWO releases, and a carve-out due to ship 2026-08-31 whose own prerequisite does not START until 2026-10-05 — and NO gate caught it; only an operator's manual read of</w:t>
+      </w:r>
+      <w:r>
+        <w:t xml:space="preserve"> </w:t>
+      </w:r>
+      <w:r>
+        <w:rPr>
+          <w:rStyle w:val="VerbatimChar"/>
+        </w:rPr>
+        <w:t xml:space="preserve">Plan_v9.0.xlsx</w:t>
+      </w:r>
+      <w:r>
+        <w:t xml:space="preserve"> </w:t>
+      </w:r>
+      <w:r>
+        <w:t xml:space="preserve">surfaced it, after the divergent bytes had already exported). (1)</w:t>
+      </w:r>
+      <w:r>
+        <w:t xml:space="preserve"> </w:t>
+      </w:r>
+      <w:r>
+        <w:rPr>
+          <w:b/>
+          <w:bCs/>
+        </w:rPr>
+        <w:t xml:space="preserve">One no-divergence verdict, three seams</w:t>
+      </w:r>
+      <w:r>
+        <w:t xml:space="preserve"> </w:t>
+      </w:r>
+      <w:r>
+        <w:t xml:space="preserve">— a single deterministic PASS/FAIL/SKIP verdict (built by composing a cross-document integrity validator with the workable-items-DB internal</w:t>
+      </w:r>
+      <w:r>
+        <w:t xml:space="preserve"> </w:t>
+      </w:r>
+      <w:r>
+        <w:rPr>
+          <w:rStyle w:val="VerbatimChar"/>
+        </w:rPr>
+        <w:t xml:space="preserve">validate</w:t>
+      </w:r>
+      <w:r>
+        <w:t xml:space="preserve">) gates all three write-seams (export / sync-verify / commit); a FAIL at any seam refuses that seam, naming the exact offending records (§11.4.6 actionable). (2)</w:t>
+      </w:r>
+      <w:r>
+        <w:t xml:space="preserve"> </w:t>
+      </w:r>
+      <w:r>
+        <w:rPr>
+          <w:b/>
+          <w:bCs/>
+        </w:rPr>
+        <w:t xml:space="preserve">Five decidable check families</w:t>
+      </w:r>
+      <w:r>
+        <w:t xml:space="preserve"> </w:t>
+      </w:r>
+      <w:r>
+        <w:t xml:space="preserve">— DEDUP (no two records describe one feature with divergent timeline/status/release, keyed on ticket OR normalised</w:t>
+      </w:r>
+      <w:r>
+        <w:t xml:space="preserve"> </w:t>
+      </w:r>
+      <w:r>
+        <w:rPr>
+          <w:rStyle w:val="VerbatimChar"/>
+        </w:rPr>
+        <w:t xml:space="preserve">(subject, scope)</w:t>
+      </w:r>
+      <w:r>
+        <w:t xml:space="preserve">, NOT bare subject substring), TIMELINE (start ≤ deadline; no deadline-before-dependency; no dependency cycle; GATED exempt-but-marked), CROSS-DOC (the same item across every representation carries identical timeline/status/type against a NAMED authoritative source), INTEGRITY (no orphan refs; Status↔Type §11.4.33; location↔status), STRUCTURAL (required columns; ID uniqueness+monotonicity §11.4.54). (3)</w:t>
+      </w:r>
+      <w:r>
+        <w:t xml:space="preserve"> </w:t>
+      </w:r>
+      <w:r>
+        <w:rPr>
+          <w:b/>
+          <w:bCs/>
+        </w:rPr>
+        <w:t xml:space="preserve">Drift-proof trigger</w:t>
+      </w:r>
+      <w:r>
+        <w:t xml:space="preserve"> </w:t>
+      </w:r>
+      <w:r>
+        <w:t xml:space="preserve">— a §11.4.86 sha256-of-sorted-members fingerprint of the authoritative inputs re-arms the gate on ANY input change, so a stale verify cannot pass on changed data. (4)</w:t>
+      </w:r>
+      <w:r>
+        <w:t xml:space="preserve"> </w:t>
+      </w:r>
+      <w:r>
+        <w:rPr>
+          <w:b/>
+          <w:bCs/>
+        </w:rPr>
+        <w:t xml:space="preserve">Self-validated analyzer (§11.4.107(10))</w:t>
+      </w:r>
+      <w:r>
+        <w:t xml:space="preserve"> </w:t>
+      </w:r>
+      <w:r>
+        <w:t xml:space="preserve">— the validator ships golden-good (MUST PASS) + one golden-bad per family (MUST FAIL, pinpointing the offender) + a negative-control (distinct same-subject tasks that MUST PASS — the false-positive guard); a validator that passes its golden-bad, or fails golden-good/the negative-control, is itself a §11.4 bluff and a release blocker. (5)</w:t>
+      </w:r>
+      <w:r>
+        <w:t xml:space="preserve"> </w:t>
+      </w:r>
+      <w:r>
+        <w:rPr>
+          <w:b/>
+          <w:bCs/>
+        </w:rPr>
+        <w:t xml:space="preserve">Reusable + decoupled (§11.4.28/.31)</w:t>
+      </w:r>
+      <w:r>
+        <w:t xml:space="preserve"> </w:t>
+      </w:r>
+      <w:r>
+        <w:t xml:space="preserve">— packaged as a depth-1 reusable engine under the constitution submodule per the §11.4.28(C) carve-out with a</w:t>
+      </w:r>
+      <w:r>
+        <w:t xml:space="preserve"> </w:t>
+      </w:r>
+      <w:r>
+        <w:rPr>
+          <w:rStyle w:val="VerbatimChar"/>
+        </w:rPr>
+        <w:t xml:space="preserve">helix-deps.yaml</w:t>
+      </w:r>
+      <w:r>
+        <w:t xml:space="preserve">; project-specific doc-sets + authoritative-source bindings live in a consumer-owned checkset (data, never engine code). (6)</w:t>
+      </w:r>
+      <w:r>
+        <w:t xml:space="preserve"> </w:t>
+      </w:r>
+      <w:r>
+        <w:rPr>
+          <w:b/>
+          <w:bCs/>
+        </w:rPr>
+        <w:t xml:space="preserve">Supersedes ad-hoc audits</w:t>
+      </w:r>
+      <w:r>
+        <w:t xml:space="preserve"> </w:t>
+      </w:r>
+      <w:r>
+        <w:t xml:space="preserve">— the per-cycle</w:t>
+      </w:r>
+      <w:r>
+        <w:t xml:space="preserve"> </w:t>
+      </w:r>
+      <w:r>
+        <w:rPr>
+          <w:rStyle w:val="VerbatimChar"/>
+        </w:rPr>
+        <w:t xml:space="preserve">*_INTEGRITY_FINDINGS.md</w:t>
+      </w:r>
+      <w:r>
+        <w:t xml:space="preserve"> </w:t>
+      </w:r>
+      <w:r>
+        <w:t xml:space="preserve">/</w:t>
+      </w:r>
+      <w:r>
+        <w:t xml:space="preserve"> </w:t>
+      </w:r>
+      <w:r>
+        <w:rPr>
+          <w:rStyle w:val="VerbatimChar"/>
+        </w:rPr>
+        <w:t xml:space="preserve">RECONCILIATION_*.md</w:t>
+      </w:r>
+      <w:r>
+        <w:t xml:space="preserve"> </w:t>
+      </w:r>
+      <w:r>
+        <w:t xml:space="preserve">after-the-fact audit docs are retired in favour of the gate; honest boundary §11.4.6 — the gate proves internal CONSISTENCY (no record diverges, no timeline is incoherent, every ref resolves), NOT plan CORRECTNESS (achievability/date-rightness stay operator/management decisions the gate SURFACES, never MAKES). Classification: universal (§11.4.17). Composes §11.4.6/.12/.33/.44/.50/.53/.54/.60/.65/.73/.75/.85/.86/.91/.93/.95/.106/.107/.108/.110/.148/.176. Propagation gate</w:t>
+      </w:r>
+      <w:r>
+        <w:t xml:space="preserve"> </w:t>
+      </w:r>
+      <w:r>
+        <w:rPr>
+          <w:rStyle w:val="VerbatimChar"/>
+        </w:rPr>
+        <w:t xml:space="preserve">CM-COVENANT-114-186-PROPAGATION</w:t>
+      </w:r>
+      <w:r>
+        <w:t xml:space="preserve"> </w:t>
+      </w:r>
+      <w:r>
+        <w:t xml:space="preserve">(literal</w:t>
+      </w:r>
+      <w:r>
+        <w:t xml:space="preserve"> </w:t>
+      </w:r>
+      <w:r>
+        <w:rPr>
+          <w:rStyle w:val="VerbatimChar"/>
+        </w:rPr>
+        <w:t xml:space="preserve">11.4.186</w:t>
+      </w:r>
+      <w:r>
+        <w:t xml:space="preserve">) + recommended gate</w:t>
+      </w:r>
+      <w:r>
+        <w:t xml:space="preserve"> </w:t>
+      </w:r>
+      <w:r>
+        <w:rPr>
+          <w:rStyle w:val="VerbatimChar"/>
+        </w:rPr>
+        <w:t xml:space="preserve">CM-DOC-INTEGRITY-VALIDATION</w:t>
+      </w:r>
+      <w:r>
+        <w:t xml:space="preserve"> </w:t>
+      </w:r>
+      <w:r>
+        <w:t xml:space="preserve">(5 invariants: validator present+executable; consumer checkset present; the no-divergence gate wired into each of the three seams; fingerprint sidecar fresh;</w:t>
+      </w:r>
+      <w:r>
+        <w:t xml:space="preserve"> </w:t>
+      </w:r>
+      <w:r>
+        <w:rPr>
+          <w:rStyle w:val="VerbatimChar"/>
+        </w:rPr>
+        <w:t xml:space="preserve">selfcheck</w:t>
+      </w:r>
+      <w:r>
+        <w:t xml:space="preserve"> </w:t>
+      </w:r>
+      <w:r>
+        <w:t xml:space="preserve">golden-good/golden-bad/negative-control wired into meta-test) + paired §1.1 mutation.</w:t>
+      </w:r>
+      <w:r>
+        <w:t xml:space="preserve"> </w:t>
+      </w:r>
+      <w:r>
+        <w:rPr>
+          <w:b/>
+          <w:bCs/>
+        </w:rPr>
+        <w:t xml:space="preserve">Canonical authority:</w:t>
+      </w:r>
+      <w:r>
+        <w:t xml:space="preserve"> </w:t>
+      </w:r>
+      <w:r>
+        <w:t xml:space="preserve">constitution submodule</w:t>
+      </w:r>
+      <w:r>
+        <w:t xml:space="preserve"> </w:t>
+      </w:r>
+      <w:hyperlink r:id="rId70">
+        <w:r>
+          <w:rPr>
+            <w:rStyle w:val="VerbatimChar"/>
+          </w:rPr>
+          <w:t xml:space="preserve">Constitution.md</w:t>
+        </w:r>
+      </w:hyperlink>
+      <w:r>
+        <w:t xml:space="preserve"> </w:t>
+      </w:r>
+      <w:r>
+        <w:t xml:space="preserve">§11.4.186. Non-compliance is a release blocker. No escape hatch — no</w:t>
+      </w:r>
+      <w:r>
+        <w:t xml:space="preserve"> </w:t>
+      </w:r>
+      <w:r>
+        <w:rPr>
+          <w:rStyle w:val="VerbatimChar"/>
+        </w:rPr>
+        <w:t xml:space="preserve">--skip-divergence-gate</w:t>
+      </w:r>
+      <w:r>
+        <w:t xml:space="preserve">,</w:t>
+      </w:r>
+      <w:r>
+        <w:t xml:space="preserve"> </w:t>
+      </w:r>
+      <w:r>
+        <w:rPr>
+          <w:rStyle w:val="VerbatimChar"/>
+        </w:rPr>
+        <w:t xml:space="preserve">--audit-after-export-OK</w:t>
+      </w:r>
+      <w:r>
+        <w:t xml:space="preserve">,</w:t>
+      </w:r>
+      <w:r>
+        <w:t xml:space="preserve"> </w:t>
+      </w:r>
+      <w:r>
+        <w:rPr>
+          <w:rStyle w:val="VerbatimChar"/>
+        </w:rPr>
+        <w:t xml:space="preserve">--cross-doc-check-not-applicable</w:t>
+      </w:r>
+      <w:r>
+        <w:t xml:space="preserve">,</w:t>
+      </w:r>
+      <w:r>
+        <w:t xml:space="preserve"> </w:t>
+      </w:r>
+      <w:r>
+        <w:rPr>
+          <w:rStyle w:val="VerbatimChar"/>
+        </w:rPr>
+        <w:t xml:space="preserve">--unvalidated-analyzer-OK</w:t>
+      </w:r>
+      <w:r>
+        <w:t xml:space="preserve">,</w:t>
+      </w:r>
+      <w:r>
+        <w:t xml:space="preserve"> </w:t>
+      </w:r>
+      <w:r>
+        <w:rPr>
+          <w:rStyle w:val="VerbatimChar"/>
+        </w:rPr>
+        <w:t xml:space="preserve">--divergent-commit-OK</w:t>
       </w:r>
       <w:r>
         <w:t xml:space="preserve"> </w:t>

</xml_diff>

<commit_message>
docs(§11.4.65): regenerate + commit governance + guard-doc exports (the 85554dd deferred sync_all cap-abort follow-up)
The docs-chain 1800-cap fix (parent 5394448) unblocked sync_all_markdown_exports.sh (was exit-4 aborting on the §11.4.186 golden fixtures). Committing exports-only: (a) root AGENTS/CLAUDE/Constitution/GEMINI/QWEN .html/.pdf/.docx that the §11.4.191 landing (85554dd) explicitly deferred to 'the known sync_all cap-abort follow-up'; (b) the guard-work-track-binding / guard-forbidden-commands / multitrack_work_binding docs/scripts exports (companions to the .md committed at 8f728fb/5ab2986). pandoc 3.10 + weasyprint 69.0, 0 failed (§11.4.106 no faked transforms). No source changes bundled. No force-push (§11.4.113).

Co-Authored-By: Claude Opus 4.8 <noreply@anthropic.com>
</commit_message>
<xml_diff>
--- a/AGENTS.docx
+++ b/AGENTS.docx
@@ -75,7 +75,7 @@
               <w:pStyle w:val="Compact"/>
             </w:pPr>
             <w:r>
-              <w:t xml:space="preserve">39</w:t>
+              <w:t xml:space="preserve">42</w:t>
             </w:r>
           </w:p>
         </w:tc>
@@ -123,7 +123,7 @@
               <w:pStyle w:val="Compact"/>
             </w:pPr>
             <w:r>
-              <w:t xml:space="preserve">2026-07-09T11:37:44Z</w:t>
+              <w:t xml:space="preserve">2026-07-10T18:45:00Z</w:t>
             </w:r>
           </w:p>
         </w:tc>
@@ -171,7 +171,325 @@
               <w:pStyle w:val="Compact"/>
             </w:pPr>
             <w:r>
-              <w:t xml:space="preserve">Added §11.4.187 — Automatic multi-track ruler orchestration (User mandate 2026-07-04; landed 2026-07-09): every project incorporating this constitution MUST ship its multi-track parallel-development orchestration as a UNIVERSAL, AUTOMATIC, OUT-OF-THE-BOX, INHERITED capability, not a per-project reimplementation, via a single conductor session that programmatically spawns/drives/resumes/monitors/controls per-track headless workers (native headless</w:t>
+              <w:t xml:space="preserve">Added §11.4.191 — Work-to-track/branch binding enforcement: a logic-group's work can NEVER be committed OR dispatched onto the wrong track/branch (research-derived 2026-07-10): every logical group of workable items binds to EXACTLY ONE canonical</w:t>
+            </w:r>
+            <w:r>
+              <w:t xml:space="preserve"> </w:t>
+            </w:r>
+            <w:r>
+              <w:rPr>
+                <w:rStyle w:val="VerbatimChar"/>
+              </w:rPr>
+              <w:t xml:space="preserve">(track, branch)</w:t>
+            </w:r>
+            <w:r>
+              <w:t xml:space="preserve"> </w:t>
+            </w:r>
+            <w:r>
+              <w:t xml:space="preserve">recorded ONCE in the §11.4.93 workable-items DB (</w:t>
+            </w:r>
+            <w:r>
+              <w:rPr>
+                <w:rStyle w:val="VerbatimChar"/>
+              </w:rPr>
+              <w:t xml:space="preserve">logic_groups.destination</w:t>
+            </w:r>
+            <w:r>
+              <w:t xml:space="preserve"> </w:t>
+            </w:r>
+            <w:r>
+              <w:t xml:space="preserve">authoritative branch + a</w:t>
+            </w:r>
+            <w:r>
+              <w:t xml:space="preserve"> </w:t>
+            </w:r>
+            <w:r>
+              <w:rPr>
+                <w:rStyle w:val="VerbatimChar"/>
+              </w:rPr>
+              <w:t xml:space="preserve">canonical_track</w:t>
+            </w:r>
+            <w:r>
+              <w:t xml:space="preserve"> </w:t>
+            </w:r>
+            <w:r>
+              <w:t xml:space="preserve">column + a</w:t>
+            </w:r>
+            <w:r>
+              <w:t xml:space="preserve"> </w:t>
+            </w:r>
+            <w:r>
+              <w:rPr>
+                <w:rStyle w:val="VerbatimChar"/>
+              </w:rPr>
+              <w:t xml:space="preserve">group_paths</w:t>
+            </w:r>
+            <w:r>
+              <w:t xml:space="preserve"> </w:t>
+            </w:r>
+            <w:r>
+              <w:t xml:space="preserve">file-scope manifest), and NO change belonging to a group may LAND on nor be DISPATCHED to a track/branch other than that group's canonical one — the file-scope generalisation of §11.4.181/.182 from branch-NAME to work-PLACEMENT consistency (forensic FACT 2026-07-10: scrcpy/Remote-app work — group</w:t>
+            </w:r>
+            <w:r>
+              <w:t xml:space="preserve"> </w:t>
+            </w:r>
+            <w:r>
+              <w:rPr>
+                <w:rStyle w:val="VerbatimChar"/>
+              </w:rPr>
+              <w:t xml:space="preserve">mistiq-vader</w:t>
+            </w:r>
+            <w:r>
+              <w:t xml:space="preserve">, canonical</w:t>
+            </w:r>
+            <w:r>
+              <w:t xml:space="preserve"> </w:t>
+            </w:r>
+            <w:r>
+              <w:rPr>
+                <w:rStyle w:val="VerbatimChar"/>
+              </w:rPr>
+              <w:t xml:space="preserve">feature/mistiq-vader</w:t>
+            </w:r>
+            <w:r>
+              <w:t xml:space="preserve">/T2 — was committed onto</w:t>
+            </w:r>
+            <w:r>
+              <w:t xml:space="preserve"> </w:t>
+            </w:r>
+            <w:r>
+              <w:rPr>
+                <w:rStyle w:val="VerbatimChar"/>
+              </w:rPr>
+              <w:t xml:space="preserve">main</w:t>
+            </w:r>
+            <w:r>
+              <w:t xml:space="preserve">/T1; §11.4.181's</w:t>
+            </w:r>
+            <w:r>
+              <w:t xml:space="preserve"> </w:t>
+            </w:r>
+            <w:r>
+              <w:rPr>
+                <w:rStyle w:val="VerbatimChar"/>
+              </w:rPr>
+              <w:t xml:space="preserve">guard-branch-consistency.sh</w:t>
+            </w:r>
+            <w:r>
+              <w:t xml:space="preserve"> </w:t>
+            </w:r>
+            <w:r>
+              <w:t xml:space="preserve">never fired because committing onto an existing branch is not a feature-branch CREATE, no gate checked which FILES land on which BRANCH); (1) single source of truth looked-up-never-reinvented (§11.4.6); (2) preventive PreToolUse hook</w:t>
+            </w:r>
+            <w:r>
+              <w:t xml:space="preserve"> </w:t>
+            </w:r>
+            <w:r>
+              <w:rPr>
+                <w:rStyle w:val="VerbatimChar"/>
+              </w:rPr>
+              <w:t xml:space="preserve">guard-work-track-binding.sh</w:t>
+            </w:r>
+            <w:r>
+              <w:t xml:space="preserve"> </w:t>
+            </w:r>
+            <w:r>
+              <w:t xml:space="preserve">(§11.4.109/.177, BLOCKS a git-commit-class Bash call OR an Agent/Task dispatch whose file-scope/label track+branch ≠ canonical; fail-closed on unreadable registry); (3) detective gate</w:t>
+            </w:r>
+            <w:r>
+              <w:t xml:space="preserve"> </w:t>
+            </w:r>
+            <w:r>
+              <w:rPr>
+                <w:rStyle w:val="VerbatimChar"/>
+              </w:rPr>
+              <w:t xml:space="preserve">CM-WORK-TRACK-BINDING-ENFORCED</w:t>
+            </w:r>
+            <w:r>
+              <w:t xml:space="preserve"> </w:t>
+            </w:r>
+            <w:r>
+              <w:t xml:space="preserve">(§11.4.110/.108, asserts on</w:t>
+            </w:r>
+            <w:r>
+              <w:t xml:space="preserve"> </w:t>
+            </w:r>
+            <w:r>
+              <w:rPr>
+                <w:rStyle w:val="VerbatimChar"/>
+              </w:rPr>
+              <w:t xml:space="preserve">merge-base(HEAD,main)..HEAD</w:t>
+            </w:r>
+            <w:r>
+              <w:t xml:space="preserve"> </w:t>
+            </w:r>
+            <w:r>
+              <w:t xml:space="preserve">that every</w:t>
+            </w:r>
+            <w:r>
+              <w:t xml:space="preserve"> </w:t>
+            </w:r>
+            <w:r>
+              <w:rPr>
+                <w:rStyle w:val="VerbatimChar"/>
+              </w:rPr>
+              <w:t xml:space="preserve">group_paths</w:t>
+            </w:r>
+            <w:r>
+              <w:t xml:space="preserve">-owned file's group destination == current branch); (4) risk-free reconciliation by MERGE-onto-canonical-branch, ff-only, NEVER force-push (§9.2/.113/.84). Classification: universal (§11.4.17). Propagation gate</w:t>
+            </w:r>
+            <w:r>
+              <w:t xml:space="preserve"> </w:t>
+            </w:r>
+            <w:r>
+              <w:rPr>
+                <w:rStyle w:val="VerbatimChar"/>
+              </w:rPr>
+              <w:t xml:space="preserve">CM-COVENANT-114-191-PROPAGATION</w:t>
+            </w:r>
+            <w:r>
+              <w:t xml:space="preserve"> </w:t>
+            </w:r>
+            <w:r>
+              <w:t xml:space="preserve">+ recommended gate</w:t>
+            </w:r>
+            <w:r>
+              <w:t xml:space="preserve"> </w:t>
+            </w:r>
+            <w:r>
+              <w:rPr>
+                <w:rStyle w:val="VerbatimChar"/>
+              </w:rPr>
+              <w:t xml:space="preserve">CM-WORK-TRACK-BINDING-ENFORCED</w:t>
+            </w:r>
+            <w:r>
+              <w:t xml:space="preserve"> </w:t>
+            </w:r>
+            <w:r>
+              <w:t xml:space="preserve">+ paired §1.1 mutation. CLAUDE.md + AGENTS.md + QWEN.md + GEMINI.md mirrors updated in lockstep (§11.4.157). Prior round: Added §11.4.190 — Website engineering-quality mandate (User mandate 2026-07-10): every website / web-UI a project ships — INCLUDING this project's OWN website — MUST satisfy AND PROVE with captured physical evidence (§11.4.5/.69/.107/.170, never a bare claim §11.4.6) ALL of — (A) FULL RESPONSIVENESS across all major browser engines (Chromium/Firefox/WebKit) + all OSes + all device classes (desktop/laptop/tablet/phone/large-display) + the full range of screen sizes/orientations/pixel-densities, NO broken layout/overflow/clipping/overlap/off-screen/unusable control at ANY breakpoint; (B) COMPLETE SEO OPTIMIZATION — semantic HTML + document outline, per-page unique title + meta description, Open Graph + Twitter cards, canonical URLs, schema.org/JSON-LD structured data, robots + XML sitemap, crawlable/indexable markup, WCAG AA + Core Web Vitals; (C) UNIQUE OpenDesign-AUTHORED templates/layouts (§11.4.162), NOT generic/off-the-shelf/templated, visually unique/innovative/creative/brand-distinct; (D) BLEEDING-EDGE ENTERPRISE VISUAL QUALITY, stunning polished look-and-feel in BOTH light+dark themes; (E) ANTI-BLUFF PROOF — responsiveness by device-independent host-rendered screenshots across the real breakpoint×engine matrix + an OCR/vision layout oracle, SEO by automated audit (Lighthouse SEO + structured-data validation + meta/OG/sitemap/robots presence) meeting a defined score floor, visual quality by §11.4.170 host-rendered pixel proof per screen×state×{light,dark}, uniqueness by OpenDesign-token provenance; a website reported responsive/SEO-optimized/unique/enterprise-quality WITHOUT these captured proofs is a §11.4 PASS-bluff at the web-UI layer; strict WEB-quality expansion of §11.4.162 (OpenDesign) binding §11.4.170 host-rendered pixel proof as the correctness oracle. Classification: universal (§11.4.17). Propagation gate</w:t>
+            </w:r>
+            <w:r>
+              <w:t xml:space="preserve"> </w:t>
+            </w:r>
+            <w:r>
+              <w:rPr>
+                <w:rStyle w:val="VerbatimChar"/>
+              </w:rPr>
+              <w:t xml:space="preserve">CM-COVENANT-114-190-PROPAGATION</w:t>
+            </w:r>
+            <w:r>
+              <w:t xml:space="preserve"> </w:t>
+            </w:r>
+            <w:r>
+              <w:t xml:space="preserve">+ recommended gates</w:t>
+            </w:r>
+            <w:r>
+              <w:t xml:space="preserve"> </w:t>
+            </w:r>
+            <w:r>
+              <w:rPr>
+                <w:rStyle w:val="VerbatimChar"/>
+              </w:rPr>
+              <w:t xml:space="preserve">CM-WEBSITE-RESPONSIVE-PROVEN</w:t>
+            </w:r>
+            <w:r>
+              <w:t xml:space="preserve">/</w:t>
+            </w:r>
+            <w:r>
+              <w:rPr>
+                <w:rStyle w:val="VerbatimChar"/>
+              </w:rPr>
+              <w:t xml:space="preserve">CM-WEBSITE-SEO-OPTIMIZED</w:t>
+            </w:r>
+            <w:r>
+              <w:t xml:space="preserve">/</w:t>
+            </w:r>
+            <w:r>
+              <w:rPr>
+                <w:rStyle w:val="VerbatimChar"/>
+              </w:rPr>
+              <w:t xml:space="preserve">CM-WEBSITE-OPENDESIGN-UNIQUE</w:t>
+            </w:r>
+            <w:r>
+              <w:t xml:space="preserve"> </w:t>
+            </w:r>
+            <w:r>
+              <w:t xml:space="preserve">+ paired §1.1 mutation. CLAUDE.md + AGENTS.md + QWEN.md + GEMINI.md mirrors updated in lockstep (§11.4.157). Prior round: Added §11.4.189 — Most-reopened cases get extra-depth live-testing scrutiny FIRST (User mandate 2026-07-10): all LIVE TESTING MUST give EXTRA-DEPTH retest + in-depth investigation + FULL validation/verification with REAL PHYSICAL captured evidence (§11.4.5/.69/.107) and NO bluff ANYWHERE to the cases REOPENED THE MOST TIMES (highest §11.4.55 reopens-count) — the empirically-most-fragile set gets the DEEPEST live scrutiny FIRST, ahead of the rest of the suite (§11.4.132 risk-descending, most-reopened the load-bearing key); each most-reopened case's live PASS cites captured-evidence on a CLEAN deployment (§11.4.108 runtime-signature) with the §11.4.115 RED→GREEN flip where a §11.4.135 guard exists; STRENGTHENS/REFINES §11.4.132(d) (promotes most-reopened into its OWN extra-depth mandate at the LIVE-TEST layer, not merely one ranking factor) + §11.4.55 + §11.4.129/.130. Classification: universal (§11.4.17). Propagation gate</w:t>
+            </w:r>
+            <w:r>
+              <w:t xml:space="preserve"> </w:t>
+            </w:r>
+            <w:r>
+              <w:rPr>
+                <w:rStyle w:val="VerbatimChar"/>
+              </w:rPr>
+              <w:t xml:space="preserve">CM-COVENANT-114-189-PROPAGATION</w:t>
+            </w:r>
+            <w:r>
+              <w:t xml:space="preserve"> </w:t>
+            </w:r>
+            <w:r>
+              <w:t xml:space="preserve">+ recommended gate</w:t>
+            </w:r>
+            <w:r>
+              <w:t xml:space="preserve"> </w:t>
+            </w:r>
+            <w:r>
+              <w:rPr>
+                <w:rStyle w:val="VerbatimChar"/>
+              </w:rPr>
+              <w:t xml:space="preserve">CM-MOST-REOPENED-EXTRA-DEPTH-LIVE-TEST</w:t>
+            </w:r>
+            <w:r>
+              <w:t xml:space="preserve"> </w:t>
+            </w:r>
+            <w:r>
+              <w:t xml:space="preserve">+ paired §1.1 mutation. CLAUDE.md + AGENTS.md + QWEN.md + GEMINI.md mirrors updated in lockstep (§11.4.157). Prior round: Added §11.4.188 — Regular main→feature merge cadence (User mandate 2026-07-09): every long-lived feature branch AND every parallel-development track (§11.4.58/.103/.167/.176/.178/.179) MUST regularly</w:t>
+            </w:r>
+            <w:r>
+              <w:t xml:space="preserve"> </w:t>
+            </w:r>
+            <w:r>
+              <w:rPr>
+                <w:rStyle w:val="VerbatimChar"/>
+              </w:rPr>
+              <w:t xml:space="preserve">git merge origin/main</w:t>
+            </w:r>
+            <w:r>
+              <w:t xml:space="preserve"> </w:t>
+            </w:r>
+            <w:r>
+              <w:t xml:space="preserve">INTO its own branch THROUGHOUT the work, NEVER only at the end, so no branch drifts far from main + the back-merge stays small/low-conflict/low-risk; GENERALISES §11.4.167(D) (trunk-into-every-BIG-feature-stream) to EVERY feature branch on EVERY track (§11.4.167(D) remains the big-item specialisation); cadence = after every trunk tag / ≥ daily / before any significant new work chunk (many small merges); HOW = MERGE never rebase a shared/tagged branch (§9/§11.4.113), fetch-first (§11.4.37/.71/.6), §9.2 pre-op backup before large/risky merges, resolve conflicts with ZERO markers + ZERO dropped files + union preserved (§11.4.41 step 3), quiescent-only (§11.4.84), background merge+verify (§11.4.88/.89/.103), NEVER force-push (§11.4.113); ANTI-BLUFF = post-merge smoke GREEN (§11.4.42) + conflict-marker scan empty + no-lost-commit, captured evidence (§11.4.5/.69), a merge claimed "clean" without those checks is a §11.4/.1 integration-layer bluff; honest boundary §11.4.6 — keeps the branch mergeable + low-conflict, does NOT prove its own work correct (still §11.4.108/.40) nor replace the approval-gated back-merge (§11.4.167(I)/.40/.41). Classification: universal (§11.4.17). Propagation gate</w:t>
+            </w:r>
+            <w:r>
+              <w:t xml:space="preserve"> </w:t>
+            </w:r>
+            <w:r>
+              <w:rPr>
+                <w:rStyle w:val="VerbatimChar"/>
+              </w:rPr>
+              <w:t xml:space="preserve">CM-COVENANT-114-188-PROPAGATION</w:t>
+            </w:r>
+            <w:r>
+              <w:t xml:space="preserve"> </w:t>
+            </w:r>
+            <w:r>
+              <w:t xml:space="preserve">+ recommended gate</w:t>
+            </w:r>
+            <w:r>
+              <w:t xml:space="preserve"> </w:t>
+            </w:r>
+            <w:r>
+              <w:rPr>
+                <w:rStyle w:val="VerbatimChar"/>
+              </w:rPr>
+              <w:t xml:space="preserve">CM-REGULAR-MAIN-MERGE-INTO-FEATURE</w:t>
+            </w:r>
+            <w:r>
+              <w:t xml:space="preserve"> </w:t>
+            </w:r>
+            <w:r>
+              <w:t xml:space="preserve">+ paired §1.1 mutation. CLAUDE.md + AGENTS.md + QWEN.md + GEMINI.md mirrors updated in lockstep (§11.4.157). Prior round: Added §11.4.187 — Automatic multi-track ruler orchestration (User mandate 2026-07-04; landed 2026-07-09): every project incorporating this constitution MUST ship its multi-track parallel-development orchestration as a UNIVERSAL, AUTOMATIC, OUT-OF-THE-BOX, INHERITED capability, not a per-project reimplementation, via a single conductor session that programmatically spawns/drives/resumes/monitors/controls per-track headless workers (native headless</w:t>
             </w:r>
             <w:r>
               <w:t xml:space="preserve"> </w:t>
@@ -44136,6 +44454,136 @@
           <w:b/>
           <w:bCs/>
         </w:rPr>
+        <w:t xml:space="preserve">Multi-project-per-track layout clarification (2026-07-10):</w:t>
+      </w:r>
+      <w:r>
+        <w:t xml:space="preserve"> </w:t>
+      </w:r>
+      <w:r>
+        <w:t xml:space="preserve">a</w:t>
+      </w:r>
+      <w:r>
+        <w:t xml:space="preserve"> </w:t>
+      </w:r>
+      <w:r>
+        <w:rPr>
+          <w:rStyle w:val="VerbatimChar"/>
+        </w:rPr>
+        <w:t xml:space="preserve">/mnt/track&lt;N&gt;</w:t>
+      </w:r>
+      <w:r>
+        <w:t xml:space="preserve"> </w:t>
+      </w:r>
+      <w:r>
+        <w:t xml:space="preserve">track parent is NOT single-project — MULTIPLE projects coexist on the same track parents, each in its OWN project-named subdirectory</w:t>
+      </w:r>
+      <w:r>
+        <w:t xml:space="preserve"> </w:t>
+      </w:r>
+      <w:r>
+        <w:rPr>
+          <w:rStyle w:val="VerbatimChar"/>
+        </w:rPr>
+        <w:t xml:space="preserve">/mnt/track&lt;N&gt;/&lt;project_name&gt;/</w:t>
+      </w:r>
+      <w:r>
+        <w:t xml:space="preserve"> </w:t>
+      </w:r>
+      <w:r>
+        <w:t xml:space="preserve">(e.g.</w:t>
+      </w:r>
+      <w:r>
+        <w:t xml:space="preserve"> </w:t>
+      </w:r>
+      <w:r>
+        <w:rPr>
+          <w:rStyle w:val="VerbatimChar"/>
+        </w:rPr>
+        <w:t xml:space="preserve">/mnt/track1/atmosphere/</w:t>
+      </w:r>
+      <w:r>
+        <w:t xml:space="preserve"> </w:t>
+      </w:r>
+      <w:r>
+        <w:t xml:space="preserve">AND</w:t>
+      </w:r>
+      <w:r>
+        <w:t xml:space="preserve"> </w:t>
+      </w:r>
+      <w:r>
+        <w:rPr>
+          <w:rStyle w:val="VerbatimChar"/>
+        </w:rPr>
+        <w:t xml:space="preserve">/mnt/track1/helix_ota/</w:t>
+      </w:r>
+      <w:r>
+        <w:t xml:space="preserve"> </w:t>
+      </w:r>
+      <w:r>
+        <w:t xml:space="preserve">side by side); the per-track working copy of project P on track N is ALWAYS</w:t>
+      </w:r>
+      <w:r>
+        <w:t xml:space="preserve"> </w:t>
+      </w:r>
+      <w:r>
+        <w:rPr>
+          <w:rStyle w:val="VerbatimChar"/>
+        </w:rPr>
+        <w:t xml:space="preserve">/mnt/track&lt;N&gt;/&lt;project_name&gt;/</w:t>
+      </w:r>
+      <w:r>
+        <w:t xml:space="preserve"> </w:t>
+      </w:r>
+      <w:r>
+        <w:t xml:space="preserve">(canonical lowercase snake_case dir-name per §11.4.29), never the bare track root and never a shared basename; this is WHY the identity carries the</w:t>
+      </w:r>
+      <w:r>
+        <w:t xml:space="preserve"> </w:t>
+      </w:r>
+      <w:r>
+        <w:rPr>
+          <w:rStyle w:val="VerbatimChar"/>
+        </w:rPr>
+        <w:t xml:space="preserve">&lt;project&gt;</w:t>
+      </w:r>
+      <w:r>
+        <w:t xml:space="preserve"> </w:t>
+      </w:r>
+      <w:r>
+        <w:t xml:space="preserve">component (</w:t>
+      </w:r>
+      <w:r>
+        <w:rPr>
+          <w:rStyle w:val="VerbatimChar"/>
+        </w:rPr>
+        <w:t xml:space="preserve">&lt;project&gt;__&lt;track&gt;__&lt;role&gt;</w:t>
+      </w:r>
+      <w:r>
+        <w:t xml:space="preserve">) — so two coexisting projects' track-N sessions / locks / logs / device-claims / registry rows never collide; a project adopting the multi-track engine (§11.4.187) MUST create AND register its own</w:t>
+      </w:r>
+      <w:r>
+        <w:t xml:space="preserve"> </w:t>
+      </w:r>
+      <w:r>
+        <w:rPr>
+          <w:rStyle w:val="VerbatimChar"/>
+        </w:rPr>
+        <w:t xml:space="preserve">/mnt/track&lt;N&gt;/&lt;project_name&gt;/</w:t>
+      </w:r>
+      <w:r>
+        <w:t xml:space="preserve"> </w:t>
+      </w:r>
+      <w:r>
+        <w:t xml:space="preserve">per track and MUST NOT assume it owns the track root or that a track hosts only one project.</w:t>
+      </w:r>
+      <w:r>
+        <w:t xml:space="preserve"> </w:t>
+      </w:r>
+      <w:r>
+        <w:rPr>
+          <w:b/>
+          <w:bCs/>
+        </w:rPr>
         <w:t xml:space="preserve">Canonical authority:</w:t>
       </w:r>
       <w:r>
@@ -47507,6 +47955,1412 @@
           <w:rStyle w:val="VerbatimChar"/>
         </w:rPr>
         <w:t xml:space="preserve">--exit-code-is-success-signal</w:t>
+      </w:r>
+      <w:r>
+        <w:t xml:space="preserve"> </w:t>
+      </w:r>
+      <w:r>
+        <w:t xml:space="preserve">flag.</w:t>
+      </w:r>
+    </w:p>
+    <w:p>
+      <w:pPr>
+        <w:pStyle w:val="BodyText"/>
+      </w:pPr>
+      <w:r>
+        <w:rPr>
+          <w:b/>
+          <w:bCs/>
+        </w:rPr>
+        <w:t xml:space="preserve">§11.4.188 — Regular main→feature merge cadence: every track / feature-branch MUST FREQUENTLY merge canonical</w:t>
+      </w:r>
+      <w:r>
+        <w:rPr>
+          <w:b/>
+          <w:bCs/>
+        </w:rPr>
+        <w:t xml:space="preserve"> </w:t>
+      </w:r>
+      <w:r>
+        <w:rPr>
+          <w:rStyle w:val="VerbatimChar"/>
+          <w:b/>
+          <w:bCs/>
+        </w:rPr>
+        <w:t xml:space="preserve">main</w:t>
+      </w:r>
+      <w:r>
+        <w:rPr>
+          <w:b/>
+          <w:bCs/>
+        </w:rPr>
+        <w:t xml:space="preserve"> </w:t>
+      </w:r>
+      <w:r>
+        <w:rPr>
+          <w:b/>
+          <w:bCs/>
+        </w:rPr>
+        <w:t xml:space="preserve">into itself DURING the work, never only at the end (User mandate, 2026-07-09).</w:t>
+      </w:r>
+      <w:r>
+        <w:t xml:space="preserve"> </w:t>
+      </w:r>
+      <w:r>
+        <w:t xml:space="preserve">Compact summary: every long-lived feature branch AND every parallel-development track (§11.4.58/§11.4.103 parallel streams; §11.4.167 feature work-streams; §11.4.176/§11.4.178/§11.4.179 multi-track) MUST regularly</w:t>
+      </w:r>
+      <w:r>
+        <w:t xml:space="preserve"> </w:t>
+      </w:r>
+      <w:r>
+        <w:rPr>
+          <w:rStyle w:val="VerbatimChar"/>
+        </w:rPr>
+        <w:t xml:space="preserve">git merge origin/main</w:t>
+      </w:r>
+      <w:r>
+        <w:t xml:space="preserve"> </w:t>
+      </w:r>
+      <w:r>
+        <w:t xml:space="preserve">(the canonical trunk/master) INTO its own branch THROUGHOUT the work — NOT only at the end — so no branch ever drifts far from main and the eventual back-merge stays a small, low-conflict, low-risk operation. GENERALISES §11.4.167(D) (trunk-merged-INTO-every-BIG-feature-STREAM, at minimum after every trunk tag / daily,</w:t>
+      </w:r>
+      <w:r>
+        <w:t xml:space="preserve"> </w:t>
+      </w:r>
+      <w:r>
+        <w:rPr>
+          <w:rStyle w:val="VerbatimChar"/>
+        </w:rPr>
+        <w:t xml:space="preserve">git merge</w:t>
+      </w:r>
+      <w:r>
+        <w:t xml:space="preserve"> </w:t>
+      </w:r>
+      <w:r>
+        <w:t xml:space="preserve">never rebase, stale-if-not-synced) from the big-work-item feature-stream lifecycle to EVERY feature branch on EVERY track — a small/medium feature branch, or any</w:t>
+      </w:r>
+      <w:r>
+        <w:t xml:space="preserve"> </w:t>
+      </w:r>
+      <w:r>
+        <w:rPr>
+          <w:rStyle w:val="VerbatimChar"/>
+        </w:rPr>
+        <w:t xml:space="preserve">git worktree</w:t>
+      </w:r>
+      <w:r>
+        <w:t xml:space="preserve">/CoW track that never earned a full §11.4.167 stream, is STILL bound to this cadence (the §11.4.167(D) discipline promoted to the general standalone rule; §11.4.167(D) remains its big-item specialisation). (1)</w:t>
+      </w:r>
+      <w:r>
+        <w:t xml:space="preserve"> </w:t>
+      </w:r>
+      <w:r>
+        <w:rPr>
+          <w:b/>
+          <w:bCs/>
+        </w:rPr>
+        <w:t xml:space="preserve">WHAT</w:t>
+      </w:r>
+      <w:r>
+        <w:t xml:space="preserve"> </w:t>
+      </w:r>
+      <w:r>
+        <w:t xml:space="preserve">— fetch the latest canonical</w:t>
+      </w:r>
+      <w:r>
+        <w:t xml:space="preserve"> </w:t>
+      </w:r>
+      <w:r>
+        <w:rPr>
+          <w:rStyle w:val="VerbatimChar"/>
+        </w:rPr>
+        <w:t xml:space="preserve">main</w:t>
+      </w:r>
+      <w:r>
+        <w:t xml:space="preserve">/</w:t>
+      </w:r>
+      <w:r>
+        <w:rPr>
+          <w:rStyle w:val="VerbatimChar"/>
+        </w:rPr>
+        <w:t xml:space="preserve">master</w:t>
+      </w:r>
+      <w:r>
+        <w:t xml:space="preserve"> </w:t>
+      </w:r>
+      <w:r>
+        <w:t xml:space="preserve">and merge it INTO the working branch, keeping the branch continuously close to trunk; a branch that has NOT integrated trunk within the cadence is flagged STALE (the exact long-lived-branch conflict-storm + integration-risk anti-pattern this forbids). (2)</w:t>
+      </w:r>
+      <w:r>
+        <w:t xml:space="preserve"> </w:t>
+      </w:r>
+      <w:r>
+        <w:rPr>
+          <w:b/>
+          <w:bCs/>
+        </w:rPr>
+        <w:t xml:space="preserve">CADENCE</w:t>
+      </w:r>
+      <w:r>
+        <w:t xml:space="preserve"> </w:t>
+      </w:r>
+      <w:r>
+        <w:t xml:space="preserve">— merge trunk in FREQUENTLY: after EVERY trunk tag, at minimum DAILY while the branch is live, AND before starting any significant new chunk of work on the branch — MANY SMALL merges, never one big deferred end-of-branch merge (small frequent merges minimise the divergence + conflict surface). (3)</w:t>
+      </w:r>
+      <w:r>
+        <w:t xml:space="preserve"> </w:t>
+      </w:r>
+      <w:r>
+        <w:rPr>
+          <w:b/>
+          <w:bCs/>
+        </w:rPr>
+        <w:t xml:space="preserve">HOW (safe-by-construction)</w:t>
+      </w:r>
+      <w:r>
+        <w:t xml:space="preserve"> </w:t>
+      </w:r>
+      <w:r>
+        <w:t xml:space="preserve">— MERGE, NEVER rebase a shared/tagged/pushed branch (no commit-loss, no history rewrite — §9/§11.4.113); FETCH-FIRST every remote before the merge (§11.4.37/§11.4.71 — remote state is unknowable without a fetch, §11.4.6); take a §9.2 hardlinked pre-op backup before any LARGE / conflict-heavy / risky merge; resolve every conflict CAREFULLY — ZERO conflict markers committed, ZERO file silently dropped, union of both sides preserved (§11.4.41 step 3 / §9 no-loss); integrate ONLY when the branch is QUIESCENT (§11.4.84 — no in-flight mutation gate, no unaccounted uncommitted work); prefer running the merge + its verification in the BACKGROUND parallel to the main stream so it never stalls other work (§11.4.88/§11.4.89/§11.4.103); NEVER force-push the merged result (§11.4.113 — the merged branch fast-forwards its own mirrors). (4)</w:t>
+      </w:r>
+      <w:r>
+        <w:t xml:space="preserve"> </w:t>
+      </w:r>
+      <w:r>
+        <w:rPr>
+          <w:b/>
+          <w:bCs/>
+        </w:rPr>
+        <w:t xml:space="preserve">CONSISTENCY + ANTI-BLUFF</w:t>
+      </w:r>
+      <w:r>
+        <w:t xml:space="preserve"> </w:t>
+      </w:r>
+      <w:r>
+        <w:t xml:space="preserve">— after EVERY merge the branch MUST be PROVEN consistent, never ASSUMED: a pre-build smoke gate runs post-merge (§11.4.42 step-3 smoke) and is GREEN, a</w:t>
+      </w:r>
+      <w:r>
+        <w:t xml:space="preserve"> </w:t>
+      </w:r>
+      <w:r>
+        <w:rPr>
+          <w:rStyle w:val="VerbatimChar"/>
+        </w:rPr>
+        <w:t xml:space="preserve">git grep</w:t>
+      </w:r>
+      <w:r>
+        <w:t xml:space="preserve"> </w:t>
+      </w:r>
+      <w:r>
+        <w:t xml:space="preserve">for conflict markers (</w:t>
+      </w:r>
+      <w:r>
+        <w:rPr>
+          <w:rStyle w:val="VerbatimChar"/>
+        </w:rPr>
+        <w:t xml:space="preserve">&lt;&lt;&lt;&lt;&lt;&lt;&lt;</w:t>
+      </w:r>
+      <w:r>
+        <w:t xml:space="preserve"> </w:t>
+      </w:r>
+      <w:r>
+        <w:t xml:space="preserve">/</w:t>
+      </w:r>
+      <w:r>
+        <w:t xml:space="preserve"> </w:t>
+      </w:r>
+      <w:r>
+        <w:rPr>
+          <w:rStyle w:val="VerbatimChar"/>
+        </w:rPr>
+        <w:t xml:space="preserve">=======</w:t>
+      </w:r>
+      <w:r>
+        <w:t xml:space="preserve"> </w:t>
+      </w:r>
+      <w:r>
+        <w:t xml:space="preserve">/</w:t>
+      </w:r>
+      <w:r>
+        <w:t xml:space="preserve"> </w:t>
+      </w:r>
+      <w:r>
+        <w:rPr>
+          <w:rStyle w:val="VerbatimChar"/>
+        </w:rPr>
+        <w:t xml:space="preserve">&gt;&gt;&gt;&gt;&gt;&gt;&gt;</w:t>
+      </w:r>
+      <w:r>
+        <w:t xml:space="preserve">) returns EMPTY, and no commit present pre-merge on either side is lost — captured evidence per §11.4.5/§11.4.69; a merge claimed "clean" without the post-merge smoke + marker-scan + no-lost-commit check is a §11.4/§11.4.1 bluff at the integration layer. (5)</w:t>
+      </w:r>
+      <w:r>
+        <w:t xml:space="preserve"> </w:t>
+      </w:r>
+      <w:r>
+        <w:rPr>
+          <w:b/>
+          <w:bCs/>
+        </w:rPr>
+        <w:t xml:space="preserve">HONEST BOUNDARY (§11.4.6)</w:t>
+      </w:r>
+      <w:r>
+        <w:t xml:space="preserve"> </w:t>
+      </w:r>
+      <w:r>
+        <w:t xml:space="preserve">— regular trunk-integration keeps the branch MERGEABLE + low-conflict; it does NOT by itself prove the branch's own work is correct (each change still crosses §11.4.108 runtime-signature + §11.4.40 retest), and it is NOT the approval-gated back-merge TO trunk (that stays §11.4.167(I)/§11.4.40/§11.4.41 no-merge-until-approved). Classification: universal (§11.4.17) — the consuming project supplies its canonical-trunk ref name, cadence unit, post-merge smoke-gate command, and per-track worktree/CoW mechanism per §11.4.35. Composes §9/§9.2/§11.4.6/§11.4.17/§11.4.37/§11.4.41/§11.4.42/§11.4.71/§11.4.84/§11.4.88/§11.4.89/§11.4.103/§11.4.113/§11.4.167/§11.4.176/§11.4.178/§11.4.179/§11.4.181. Propagation gate</w:t>
+      </w:r>
+      <w:r>
+        <w:t xml:space="preserve"> </w:t>
+      </w:r>
+      <w:r>
+        <w:rPr>
+          <w:rStyle w:val="VerbatimChar"/>
+        </w:rPr>
+        <w:t xml:space="preserve">CM-COVENANT-114-188-PROPAGATION</w:t>
+      </w:r>
+      <w:r>
+        <w:t xml:space="preserve"> </w:t>
+      </w:r>
+      <w:r>
+        <w:t xml:space="preserve">(literal</w:t>
+      </w:r>
+      <w:r>
+        <w:t xml:space="preserve"> </w:t>
+      </w:r>
+      <w:r>
+        <w:rPr>
+          <w:rStyle w:val="VerbatimChar"/>
+        </w:rPr>
+        <w:t xml:space="preserve">11.4.188</w:t>
+      </w:r>
+      <w:r>
+        <w:t xml:space="preserve">) + recommended gate</w:t>
+      </w:r>
+      <w:r>
+        <w:t xml:space="preserve"> </w:t>
+      </w:r>
+      <w:r>
+        <w:rPr>
+          <w:rStyle w:val="VerbatimChar"/>
+        </w:rPr>
+        <w:t xml:space="preserve">CM-REGULAR-MAIN-MERGE-INTO-FEATURE</w:t>
+      </w:r>
+      <w:r>
+        <w:t xml:space="preserve"> </w:t>
+      </w:r>
+      <w:r>
+        <w:t xml:space="preserve">(every live feature branch / track has integrated the canonical trunk within the declared cadence; its last integration is a real</w:t>
+      </w:r>
+      <w:r>
+        <w:t xml:space="preserve"> </w:t>
+      </w:r>
+      <w:r>
+        <w:rPr>
+          <w:rStyle w:val="VerbatimChar"/>
+        </w:rPr>
+        <w:t xml:space="preserve">git merge</w:t>
+      </w:r>
+      <w:r>
+        <w:t xml:space="preserve"> </w:t>
+      </w:r>
+      <w:r>
+        <w:t xml:space="preserve">not a rebase; the post-merge smoke + zero-conflict-marker + no-lost-commit checks passed) + paired §1.1 mutation (let a live branch go stale past the cadence, OR record a rebase of a shared branch in place of a merge, OR commit a conflict marker → the gate FAILs; gate-code = separate work item).</w:t>
+      </w:r>
+      <w:r>
+        <w:t xml:space="preserve"> </w:t>
+      </w:r>
+      <w:r>
+        <w:rPr>
+          <w:b/>
+          <w:bCs/>
+        </w:rPr>
+        <w:t xml:space="preserve">Canonical authority:</w:t>
+      </w:r>
+      <w:r>
+        <w:t xml:space="preserve"> </w:t>
+      </w:r>
+      <w:r>
+        <w:t xml:space="preserve">constitution submodule</w:t>
+      </w:r>
+      <w:r>
+        <w:t xml:space="preserve"> </w:t>
+      </w:r>
+      <w:hyperlink r:id="rId70">
+        <w:r>
+          <w:rPr>
+            <w:rStyle w:val="VerbatimChar"/>
+          </w:rPr>
+          <w:t xml:space="preserve">Constitution.md</w:t>
+        </w:r>
+      </w:hyperlink>
+      <w:r>
+        <w:t xml:space="preserve"> </w:t>
+      </w:r>
+      <w:r>
+        <w:t xml:space="preserve">§11.4.188. Non-compliance is a release blocker. No escape hatch — no</w:t>
+      </w:r>
+      <w:r>
+        <w:t xml:space="preserve"> </w:t>
+      </w:r>
+      <w:r>
+        <w:rPr>
+          <w:rStyle w:val="VerbatimChar"/>
+        </w:rPr>
+        <w:t xml:space="preserve">--skip-main-merge</w:t>
+      </w:r>
+      <w:r>
+        <w:t xml:space="preserve">,</w:t>
+      </w:r>
+      <w:r>
+        <w:t xml:space="preserve"> </w:t>
+      </w:r>
+      <w:r>
+        <w:rPr>
+          <w:rStyle w:val="VerbatimChar"/>
+        </w:rPr>
+        <w:t xml:space="preserve">--merge-only-at-end</w:t>
+      </w:r>
+      <w:r>
+        <w:t xml:space="preserve">,</w:t>
+      </w:r>
+      <w:r>
+        <w:t xml:space="preserve"> </w:t>
+      </w:r>
+      <w:r>
+        <w:rPr>
+          <w:rStyle w:val="VerbatimChar"/>
+        </w:rPr>
+        <w:t xml:space="preserve">--rebase-shared-branch</w:t>
+      </w:r>
+      <w:r>
+        <w:t xml:space="preserve">,</w:t>
+      </w:r>
+      <w:r>
+        <w:t xml:space="preserve"> </w:t>
+      </w:r>
+      <w:r>
+        <w:rPr>
+          <w:rStyle w:val="VerbatimChar"/>
+        </w:rPr>
+        <w:t xml:space="preserve">--defer-trunk-sync</w:t>
+      </w:r>
+      <w:r>
+        <w:t xml:space="preserve">,</w:t>
+      </w:r>
+      <w:r>
+        <w:t xml:space="preserve"> </w:t>
+      </w:r>
+      <w:r>
+        <w:rPr>
+          <w:rStyle w:val="VerbatimChar"/>
+        </w:rPr>
+        <w:t xml:space="preserve">--no-post-merge-smoke</w:t>
+      </w:r>
+      <w:r>
+        <w:t xml:space="preserve">,</w:t>
+      </w:r>
+      <w:r>
+        <w:t xml:space="preserve"> </w:t>
+      </w:r>
+      <w:r>
+        <w:rPr>
+          <w:rStyle w:val="VerbatimChar"/>
+        </w:rPr>
+        <w:t xml:space="preserve">--force-push-after-merge</w:t>
+      </w:r>
+      <w:r>
+        <w:t xml:space="preserve">,</w:t>
+      </w:r>
+      <w:r>
+        <w:t xml:space="preserve"> </w:t>
+      </w:r>
+      <w:r>
+        <w:rPr>
+          <w:rStyle w:val="VerbatimChar"/>
+        </w:rPr>
+        <w:t xml:space="preserve">--big-items-only-trunk-sync</w:t>
+      </w:r>
+      <w:r>
+        <w:t xml:space="preserve"> </w:t>
+      </w:r>
+      <w:r>
+        <w:t xml:space="preserve">flag.</w:t>
+      </w:r>
+    </w:p>
+    <w:p>
+      <w:pPr>
+        <w:pStyle w:val="BodyText"/>
+      </w:pPr>
+      <w:r>
+        <w:rPr>
+          <w:b/>
+          <w:bCs/>
+        </w:rPr>
+        <w:t xml:space="preserve">§11.4.189 — Most-reopened cases get extra-depth live-testing scrutiny FIRST (User mandate, 2026-07-10).</w:t>
+      </w:r>
+      <w:r>
+        <w:t xml:space="preserve"> </w:t>
+      </w:r>
+      <w:r>
+        <w:t xml:space="preserve">Verbatim operator mandate: "All live testing MUST pay extra attention to cases which have been reopened numerous times and those cases in depth retested, investigated, fully validated and verified with real physical results and no bluff of any kind anywhere!" All LIVE TESTING (on-device / on-target runtime validation, deploy-and-observe) MUST give EXTRA-DEPTH retest + in-depth investigation + FULL validation/verification with REAL PHYSICAL captured evidence (§11.4.5/§11.4.69/§11.4.107 — captured audio/video/sysfs/dumpsys/sink-side/runtime-signature) and NO bluff of any kind ANYWHERE to the cases that have been REOPENED THE MOST TIMES (highest §11.4.55 reopens-count) — the empirically-most-fragile set gets the DEEPEST live scrutiny, and it gets it FIRST. (1)</w:t>
+      </w:r>
+      <w:r>
+        <w:t xml:space="preserve"> </w:t>
+      </w:r>
+      <w:r>
+        <w:rPr>
+          <w:b/>
+          <w:bCs/>
+        </w:rPr>
+        <w:t xml:space="preserve">WHAT</w:t>
+      </w:r>
+      <w:r>
+        <w:t xml:space="preserve"> </w:t>
+      </w:r>
+      <w:r>
+        <w:t xml:space="preserve">— for the highest-reopens-count cases, live testing is NOT a single pass: it re-runs the case at EXTRA DEPTH (more iterations per §11.4.50 deterministic consistency, wider edge-case + regression coverage), RE-INVESTIGATES the underlying defect per §11.4.102 systematic-debugging + §11.4.146 reproduce-first, and CONFIRMS with rock-solid captured physical evidence per §11.4.123 — never metadata-only / config-only / absence-of-error / grep-without-runtime (§11.4/§11.4.1), never a false result. (2)</w:t>
+      </w:r>
+      <w:r>
+        <w:t xml:space="preserve"> </w:t>
+      </w:r>
+      <w:r>
+        <w:rPr>
+          <w:b/>
+          <w:bCs/>
+        </w:rPr>
+        <w:t xml:space="preserve">ORDER</w:t>
+      </w:r>
+      <w:r>
+        <w:t xml:space="preserve"> </w:t>
+      </w:r>
+      <w:r>
+        <w:t xml:space="preserve">— the most-reopened set is scrutinised FIRST, ahead of the rest of the live-test suite (the §11.4.132 risk-descending discipline, with most-reopened the load-bearing key). (3)</w:t>
+      </w:r>
+      <w:r>
+        <w:t xml:space="preserve"> </w:t>
+      </w:r>
+      <w:r>
+        <w:rPr>
+          <w:b/>
+          <w:bCs/>
+        </w:rPr>
+        <w:t xml:space="preserve">KEY</w:t>
+      </w:r>
+      <w:r>
+        <w:t xml:space="preserve"> </w:t>
+      </w:r>
+      <w:r>
+        <w:t xml:space="preserve">— priority is keyed off the §11.4.55 reopens-count (the consuming project supplies its reopens-count source per §11.4.35, e.g. the §11.4.93 workable-items DB</w:t>
+      </w:r>
+      <w:r>
+        <w:t xml:space="preserve"> </w:t>
+      </w:r>
+      <w:r>
+        <w:rPr>
+          <w:rStyle w:val="VerbatimChar"/>
+        </w:rPr>
+        <w:t xml:space="preserve">reopens_count</w:t>
+      </w:r>
+      <w:r>
+        <w:t xml:space="preserve">); a high reopens-count is the strongest empirical fragility signal (§11.4.132(d)). (4)</w:t>
+      </w:r>
+      <w:r>
+        <w:t xml:space="preserve"> </w:t>
+      </w:r>
+      <w:r>
+        <w:rPr>
+          <w:b/>
+          <w:bCs/>
+        </w:rPr>
+        <w:t xml:space="preserve">PROOF</w:t>
+      </w:r>
+      <w:r>
+        <w:t xml:space="preserve"> </w:t>
+      </w:r>
+      <w:r>
+        <w:t xml:space="preserve">— each most-reopened case's live PASS cites its captured-evidence artefact path (§11.4.69/§11.4.107) on a CLEAN/fresh deployment (§11.4.108 runtime-signature), with the §11.4.115 RED→GREEN polarity flip captured where a permanent regression guard exists (§11.4.135). STRENGTHENS/REFINES §11.4.132 (risk-ordered validation factor (d) most-reopened — §11.4.189 promotes most-reopened into its OWN EXTRA-DEPTH mandate at the LIVE-TEST layer, not merely one ranking factor among four) + §11.4.55 (reopens-count as the priority key) + §11.4.129/§11.4.130 (validate-the-just-fixed / highest-risk-first after redeploy). Classification: universal (§11.4.17) — references no project-specific hardware; the consuming project supplies its reopens-count source per §11.4.35. Composes §11.4.5/§11.4.6/§11.4.55/§11.4.69/§11.4.107/§11.4.108/§11.4.115/§11.4.129/§11.4.130/§11.4.132/§11.4.135/§11.4.146. Propagation gate</w:t>
+      </w:r>
+      <w:r>
+        <w:t xml:space="preserve"> </w:t>
+      </w:r>
+      <w:r>
+        <w:rPr>
+          <w:rStyle w:val="VerbatimChar"/>
+        </w:rPr>
+        <w:t xml:space="preserve">CM-COVENANT-114-189-PROPAGATION</w:t>
+      </w:r>
+      <w:r>
+        <w:t xml:space="preserve"> </w:t>
+      </w:r>
+      <w:r>
+        <w:t xml:space="preserve">(literal</w:t>
+      </w:r>
+      <w:r>
+        <w:t xml:space="preserve"> </w:t>
+      </w:r>
+      <w:r>
+        <w:rPr>
+          <w:rStyle w:val="VerbatimChar"/>
+        </w:rPr>
+        <w:t xml:space="preserve">11.4.189</w:t>
+      </w:r>
+      <w:r>
+        <w:t xml:space="preserve">) + recommended gate</w:t>
+      </w:r>
+      <w:r>
+        <w:t xml:space="preserve"> </w:t>
+      </w:r>
+      <w:r>
+        <w:rPr>
+          <w:rStyle w:val="VerbatimChar"/>
+        </w:rPr>
+        <w:t xml:space="preserve">CM-MOST-REOPENED-EXTRA-DEPTH-LIVE-TEST</w:t>
+      </w:r>
+      <w:r>
+        <w:t xml:space="preserve"> </w:t>
+      </w:r>
+      <w:r>
+        <w:t xml:space="preserve">(the live-test suite orders + extra-depth-scrutinises the highest-reopens-count cases FIRST, each with captured physical evidence on a clean deployment) + paired §1.1 mutation (drop the most-reopened extra-depth pass, OR run it AFTER the rest of the suite, OR PASS a most-reopened case on metadata-only evidence → the gate FAILs; strip the literal → propagation gate FAILs; gate-code = separate work item).</w:t>
+      </w:r>
+      <w:r>
+        <w:t xml:space="preserve"> </w:t>
+      </w:r>
+      <w:r>
+        <w:rPr>
+          <w:b/>
+          <w:bCs/>
+        </w:rPr>
+        <w:t xml:space="preserve">Canonical authority:</w:t>
+      </w:r>
+      <w:r>
+        <w:t xml:space="preserve"> </w:t>
+      </w:r>
+      <w:r>
+        <w:t xml:space="preserve">constitution submodule</w:t>
+      </w:r>
+      <w:r>
+        <w:t xml:space="preserve"> </w:t>
+      </w:r>
+      <w:hyperlink r:id="rId70">
+        <w:r>
+          <w:rPr>
+            <w:rStyle w:val="VerbatimChar"/>
+          </w:rPr>
+          <w:t xml:space="preserve">Constitution.md</w:t>
+        </w:r>
+      </w:hyperlink>
+      <w:r>
+        <w:t xml:space="preserve"> </w:t>
+      </w:r>
+      <w:r>
+        <w:t xml:space="preserve">§11.4.189. Non-compliance is a release blocker. No escape hatch — no</w:t>
+      </w:r>
+      <w:r>
+        <w:t xml:space="preserve"> </w:t>
+      </w:r>
+      <w:r>
+        <w:rPr>
+          <w:rStyle w:val="VerbatimChar"/>
+        </w:rPr>
+        <w:t xml:space="preserve">--skip-most-reopened-depth</w:t>
+      </w:r>
+      <w:r>
+        <w:t xml:space="preserve">,</w:t>
+      </w:r>
+      <w:r>
+        <w:t xml:space="preserve"> </w:t>
+      </w:r>
+      <w:r>
+        <w:rPr>
+          <w:rStyle w:val="VerbatimChar"/>
+        </w:rPr>
+        <w:t xml:space="preserve">--reopened-same-as-any</w:t>
+      </w:r>
+      <w:r>
+        <w:t xml:space="preserve">,</w:t>
+      </w:r>
+      <w:r>
+        <w:t xml:space="preserve"> </w:t>
+      </w:r>
+      <w:r>
+        <w:rPr>
+          <w:rStyle w:val="VerbatimChar"/>
+        </w:rPr>
+        <w:t xml:space="preserve">--live-test-any-order</w:t>
+      </w:r>
+      <w:r>
+        <w:t xml:space="preserve">,</w:t>
+      </w:r>
+      <w:r>
+        <w:t xml:space="preserve"> </w:t>
+      </w:r>
+      <w:r>
+        <w:rPr>
+          <w:rStyle w:val="VerbatimChar"/>
+        </w:rPr>
+        <w:t xml:space="preserve">--metadata-pass-for-reopened-OK</w:t>
+      </w:r>
+      <w:r>
+        <w:t xml:space="preserve">,</w:t>
+      </w:r>
+      <w:r>
+        <w:t xml:space="preserve"> </w:t>
+      </w:r>
+      <w:r>
+        <w:rPr>
+          <w:rStyle w:val="VerbatimChar"/>
+        </w:rPr>
+        <w:t xml:space="preserve">--defer-reopened-scrutiny</w:t>
+      </w:r>
+      <w:r>
+        <w:t xml:space="preserve"> </w:t>
+      </w:r>
+      <w:r>
+        <w:t xml:space="preserve">flag.</w:t>
+      </w:r>
+    </w:p>
+    <w:p>
+      <w:pPr>
+        <w:pStyle w:val="BodyText"/>
+      </w:pPr>
+      <w:r>
+        <w:rPr>
+          <w:b/>
+          <w:bCs/>
+        </w:rPr>
+        <w:t xml:space="preserve">§11.4.190 — Website engineering-quality mandate: every project website MUST be fully responsive + completely SEO-optimized + uniquely OpenDesign-authored + bleeding-edge enterprise-quality, each PROVEN with captured evidence (User mandate, 2026-07-10).</w:t>
+      </w:r>
+      <w:r>
+        <w:t xml:space="preserve"> </w:t>
+      </w:r>
+      <w:r>
+        <w:t xml:space="preserve">Verbatim operator mandate: "every website we create inside our projects MUST BE fully responsive - working on all browsers, all operating systems, all platforms and all devices and screen sizes! Every Website MUST BE completely SEO optimized! Layouts and templates done MUST BE unique and everything fully designed from OpenDesign! Make sure this applies to our project Website as well! Everything must be bleeding-edge enterprise quality, stunning visual look and feel, innovative, creative and unique! There MUST BE no false or faulty result or bluff of any kind anywhere!" Every website / web-UI surface a project ships — INCLUDING this project's OWN website — MUST satisfy AND PROVE with captured physical evidence (§11.4.5/§11.4.69/§11.4.107/§11.4.170 — never a bare claim, §11.4.6) ALL of:</w:t>
+      </w:r>
+      <w:r>
+        <w:t xml:space="preserve"> </w:t>
+      </w:r>
+      <w:r>
+        <w:rPr>
+          <w:b/>
+          <w:bCs/>
+        </w:rPr>
+        <w:t xml:space="preserve">(A) FULL RESPONSIVENESS</w:t>
+      </w:r>
+      <w:r>
+        <w:t xml:space="preserve"> </w:t>
+      </w:r>
+      <w:r>
+        <w:t xml:space="preserve">— correct, usable rendering across ALL major browser engines (Chromium/Firefox/WebKit), all operating systems, all device classes (desktop/laptop/tablet/phone/large-display) and the full range of screen sizes/orientations/pixel-densities; NO broken layout / overflow / clipping / overlap / off-screen or unusable control at ANY breakpoint.</w:t>
+      </w:r>
+      <w:r>
+        <w:t xml:space="preserve"> </w:t>
+      </w:r>
+      <w:r>
+        <w:rPr>
+          <w:b/>
+          <w:bCs/>
+        </w:rPr>
+        <w:t xml:space="preserve">(B) COMPLETE SEO OPTIMIZATION</w:t>
+      </w:r>
+      <w:r>
+        <w:t xml:space="preserve"> </w:t>
+      </w:r>
+      <w:r>
+        <w:t xml:space="preserve">— semantic HTML + correct document outline; per-page unique</w:t>
+      </w:r>
+      <w:r>
+        <w:t xml:space="preserve"> </w:t>
+      </w:r>
+      <w:r>
+        <w:rPr>
+          <w:rStyle w:val="VerbatimChar"/>
+        </w:rPr>
+        <w:t xml:space="preserve">&lt;title&gt;</w:t>
+      </w:r>
+      <w:r>
+        <w:t xml:space="preserve"> </w:t>
+      </w:r>
+      <w:r>
+        <w:t xml:space="preserve">+ meta description; Open Graph + Twitter cards; canonical URLs; structured data (schema.org / JSON-LD);</w:t>
+      </w:r>
+      <w:r>
+        <w:t xml:space="preserve"> </w:t>
+      </w:r>
+      <w:r>
+        <w:rPr>
+          <w:rStyle w:val="VerbatimChar"/>
+        </w:rPr>
+        <w:t xml:space="preserve">robots</w:t>
+      </w:r>
+      <w:r>
+        <w:t xml:space="preserve"> </w:t>
+      </w:r>
+      <w:r>
+        <w:t xml:space="preserve">+ XML sitemap; crawlable / indexable markup; WCAG AA accessibility + Core Web Vitals performance (both feed ranking).</w:t>
+      </w:r>
+      <w:r>
+        <w:t xml:space="preserve"> </w:t>
+      </w:r>
+      <w:r>
+        <w:rPr>
+          <w:b/>
+          <w:bCs/>
+        </w:rPr>
+        <w:t xml:space="preserve">(C) UNIQUE OpenDesign-AUTHORED templates/layouts</w:t>
+      </w:r>
+      <w:r>
+        <w:t xml:space="preserve"> </w:t>
+      </w:r>
+      <w:r>
+        <w:t xml:space="preserve">— EVERY layout + template designed FROM the OpenDesign design-token system (§11.4.162), NOT generic / off-the-shelf / templated; visually unique, innovative, creative, brand-distinct.</w:t>
+      </w:r>
+      <w:r>
+        <w:t xml:space="preserve"> </w:t>
+      </w:r>
+      <w:r>
+        <w:rPr>
+          <w:b/>
+          <w:bCs/>
+        </w:rPr>
+        <w:t xml:space="preserve">(D) BLEEDING-EDGE ENTERPRISE VISUAL QUALITY</w:t>
+      </w:r>
+      <w:r>
+        <w:t xml:space="preserve"> </w:t>
+      </w:r>
+      <w:r>
+        <w:t xml:space="preserve">— stunning, polished, professional look-and-feel in BOTH light AND dark themes (§11.4.162 tokens).</w:t>
+      </w:r>
+      <w:r>
+        <w:t xml:space="preserve"> </w:t>
+      </w:r>
+      <w:r>
+        <w:rPr>
+          <w:b/>
+          <w:bCs/>
+        </w:rPr>
+        <w:t xml:space="preserve">(E) ANTI-BLUFF PROOF</w:t>
+      </w:r>
+      <w:r>
+        <w:t xml:space="preserve"> </w:t>
+      </w:r>
+      <w:r>
+        <w:t xml:space="preserve">— NONE of (A)–(D) may be CLAIMED without captured physical evidence: responsiveness PROVEN by device-independent host-rendered screenshots across the real breakpoint × engine matrix + an OCR/vision layout oracle (no overlap / label-over-label / clip / overflow / off-screen); SEO PROVEN by an automated audit (Lighthouse SEO + structured-data validation + meta / OG / sitemap / robots presence) meeting a defined score floor; visual quality PROVEN by the §11.4.170 device-independent host-rendered pixel proof per screen × state × {light,dark}; uniqueness PROVEN by OpenDesign-token provenance. A website reported responsive / SEO-optimized / unique / enterprise-quality WITHOUT these captured proofs is a §11.4 PASS-bluff at the web-UI layer. §11.4.190 is the strict WEB-quality expansion of §11.4.162 (OpenDesign — it applies §11.4.162's design-token mandate to the full responsive + SEO + enterprise-quality web surface) and binds §11.4.170's device-independent host-rendered pixel proof as the correctness oracle; sibling of §11.4.168 (exported-document independent visual validation) at the web-UI layer. Classification: universal (§11.4.17) — references no project-specific hardware; the consuming project supplies its concrete breakpoint × engine matrix, SEO score-floor, and OpenDesign token set per §11.4.35. Composes §11.4.5/§11.4.6/§11.4.69/§11.4.107/§11.4.162/§11.4.168/§11.4.170. Propagation gate</w:t>
+      </w:r>
+      <w:r>
+        <w:t xml:space="preserve"> </w:t>
+      </w:r>
+      <w:r>
+        <w:rPr>
+          <w:rStyle w:val="VerbatimChar"/>
+        </w:rPr>
+        <w:t xml:space="preserve">CM-COVENANT-114-190-PROPAGATION</w:t>
+      </w:r>
+      <w:r>
+        <w:t xml:space="preserve"> </w:t>
+      </w:r>
+      <w:r>
+        <w:t xml:space="preserve">(literal</w:t>
+      </w:r>
+      <w:r>
+        <w:t xml:space="preserve"> </w:t>
+      </w:r>
+      <w:r>
+        <w:rPr>
+          <w:rStyle w:val="VerbatimChar"/>
+        </w:rPr>
+        <w:t xml:space="preserve">11.4.190</w:t>
+      </w:r>
+      <w:r>
+        <w:t xml:space="preserve">) + recommended gates</w:t>
+      </w:r>
+      <w:r>
+        <w:t xml:space="preserve"> </w:t>
+      </w:r>
+      <w:r>
+        <w:rPr>
+          <w:rStyle w:val="VerbatimChar"/>
+        </w:rPr>
+        <w:t xml:space="preserve">CM-WEBSITE-RESPONSIVE-PROVEN</w:t>
+      </w:r>
+      <w:r>
+        <w:t xml:space="preserve"> </w:t>
+      </w:r>
+      <w:r>
+        <w:t xml:space="preserve">(host-rendered screenshots across the breakpoint × engine matrix + layout oracle — no overlap/clip/overflow/off-screen) /</w:t>
+      </w:r>
+      <w:r>
+        <w:t xml:space="preserve"> </w:t>
+      </w:r>
+      <w:r>
+        <w:rPr>
+          <w:rStyle w:val="VerbatimChar"/>
+        </w:rPr>
+        <w:t xml:space="preserve">CM-WEBSITE-SEO-OPTIMIZED</w:t>
+      </w:r>
+      <w:r>
+        <w:t xml:space="preserve"> </w:t>
+      </w:r>
+      <w:r>
+        <w:t xml:space="preserve">(automated SEO audit meets the score floor + structured-data / meta / OG / sitemap / robots present) /</w:t>
+      </w:r>
+      <w:r>
+        <w:t xml:space="preserve"> </w:t>
+      </w:r>
+      <w:r>
+        <w:rPr>
+          <w:rStyle w:val="VerbatimChar"/>
+        </w:rPr>
+        <w:t xml:space="preserve">CM-WEBSITE-OPENDESIGN-UNIQUE</w:t>
+      </w:r>
+      <w:r>
+        <w:t xml:space="preserve"> </w:t>
+      </w:r>
+      <w:r>
+        <w:t xml:space="preserve">(every layout/template's OpenDesign-token provenance, no generic/off-the-shelf template) + paired §1.1 mutation (report a website responsive/SEO/unique/enterprise-quality with NO captured proof, OR ship a generic non-OpenDesign template, OR skip the light/dark host-rendered pixel proof → the recommended gate FAILs; strip the literal → propagation gate FAILs; gate-code = separate work item).</w:t>
+      </w:r>
+      <w:r>
+        <w:t xml:space="preserve"> </w:t>
+      </w:r>
+      <w:r>
+        <w:rPr>
+          <w:b/>
+          <w:bCs/>
+        </w:rPr>
+        <w:t xml:space="preserve">Canonical authority:</w:t>
+      </w:r>
+      <w:r>
+        <w:t xml:space="preserve"> </w:t>
+      </w:r>
+      <w:r>
+        <w:t xml:space="preserve">constitution submodule</w:t>
+      </w:r>
+      <w:r>
+        <w:t xml:space="preserve"> </w:t>
+      </w:r>
+      <w:hyperlink r:id="rId70">
+        <w:r>
+          <w:rPr>
+            <w:rStyle w:val="VerbatimChar"/>
+          </w:rPr>
+          <w:t xml:space="preserve">Constitution.md</w:t>
+        </w:r>
+      </w:hyperlink>
+      <w:r>
+        <w:t xml:space="preserve"> </w:t>
+      </w:r>
+      <w:r>
+        <w:t xml:space="preserve">§11.4.190. Non-compliance is a release blocker. No escape hatch — no</w:t>
+      </w:r>
+      <w:r>
+        <w:t xml:space="preserve"> </w:t>
+      </w:r>
+      <w:r>
+        <w:rPr>
+          <w:rStyle w:val="VerbatimChar"/>
+        </w:rPr>
+        <w:t xml:space="preserve">--skip-responsive-proof</w:t>
+      </w:r>
+      <w:r>
+        <w:t xml:space="preserve">,</w:t>
+      </w:r>
+      <w:r>
+        <w:t xml:space="preserve"> </w:t>
+      </w:r>
+      <w:r>
+        <w:rPr>
+          <w:rStyle w:val="VerbatimChar"/>
+        </w:rPr>
+        <w:t xml:space="preserve">--seo-optional</w:t>
+      </w:r>
+      <w:r>
+        <w:t xml:space="preserve">,</w:t>
+      </w:r>
+      <w:r>
+        <w:t xml:space="preserve"> </w:t>
+      </w:r>
+      <w:r>
+        <w:rPr>
+          <w:rStyle w:val="VerbatimChar"/>
+        </w:rPr>
+        <w:t xml:space="preserve">--generic-template-OK</w:t>
+      </w:r>
+      <w:r>
+        <w:t xml:space="preserve">,</w:t>
+      </w:r>
+      <w:r>
+        <w:t xml:space="preserve"> </w:t>
+      </w:r>
+      <w:r>
+        <w:rPr>
+          <w:rStyle w:val="VerbatimChar"/>
+        </w:rPr>
+        <w:t xml:space="preserve">--visual-quality-later</w:t>
+      </w:r>
+      <w:r>
+        <w:t xml:space="preserve">,</w:t>
+      </w:r>
+      <w:r>
+        <w:t xml:space="preserve"> </w:t>
+      </w:r>
+      <w:r>
+        <w:rPr>
+          <w:rStyle w:val="VerbatimChar"/>
+        </w:rPr>
+        <w:t xml:space="preserve">--claim-without-render</w:t>
+      </w:r>
+      <w:r>
+        <w:t xml:space="preserve"> </w:t>
+      </w:r>
+      <w:r>
+        <w:t xml:space="preserve">flag.</w:t>
+      </w:r>
+    </w:p>
+    <w:p>
+      <w:pPr>
+        <w:pStyle w:val="BodyText"/>
+      </w:pPr>
+      <w:r>
+        <w:rPr>
+          <w:b/>
+          <w:bCs/>
+        </w:rPr>
+        <w:t xml:space="preserve">§11.4.191 — Work-to-track/branch binding enforcement: a logic-group's work can NEVER be committed OR dispatched onto the wrong track/branch (research-derived, 2026-07-10).</w:t>
+      </w:r>
+      <w:r>
+        <w:t xml:space="preserve"> </w:t>
+      </w:r>
+      <w:r>
+        <w:t xml:space="preserve">Compact summary: every logical group of workable items binds to EXACTLY ONE canonical</w:t>
+      </w:r>
+      <w:r>
+        <w:t xml:space="preserve"> </w:t>
+      </w:r>
+      <w:r>
+        <w:rPr>
+          <w:rStyle w:val="VerbatimChar"/>
+        </w:rPr>
+        <w:t xml:space="preserve">(track, branch)</w:t>
+      </w:r>
+      <w:r>
+        <w:t xml:space="preserve"> </w:t>
+      </w:r>
+      <w:r>
+        <w:t xml:space="preserve">recorded ONCE in the single source of truth (the §11.4.93 workable-items DB</w:t>
+      </w:r>
+      <w:r>
+        <w:t xml:space="preserve"> </w:t>
+      </w:r>
+      <w:r>
+        <w:rPr>
+          <w:rStyle w:val="VerbatimChar"/>
+        </w:rPr>
+        <w:t xml:space="preserve">logic_groups.destination</w:t>
+      </w:r>
+      <w:r>
+        <w:t xml:space="preserve"> </w:t>
+      </w:r>
+      <w:r>
+        <w:t xml:space="preserve">= authoritative branch + a</w:t>
+      </w:r>
+      <w:r>
+        <w:t xml:space="preserve"> </w:t>
+      </w:r>
+      <w:r>
+        <w:rPr>
+          <w:rStyle w:val="VerbatimChar"/>
+        </w:rPr>
+        <w:t xml:space="preserve">canonical_track</w:t>
+      </w:r>
+      <w:r>
+        <w:t xml:space="preserve"> </w:t>
+      </w:r>
+      <w:r>
+        <w:t xml:space="preserve">column + a</w:t>
+      </w:r>
+      <w:r>
+        <w:t xml:space="preserve"> </w:t>
+      </w:r>
+      <w:r>
+        <w:rPr>
+          <w:rStyle w:val="VerbatimChar"/>
+        </w:rPr>
+        <w:t xml:space="preserve">group_paths</w:t>
+      </w:r>
+      <w:r>
+        <w:t xml:space="preserve"> </w:t>
+      </w:r>
+      <w:r>
+        <w:t xml:space="preserve">file-scope manifest), and NO change belonging to a group may LAND on, nor be DISPATCHED to, a track/branch other than that group's canonical one — the file-scope generalisation of §11.4.181/§11.4.182 from branch-NAME consistency to work-PLACEMENT consistency (forensic FACT 2026-07-10: scrcpy/Remote-app work — group</w:t>
+      </w:r>
+      <w:r>
+        <w:t xml:space="preserve"> </w:t>
+      </w:r>
+      <w:r>
+        <w:rPr>
+          <w:rStyle w:val="VerbatimChar"/>
+        </w:rPr>
+        <w:t xml:space="preserve">mistiq-vader</w:t>
+      </w:r>
+      <w:r>
+        <w:t xml:space="preserve">, canonical</w:t>
+      </w:r>
+      <w:r>
+        <w:t xml:space="preserve"> </w:t>
+      </w:r>
+      <w:r>
+        <w:rPr>
+          <w:rStyle w:val="VerbatimChar"/>
+        </w:rPr>
+        <w:t xml:space="preserve">feature/mistiq-vader</w:t>
+      </w:r>
+      <w:r>
+        <w:t xml:space="preserve">/T2 — was committed onto</w:t>
+      </w:r>
+      <w:r>
+        <w:t xml:space="preserve"> </w:t>
+      </w:r>
+      <w:r>
+        <w:rPr>
+          <w:rStyle w:val="VerbatimChar"/>
+        </w:rPr>
+        <w:t xml:space="preserve">main</w:t>
+      </w:r>
+      <w:r>
+        <w:t xml:space="preserve">/T1; §11.4.181's</w:t>
+      </w:r>
+      <w:r>
+        <w:t xml:space="preserve"> </w:t>
+      </w:r>
+      <w:r>
+        <w:rPr>
+          <w:rStyle w:val="VerbatimChar"/>
+        </w:rPr>
+        <w:t xml:space="preserve">guard-branch-consistency.sh</w:t>
+      </w:r>
+      <w:r>
+        <w:t xml:space="preserve"> </w:t>
+      </w:r>
+      <w:r>
+        <w:t xml:space="preserve">never fired because committing onto an existing branch is not a feature-branch CREATE, and no gate checked which FILES land on which BRANCH). (1)</w:t>
+      </w:r>
+      <w:r>
+        <w:t xml:space="preserve"> </w:t>
+      </w:r>
+      <w:r>
+        <w:rPr>
+          <w:b/>
+          <w:bCs/>
+        </w:rPr>
+        <w:t xml:space="preserve">Single source of truth</w:t>
+      </w:r>
+      <w:r>
+        <w:t xml:space="preserve"> </w:t>
+      </w:r>
+      <w:r>
+        <w:t xml:space="preserve">— the</w:t>
+      </w:r>
+      <w:r>
+        <w:t xml:space="preserve"> </w:t>
+      </w:r>
+      <w:r>
+        <w:rPr>
+          <w:rStyle w:val="VerbatimChar"/>
+        </w:rPr>
+        <w:t xml:space="preserve">logic_group → (branch, track, path-globs)</w:t>
+      </w:r>
+      <w:r>
+        <w:t xml:space="preserve"> </w:t>
+      </w:r>
+      <w:r>
+        <w:t xml:space="preserve">binding is recorded ONCE in the DB and LOOKED UP, never re-invented (a commit/dispatch placing a group's file-scope on a non-canonical branch/track is a §11.4.6 no-guessing violation). (2)</w:t>
+      </w:r>
+      <w:r>
+        <w:t xml:space="preserve"> </w:t>
+      </w:r>
+      <w:r>
+        <w:rPr>
+          <w:b/>
+          <w:bCs/>
+        </w:rPr>
+        <w:t xml:space="preserve">Preventive hook (§11.4.109/§11.4.177)</w:t>
+      </w:r>
+      <w:r>
+        <w:t xml:space="preserve"> </w:t>
+      </w:r>
+      <w:r>
+        <w:t xml:space="preserve">— a PreToolUse guard</w:t>
+      </w:r>
+      <w:r>
+        <w:t xml:space="preserve"> </w:t>
+      </w:r>
+      <w:r>
+        <w:rPr>
+          <w:rStyle w:val="VerbatimChar"/>
+        </w:rPr>
+        <w:t xml:space="preserve">guard-work-track-binding.sh</w:t>
+      </w:r>
+      <w:r>
+        <w:t xml:space="preserve"> </w:t>
+      </w:r>
+      <w:r>
+        <w:t xml:space="preserve">(inherited BY REFERENCE, never copied) BLOCKS (exit 2) a git-commit-class Bash call whose to-be-committed file set contains a path owned by a group whose canonical branch/track ≠ the current checkout, AND BLOCKS an Agent/Task dispatch whose §11.4.182 label track/branch ≠ the canonical (track, branch) of the ticket's group; fail-closed on unreadable registry,</w:t>
+      </w:r>
+      <w:r>
+        <w:t xml:space="preserve"> </w:t>
+      </w:r>
+      <w:r>
+        <w:rPr>
+          <w:rStyle w:val="VerbatimChar"/>
+        </w:rPr>
+        <w:t xml:space="preserve"># guardrails:allow &lt;reason&gt;</w:t>
+      </w:r>
+      <w:r>
+        <w:t xml:space="preserve"> </w:t>
+      </w:r>
+      <w:r>
+        <w:t xml:space="preserve">audited escape. (3)</w:t>
+      </w:r>
+      <w:r>
+        <w:t xml:space="preserve"> </w:t>
+      </w:r>
+      <w:r>
+        <w:rPr>
+          <w:b/>
+          <w:bCs/>
+        </w:rPr>
+        <w:t xml:space="preserve">Detective gate (§11.4.110/§11.4.108)</w:t>
+      </w:r>
+      <w:r>
+        <w:t xml:space="preserve"> </w:t>
+      </w:r>
+      <w:r>
+        <w:t xml:space="preserve">—</w:t>
+      </w:r>
+      <w:r>
+        <w:t xml:space="preserve"> </w:t>
+      </w:r>
+      <w:r>
+        <w:rPr>
+          <w:rStyle w:val="VerbatimChar"/>
+        </w:rPr>
+        <w:t xml:space="preserve">CM-WORK-TRACK-BINDING-ENFORCED</w:t>
+      </w:r>
+      <w:r>
+        <w:t xml:space="preserve"> </w:t>
+      </w:r>
+      <w:r>
+        <w:t xml:space="preserve">asserts, on the current branch's own added commits (</w:t>
+      </w:r>
+      <w:r>
+        <w:rPr>
+          <w:rStyle w:val="VerbatimChar"/>
+        </w:rPr>
+        <w:t xml:space="preserve">merge-base(HEAD,main)..HEAD</w:t>
+      </w:r>
+      <w:r>
+        <w:t xml:space="preserve">), that every</w:t>
+      </w:r>
+      <w:r>
+        <w:t xml:space="preserve"> </w:t>
+      </w:r>
+      <w:r>
+        <w:rPr>
+          <w:rStyle w:val="VerbatimChar"/>
+        </w:rPr>
+        <w:t xml:space="preserve">group_paths</w:t>
+      </w:r>
+      <w:r>
+        <w:t xml:space="preserve">-owned file's group destination == current branch (and canonical_track == current track when pinned) — the actual enforcement boundary regardless of how the commit was made, the runtime signature being FAIL-on-wrong-placement / PASS-on-canonical-placement on a clean checkout. (4)</w:t>
+      </w:r>
+      <w:r>
+        <w:t xml:space="preserve"> </w:t>
+      </w:r>
+      <w:r>
+        <w:rPr>
+          <w:b/>
+          <w:bCs/>
+        </w:rPr>
+        <w:t xml:space="preserve">Risk-free reconciliation (§9.2/§11.4.113/§11.4.84)</w:t>
+      </w:r>
+      <w:r>
+        <w:t xml:space="preserve"> </w:t>
+      </w:r>
+      <w:r>
+        <w:t xml:space="preserve">— a mis-placed change is reconciled by MERGING its commits onto the group's canonical branch (union, no commit lost, no</w:t>
+      </w:r>
+      <w:r>
+        <w:t xml:space="preserve"> </w:t>
+      </w:r>
+      <w:r>
+        <w:rPr>
+          <w:rStyle w:val="VerbatimChar"/>
+        </w:rPr>
+        <w:t xml:space="preserve">-s ours</w:t>
+      </w:r>
+      <w:r>
+        <w:t xml:space="preserve">/reset), ff-only push to all upstreams (NEVER force-push), then removing it from the wrong branch only after the merge is confirmed on all mirrors. Classification: universal (§11.4.17) — references no project hardware; the consuming project supplies its</w:t>
+      </w:r>
+      <w:r>
+        <w:t xml:space="preserve"> </w:t>
+      </w:r>
+      <w:r>
+        <w:rPr>
+          <w:rStyle w:val="VerbatimChar"/>
+        </w:rPr>
+        <w:t xml:space="preserve">(track, branch)</w:t>
+      </w:r>
+      <w:r>
+        <w:t xml:space="preserve"> </w:t>
+      </w:r>
+      <w:r>
+        <w:t xml:space="preserve">map,</w:t>
+      </w:r>
+      <w:r>
+        <w:t xml:space="preserve"> </w:t>
+      </w:r>
+      <w:r>
+        <w:rPr>
+          <w:rStyle w:val="VerbatimChar"/>
+        </w:rPr>
+        <w:t xml:space="preserve">group_paths</w:t>
+      </w:r>
+      <w:r>
+        <w:t xml:space="preserve"> </w:t>
+      </w:r>
+      <w:r>
+        <w:t xml:space="preserve">seed, and commit-wrapper wiring per §11.4.35. Composes §11.4.6/.28/.29/.35/.58/.75/.84/.93/.95/.109/.110/.113/.119/.167/.176/.177/.178/.181/.182/§9.2. Propagation gate</w:t>
+      </w:r>
+      <w:r>
+        <w:t xml:space="preserve"> </w:t>
+      </w:r>
+      <w:r>
+        <w:rPr>
+          <w:rStyle w:val="VerbatimChar"/>
+        </w:rPr>
+        <w:t xml:space="preserve">CM-COVENANT-114-191-PROPAGATION</w:t>
+      </w:r>
+      <w:r>
+        <w:t xml:space="preserve"> </w:t>
+      </w:r>
+      <w:r>
+        <w:t xml:space="preserve">(literal</w:t>
+      </w:r>
+      <w:r>
+        <w:t xml:space="preserve"> </w:t>
+      </w:r>
+      <w:r>
+        <w:rPr>
+          <w:rStyle w:val="VerbatimChar"/>
+        </w:rPr>
+        <w:t xml:space="preserve">11.4.191</w:t>
+      </w:r>
+      <w:r>
+        <w:t xml:space="preserve">) + recommended gate</w:t>
+      </w:r>
+      <w:r>
+        <w:t xml:space="preserve"> </w:t>
+      </w:r>
+      <w:r>
+        <w:rPr>
+          <w:rStyle w:val="VerbatimChar"/>
+        </w:rPr>
+        <w:t xml:space="preserve">CM-WORK-TRACK-BINDING-ENFORCED</w:t>
+      </w:r>
+      <w:r>
+        <w:t xml:space="preserve"> </w:t>
+      </w:r>
+      <w:r>
+        <w:t xml:space="preserve">+ paired §1.1 mutation.</w:t>
+      </w:r>
+      <w:r>
+        <w:t xml:space="preserve"> </w:t>
+      </w:r>
+      <w:r>
+        <w:rPr>
+          <w:b/>
+          <w:bCs/>
+        </w:rPr>
+        <w:t xml:space="preserve">Canonical authority:</w:t>
+      </w:r>
+      <w:r>
+        <w:t xml:space="preserve"> </w:t>
+      </w:r>
+      <w:r>
+        <w:t xml:space="preserve">constitution submodule</w:t>
+      </w:r>
+      <w:r>
+        <w:t xml:space="preserve"> </w:t>
+      </w:r>
+      <w:hyperlink r:id="rId70">
+        <w:r>
+          <w:rPr>
+            <w:rStyle w:val="VerbatimChar"/>
+          </w:rPr>
+          <w:t xml:space="preserve">Constitution.md</w:t>
+        </w:r>
+      </w:hyperlink>
+      <w:r>
+        <w:t xml:space="preserve"> </w:t>
+      </w:r>
+      <w:r>
+        <w:t xml:space="preserve">§11.4.191. Non-compliance is a release blocker. No escape hatch — no</w:t>
+      </w:r>
+      <w:r>
+        <w:t xml:space="preserve"> </w:t>
+      </w:r>
+      <w:r>
+        <w:rPr>
+          <w:rStyle w:val="VerbatimChar"/>
+        </w:rPr>
+        <w:t xml:space="preserve">--allow-cross-track-commit</w:t>
+      </w:r>
+      <w:r>
+        <w:t xml:space="preserve">,</w:t>
+      </w:r>
+      <w:r>
+        <w:t xml:space="preserve"> </w:t>
+      </w:r>
+      <w:r>
+        <w:rPr>
+          <w:rStyle w:val="VerbatimChar"/>
+        </w:rPr>
+        <w:t xml:space="preserve">--skip-work-binding</w:t>
+      </w:r>
+      <w:r>
+        <w:t xml:space="preserve">,</w:t>
+      </w:r>
+      <w:r>
+        <w:t xml:space="preserve"> </w:t>
+      </w:r>
+      <w:r>
+        <w:rPr>
+          <w:rStyle w:val="VerbatimChar"/>
+        </w:rPr>
+        <w:t xml:space="preserve">--commit-any-branch-OK</w:t>
+      </w:r>
+      <w:r>
+        <w:t xml:space="preserve">,</w:t>
+      </w:r>
+      <w:r>
+        <w:t xml:space="preserve"> </w:t>
+      </w:r>
+      <w:r>
+        <w:rPr>
+          <w:rStyle w:val="VerbatimChar"/>
+        </w:rPr>
+        <w:t xml:space="preserve">--dispatch-any-track-OK</w:t>
+      </w:r>
+      <w:r>
+        <w:t xml:space="preserve">,</w:t>
+      </w:r>
+      <w:r>
+        <w:t xml:space="preserve"> </w:t>
+      </w:r>
+      <w:r>
+        <w:rPr>
+          <w:rStyle w:val="VerbatimChar"/>
+        </w:rPr>
+        <w:t xml:space="preserve">--no-file-scope-check</w:t>
       </w:r>
       <w:r>
         <w:t xml:space="preserve"> </w:t>

</xml_diff>

<commit_message>
sync: recursive commit+push via commit_all — 1.2.1-dev-0.0.4
</commit_message>
<xml_diff>
--- a/AGENTS.docx
+++ b/AGENTS.docx
@@ -75,7 +75,7 @@
               <w:pStyle w:val="Compact"/>
             </w:pPr>
             <w:r>
-              <w:t xml:space="preserve">42</w:t>
+              <w:t xml:space="preserve">43</w:t>
             </w:r>
           </w:p>
         </w:tc>
@@ -123,7 +123,7 @@
               <w:pStyle w:val="Compact"/>
             </w:pPr>
             <w:r>
-              <w:t xml:space="preserve">2026-07-10T18:45:00Z</w:t>
+              <w:t xml:space="preserve">2026-07-11T12:00:00Z</w:t>
             </w:r>
           </w:p>
         </w:tc>
@@ -171,7 +171,37 @@
               <w:pStyle w:val="Compact"/>
             </w:pPr>
             <w:r>
-              <w:t xml:space="preserve">Added §11.4.191 — Work-to-track/branch binding enforcement: a logic-group's work can NEVER be committed OR dispatched onto the wrong track/branch (research-derived 2026-07-10): every logical group of workable items binds to EXACTLY ONE canonical</w:t>
+              <w:t xml:space="preserve">Added §11.4.192 — Continuous multi-track auto-backfill: a FREE track MUST be IMMEDIATELY re-assigned its next-highest-priority domain work-set, never left idle while its domain has actionable items (User mandate 2026-07-11, verbatim "once a Track is free, we shall assign next set of workable items to it ... full continuous multi-track development ... no stopping ... this is MANDATORY"): the moment any track's worker COMPLETES its current work-set, that FREE track MUST be IMMEDIATELY assigned the NEXT-highest-priority actionable work-set from its OWN domain (its §11.4.191 logic_group / canonical branch) — a track is NEVER idle while its domain still holds actionable items, and the conductor/ruler CONTINUOUSLY re-assigns with NO stopping; PROMOTES the §11.4.103(B) ≥3-parallel-background-streams-with-auto-backfill invariant into the multi-track (§11.4.176/.178/.179/.187) layer (§11.4.103(B) backfills a STREAM the moment it is done, §11.4.192 backfills a TRACK the moment its worker is done, keyed to that track's canonical (track, branch) domain §11.4.191); (1) on completion the ruler §11.4.187 looks up + CLAIMs exactly-once §11.4.176 + DISPATCHes the next §11.4.182-labelled stream; (2) priority per §11.4.42/.72 (audio-first); (3) SOURCE-SIDE advances even when on-device VALIDATION is build/device-gated (§11.4.108/.185, honest §11.4.3/.52 SKIP-with-reason ONLY the device-gated portion — NOT a stop); (4) honest boundary §11.4.6 — a track idles ONLY when its domain genuinely has zero actionable items OR all remaining is externally blocked with no source-side advancement possible (§11.4.94(A)/.97/.101), "the merges are done"/"nothing visible right now" is NEVER a valid idle reason. Classification: universal (§11.4.17). Composes §11.4.42/.58/.72/.94/.97/.101/.103/.167/.176/.178/.179/.182/.187. Propagation gate</w:t>
+            </w:r>
+            <w:r>
+              <w:t xml:space="preserve"> </w:t>
+            </w:r>
+            <w:r>
+              <w:rPr>
+                <w:rStyle w:val="VerbatimChar"/>
+              </w:rPr>
+              <w:t xml:space="preserve">CM-COVENANT-114-192-PROPAGATION</w:t>
+            </w:r>
+            <w:r>
+              <w:t xml:space="preserve"> </w:t>
+            </w:r>
+            <w:r>
+              <w:t xml:space="preserve">+ recommended gate</w:t>
+            </w:r>
+            <w:r>
+              <w:t xml:space="preserve"> </w:t>
+            </w:r>
+            <w:r>
+              <w:rPr>
+                <w:rStyle w:val="VerbatimChar"/>
+              </w:rPr>
+              <w:t xml:space="preserve">CM-CONTINUOUS-MULTITRACK-BACKFILL</w:t>
+            </w:r>
+            <w:r>
+              <w:t xml:space="preserve"> </w:t>
+            </w:r>
+            <w:r>
+              <w:t xml:space="preserve">+ paired §1.1 mutation. CLAUDE.md + AGENTS.md + QWEN.md + GEMINI.md mirrors updated in lockstep (§11.4.157). Prior round: Added §11.4.191 — Work-to-track/branch binding enforcement: a logic-group's work can NEVER be committed OR dispatched onto the wrong track/branch (research-derived 2026-07-10): every logical group of workable items binds to EXACTLY ONE canonical</w:t>
             </w:r>
             <w:r>
               <w:t xml:space="preserve"> </w:t>
@@ -49361,6 +49391,226 @@
           <w:rStyle w:val="VerbatimChar"/>
         </w:rPr>
         <w:t xml:space="preserve">--no-file-scope-check</w:t>
+      </w:r>
+      <w:r>
+        <w:t xml:space="preserve"> </w:t>
+      </w:r>
+      <w:r>
+        <w:t xml:space="preserve">flag.</w:t>
+      </w:r>
+    </w:p>
+    <w:p>
+      <w:pPr>
+        <w:pStyle w:val="BodyText"/>
+      </w:pPr>
+      <w:r>
+        <w:rPr>
+          <w:b/>
+          <w:bCs/>
+        </w:rPr>
+        <w:t xml:space="preserve">§11.4.192 — Continuous multi-track auto-backfill: a FREE track MUST be IMMEDIATELY re-assigned its next-highest-priority domain work-set, never left idle while its domain has actionable items (User mandate, 2026-07-11).</w:t>
+      </w:r>
+      <w:r>
+        <w:t xml:space="preserve"> </w:t>
+      </w:r>
+      <w:r>
+        <w:t xml:space="preserve">Verbatim operator mandate: "once a Track is free, we shall assign next set of workable items to it ... full continuous multi-track development ... no stopping ... this is MANDATORY". Compact summary: the moment any track's worker COMPLETES its current work-set (its item(s) closed with anti-bluff evidence, or merged), that FREE track MUST be IMMEDIATELY assigned the NEXT-highest-priority actionable work-set from its OWN domain (its §11.4.191 logic_group / canonical branch) — a track is NEVER left idle while its domain still holds actionable workable items, and the conductor/ruler CONTINUOUSLY re-assigns with NO stopping (full continuous multi-track development); PROMOTES the §11.4.103(B) ≥3-parallel-background-streams-with-auto-backfill invariant into the multi-track (§11.4.176/§11.4.178/§11.4.179/§11.4.187) layer (§11.4.103(B) backfills a STREAM the moment it is done; §11.4.192 backfills a TRACK the moment its worker is done, keyed to that track's canonical (track, branch) domain per §11.4.191). (1)</w:t>
+      </w:r>
+      <w:r>
+        <w:t xml:space="preserve"> </w:t>
+      </w:r>
+      <w:r>
+        <w:rPr>
+          <w:b/>
+          <w:bCs/>
+        </w:rPr>
+        <w:t xml:space="preserve">WHAT</w:t>
+      </w:r>
+      <w:r>
+        <w:t xml:space="preserve"> </w:t>
+      </w:r>
+      <w:r>
+        <w:t xml:space="preserve">— on any track-worker completion the conductor/ruler (§11.4.187) MUST, per that track's domain, look up the NEXT actionable work-set, CLAIM it exactly-once (§11.4.176 exactly-once claim registry, no two tracks claiming one item), and DISPATCH it as the track's new §11.4.182-labelled work stream — without waiting for a scheduled wake or an operator prompt. (2)</w:t>
+      </w:r>
+      <w:r>
+        <w:t xml:space="preserve"> </w:t>
+      </w:r>
+      <w:r>
+        <w:rPr>
+          <w:b/>
+          <w:bCs/>
+        </w:rPr>
+        <w:t xml:space="preserve">PRIORITY</w:t>
+      </w:r>
+      <w:r>
+        <w:t xml:space="preserve"> </w:t>
+      </w:r>
+      <w:r>
+        <w:t xml:space="preserve">— the next work-set is the track domain's highest-priority actionable item (§11.4.42/§11.4.72 priority order, audio-first where in scope), never an arbitrary pick. (3)</w:t>
+      </w:r>
+      <w:r>
+        <w:t xml:space="preserve"> </w:t>
+      </w:r>
+      <w:r>
+        <w:rPr>
+          <w:b/>
+          <w:bCs/>
+        </w:rPr>
+        <w:t xml:space="preserve">SOURCE-SIDE ADVANCES EVEN WHEN VALIDATION IS GATED</w:t>
+      </w:r>
+      <w:r>
+        <w:t xml:space="preserve"> </w:t>
+      </w:r>
+      <w:r>
+        <w:t xml:space="preserve">— when the next item's on-device VALIDATION is blocked on a pending build / device availability (§11.4.108 clean-target / §11.4.185 manual-QA / operator-gated flash), the track MUST still advance the item's SOURCE-SIDE work (investigation, RED-test §11.4.115, source patch, pre-build gate + paired §1.1 mutation, docs) and honestly §11.4.3/§11.4.52 SKIP-with-reason ONLY the genuinely device-gated validation portion — a build/device gate on the validation step is NOT a reason to idle the whole track. (4)</w:t>
+      </w:r>
+      <w:r>
+        <w:t xml:space="preserve"> </w:t>
+      </w:r>
+      <w:r>
+        <w:rPr>
+          <w:b/>
+          <w:bCs/>
+        </w:rPr>
+        <w:t xml:space="preserve">HONEST BOUNDARY (§11.4.6)</w:t>
+      </w:r>
+      <w:r>
+        <w:t xml:space="preserve"> </w:t>
+      </w:r>
+      <w:r>
+        <w:t xml:space="preserve">— a track idles ONLY when its domain GENUINELY has zero remaining actionable workable items OR every remaining item is externally blocked with no source-side advancement possible (§11.4.94(A)/§11.4.97/§11.4.101 idle-only-when-blocked closed set); "the merges are done" / "the current item is done" / "nothing visible right now" is NEVER a valid idle reason while the domain still holds progressable items (a §11.4.94+§11.4.97 violation); an unavoidable per-item block PARKS one item, it does NOT stop the track (§11.4.101 — the track backfills its next non-blocked domain item). Classification: universal (§11.4.17) — references no project hardware; the consuming project supplies its track→domain map + priority source per §11.4.35. Composes §11.4.42/.58/.72/.94/.97/.101/.103/.167/.176/.178/.179/.182/.187. Propagation gate</w:t>
+      </w:r>
+      <w:r>
+        <w:t xml:space="preserve"> </w:t>
+      </w:r>
+      <w:r>
+        <w:rPr>
+          <w:rStyle w:val="VerbatimChar"/>
+        </w:rPr>
+        <w:t xml:space="preserve">CM-COVENANT-114-192-PROPAGATION</w:t>
+      </w:r>
+      <w:r>
+        <w:t xml:space="preserve"> </w:t>
+      </w:r>
+      <w:r>
+        <w:t xml:space="preserve">(literal</w:t>
+      </w:r>
+      <w:r>
+        <w:t xml:space="preserve"> </w:t>
+      </w:r>
+      <w:r>
+        <w:rPr>
+          <w:rStyle w:val="VerbatimChar"/>
+        </w:rPr>
+        <w:t xml:space="preserve">11.4.192</w:t>
+      </w:r>
+      <w:r>
+        <w:t xml:space="preserve">) + recommended gate</w:t>
+      </w:r>
+      <w:r>
+        <w:t xml:space="preserve"> </w:t>
+      </w:r>
+      <w:r>
+        <w:rPr>
+          <w:rStyle w:val="VerbatimChar"/>
+        </w:rPr>
+        <w:t xml:space="preserve">CM-CONTINUOUS-MULTITRACK-BACKFILL</w:t>
+      </w:r>
+      <w:r>
+        <w:t xml:space="preserve"> </w:t>
+      </w:r>
+      <w:r>
+        <w:t xml:space="preserve">(on a track-worker completion the ruler re-assigns that track's next-highest-priority domain work-set; a track with a completed worker AND remaining actionable domain items but no new dispatch → the gate FAILs) + paired §1.1 mutation (let a free track sit idle while its domain holds an actionable item, OR treat "merges done" as a valid idle reason → the gate FAILs; strip the literal → propagation gate FAILs; gate-code = separate work item).</w:t>
+      </w:r>
+      <w:r>
+        <w:t xml:space="preserve"> </w:t>
+      </w:r>
+      <w:r>
+        <w:rPr>
+          <w:b/>
+          <w:bCs/>
+        </w:rPr>
+        <w:t xml:space="preserve">Canonical authority:</w:t>
+      </w:r>
+      <w:r>
+        <w:t xml:space="preserve"> </w:t>
+      </w:r>
+      <w:r>
+        <w:t xml:space="preserve">constitution submodule</w:t>
+      </w:r>
+      <w:r>
+        <w:t xml:space="preserve"> </w:t>
+      </w:r>
+      <w:hyperlink r:id="rId70">
+        <w:r>
+          <w:rPr>
+            <w:rStyle w:val="VerbatimChar"/>
+          </w:rPr>
+          <w:t xml:space="preserve">Constitution.md</w:t>
+        </w:r>
+      </w:hyperlink>
+      <w:r>
+        <w:t xml:space="preserve"> </w:t>
+      </w:r>
+      <w:r>
+        <w:t xml:space="preserve">§11.4.192. Non-compliance is a release blocker. No escape hatch — no</w:t>
+      </w:r>
+      <w:r>
+        <w:t xml:space="preserve"> </w:t>
+      </w:r>
+      <w:r>
+        <w:rPr>
+          <w:rStyle w:val="VerbatimChar"/>
+        </w:rPr>
+        <w:t xml:space="preserve">--allow-idle-track</w:t>
+      </w:r>
+      <w:r>
+        <w:t xml:space="preserve">,</w:t>
+      </w:r>
+      <w:r>
+        <w:t xml:space="preserve"> </w:t>
+      </w:r>
+      <w:r>
+        <w:rPr>
+          <w:rStyle w:val="VerbatimChar"/>
+        </w:rPr>
+        <w:t xml:space="preserve">--skip-backfill</w:t>
+      </w:r>
+      <w:r>
+        <w:t xml:space="preserve">,</w:t>
+      </w:r>
+      <w:r>
+        <w:t xml:space="preserve"> </w:t>
+      </w:r>
+      <w:r>
+        <w:rPr>
+          <w:rStyle w:val="VerbatimChar"/>
+        </w:rPr>
+        <w:t xml:space="preserve">--stop-multitrack</w:t>
+      </w:r>
+      <w:r>
+        <w:t xml:space="preserve">,</w:t>
+      </w:r>
+      <w:r>
+        <w:t xml:space="preserve"> </w:t>
+      </w:r>
+      <w:r>
+        <w:rPr>
+          <w:rStyle w:val="VerbatimChar"/>
+        </w:rPr>
+        <w:t xml:space="preserve">--merges-done-is-idle</w:t>
+      </w:r>
+      <w:r>
+        <w:t xml:space="preserve">,</w:t>
+      </w:r>
+      <w:r>
+        <w:t xml:space="preserve"> </w:t>
+      </w:r>
+      <w:r>
+        <w:rPr>
+          <w:rStyle w:val="VerbatimChar"/>
+        </w:rPr>
+        <w:t xml:space="preserve">--defer-track-reassign</w:t>
       </w:r>
       <w:r>
         <w:t xml:space="preserve"> </w:t>

</xml_diff>

<commit_message>
docs: regenerate stale four-format exports + add missing session-sync skill exports
Doc-export drift found during the 2026-07-13 full-recursive pull_all.sh
cycle: several .docx/.html/.pdf exports were stale relative to their
already-committed .md sources, and skills/session-sync/skill.md had no
exports at all. Regenerated via pandoc + weasyprint against the
constitution/styles/default-md.css pipeline (§11.4.65/§11.4.73). No
source content changed — export-only sync.

Classification: project-hygiene, no new rule (§11.4.17 n/a).
</commit_message>
<xml_diff>
--- a/AGENTS.docx
+++ b/AGENTS.docx
@@ -49619,6 +49619,24 @@
         <w:t xml:space="preserve">flag.</w:t>
       </w:r>
     </w:p>
+    <w:p>
+      <w:pPr>
+        <w:pStyle w:val="BodyText"/>
+      </w:pPr>
+      <w:r>
+        <w:rPr>
+          <w:b/>
+          <w:bCs/>
+        </w:rPr>
+        <w:t xml:space="preserve">§11.4.193 — Anti-blind-typing mandate: every UI interaction MUST be "seen" and "understood" via OCR/vision/screenshot proof, NEVER blind-typed (User mandate, 2026-07-13).</w:t>
+      </w:r>
+      <w:r>
+        <w:t xml:space="preserve"> </w:t>
+      </w:r>
+      <w:r>
+        <w:t xml:space="preserve">Blind typing is STRICTLY FORBIDDEN everywhere — every agent, every tool, every automation. See-before-you-type, verify-after-you-type, OCR/vision oracle mandatory, WebView fallback required, credential redaction per §11.4.10. No escape hatch. Canonical authority: constitution submodule Constitution.md §11.4.193.</w:t>
+      </w:r>
+    </w:p>
     <w:bookmarkEnd w:id="116"/>
     <w:bookmarkEnd w:id="117"/>
     <w:bookmarkEnd w:id="118"/>

</xml_diff>

<commit_message>
docs: regenerate pandoc twins for Rev 54 (§11.4.216-223 amendment) — forensically matched generation chain
Co-Authored-By: Claude Opus 4.8 <noreply@anthropic.com>
</commit_message>
<xml_diff>
--- a/AGENTS.docx
+++ b/AGENTS.docx
@@ -75,7 +75,7 @@
               <w:pStyle w:val="Compact"/>
             </w:pPr>
             <w:r>
-              <w:t xml:space="preserve">56</w:t>
+              <w:t xml:space="preserve">57</w:t>
             </w:r>
           </w:p>
         </w:tc>
@@ -123,7 +123,7 @@
               <w:pStyle w:val="Compact"/>
             </w:pPr>
             <w:r>
-              <w:t xml:space="preserve">2026-07-17T14:30:00Z</w:t>
+              <w:t xml:space="preserve">2026-07-22T08:52:07Z</w:t>
             </w:r>
           </w:p>
         </w:tc>
@@ -171,7 +171,100 @@
               <w:pStyle w:val="Compact"/>
             </w:pPr>
             <w:r>
-              <w:t xml:space="preserve">Round 2 of 2026-07-17 — the CARRIER / MEASUREMENT-INTEGRITY harvest (research-derived from one cycle's forensics in a consuming project). 4 EXTENSIONS + 2 NEW anchors + 1 candidate REJECTED-as-already-covered. The unifying FACT: every false finding that cycle had ONE shape — a token that MENTIONS X matched as X, or an instrument's silence read as data (a removal's ref-count matched the audit-trail comments DOCUMENTING the removal; escapes eaten by a wrapper shell so the far side searched a literal;</w:t>
+              <w:t xml:space="preserve">Round of 2026-07-22 — the DESIGN-METHODOLOGY codification (User mandate, 2026-07-22; proving project: the Helix Thready MVP design package,</w:t>
+            </w:r>
+            <w:r>
+              <w:t xml:space="preserve"> </w:t>
+            </w:r>
+            <w:r>
+              <w:rPr>
+                <w:rStyle w:val="VerbatimChar"/>
+              </w:rPr>
+              <w:t xml:space="preserve">docs/public/research/mvp/design/</w:t>
+            </w:r>
+            <w:r>
+              <w:t xml:space="preserve"> </w:t>
+            </w:r>
+            <w:r>
+              <w:t xml:space="preserve">— the complete design approach built and verified there is promoted into 8 NEW universal anchors §11.4.216–§11.4.223 so every future project inherits it out of the box). §11.4.216 — canonical machine-readable design-token source: ONE CSS custom-property file (</w:t>
+            </w:r>
+            <w:r>
+              <w:rPr>
+                <w:rStyle w:val="VerbatimChar"/>
+              </w:rPr>
+              <w:t xml:space="preserve">:root {}</w:t>
+            </w:r>
+            <w:r>
+              <w:t xml:space="preserve"> </w:t>
+            </w:r>
+            <w:r>
+              <w:t xml:space="preserve">+</w:t>
+            </w:r>
+            <w:r>
+              <w:t xml:space="preserve"> </w:t>
+            </w:r>
+            <w:r>
+              <w:rPr>
+                <w:rStyle w:val="VerbatimChar"/>
+              </w:rPr>
+              <w:t xml:space="preserve">[data-theme="dark"]</w:t>
+            </w:r>
+            <w:r>
+              <w:t xml:space="preserve"> </w:t>
+            </w:r>
+            <w:r>
+              <w:t xml:space="preserve">override), every platform consumes GENERATED bindings never hand-copies, no invented values (§11.4.6 applied to design — every color traceable to eyedrop/measured-contrast evidence). §11.4.217 — OpenDesign brand contract: every UI-shipping product carries a 9-section DESIGN.md (category blockquote, font-labels block,</w:t>
+            </w:r>
+            <w:r>
+              <w:t xml:space="preserve"> </w:t>
+            </w:r>
+            <w:r>
+              <w:rPr>
+                <w:rStyle w:val="VerbatimChar"/>
+              </w:rPr>
+              <w:t xml:space="preserve">:root {}</w:t>
+            </w:r>
+            <w:r>
+              <w:t xml:space="preserve"> </w:t>
+            </w:r>
+            <w:r>
+              <w:t xml:space="preserve">+</w:t>
+            </w:r>
+            <w:r>
+              <w:t xml:space="preserve"> </w:t>
+            </w:r>
+            <w:r>
+              <w:rPr>
+                <w:rStyle w:val="VerbatimChar"/>
+              </w:rPr>
+              <w:t xml:space="preserve">[data-theme="dark"]</w:t>
+            </w:r>
+            <w:r>
+              <w:t xml:space="preserve">, targeted reduced-motion,</w:t>
+            </w:r>
+            <w:r>
+              <w:t xml:space="preserve"> </w:t>
+            </w:r>
+            <w:r>
+              <w:rPr>
+                <w:rStyle w:val="VerbatimChar"/>
+              </w:rPr>
+              <w:t xml:space="preserve">:focus-visible</w:t>
+            </w:r>
+            <w:r>
+              <w:t xml:space="preserve">) + a machine-readable tokens.css twin under</w:t>
+            </w:r>
+            <w:r>
+              <w:t xml:space="preserve"> </w:t>
+            </w:r>
+            <w:r>
+              <w:rPr>
+                <w:rStyle w:val="VerbatimChar"/>
+              </w:rPr>
+              <w:t xml:space="preserve">design/opendesign/</w:t>
+            </w:r>
+            <w:r>
+              <w:t xml:space="preserve">; brand/accent/semantic are DISJOINT color roles; white-label is a closed override set with SERVER-VALIDATED WCAG AA ≥4.5:1 accents; the attribution footer is locked, never removed even white-labeled. §11.4.218 — living design-library catalogue: every component × state × theme rendered in self-contained artifacts (zero CDNs, real behaviors), plus a cross-platform reusability matrix with per-cell VERIFIED/PROPOSED/ASSUMED provenance. §11.4.219 — per-app screen catalogues: full-IA coverage per surface, per-platform chrome variants, honesty markers ([GAP]/[OPEN]) for unbuilt behavior — never a fake flow. §11.4.220 — open-first design tooling: self-hosted PenPot is the primary design platform, consumed ONLY via the dedicated PenPot submodule (working name vasic-digital/PenPot, final name pending — generic referent normative meanwhile; mechanisms/utils only: deployment recipe, RPC client, access-token minting, import tooling, browser-hydration automation, MCP wiring; itself consuming the Containers submodule §11.4.76/§11.4.161 with a §11.4.31 helix-deps.yaml declaration; NO hand-rolled PenPot deployment/client code in projects §11.4.28/§11.4.74); proprietary tools (Figma) are import/export bridges only, never the source of truth; design sources live in-repo in open formats (SVG/CSS/JSON/Lottie/self-contained HTML); tooling claims runtime-probed (§11.4.201/§11.4.99); automation auth = token-authenticated RPC access tokens (enable-access-tokens), never interactive OAuth relays; API-created files require a browser hydration pass before handoff (thumbnails/text layout). §11.4.221 — motion discipline: token-bound durations/easings only; every playable animation ships a keyframe-derived reduced-motion static fallback named in a machine-readable motion manifest (deliberate instant-cut = explicit null-with-reason); prefers-reduced-motion honored via targeted gates never a global *; every animation render-validated before claimed working, unverified runtimes [OPEN]-tracked. §11.4.222 — design-completion export wave: a design is not done until per-platform token codegen, the FULL icon/asset raster matrix via the honest-output raster pipeline (probe-tested renderers §11.4.201, honest SKIP-with-note §11.4.3/§11.4.69, NEVER faked/blank outputs, every raster verified non-degenerate §11.4.38), both-theme screen renders + the bound design book, honest-status hand-off bundles, and the §11.4.65/§11.4.73 doc twins land. §11.4.223 — provenance-marker discipline for design docs: [VERIFIED]/[OPERATOR]/[DEFAULT — adjustable]/[OPEN: id] markers mandatory, every open item centrally registered in the area index (tree-verified both directions §11.4.186) and mapped to tracked workable items (§11.4.93/§11.4.197). All Classification: universal (§11.4.17) — consumers supply brand values, platform lists, paths, and submodule pointers as DATA per §11.4.35. Propagation gates CM-COVENANT-114-216…223-PROPAGATION + recommended mechanism gates + paired §1.1 mutations (gate-code = separate work item). CLAUDE.md + AGENTS.md + QWEN.md + GEMINI.md mirrors updated in lockstep (§11.4.157). Generated .html/.pdf/.docx twins NOT regenerated this round — no in-repo §11.4.65 export-pipeline invocation is available in this checkout; twins are honestly STALE pending the exporter run (§11.4.6, no silent divergence claimed otherwise). Prior round: Round 2 of 2026-07-17 — the CARRIER / MEASUREMENT-INTEGRITY harvest (research-derived from one cycle's forensics in a consuming project). 4 EXTENSIONS + 2 NEW anchors + 1 candidate REJECTED-as-already-covered. The unifying FACT: every false finding that cycle had ONE shape — a token that MENTIONS X matched as X, or an instrument's silence read as data (a removal's ref-count matched the audit-trail comments DOCUMENTING the removal; escapes eaten by a wrapper shell so the far side searched a literal;</w:t>
             </w:r>
             <w:r>
               <w:t xml:space="preserve"> </w:t>
@@ -56584,6 +56677,1790 @@
       </w:r>
       <w:r>
         <w:t xml:space="preserve">are unchanged and their propagation gates stay GREEN. All recommended mechanism gates + paired §1.1 mutations = gate-code, a separate work item.</w:t>
+      </w:r>
+    </w:p>
+    <w:p>
+      <w:pPr>
+        <w:pStyle w:val="BodyText"/>
+      </w:pPr>
+      <w:r>
+        <w:rPr>
+          <w:b/>
+          <w:bCs/>
+        </w:rPr>
+        <w:t xml:space="preserve">DESIGN-METHODOLOGY MANDATES landed 2026-07-22 (§11.4.216–§11.4.223 — full text in</w:t>
+      </w:r>
+      <w:r>
+        <w:rPr>
+          <w:b/>
+          <w:bCs/>
+        </w:rPr>
+        <w:t xml:space="preserve"> </w:t>
+      </w:r>
+      <w:r>
+        <w:rPr>
+          <w:rStyle w:val="VerbatimChar"/>
+          <w:b/>
+          <w:bCs/>
+        </w:rPr>
+        <w:t xml:space="preserve">Constitution.md</w:t>
+      </w:r>
+      <w:r>
+        <w:rPr>
+          <w:b/>
+          <w:bCs/>
+        </w:rPr>
+        <w:t xml:space="preserve">; proving project: the Helix Thready MVP design package at</w:t>
+      </w:r>
+      <w:r>
+        <w:rPr>
+          <w:b/>
+          <w:bCs/>
+        </w:rPr>
+        <w:t xml:space="preserve"> </w:t>
+      </w:r>
+      <w:r>
+        <w:rPr>
+          <w:rStyle w:val="VerbatimChar"/>
+          <w:b/>
+          <w:bCs/>
+        </w:rPr>
+        <w:t xml:space="preserve">docs/public/research/mvp/design/</w:t>
+      </w:r>
+      <w:r>
+        <w:rPr>
+          <w:b/>
+          <w:bCs/>
+        </w:rPr>
+        <w:t xml:space="preserve">).</w:t>
+      </w:r>
+      <w:r>
+        <w:t xml:space="preserve"> </w:t>
+      </w:r>
+      <w:r>
+        <w:t xml:space="preserve">The complete design methodology built and verified end-to-end in Helix Thready is codified as eight universal anchors so every governed project inherits it out of the box. All Classification: universal (§11.4.17) — consumers supply brand values, platform lists, paths, and submodule pointers as DATA per §11.4.35. Propagation gates</w:t>
+      </w:r>
+      <w:r>
+        <w:t xml:space="preserve"> </w:t>
+      </w:r>
+      <w:r>
+        <w:rPr>
+          <w:rStyle w:val="VerbatimChar"/>
+        </w:rPr>
+        <w:t xml:space="preserve">CM-COVENANT-114-216-PROPAGATION</w:t>
+      </w:r>
+      <w:r>
+        <w:t xml:space="preserve"> </w:t>
+      </w:r>
+      <w:r>
+        <w:t xml:space="preserve">…</w:t>
+      </w:r>
+      <w:r>
+        <w:t xml:space="preserve"> </w:t>
+      </w:r>
+      <w:r>
+        <w:rPr>
+          <w:rStyle w:val="VerbatimChar"/>
+        </w:rPr>
+        <w:t xml:space="preserve">CM-COVENANT-114-223-PROPAGATION</w:t>
+      </w:r>
+      <w:r>
+        <w:t xml:space="preserve"> </w:t>
+      </w:r>
+      <w:r>
+        <w:t xml:space="preserve">(literals</w:t>
+      </w:r>
+      <w:r>
+        <w:t xml:space="preserve"> </w:t>
+      </w:r>
+      <w:r>
+        <w:rPr>
+          <w:rStyle w:val="VerbatimChar"/>
+        </w:rPr>
+        <w:t xml:space="preserve">11.4.216</w:t>
+      </w:r>
+      <w:r>
+        <w:t xml:space="preserve">–</w:t>
+      </w:r>
+      <w:r>
+        <w:rPr>
+          <w:rStyle w:val="VerbatimChar"/>
+        </w:rPr>
+        <w:t xml:space="preserve">11.4.223</w:t>
+      </w:r>
+      <w:r>
+        <w:t xml:space="preserve">) + recommended mechanism gates + paired §1.1 mutations = gate-code, a separate work item.</w:t>
+      </w:r>
+    </w:p>
+    <w:p>
+      <w:pPr>
+        <w:pStyle w:val="BodyText"/>
+      </w:pPr>
+      <w:r>
+        <w:rPr>
+          <w:b/>
+          <w:bCs/>
+        </w:rPr>
+        <w:t xml:space="preserve">§11.4.216 — Canonical machine-readable design-token source (User mandate, 2026-07-22).</w:t>
+      </w:r>
+      <w:r>
+        <w:t xml:space="preserve"> </w:t>
+      </w:r>
+      <w:r>
+        <w:t xml:space="preserve">Compact summary: every UI-shipping project maintains its design tokens as ONE canonical machine-readable source — CSS custom properties, light in</w:t>
+      </w:r>
+      <w:r>
+        <w:t xml:space="preserve"> </w:t>
+      </w:r>
+      <w:r>
+        <w:rPr>
+          <w:rStyle w:val="VerbatimChar"/>
+        </w:rPr>
+        <w:t xml:space="preserve">:root {}</w:t>
+      </w:r>
+      <w:r>
+        <w:t xml:space="preserve">, dark via the</w:t>
+      </w:r>
+      <w:r>
+        <w:t xml:space="preserve"> </w:t>
+      </w:r>
+      <w:r>
+        <w:rPr>
+          <w:rStyle w:val="VerbatimChar"/>
+        </w:rPr>
+        <w:t xml:space="preserve">[data-theme="dark"]</w:t>
+      </w:r>
+      <w:r>
+        <w:t xml:space="preserve"> </w:t>
+      </w:r>
+      <w:r>
+        <w:t xml:space="preserve">override (composing the sanctioned dark mechanisms) — and EVERY surface binds via</w:t>
+      </w:r>
+      <w:r>
+        <w:t xml:space="preserve"> </w:t>
+      </w:r>
+      <w:r>
+        <w:rPr>
+          <w:rStyle w:val="VerbatimChar"/>
+        </w:rPr>
+        <w:t xml:space="preserve">var(--…)</w:t>
+      </w:r>
+      <w:r>
+        <w:t xml:space="preserve"> </w:t>
+      </w:r>
+      <w:r>
+        <w:t xml:space="preserve">or a GENERATED binding produced by codegen FROM that file, never a hand-kept copy (hand-copies drift silently); NO INVENTED VALUES (§11.4.6 applied to design): every color/size/duration traceable to captured evidence — brand colors to a recorded eyedrop/measurement of the canonical brand asset (proving project: brand</w:t>
+      </w:r>
+      <w:r>
+        <w:t xml:space="preserve"> </w:t>
+      </w:r>
+      <w:r>
+        <w:rPr>
+          <w:rStyle w:val="VerbatimChar"/>
+        </w:rPr>
+        <w:t xml:space="preserve">#B6E376</w:t>
+      </w:r>
+      <w:r>
+        <w:t xml:space="preserve"> </w:t>
+      </w:r>
+      <w:r>
+        <w:t xml:space="preserve">= mean of 1,625,855 logo pixels), accent pairs to MEASURED WCAG ratios against their PAIRED background (6.03:1 light / 13.56:1 dark), structural values to the documented shared scale; a hex resolving to no token is a violation — use the nearest token, never mint one; the token source is the white-label seam (§11.4.217 closed override set); not-yet-built codegen bridges are [OPEN]-tracked (§11.4.223), never claimed shipped. Composes §11.4.6/.162/.170/.190/.197/.217/.223. Propagation gate</w:t>
+      </w:r>
+      <w:r>
+        <w:t xml:space="preserve"> </w:t>
+      </w:r>
+      <w:r>
+        <w:rPr>
+          <w:rStyle w:val="VerbatimChar"/>
+        </w:rPr>
+        <w:t xml:space="preserve">CM-COVENANT-114-216-PROPAGATION</w:t>
+      </w:r>
+      <w:r>
+        <w:t xml:space="preserve"> </w:t>
+      </w:r>
+      <w:r>
+        <w:t xml:space="preserve">+ recommended gate</w:t>
+      </w:r>
+      <w:r>
+        <w:t xml:space="preserve"> </w:t>
+      </w:r>
+      <w:r>
+        <w:rPr>
+          <w:rStyle w:val="VerbatimChar"/>
+        </w:rPr>
+        <w:t xml:space="preserve">CM-DESIGN-TOKEN-SINGLE-SOURCE</w:t>
+      </w:r>
+      <w:r>
+        <w:t xml:space="preserve"> </w:t>
+      </w:r>
+      <w:r>
+        <w:t xml:space="preserve">+ paired §1.1 mutation.</w:t>
+      </w:r>
+      <w:r>
+        <w:t xml:space="preserve"> </w:t>
+      </w:r>
+      <w:r>
+        <w:rPr>
+          <w:b/>
+          <w:bCs/>
+        </w:rPr>
+        <w:t xml:space="preserve">Canonical authority:</w:t>
+      </w:r>
+      <w:r>
+        <w:t xml:space="preserve"> </w:t>
+      </w:r>
+      <w:r>
+        <w:t xml:space="preserve">constitution submodule</w:t>
+      </w:r>
+      <w:r>
+        <w:t xml:space="preserve"> </w:t>
+      </w:r>
+      <w:hyperlink r:id="rId70">
+        <w:r>
+          <w:rPr>
+            <w:rStyle w:val="VerbatimChar"/>
+          </w:rPr>
+          <w:t xml:space="preserve">Constitution.md</w:t>
+        </w:r>
+      </w:hyperlink>
+      <w:r>
+        <w:t xml:space="preserve"> </w:t>
+      </w:r>
+      <w:r>
+        <w:t xml:space="preserve">§11.4.216. Non-compliance is a release blocker. No escape hatch — no</w:t>
+      </w:r>
+      <w:r>
+        <w:t xml:space="preserve"> </w:t>
+      </w:r>
+      <w:r>
+        <w:rPr>
+          <w:rStyle w:val="VerbatimChar"/>
+        </w:rPr>
+        <w:t xml:space="preserve">--hand-copied-palette-OK</w:t>
+      </w:r>
+      <w:r>
+        <w:t xml:space="preserve">,</w:t>
+      </w:r>
+      <w:r>
+        <w:t xml:space="preserve"> </w:t>
+      </w:r>
+      <w:r>
+        <w:rPr>
+          <w:rStyle w:val="VerbatimChar"/>
+        </w:rPr>
+        <w:t xml:space="preserve">--inline-hex-OK</w:t>
+      </w:r>
+      <w:r>
+        <w:t xml:space="preserve">,</w:t>
+      </w:r>
+      <w:r>
+        <w:t xml:space="preserve"> </w:t>
+      </w:r>
+      <w:r>
+        <w:rPr>
+          <w:rStyle w:val="VerbatimChar"/>
+        </w:rPr>
+        <w:t xml:space="preserve">--invent-token-value</w:t>
+      </w:r>
+      <w:r>
+        <w:t xml:space="preserve">,</w:t>
+      </w:r>
+      <w:r>
+        <w:t xml:space="preserve"> </w:t>
+      </w:r>
+      <w:r>
+        <w:rPr>
+          <w:rStyle w:val="VerbatimChar"/>
+        </w:rPr>
+        <w:t xml:space="preserve">--light-only-tokens</w:t>
+      </w:r>
+      <w:r>
+        <w:t xml:space="preserve">,</w:t>
+      </w:r>
+      <w:r>
+        <w:t xml:space="preserve"> </w:t>
+      </w:r>
+      <w:r>
+        <w:rPr>
+          <w:rStyle w:val="VerbatimChar"/>
+        </w:rPr>
+        <w:t xml:space="preserve">--platform-keeps-own-palette</w:t>
+      </w:r>
+      <w:r>
+        <w:t xml:space="preserve"> </w:t>
+      </w:r>
+      <w:r>
+        <w:t xml:space="preserve">flag.</w:t>
+      </w:r>
+    </w:p>
+    <w:p>
+      <w:pPr>
+        <w:pStyle w:val="BodyText"/>
+      </w:pPr>
+      <w:r>
+        <w:rPr>
+          <w:b/>
+          <w:bCs/>
+        </w:rPr>
+        <w:t xml:space="preserve">§11.4.217 — OpenDesign brand contract: 9-section DESIGN.md + tokens.css twin, disjoint color roles, AA-pinned accents, locked attribution footer (User mandate, 2026-07-22).</w:t>
+      </w:r>
+      <w:r>
+        <w:t xml:space="preserve"> </w:t>
+      </w:r>
+      <w:r>
+        <w:t xml:space="preserve">Compact summary: every UI-shipping product carries under</w:t>
+      </w:r>
+      <w:r>
+        <w:t xml:space="preserve"> </w:t>
+      </w:r>
+      <w:r>
+        <w:rPr>
+          <w:rStyle w:val="VerbatimChar"/>
+        </w:rPr>
+        <w:t xml:space="preserve">design/opendesign/</w:t>
+      </w:r>
+      <w:r>
+        <w:t xml:space="preserve"> </w:t>
+      </w:r>
+      <w:r>
+        <w:t xml:space="preserve">(or its declared equivalent §11.4.35) a</w:t>
+      </w:r>
+      <w:r>
+        <w:t xml:space="preserve"> </w:t>
+      </w:r>
+      <w:r>
+        <w:rPr>
+          <w:rStyle w:val="VerbatimChar"/>
+        </w:rPr>
+        <w:t xml:space="preserve">DESIGN.md</w:t>
+      </w:r>
+      <w:r>
+        <w:t xml:space="preserve"> </w:t>
+      </w:r>
+      <w:r>
+        <w:t xml:space="preserve">in the VERIFIED OpenDesign 9-section schema (H1 +</w:t>
+      </w:r>
+      <w:r>
+        <w:t xml:space="preserve"> </w:t>
+      </w:r>
+      <w:r>
+        <w:rPr>
+          <w:rStyle w:val="VerbatimChar"/>
+        </w:rPr>
+        <w:t xml:space="preserve">&gt; Category:</w:t>
+      </w:r>
+      <w:r>
+        <w:t xml:space="preserve"> </w:t>
+      </w:r>
+      <w:r>
+        <w:t xml:space="preserve">blockquote immediately after the H1; number-prefix-parsed sections; a "Font labels for catalog extraction" block; real hex; CSS variables wrapped in</w:t>
+      </w:r>
+      <w:r>
+        <w:t xml:space="preserve"> </w:t>
+      </w:r>
+      <w:r>
+        <w:rPr>
+          <w:rStyle w:val="VerbatimChar"/>
+        </w:rPr>
+        <w:t xml:space="preserve">:root {}</w:t>
+      </w:r>
+      <w:r>
+        <w:t xml:space="preserve"> </w:t>
+      </w:r>
+      <w:r>
+        <w:t xml:space="preserve">with dark via</w:t>
+      </w:r>
+      <w:r>
+        <w:t xml:space="preserve"> </w:t>
+      </w:r>
+      <w:r>
+        <w:rPr>
+          <w:rStyle w:val="VerbatimChar"/>
+        </w:rPr>
+        <w:t xml:space="preserve">[data-theme="dark"]</w:t>
+      </w:r>
+      <w:r>
+        <w:t xml:space="preserve">; real component CSS with</w:t>
+      </w:r>
+      <w:r>
+        <w:t xml:space="preserve"> </w:t>
+      </w:r>
+      <w:r>
+        <w:rPr>
+          <w:rStyle w:val="VerbatimChar"/>
+        </w:rPr>
+        <w:t xml:space="preserve">prefers-reduced-motion</w:t>
+      </w:r>
+      <w:r>
+        <w:t xml:space="preserve"> </w:t>
+      </w:r>
+      <w:r>
+        <w:t xml:space="preserve">targeting specific elements, never a global</w:t>
+      </w:r>
+      <w:r>
+        <w:t xml:space="preserve"> </w:t>
+      </w:r>
+      <w:r>
+        <w:rPr>
+          <w:rStyle w:val="VerbatimChar"/>
+        </w:rPr>
+        <w:t xml:space="preserve">*</w:t>
+      </w:r>
+      <w:r>
+        <w:t xml:space="preserve">;</w:t>
+      </w:r>
+      <w:r>
+        <w:t xml:space="preserve"> </w:t>
+      </w:r>
+      <w:r>
+        <w:rPr>
+          <w:rStyle w:val="VerbatimChar"/>
+        </w:rPr>
+        <w:t xml:space="preserve">:focus-visible</w:t>
+      </w:r>
+      <w:r>
+        <w:t xml:space="preserve"> </w:t>
+      </w:r>
+      <w:r>
+        <w:t xml:space="preserve">on every interactive component — format verified against the tool's CURRENT source per §11.4.99, never from memory) + the machine-readable</w:t>
+      </w:r>
+      <w:r>
+        <w:t xml:space="preserve"> </w:t>
+      </w:r>
+      <w:r>
+        <w:rPr>
+          <w:rStyle w:val="VerbatimChar"/>
+        </w:rPr>
+        <w:t xml:space="preserve">tokens.css</w:t>
+      </w:r>
+      <w:r>
+        <w:t xml:space="preserve"> </w:t>
+      </w:r>
+      <w:r>
+        <w:t xml:space="preserve">twin (the §11.4.216 canonical file or a compiled view; prose and tokens never diverge); THREE DISJOINT color roles by contract — brand DECORATIVE only (never body text), accent INTERACTIVE + AA-PINNED (measured ≥ 4.5:1 per mode), semantic STATE never overridden by any brand (a brand color can never mask an error signal); white-label = a CLOSED override set (brand tokens, accent pair, logo, slogan) with accent overrides SERVER-VALIDATED to WCAG AA or REJECTED carrying the measured ratio + an AA-passing suggestion; structural/neutral/semantic tokens NOT account-overridable; the organization attribution footer is LOCKED — present on every surface, never removed even fully white-labeled. Composes §11.4.6/.99/.162/.190/.216/.220/.223. Propagation gate</w:t>
+      </w:r>
+      <w:r>
+        <w:t xml:space="preserve"> </w:t>
+      </w:r>
+      <w:r>
+        <w:rPr>
+          <w:rStyle w:val="VerbatimChar"/>
+        </w:rPr>
+        <w:t xml:space="preserve">CM-COVENANT-114-217-PROPAGATION</w:t>
+      </w:r>
+      <w:r>
+        <w:t xml:space="preserve"> </w:t>
+      </w:r>
+      <w:r>
+        <w:t xml:space="preserve">+ recommended gate</w:t>
+      </w:r>
+      <w:r>
+        <w:t xml:space="preserve"> </w:t>
+      </w:r>
+      <w:r>
+        <w:rPr>
+          <w:rStyle w:val="VerbatimChar"/>
+        </w:rPr>
+        <w:t xml:space="preserve">CM-OPENDESIGN-BRAND-CONTRACT</w:t>
+      </w:r>
+      <w:r>
+        <w:t xml:space="preserve"> </w:t>
+      </w:r>
+      <w:r>
+        <w:t xml:space="preserve">+ paired §1.1 mutation.</w:t>
+      </w:r>
+      <w:r>
+        <w:t xml:space="preserve"> </w:t>
+      </w:r>
+      <w:r>
+        <w:rPr>
+          <w:b/>
+          <w:bCs/>
+        </w:rPr>
+        <w:t xml:space="preserve">Canonical authority:</w:t>
+      </w:r>
+      <w:r>
+        <w:t xml:space="preserve"> </w:t>
+      </w:r>
+      <w:r>
+        <w:t xml:space="preserve">constitution submodule</w:t>
+      </w:r>
+      <w:r>
+        <w:t xml:space="preserve"> </w:t>
+      </w:r>
+      <w:hyperlink r:id="rId70">
+        <w:r>
+          <w:rPr>
+            <w:rStyle w:val="VerbatimChar"/>
+          </w:rPr>
+          <w:t xml:space="preserve">Constitution.md</w:t>
+        </w:r>
+      </w:hyperlink>
+      <w:r>
+        <w:t xml:space="preserve"> </w:t>
+      </w:r>
+      <w:r>
+        <w:t xml:space="preserve">§11.4.217. Non-compliance is a release blocker. No escape hatch — no</w:t>
+      </w:r>
+      <w:r>
+        <w:t xml:space="preserve"> </w:t>
+      </w:r>
+      <w:r>
+        <w:rPr>
+          <w:rStyle w:val="VerbatimChar"/>
+        </w:rPr>
+        <w:t xml:space="preserve">--skip-brand-contract</w:t>
+      </w:r>
+      <w:r>
+        <w:t xml:space="preserve">,</w:t>
+      </w:r>
+      <w:r>
+        <w:t xml:space="preserve"> </w:t>
+      </w:r>
+      <w:r>
+        <w:rPr>
+          <w:rStyle w:val="VerbatimChar"/>
+        </w:rPr>
+        <w:t xml:space="preserve">--prose-only-design-md</w:t>
+      </w:r>
+      <w:r>
+        <w:t xml:space="preserve">,</w:t>
+      </w:r>
+      <w:r>
+        <w:t xml:space="preserve"> </w:t>
+      </w:r>
+      <w:r>
+        <w:rPr>
+          <w:rStyle w:val="VerbatimChar"/>
+        </w:rPr>
+        <w:t xml:space="preserve">--brand-as-text-OK</w:t>
+      </w:r>
+      <w:r>
+        <w:t xml:space="preserve">,</w:t>
+      </w:r>
+      <w:r>
+        <w:t xml:space="preserve"> </w:t>
+      </w:r>
+      <w:r>
+        <w:rPr>
+          <w:rStyle w:val="VerbatimChar"/>
+        </w:rPr>
+        <w:t xml:space="preserve">--unvalidated-accent-override</w:t>
+      </w:r>
+      <w:r>
+        <w:t xml:space="preserve">,</w:t>
+      </w:r>
+      <w:r>
+        <w:t xml:space="preserve"> </w:t>
+      </w:r>
+      <w:r>
+        <w:rPr>
+          <w:rStyle w:val="VerbatimChar"/>
+        </w:rPr>
+        <w:t xml:space="preserve">--remove-attribution-footer</w:t>
+      </w:r>
+      <w:r>
+        <w:t xml:space="preserve">,</w:t>
+      </w:r>
+      <w:r>
+        <w:t xml:space="preserve"> </w:t>
+      </w:r>
+      <w:r>
+        <w:rPr>
+          <w:rStyle w:val="VerbatimChar"/>
+        </w:rPr>
+        <w:t xml:space="preserve">--semantic-tokens-brandable</w:t>
+      </w:r>
+      <w:r>
+        <w:t xml:space="preserve"> </w:t>
+      </w:r>
+      <w:r>
+        <w:t xml:space="preserve">flag.</w:t>
+      </w:r>
+    </w:p>
+    <w:p>
+      <w:pPr>
+        <w:pStyle w:val="BodyText"/>
+      </w:pPr>
+      <w:r>
+        <w:rPr>
+          <w:b/>
+          <w:bCs/>
+        </w:rPr>
+        <w:t xml:space="preserve">§11.4.218 — Living design-library catalogue + per-cell-provenance reusability matrix (User mandate, 2026-07-22).</w:t>
+      </w:r>
+      <w:r>
+        <w:t xml:space="preserve"> </w:t>
+      </w:r>
+      <w:r>
+        <w:t xml:space="preserve">Compact summary: every UI-shipping project maintains a LIVING component catalogue rendering EVERY component × declared state × light/dark from SELF-CONTAINED artifacts (zero external requests — no CDNs, vendored libs inline, honest font fallbacks), token-bound (§11.4.216), with REAL interactive behaviors (real dialog/sort/toggle;</w:t>
+      </w:r>
+      <w:r>
+        <w:t xml:space="preserve"> </w:t>
+      </w:r>
+      <w:r>
+        <w:rPr>
+          <w:rStyle w:val="VerbatimChar"/>
+        </w:rPr>
+        <w:t xml:space="preserve">prefers-reduced-motion</w:t>
+      </w:r>
+      <w:r>
+        <w:t xml:space="preserve"> </w:t>
+      </w:r>
+      <w:r>
+        <w:t xml:space="preserve">honored per §11.4.221) — proving project: 14 groups, ~38 components, ≈118 state cells, ≈236 rendered states, both themes auditable via a real persisted toggle; PLUS a components × platforms reusability matrix where EVERY cell carries closed-set provenance — VERIFIED (re-checked at source, dated) / PROPOSED ([DEFAULT — adjustable]) / ASSUMED (labeled inference); an unmarked cell reads ASSUMED; a scaffold cell claiming VERIFIED is a §11.4 PASS-bluff at the design-planning layer; the matrix is read BEFORE implementing any component on any platform. Spec'd-but-unrendered components/states are tracked gaps (§11.4.223). Composes §11.4.6/.162/.170/.216/.221/.223. Propagation gate</w:t>
+      </w:r>
+      <w:r>
+        <w:t xml:space="preserve"> </w:t>
+      </w:r>
+      <w:r>
+        <w:rPr>
+          <w:rStyle w:val="VerbatimChar"/>
+        </w:rPr>
+        <w:t xml:space="preserve">CM-COVENANT-114-218-PROPAGATION</w:t>
+      </w:r>
+      <w:r>
+        <w:t xml:space="preserve"> </w:t>
+      </w:r>
+      <w:r>
+        <w:t xml:space="preserve">+ recommended gate</w:t>
+      </w:r>
+      <w:r>
+        <w:t xml:space="preserve"> </w:t>
+      </w:r>
+      <w:r>
+        <w:rPr>
+          <w:rStyle w:val="VerbatimChar"/>
+        </w:rPr>
+        <w:t xml:space="preserve">CM-DESIGN-LIBRARY-LIVING-CATALOGUE</w:t>
+      </w:r>
+      <w:r>
+        <w:t xml:space="preserve"> </w:t>
+      </w:r>
+      <w:r>
+        <w:t xml:space="preserve">+ paired §1.1 mutation.</w:t>
+      </w:r>
+      <w:r>
+        <w:t xml:space="preserve"> </w:t>
+      </w:r>
+      <w:r>
+        <w:rPr>
+          <w:b/>
+          <w:bCs/>
+        </w:rPr>
+        <w:t xml:space="preserve">Canonical authority:</w:t>
+      </w:r>
+      <w:r>
+        <w:t xml:space="preserve"> </w:t>
+      </w:r>
+      <w:r>
+        <w:t xml:space="preserve">constitution submodule</w:t>
+      </w:r>
+      <w:r>
+        <w:t xml:space="preserve"> </w:t>
+      </w:r>
+      <w:hyperlink r:id="rId70">
+        <w:r>
+          <w:rPr>
+            <w:rStyle w:val="VerbatimChar"/>
+          </w:rPr>
+          <w:t xml:space="preserve">Constitution.md</w:t>
+        </w:r>
+      </w:hyperlink>
+      <w:r>
+        <w:t xml:space="preserve"> </w:t>
+      </w:r>
+      <w:r>
+        <w:t xml:space="preserve">§11.4.218. Non-compliance is a release blocker. No escape hatch — no</w:t>
+      </w:r>
+      <w:r>
+        <w:t xml:space="preserve"> </w:t>
+      </w:r>
+      <w:r>
+        <w:rPr>
+          <w:rStyle w:val="VerbatimChar"/>
+        </w:rPr>
+        <w:t xml:space="preserve">--cdn-in-catalogue</w:t>
+      </w:r>
+      <w:r>
+        <w:t xml:space="preserve">,</w:t>
+      </w:r>
+      <w:r>
+        <w:t xml:space="preserve"> </w:t>
+      </w:r>
+      <w:r>
+        <w:rPr>
+          <w:rStyle w:val="VerbatimChar"/>
+        </w:rPr>
+        <w:t xml:space="preserve">--single-theme-catalogue</w:t>
+      </w:r>
+      <w:r>
+        <w:t xml:space="preserve">,</w:t>
+      </w:r>
+      <w:r>
+        <w:t xml:space="preserve"> </w:t>
+      </w:r>
+      <w:r>
+        <w:rPr>
+          <w:rStyle w:val="VerbatimChar"/>
+        </w:rPr>
+        <w:t xml:space="preserve">--mocked-behaviors-OK</w:t>
+      </w:r>
+      <w:r>
+        <w:t xml:space="preserve">,</w:t>
+      </w:r>
+      <w:r>
+        <w:t xml:space="preserve"> </w:t>
+      </w:r>
+      <w:r>
+        <w:rPr>
+          <w:rStyle w:val="VerbatimChar"/>
+        </w:rPr>
+        <w:t xml:space="preserve">--unmarked-matrix-cell</w:t>
+      </w:r>
+      <w:r>
+        <w:t xml:space="preserve">,</w:t>
+      </w:r>
+      <w:r>
+        <w:t xml:space="preserve"> </w:t>
+      </w:r>
+      <w:r>
+        <w:rPr>
+          <w:rStyle w:val="VerbatimChar"/>
+        </w:rPr>
+        <w:t xml:space="preserve">--scaffold-claims-verified</w:t>
+      </w:r>
+      <w:r>
+        <w:t xml:space="preserve"> </w:t>
+      </w:r>
+      <w:r>
+        <w:t xml:space="preserve">flag.</w:t>
+      </w:r>
+    </w:p>
+    <w:p>
+      <w:pPr>
+        <w:pStyle w:val="BodyText"/>
+      </w:pPr>
+      <w:r>
+        <w:rPr>
+          <w:b/>
+          <w:bCs/>
+        </w:rPr>
+        <w:t xml:space="preserve">§11.4.219 — Per-app screen catalogues: full-IA coverage, per-platform chrome, honesty markers (User mandate, 2026-07-22).</w:t>
+      </w:r>
+      <w:r>
+        <w:t xml:space="preserve"> </w:t>
+      </w:r>
+      <w:r>
+        <w:t xml:space="preserve">Compact summary: every shipped surface (web / mobile / desktop / TUI / marketing / …) has a screen catalogue covering EVERY node of its information architecture (an IA node with no catalogue screen is a tracked gap, never silently skipped); per-platform CHROME VARIANTS rendered where one design serves several hosts (mobile OS chrome toggle, per-OS window chrome, terminal-width constraints); each screen SELF-CONTAINED, token-bound (§11.4.216), light + dark, populated with REALISTIC product data and a per-screen state contract (loading/empty/error/populated); UNBUILT or UNDECIDED behavior is HONESTLY marked —</w:t>
+      </w:r>
+      <w:r>
+        <w:t xml:space="preserve"> </w:t>
+      </w:r>
+      <w:r>
+        <w:rPr>
+          <w:rStyle w:val="VerbatimChar"/>
+        </w:rPr>
+        <w:t xml:space="preserve">[GAP: id]</w:t>
+      </w:r>
+      <w:r>
+        <w:t xml:space="preserve"> </w:t>
+      </w:r>
+      <w:r>
+        <w:t xml:space="preserve">/</w:t>
+      </w:r>
+      <w:r>
+        <w:t xml:space="preserve"> </w:t>
+      </w:r>
+      <w:r>
+        <w:rPr>
+          <w:rStyle w:val="VerbatimChar"/>
+        </w:rPr>
+        <w:t xml:space="preserve">[OPEN: id]</w:t>
+      </w:r>
+      <w:r>
+        <w:t xml:space="preserve"> </w:t>
+      </w:r>
+      <w:r>
+        <w:t xml:space="preserve">(§11.4.223), labelled placeholders, inline notes, disabled controls — NEVER a designed-as-if-real fake flow (a fake flow presented as settled is a §11.4 PASS-bluff at the product-design layer). Proving project: 13 web + 11 mobile (Android/iOS chrome toggle) + desktop shell + 10 TUI + 3 marketing screens, every unbacked flow marked. Composes §11.4.6/.162/.170/.185/.190/.216/.218/.223. Propagation gate</w:t>
+      </w:r>
+      <w:r>
+        <w:t xml:space="preserve"> </w:t>
+      </w:r>
+      <w:r>
+        <w:rPr>
+          <w:rStyle w:val="VerbatimChar"/>
+        </w:rPr>
+        <w:t xml:space="preserve">CM-COVENANT-114-219-PROPAGATION</w:t>
+      </w:r>
+      <w:r>
+        <w:t xml:space="preserve"> </w:t>
+      </w:r>
+      <w:r>
+        <w:t xml:space="preserve">+ recommended gate</w:t>
+      </w:r>
+      <w:r>
+        <w:t xml:space="preserve"> </w:t>
+      </w:r>
+      <w:r>
+        <w:rPr>
+          <w:rStyle w:val="VerbatimChar"/>
+        </w:rPr>
+        <w:t xml:space="preserve">CM-SCREEN-CATALOGUE-FULL-IA</w:t>
+      </w:r>
+      <w:r>
+        <w:t xml:space="preserve"> </w:t>
+      </w:r>
+      <w:r>
+        <w:t xml:space="preserve">+ paired §1.1 mutation.</w:t>
+      </w:r>
+      <w:r>
+        <w:t xml:space="preserve"> </w:t>
+      </w:r>
+      <w:r>
+        <w:rPr>
+          <w:b/>
+          <w:bCs/>
+        </w:rPr>
+        <w:t xml:space="preserve">Canonical authority:</w:t>
+      </w:r>
+      <w:r>
+        <w:t xml:space="preserve"> </w:t>
+      </w:r>
+      <w:r>
+        <w:t xml:space="preserve">constitution submodule</w:t>
+      </w:r>
+      <w:r>
+        <w:t xml:space="preserve"> </w:t>
+      </w:r>
+      <w:hyperlink r:id="rId70">
+        <w:r>
+          <w:rPr>
+            <w:rStyle w:val="VerbatimChar"/>
+          </w:rPr>
+          <w:t xml:space="preserve">Constitution.md</w:t>
+        </w:r>
+      </w:hyperlink>
+      <w:r>
+        <w:t xml:space="preserve"> </w:t>
+      </w:r>
+      <w:r>
+        <w:t xml:space="preserve">§11.4.219. Non-compliance is a release blocker. No escape hatch — no</w:t>
+      </w:r>
+      <w:r>
+        <w:t xml:space="preserve"> </w:t>
+      </w:r>
+      <w:r>
+        <w:rPr>
+          <w:rStyle w:val="VerbatimChar"/>
+        </w:rPr>
+        <w:t xml:space="preserve">--partial-ia-coverage</w:t>
+      </w:r>
+      <w:r>
+        <w:t xml:space="preserve">,</w:t>
+      </w:r>
+      <w:r>
+        <w:t xml:space="preserve"> </w:t>
+      </w:r>
+      <w:r>
+        <w:rPr>
+          <w:rStyle w:val="VerbatimChar"/>
+        </w:rPr>
+        <w:t xml:space="preserve">--one-chrome-fits-all</w:t>
+      </w:r>
+      <w:r>
+        <w:t xml:space="preserve">,</w:t>
+      </w:r>
+      <w:r>
+        <w:t xml:space="preserve"> </w:t>
+      </w:r>
+      <w:r>
+        <w:rPr>
+          <w:rStyle w:val="VerbatimChar"/>
+        </w:rPr>
+        <w:t xml:space="preserve">--fake-flow-OK</w:t>
+      </w:r>
+      <w:r>
+        <w:t xml:space="preserve">,</w:t>
+      </w:r>
+      <w:r>
+        <w:t xml:space="preserve"> </w:t>
+      </w:r>
+      <w:r>
+        <w:rPr>
+          <w:rStyle w:val="VerbatimChar"/>
+        </w:rPr>
+        <w:t xml:space="preserve">--lorem-ipsum-content</w:t>
+      </w:r>
+      <w:r>
+        <w:t xml:space="preserve">,</w:t>
+      </w:r>
+      <w:r>
+        <w:t xml:space="preserve"> </w:t>
+      </w:r>
+      <w:r>
+        <w:rPr>
+          <w:rStyle w:val="VerbatimChar"/>
+        </w:rPr>
+        <w:t xml:space="preserve">--single-theme-screens</w:t>
+      </w:r>
+      <w:r>
+        <w:t xml:space="preserve"> </w:t>
+      </w:r>
+      <w:r>
+        <w:t xml:space="preserve">flag.</w:t>
+      </w:r>
+    </w:p>
+    <w:p>
+      <w:pPr>
+        <w:pStyle w:val="BodyText"/>
+      </w:pPr>
+      <w:r>
+        <w:rPr>
+          <w:b/>
+          <w:bCs/>
+        </w:rPr>
+        <w:t xml:space="preserve">§11.4.220 — Open-first design tooling: self-hosted PenPot primary via the PenPot submodule; proprietary tools import/export only; in-repo open-format sources (User mandate, 2026-07-22).</w:t>
+      </w:r>
+      <w:r>
+        <w:t xml:space="preserve"> </w:t>
+      </w:r>
+      <w:r>
+        <w:t xml:space="preserve">Compact summary: the collaborative design platform is an open-source self-hostable tool — PenPot as the standing default — run SELF-HOSTED and consumed ONLY via the dedicated reusable PenPot submodule (working name</w:t>
+      </w:r>
+      <w:r>
+        <w:t xml:space="preserve"> </w:t>
+      </w:r>
+      <w:r>
+        <w:rPr>
+          <w:rStyle w:val="VerbatimChar"/>
+        </w:rPr>
+        <w:t xml:space="preserve">vasic-digital/PenPot</w:t>
+      </w:r>
+      <w:r>
+        <w:t xml:space="preserve">, final repository name pending — the generic referent is normative meanwhile) carrying ALL PenPot mechanisms/utilities (deployment recipe, RPC client, access-token minting, import tooling, browser-hydration automation, MCP wiring), itself consuming the Containers submodule (§11.4.76, rootless §11.4.161) and DECLARING that dependency in its §11.4.31</w:t>
+      </w:r>
+      <w:r>
+        <w:t xml:space="preserve"> </w:t>
+      </w:r>
+      <w:r>
+        <w:rPr>
+          <w:rStyle w:val="VerbatimChar"/>
+        </w:rPr>
+        <w:t xml:space="preserve">helix-deps.yaml</w:t>
+      </w:r>
+      <w:r>
+        <w:t xml:space="preserve">; projects MUST NOT hand-roll PenPot deployment/client code (§11.4.28/§11.4.74 — extend the submodule upstream); the submodule carries mechanisms ONLY, never project design content. Proprietary tools (Figma or equivalent) are OPTIONAL import/export/review bridges, NEVER the source of truth — no design value may exist only inside a proprietary tool/cloud; design sources live IN-REPO in open, diffable formats (SVG masters, CSS tokens, JSON manifests/IR/variables payloads, Lottie JSON, self-contained HTML — §11.4.215 applied to design). Tooling capability claims are RUNTIME-PROBED (§11.4.201/§11.4.99) with a headless-vs-operator-interactive matrix + an honest-limits section — a cloud push claimed without a real credentialed run is a fabrication. Operational rules (research-verified): the HEADLESS write path is the token-authenticated RPC API — access tokens (minted under the</w:t>
+      </w:r>
+      <w:r>
+        <w:t xml:space="preserve"> </w:t>
+      </w:r>
+      <w:r>
+        <w:rPr>
+          <w:rStyle w:val="VerbatimChar"/>
+        </w:rPr>
+        <w:t xml:space="preserve">enable-access-tokens</w:t>
+      </w:r>
+      <w:r>
+        <w:t xml:space="preserve"> </w:t>
+      </w:r>
+      <w:r>
+        <w:t xml:space="preserve">backend flag, handled per §11.4.10) are the MANDATED automation auth mechanism, never interactive OAuth relays; API-created PenPot files REQUIRE a browser hydration pass before handoff (thumbnails/text layout materialize in the browser runtime, not the write API) — an unhydrated API-created file handed off as render-ready is a §11.4 PASS-bluff at the design-handoff layer. Composes §11.4.6/.10/.28/.31/.69/.74/.76/.99/.161/.162/.201/.215/.216/.223. Propagation gate</w:t>
+      </w:r>
+      <w:r>
+        <w:t xml:space="preserve"> </w:t>
+      </w:r>
+      <w:r>
+        <w:rPr>
+          <w:rStyle w:val="VerbatimChar"/>
+        </w:rPr>
+        <w:t xml:space="preserve">CM-COVENANT-114-220-PROPAGATION</w:t>
+      </w:r>
+      <w:r>
+        <w:t xml:space="preserve"> </w:t>
+      </w:r>
+      <w:r>
+        <w:t xml:space="preserve">+ recommended gate</w:t>
+      </w:r>
+      <w:r>
+        <w:t xml:space="preserve"> </w:t>
+      </w:r>
+      <w:r>
+        <w:rPr>
+          <w:rStyle w:val="VerbatimChar"/>
+        </w:rPr>
+        <w:t xml:space="preserve">CM-OPEN-DESIGN-TOOLING-PRIMARY</w:t>
+      </w:r>
+      <w:r>
+        <w:t xml:space="preserve"> </w:t>
+      </w:r>
+      <w:r>
+        <w:t xml:space="preserve">+ paired §1.1 mutation.</w:t>
+      </w:r>
+      <w:r>
+        <w:t xml:space="preserve"> </w:t>
+      </w:r>
+      <w:r>
+        <w:rPr>
+          <w:b/>
+          <w:bCs/>
+        </w:rPr>
+        <w:t xml:space="preserve">Canonical authority:</w:t>
+      </w:r>
+      <w:r>
+        <w:t xml:space="preserve"> </w:t>
+      </w:r>
+      <w:r>
+        <w:t xml:space="preserve">constitution submodule</w:t>
+      </w:r>
+      <w:r>
+        <w:t xml:space="preserve"> </w:t>
+      </w:r>
+      <w:hyperlink r:id="rId70">
+        <w:r>
+          <w:rPr>
+            <w:rStyle w:val="VerbatimChar"/>
+          </w:rPr>
+          <w:t xml:space="preserve">Constitution.md</w:t>
+        </w:r>
+      </w:hyperlink>
+      <w:r>
+        <w:t xml:space="preserve"> </w:t>
+      </w:r>
+      <w:r>
+        <w:t xml:space="preserve">§11.4.220. Non-compliance is a release blocker. No escape hatch — no</w:t>
+      </w:r>
+      <w:r>
+        <w:t xml:space="preserve"> </w:t>
+      </w:r>
+      <w:r>
+        <w:rPr>
+          <w:rStyle w:val="VerbatimChar"/>
+        </w:rPr>
+        <w:t xml:space="preserve">--figma-is-source-of-truth</w:t>
+      </w:r>
+      <w:r>
+        <w:t xml:space="preserve">,</w:t>
+      </w:r>
+      <w:r>
+        <w:t xml:space="preserve"> </w:t>
+      </w:r>
+      <w:r>
+        <w:rPr>
+          <w:rStyle w:val="VerbatimChar"/>
+        </w:rPr>
+        <w:t xml:space="preserve">--cloud-only-design</w:t>
+      </w:r>
+      <w:r>
+        <w:t xml:space="preserve">,</w:t>
+      </w:r>
+      <w:r>
+        <w:t xml:space="preserve"> </w:t>
+      </w:r>
+      <w:r>
+        <w:rPr>
+          <w:rStyle w:val="VerbatimChar"/>
+        </w:rPr>
+        <w:t xml:space="preserve">--proprietary-format-source</w:t>
+      </w:r>
+      <w:r>
+        <w:t xml:space="preserve">,</w:t>
+      </w:r>
+      <w:r>
+        <w:t xml:space="preserve"> </w:t>
+      </w:r>
+      <w:r>
+        <w:rPr>
+          <w:rStyle w:val="VerbatimChar"/>
+        </w:rPr>
+        <w:t xml:space="preserve">--hand-rolled-penpot-stack</w:t>
+      </w:r>
+      <w:r>
+        <w:t xml:space="preserve">,</w:t>
+      </w:r>
+      <w:r>
+        <w:t xml:space="preserve"> </w:t>
+      </w:r>
+      <w:r>
+        <w:rPr>
+          <w:rStyle w:val="VerbatimChar"/>
+        </w:rPr>
+        <w:t xml:space="preserve">--oauth-relay-automation</w:t>
+      </w:r>
+      <w:r>
+        <w:t xml:space="preserve">,</w:t>
+      </w:r>
+      <w:r>
+        <w:t xml:space="preserve"> </w:t>
+      </w:r>
+      <w:r>
+        <w:rPr>
+          <w:rStyle w:val="VerbatimChar"/>
+        </w:rPr>
+        <w:t xml:space="preserve">--skip-hydration-pass</w:t>
+      </w:r>
+      <w:r>
+        <w:t xml:space="preserve">,</w:t>
+      </w:r>
+      <w:r>
+        <w:t xml:space="preserve"> </w:t>
+      </w:r>
+      <w:r>
+        <w:rPr>
+          <w:rStyle w:val="VerbatimChar"/>
+        </w:rPr>
+        <w:t xml:space="preserve">--unprobed-tooling-claim</w:t>
+      </w:r>
+      <w:r>
+        <w:t xml:space="preserve">,</w:t>
+      </w:r>
+      <w:r>
+        <w:t xml:space="preserve"> </w:t>
+      </w:r>
+      <w:r>
+        <w:rPr>
+          <w:rStyle w:val="VerbatimChar"/>
+        </w:rPr>
+        <w:t xml:space="preserve">--rootful-design-stack</w:t>
+      </w:r>
+      <w:r>
+        <w:t xml:space="preserve"> </w:t>
+      </w:r>
+      <w:r>
+        <w:t xml:space="preserve">flag.</w:t>
+      </w:r>
+    </w:p>
+    <w:p>
+      <w:pPr>
+        <w:pStyle w:val="BodyText"/>
+      </w:pPr>
+      <w:r>
+        <w:rPr>
+          <w:b/>
+          <w:bCs/>
+        </w:rPr>
+        <w:t xml:space="preserve">§11.4.221 — Motion discipline: token-bound timing + machine-readable manifest + reduced-motion static fallbacks (User mandate, 2026-07-22).</w:t>
+      </w:r>
+      <w:r>
+        <w:t xml:space="preserve"> </w:t>
+      </w:r>
+      <w:r>
+        <w:t xml:space="preserve">Compact summary: every duration/easing binds to the §11.4.216 motion tokens (an ad-hoc timing literal bypassing the token layer violates §11.4.6); every playable animation ships a STATIC reduced-motion fallback DERIVED FROM ITS OWN KEYFRAMES (poster frame for loopers, final frame for one-shots) in an open format, named per animation in a versioned MACHINE-READABLE motion manifest (id, loop mode, poster, reduced-motion mode,</w:t>
+      </w:r>
+      <w:r>
+        <w:t xml:space="preserve"> </w:t>
+      </w:r>
+      <w:r>
+        <w:rPr>
+          <w:rStyle w:val="VerbatimChar"/>
+        </w:rPr>
+        <w:t xml:space="preserve">reducedMotionFallback</w:t>
+      </w:r>
+      <w:r>
+        <w:t xml:space="preserve">) — a deliberate instant-cut is an EXPLICIT null-with-reason, never a silent absence;</w:t>
+      </w:r>
+      <w:r>
+        <w:t xml:space="preserve"> </w:t>
+      </w:r>
+      <w:r>
+        <w:rPr>
+          <w:rStyle w:val="VerbatimChar"/>
+        </w:rPr>
+        <w:t xml:space="preserve">prefers-reduced-motion: reduce</w:t>
+      </w:r>
+      <w:r>
+        <w:t xml:space="preserve"> </w:t>
+      </w:r>
+      <w:r>
+        <w:t xml:space="preserve">honored on EVERY surface via targeted component gates (never a global</w:t>
+      </w:r>
+      <w:r>
+        <w:t xml:space="preserve"> </w:t>
+      </w:r>
+      <w:r>
+        <w:rPr>
+          <w:rStyle w:val="VerbatimChar"/>
+        </w:rPr>
+        <w:t xml:space="preserve">*</w:t>
+      </w:r>
+      <w:r>
+        <w:t xml:space="preserve">), swapping in the manifest-named fallback; NO animation is claimed working without a REAL render in a real runtime (parse + structural schema + rendered geometry with progression assertions — the §11.4.107(10) analyzer discipline applied to motion assets), unexercised runtimes [OPEN]-tracked. Proving project: 6 hand-authored Lottie animations + 5 keyframe-derived fallback SVGs + manifest v2, lottie-web/jsdom + headless-Chromium validated, mobile runtimes honestly [OPEN]. Composes §11.4.6/.107(10)/.162/.170/.216/.218/.223. Propagation gate</w:t>
+      </w:r>
+      <w:r>
+        <w:t xml:space="preserve"> </w:t>
+      </w:r>
+      <w:r>
+        <w:rPr>
+          <w:rStyle w:val="VerbatimChar"/>
+        </w:rPr>
+        <w:t xml:space="preserve">CM-COVENANT-114-221-PROPAGATION</w:t>
+      </w:r>
+      <w:r>
+        <w:t xml:space="preserve"> </w:t>
+      </w:r>
+      <w:r>
+        <w:t xml:space="preserve">+ recommended gate</w:t>
+      </w:r>
+      <w:r>
+        <w:t xml:space="preserve"> </w:t>
+      </w:r>
+      <w:r>
+        <w:rPr>
+          <w:rStyle w:val="VerbatimChar"/>
+        </w:rPr>
+        <w:t xml:space="preserve">CM-MOTION-TOKEN-BOUND-REDUCED-FALLBACK</w:t>
+      </w:r>
+      <w:r>
+        <w:t xml:space="preserve"> </w:t>
+      </w:r>
+      <w:r>
+        <w:t xml:space="preserve">+ paired §1.1 mutation.</w:t>
+      </w:r>
+      <w:r>
+        <w:t xml:space="preserve"> </w:t>
+      </w:r>
+      <w:r>
+        <w:rPr>
+          <w:b/>
+          <w:bCs/>
+        </w:rPr>
+        <w:t xml:space="preserve">Canonical authority:</w:t>
+      </w:r>
+      <w:r>
+        <w:t xml:space="preserve"> </w:t>
+      </w:r>
+      <w:r>
+        <w:t xml:space="preserve">constitution submodule</w:t>
+      </w:r>
+      <w:r>
+        <w:t xml:space="preserve"> </w:t>
+      </w:r>
+      <w:hyperlink r:id="rId70">
+        <w:r>
+          <w:rPr>
+            <w:rStyle w:val="VerbatimChar"/>
+          </w:rPr>
+          <w:t xml:space="preserve">Constitution.md</w:t>
+        </w:r>
+      </w:hyperlink>
+      <w:r>
+        <w:t xml:space="preserve"> </w:t>
+      </w:r>
+      <w:r>
+        <w:t xml:space="preserve">§11.4.221. Non-compliance is a release blocker. No escape hatch — no</w:t>
+      </w:r>
+      <w:r>
+        <w:t xml:space="preserve"> </w:t>
+      </w:r>
+      <w:r>
+        <w:rPr>
+          <w:rStyle w:val="VerbatimChar"/>
+        </w:rPr>
+        <w:t xml:space="preserve">--ad-hoc-duration</w:t>
+      </w:r>
+      <w:r>
+        <w:t xml:space="preserve">,</w:t>
+      </w:r>
+      <w:r>
+        <w:t xml:space="preserve"> </w:t>
+      </w:r>
+      <w:r>
+        <w:rPr>
+          <w:rStyle w:val="VerbatimChar"/>
+        </w:rPr>
+        <w:t xml:space="preserve">--no-reduced-motion-fallback</w:t>
+      </w:r>
+      <w:r>
+        <w:t xml:space="preserve">,</w:t>
+      </w:r>
+      <w:r>
+        <w:t xml:space="preserve"> </w:t>
+      </w:r>
+      <w:r>
+        <w:rPr>
+          <w:rStyle w:val="VerbatimChar"/>
+        </w:rPr>
+        <w:t xml:space="preserve">--global-star-motion-kill</w:t>
+      </w:r>
+      <w:r>
+        <w:t xml:space="preserve">,</w:t>
+      </w:r>
+      <w:r>
+        <w:t xml:space="preserve"> </w:t>
+      </w:r>
+      <w:r>
+        <w:rPr>
+          <w:rStyle w:val="VerbatimChar"/>
+        </w:rPr>
+        <w:t xml:space="preserve">--manifest-optional</w:t>
+      </w:r>
+      <w:r>
+        <w:t xml:space="preserve">,</w:t>
+      </w:r>
+      <w:r>
+        <w:t xml:space="preserve"> </w:t>
+      </w:r>
+      <w:r>
+        <w:rPr>
+          <w:rStyle w:val="VerbatimChar"/>
+        </w:rPr>
+        <w:t xml:space="preserve">--unrendered-animation-claimed-working</w:t>
+      </w:r>
+      <w:r>
+        <w:t xml:space="preserve"> </w:t>
+      </w:r>
+      <w:r>
+        <w:t xml:space="preserve">flag.</w:t>
+      </w:r>
+    </w:p>
+    <w:p>
+      <w:pPr>
+        <w:pStyle w:val="BodyText"/>
+      </w:pPr>
+      <w:r>
+        <w:rPr>
+          <w:b/>
+          <w:bCs/>
+        </w:rPr>
+        <w:t xml:space="preserve">§11.4.222 — Design-completion export wave: a design is not done until the exports land, honestly (User mandate, 2026-07-22).</w:t>
+      </w:r>
+      <w:r>
+        <w:t xml:space="preserve"> </w:t>
+      </w:r>
+      <w:r>
+        <w:t xml:space="preserve">Compact summary: a design (system / brand / screen set / change wave) is NOT done until its EXPORT WAVE runs with verified outputs — (1) per-platform token codegen regenerated from the canonical source (or [OPEN]-tracked); (2) the FULL icon/asset raster matrix, documented per OS surface and locked 1:1 to its generator, produced by an HONEST-OUTPUT pipeline: every candidate renderer PROBE-TESTED with a content-verified probe render before use (§11.4.201 — presence ≠ correctness), fall-through on probe failure, absent tools SKIP-with-note (§11.4.3/§11.4.69), NEVER a placeholder/blank/faked output, every raster verified non-degenerate (size floor + non-blank; multi-resolution bundles opened + verified per §11.4.38) — proving project: 83 real rasters, zero faked; (3) both-theme screen renders (deterministic theme forcing, every render verified non-blank) + the bound design book; (4) hand-off bundles with per-leg HONEST statuses (produced / deferred-operator-only / impossible-with-reason); (5) the §11.4.65/§11.4.73 doc twins regenerated. A design wave reported complete without its export wave — or with any faked/unverified export output — is a §11.4 PASS-bluff at the design-delivery layer. Composes §11.4.3/.6/.38/.65/.69/.73/.201/.216/.219/.220. Propagation gate</w:t>
+      </w:r>
+      <w:r>
+        <w:t xml:space="preserve"> </w:t>
+      </w:r>
+      <w:r>
+        <w:rPr>
+          <w:rStyle w:val="VerbatimChar"/>
+        </w:rPr>
+        <w:t xml:space="preserve">CM-COVENANT-114-222-PROPAGATION</w:t>
+      </w:r>
+      <w:r>
+        <w:t xml:space="preserve"> </w:t>
+      </w:r>
+      <w:r>
+        <w:t xml:space="preserve">+ recommended gate</w:t>
+      </w:r>
+      <w:r>
+        <w:t xml:space="preserve"> </w:t>
+      </w:r>
+      <w:r>
+        <w:rPr>
+          <w:rStyle w:val="VerbatimChar"/>
+        </w:rPr>
+        <w:t xml:space="preserve">CM-DESIGN-EXPORT-WAVE-COMPLETE</w:t>
+      </w:r>
+      <w:r>
+        <w:t xml:space="preserve"> </w:t>
+      </w:r>
+      <w:r>
+        <w:t xml:space="preserve">+ paired §1.1 mutation.</w:t>
+      </w:r>
+      <w:r>
+        <w:t xml:space="preserve"> </w:t>
+      </w:r>
+      <w:r>
+        <w:rPr>
+          <w:b/>
+          <w:bCs/>
+        </w:rPr>
+        <w:t xml:space="preserve">Canonical authority:</w:t>
+      </w:r>
+      <w:r>
+        <w:t xml:space="preserve"> </w:t>
+      </w:r>
+      <w:r>
+        <w:t xml:space="preserve">constitution submodule</w:t>
+      </w:r>
+      <w:r>
+        <w:t xml:space="preserve"> </w:t>
+      </w:r>
+      <w:hyperlink r:id="rId70">
+        <w:r>
+          <w:rPr>
+            <w:rStyle w:val="VerbatimChar"/>
+          </w:rPr>
+          <w:t xml:space="preserve">Constitution.md</w:t>
+        </w:r>
+      </w:hyperlink>
+      <w:r>
+        <w:t xml:space="preserve"> </w:t>
+      </w:r>
+      <w:r>
+        <w:t xml:space="preserve">§11.4.222. Non-compliance is a release blocker. No escape hatch — no</w:t>
+      </w:r>
+      <w:r>
+        <w:t xml:space="preserve"> </w:t>
+      </w:r>
+      <w:r>
+        <w:rPr>
+          <w:rStyle w:val="VerbatimChar"/>
+        </w:rPr>
+        <w:t xml:space="preserve">--skip-export-wave</w:t>
+      </w:r>
+      <w:r>
+        <w:t xml:space="preserve">,</w:t>
+      </w:r>
+      <w:r>
+        <w:t xml:space="preserve"> </w:t>
+      </w:r>
+      <w:r>
+        <w:rPr>
+          <w:rStyle w:val="VerbatimChar"/>
+        </w:rPr>
+        <w:t xml:space="preserve">--unprobed-renderer</w:t>
+      </w:r>
+      <w:r>
+        <w:t xml:space="preserve">,</w:t>
+      </w:r>
+      <w:r>
+        <w:t xml:space="preserve"> </w:t>
+      </w:r>
+      <w:r>
+        <w:rPr>
+          <w:rStyle w:val="VerbatimChar"/>
+        </w:rPr>
+        <w:t xml:space="preserve">--placeholder-raster-OK</w:t>
+      </w:r>
+      <w:r>
+        <w:t xml:space="preserve">,</w:t>
+      </w:r>
+      <w:r>
+        <w:t xml:space="preserve"> </w:t>
+      </w:r>
+      <w:r>
+        <w:rPr>
+          <w:rStyle w:val="VerbatimChar"/>
+        </w:rPr>
+        <w:t xml:space="preserve">--single-theme-renders</w:t>
+      </w:r>
+      <w:r>
+        <w:t xml:space="preserve">,</w:t>
+      </w:r>
+      <w:r>
+        <w:t xml:space="preserve"> </w:t>
+      </w:r>
+      <w:r>
+        <w:rPr>
+          <w:rStyle w:val="VerbatimChar"/>
+        </w:rPr>
+        <w:t xml:space="preserve">--fake-bundle-status</w:t>
+      </w:r>
+      <w:r>
+        <w:t xml:space="preserve">,</w:t>
+      </w:r>
+      <w:r>
+        <w:t xml:space="preserve"> </w:t>
+      </w:r>
+      <w:r>
+        <w:rPr>
+          <w:rStyle w:val="VerbatimChar"/>
+        </w:rPr>
+        <w:t xml:space="preserve">--stale-doc-twins</w:t>
+      </w:r>
+      <w:r>
+        <w:t xml:space="preserve"> </w:t>
+      </w:r>
+      <w:r>
+        <w:t xml:space="preserve">flag.</w:t>
+      </w:r>
+    </w:p>
+    <w:p>
+      <w:pPr>
+        <w:pStyle w:val="BodyText"/>
+      </w:pPr>
+      <w:r>
+        <w:rPr>
+          <w:b/>
+          <w:bCs/>
+        </w:rPr>
+        <w:t xml:space="preserve">§11.4.223 — Provenance-marker discipline for design docs + central open-item registry (User mandate, 2026-07-22).</w:t>
+      </w:r>
+      <w:r>
+        <w:t xml:space="preserve"> </w:t>
+      </w:r>
+      <w:r>
+        <w:t xml:space="preserve">Compact summary: every design document carries inline provenance markers from a closed, project-declared vocabulary whose MINIMUM CORE is</w:t>
+      </w:r>
+      <w:r>
+        <w:t xml:space="preserve"> </w:t>
+      </w:r>
+      <w:r>
+        <w:rPr>
+          <w:rStyle w:val="VerbatimChar"/>
+        </w:rPr>
+        <w:t xml:space="preserve">[VERIFIED]</w:t>
+      </w:r>
+      <w:r>
+        <w:t xml:space="preserve"> </w:t>
+      </w:r>
+      <w:r>
+        <w:t xml:space="preserve">(with evidence/check date) /</w:t>
+      </w:r>
+      <w:r>
+        <w:t xml:space="preserve"> </w:t>
+      </w:r>
+      <w:r>
+        <w:rPr>
+          <w:rStyle w:val="VerbatimChar"/>
+        </w:rPr>
+        <w:t xml:space="preserve">[OPERATOR]</w:t>
+      </w:r>
+      <w:r>
+        <w:t xml:space="preserve"> </w:t>
+      </w:r>
+      <w:r>
+        <w:t xml:space="preserve">/</w:t>
+      </w:r>
+      <w:r>
+        <w:t xml:space="preserve"> </w:t>
+      </w:r>
+      <w:r>
+        <w:rPr>
+          <w:rStyle w:val="VerbatimChar"/>
+        </w:rPr>
+        <w:t xml:space="preserve">[DEFAULT — adjustable]</w:t>
+      </w:r>
+      <w:r>
+        <w:t xml:space="preserve"> </w:t>
+      </w:r>
+      <w:r>
+        <w:t xml:space="preserve">/</w:t>
+      </w:r>
+      <w:r>
+        <w:t xml:space="preserve"> </w:t>
+      </w:r>
+      <w:r>
+        <w:rPr>
+          <w:rStyle w:val="VerbatimChar"/>
+        </w:rPr>
+        <w:t xml:space="preserve">[OPEN: id]</w:t>
+      </w:r>
+      <w:r>
+        <w:t xml:space="preserve"> </w:t>
+      </w:r>
+      <w:r>
+        <w:t xml:space="preserve">(extensions:</w:t>
+      </w:r>
+      <w:r>
+        <w:t xml:space="preserve"> </w:t>
+      </w:r>
+      <w:r>
+        <w:rPr>
+          <w:rStyle w:val="VerbatimChar"/>
+        </w:rPr>
+        <w:t xml:space="preserve">[RESEARCH]</w:t>
+      </w:r>
+      <w:r>
+        <w:t xml:space="preserve">,</w:t>
+      </w:r>
+      <w:r>
+        <w:t xml:space="preserve"> </w:t>
+      </w:r>
+      <w:r>
+        <w:rPr>
+          <w:rStyle w:val="VerbatimChar"/>
+        </w:rPr>
+        <w:t xml:space="preserve">[ASSUMED]</w:t>
+      </w:r>
+      <w:r>
+        <w:t xml:space="preserve">,</w:t>
+      </w:r>
+      <w:r>
+        <w:t xml:space="preserve"> </w:t>
+      </w:r>
+      <w:r>
+        <w:rPr>
+          <w:rStyle w:val="VerbatimChar"/>
+        </w:rPr>
+        <w:t xml:space="preserve">[BUILD-NEW]</w:t>
+      </w:r>
+      <w:r>
+        <w:t xml:space="preserve">,</w:t>
+      </w:r>
+      <w:r>
+        <w:t xml:space="preserve"> </w:t>
+      </w:r>
+      <w:r>
+        <w:rPr>
+          <w:rStyle w:val="VerbatimChar"/>
+        </w:rPr>
+        <w:t xml:space="preserve">[GAP: id]</w:t>
+      </w:r>
+      <w:r>
+        <w:t xml:space="preserve">,</w:t>
+      </w:r>
+      <w:r>
+        <w:t xml:space="preserve"> </w:t>
+      </w:r>
+      <w:r>
+        <w:rPr>
+          <w:rStyle w:val="VerbatimChar"/>
+        </w:rPr>
+        <w:t xml:space="preserve">[IN-HOUSE: …]</w:t>
+      </w:r>
+      <w:r>
+        <w:t xml:space="preserve">,</w:t>
+      </w:r>
+      <w:r>
+        <w:t xml:space="preserve"> </w:t>
+      </w:r>
+      <w:r>
+        <w:rPr>
+          <w:rStyle w:val="VerbatimChar"/>
+        </w:rPr>
+        <w:t xml:space="preserve">[CONSTITUTION §x]</w:t>
+      </w:r>
+      <w:r>
+        <w:t xml:space="preserve"> </w:t>
+      </w:r>
+      <w:r>
+        <w:t xml:space="preserve">per §11.4.35); an unmarked load-bearing claim reads UNVERIFIED, and an assumption presented as verified is a §11.4.6 violation of §11.4 PASS-bluff severity at the design-documentation layer; every unresolved decision is an</w:t>
+      </w:r>
+      <w:r>
+        <w:t xml:space="preserve"> </w:t>
+      </w:r>
+      <w:r>
+        <w:rPr>
+          <w:rStyle w:val="VerbatimChar"/>
+        </w:rPr>
+        <w:t xml:space="preserve">[OPEN: id]</w:t>
+      </w:r>
+      <w:r>
+        <w:t xml:space="preserve"> </w:t>
+      </w:r>
+      <w:r>
+        <w:t xml:space="preserve">with a stable, never-renumbered id (§11.4.54 discipline) owned by a named file; the design area index maintains the SINGLE CANONICAL open-item registry, TREE-VERIFIED in both directions (every tree id in the registry, no registry ghosts — the §11.4.186 consistency discipline applied to design opens), closures citing the closing revision, narrowed items recording exactly what closed and what remains; registry items map to tracked workable items (§11.4.15/§11.4.54/§11.4.93) so the §11.4.197 completion mandate applies — no design open is silently abandoned. Proving project: 41 registered ids across nine families, tree-verified, 2 closed with citations. Composes §11.4.6/.15/.44/.54/.61/.93/.123/.186/.197/.212. Propagation gate</w:t>
+      </w:r>
+      <w:r>
+        <w:t xml:space="preserve"> </w:t>
+      </w:r>
+      <w:r>
+        <w:rPr>
+          <w:rStyle w:val="VerbatimChar"/>
+        </w:rPr>
+        <w:t xml:space="preserve">CM-COVENANT-114-223-PROPAGATION</w:t>
+      </w:r>
+      <w:r>
+        <w:t xml:space="preserve"> </w:t>
+      </w:r>
+      <w:r>
+        <w:t xml:space="preserve">+ recommended gate</w:t>
+      </w:r>
+      <w:r>
+        <w:t xml:space="preserve"> </w:t>
+      </w:r>
+      <w:r>
+        <w:rPr>
+          <w:rStyle w:val="VerbatimChar"/>
+        </w:rPr>
+        <w:t xml:space="preserve">CM-DESIGN-DOC-PROVENANCE-MARKERS</w:t>
+      </w:r>
+      <w:r>
+        <w:t xml:space="preserve"> </w:t>
+      </w:r>
+      <w:r>
+        <w:t xml:space="preserve">+ paired §1.1 mutation.</w:t>
+      </w:r>
+      <w:r>
+        <w:t xml:space="preserve"> </w:t>
+      </w:r>
+      <w:r>
+        <w:rPr>
+          <w:b/>
+          <w:bCs/>
+        </w:rPr>
+        <w:t xml:space="preserve">Canonical authority:</w:t>
+      </w:r>
+      <w:r>
+        <w:t xml:space="preserve"> </w:t>
+      </w:r>
+      <w:r>
+        <w:t xml:space="preserve">constitution submodule</w:t>
+      </w:r>
+      <w:r>
+        <w:t xml:space="preserve"> </w:t>
+      </w:r>
+      <w:hyperlink r:id="rId70">
+        <w:r>
+          <w:rPr>
+            <w:rStyle w:val="VerbatimChar"/>
+          </w:rPr>
+          <w:t xml:space="preserve">Constitution.md</w:t>
+        </w:r>
+      </w:hyperlink>
+      <w:r>
+        <w:t xml:space="preserve"> </w:t>
+      </w:r>
+      <w:r>
+        <w:t xml:space="preserve">§11.4.223. Non-compliance is a release blocker. No escape hatch — no</w:t>
+      </w:r>
+      <w:r>
+        <w:t xml:space="preserve"> </w:t>
+      </w:r>
+      <w:r>
+        <w:rPr>
+          <w:rStyle w:val="VerbatimChar"/>
+        </w:rPr>
+        <w:t xml:space="preserve">--unmarked-claims-OK</w:t>
+      </w:r>
+      <w:r>
+        <w:t xml:space="preserve">,</w:t>
+      </w:r>
+      <w:r>
+        <w:t xml:space="preserve"> </w:t>
+      </w:r>
+      <w:r>
+        <w:rPr>
+          <w:rStyle w:val="VerbatimChar"/>
+        </w:rPr>
+        <w:t xml:space="preserve">--assumption-as-verified</w:t>
+      </w:r>
+      <w:r>
+        <w:t xml:space="preserve">,</w:t>
+      </w:r>
+      <w:r>
+        <w:t xml:space="preserve"> </w:t>
+      </w:r>
+      <w:r>
+        <w:rPr>
+          <w:rStyle w:val="VerbatimChar"/>
+        </w:rPr>
+        <w:t xml:space="preserve">--unregistered-open-item</w:t>
+      </w:r>
+      <w:r>
+        <w:t xml:space="preserve">,</w:t>
+      </w:r>
+      <w:r>
+        <w:t xml:space="preserve"> </w:t>
+      </w:r>
+      <w:r>
+        <w:rPr>
+          <w:rStyle w:val="VerbatimChar"/>
+        </w:rPr>
+        <w:t xml:space="preserve">--registry-optional</w:t>
+      </w:r>
+      <w:r>
+        <w:t xml:space="preserve">,</w:t>
+      </w:r>
+      <w:r>
+        <w:t xml:space="preserve"> </w:t>
+      </w:r>
+      <w:r>
+        <w:rPr>
+          <w:rStyle w:val="VerbatimChar"/>
+        </w:rPr>
+        <w:t xml:space="preserve">--silently-abandon-open</w:t>
+      </w:r>
+      <w:r>
+        <w:t xml:space="preserve"> </w:t>
+      </w:r>
+      <w:r>
+        <w:t xml:space="preserve">flag.</w:t>
       </w:r>
     </w:p>
     <w:bookmarkEnd w:id="116"/>

</xml_diff>

<commit_message>
feat(§11.4.228): cross-agent extension lifecycle + speckit exports
</commit_message>
<xml_diff>
--- a/AGENTS.docx
+++ b/AGENTS.docx
@@ -59795,124 +59795,187 @@
           <w:b/>
           <w:bCs/>
         </w:rPr>
-        <w:t xml:space="preserve">EXTENSION landed 2026-07-23 (round 2 — the reopen/first-touch root-cause harvest; full text in</w:t>
-      </w:r>
-      <w:r>
-        <w:rPr>
-          <w:b/>
-          <w:bCs/>
-        </w:rPr>
-        <w:t xml:space="preserve"> </w:t>
-      </w:r>
-      <w:r>
-        <w:rPr>
-          <w:rStyle w:val="VerbatimChar"/>
-          <w:b/>
-          <w:bCs/>
+        <w:t xml:space="preserve">§11.4.228 — Cross-agent extension lifecycle mandate: per-platform compatibility, source tracking, documentation with compatibility matrix, and auto-wiring on constitution pull (research-derived from Extensions Catalog forensics, 2026-07-24).</w:t>
+      </w:r>
+      <w:r>
+        <w:t xml:space="preserve"> </w:t>
+      </w:r>
+      <w:r>
+        <w:t xml:space="preserve">Compact summary: every governed extension (Skill, MCP, ACP, LSP, plugin) MUST (A) ship a per-platform compatibility declaration (Claude Code, OpenCode, Gemini CLI, Qwen Code minimum) with closed vocabulary</w:t>
+      </w:r>
+      <w:r>
+        <w:t xml:space="preserve"> </w:t>
+      </w:r>
+      <w:r>
+        <w:rPr>
+          <w:rStyle w:val="VerbatimChar"/>
+        </w:rPr>
+        <w:t xml:space="preserve">{SUPPORTED|UNTESTED|UNSUPPORTED|CONFIG-ONLY}</w:t>
+      </w:r>
+      <w:r>
+        <w:t xml:space="preserve">, NEVER cause loops/broken behavior in any platform, and carry a per-platform liveness test §11.4.169; (B) be traceable to its exact canonical origin (repo + commit SHA + path, recorded in</w:t>
+      </w:r>
+      <w:r>
+        <w:t xml:space="preserve"> </w:t>
+      </w:r>
+      <w:r>
+        <w:rPr>
+          <w:rStyle w:val="VerbatimChar"/>
+        </w:rPr>
+        <w:t xml:space="preserve">EXTENSION_SOURCE.yaml</w:t>
+      </w:r>
+      <w:r>
+        <w:t xml:space="preserve"> </w:t>
+      </w:r>
+      <w:r>
+        <w:t xml:space="preserve">— symlinks preferred over copies, blind copies without provenance are §11.4.124 dead-code-in-waiting), with a per-project extensions catalog (</w:t>
+      </w:r>
+      <w:r>
+        <w:rPr>
+          <w:rStyle w:val="VerbatimChar"/>
+        </w:rPr>
+        <w:t xml:space="preserve">docs/extensions/EXTENSIONS_CATALOG.md</w:t>
+      </w:r>
+      <w:r>
+        <w:t xml:space="preserve">) as the single source of truth, §11.4.86 roster/corpus-backed fingerprint; (C) the extensions catalog MUST carry a per-platform compatibility matrix + liveliness-testing evidence per extension × platform per §11.4.69</w:t>
+      </w:r>
+      <w:r>
+        <w:t xml:space="preserve"> </w:t>
+      </w:r>
+      <w:r>
+        <w:rPr>
+          <w:rStyle w:val="VerbatimChar"/>
+        </w:rPr>
+        <w:t xml:space="preserve">feature_class=extension_loading</w:t>
+      </w:r>
+      <w:r>
+        <w:t xml:space="preserve">, four-format export per §11.4.65, auto-synced via §11.4.106 docs-chain; (D) the §11.4.164</w:t>
+      </w:r>
+      <w:r>
+        <w:t xml:space="preserve"> </w:t>
+      </w:r>
+      <w:r>
+        <w:rPr>
+          <w:rStyle w:val="VerbatimChar"/>
+        </w:rPr>
+        <w:t xml:space="preserve">post_update_hook.sh</w:t>
+      </w:r>
+      <w:r>
+        <w:t xml:space="preserve"> </w:t>
+      </w:r>
+      <w:r>
+        <w:t xml:space="preserve">is EXTENDED to auto-detect all governed agent platforms, symlink constitution skills into each (</w:t>
+      </w:r>
+      <w:r>
+        <w:rPr>
+          <w:rStyle w:val="VerbatimChar"/>
+        </w:rPr>
+        <w:t xml:space="preserve">.claude/skills/</w:t>
+      </w:r>
+      <w:r>
+        <w:t xml:space="preserve">,</w:t>
+      </w:r>
+      <w:r>
+        <w:t xml:space="preserve"> </w:t>
+      </w:r>
+      <w:r>
+        <w:rPr>
+          <w:rStyle w:val="VerbatimChar"/>
+        </w:rPr>
+        <w:t xml:space="preserve">.opencode/skills/</w:t>
+      </w:r>
+      <w:r>
+        <w:t xml:space="preserve">, platform equivalents), register MCP servers into each platform's config, self-validate, and be idempotent — closing the gap where 4 constitution skills exist in source but are un-wired to any platform (the §11.4.108 source-present-runtime-absent gap). Honest boundary §11.4.6 — wiring guarantees REACHABILITY, never runtime acceptance. Classification: universal (§11.4.17). Propagation gate</w:t>
+      </w:r>
+      <w:r>
+        <w:t xml:space="preserve"> </w:t>
+      </w:r>
+      <w:r>
+        <w:rPr>
+          <w:rStyle w:val="VerbatimChar"/>
+        </w:rPr>
+        <w:t xml:space="preserve">CM-COVENANT-114-228-PROPAGATION</w:t>
+      </w:r>
+      <w:r>
+        <w:t xml:space="preserve"> </w:t>
+      </w:r>
+      <w:r>
+        <w:t xml:space="preserve">+ recommended gates</w:t>
+      </w:r>
+      <w:r>
+        <w:t xml:space="preserve"> </w:t>
+      </w:r>
+      <w:r>
+        <w:rPr>
+          <w:rStyle w:val="VerbatimChar"/>
+        </w:rPr>
+        <w:t xml:space="preserve">CM-EXTENSION-PER-PLATFORM-COMPAT</w:t>
+      </w:r>
+      <w:r>
+        <w:t xml:space="preserve"> </w:t>
+      </w:r>
+      <w:r>
+        <w:t xml:space="preserve">/</w:t>
+      </w:r>
+      <w:r>
+        <w:t xml:space="preserve"> </w:t>
+      </w:r>
+      <w:r>
+        <w:rPr>
+          <w:rStyle w:val="VerbatimChar"/>
+        </w:rPr>
+        <w:t xml:space="preserve">CM-EXTENSION-SOURCE-TRACKED</w:t>
+      </w:r>
+      <w:r>
+        <w:t xml:space="preserve"> </w:t>
+      </w:r>
+      <w:r>
+        <w:t xml:space="preserve">/</w:t>
+      </w:r>
+      <w:r>
+        <w:t xml:space="preserve"> </w:t>
+      </w:r>
+      <w:r>
+        <w:rPr>
+          <w:rStyle w:val="VerbatimChar"/>
+        </w:rPr>
+        <w:t xml:space="preserve">CM-EXTENSION-CATALOG-DOCUMENTED</w:t>
+      </w:r>
+      <w:r>
+        <w:t xml:space="preserve"> </w:t>
+      </w:r>
+      <w:r>
+        <w:t xml:space="preserve">/</w:t>
+      </w:r>
+      <w:r>
+        <w:t xml:space="preserve"> </w:t>
+      </w:r>
+      <w:r>
+        <w:rPr>
+          <w:rStyle w:val="VerbatimChar"/>
+        </w:rPr>
+        <w:t xml:space="preserve">CM-CONSTITUTION-EXTENSIONS-AUTO-WIRED</w:t>
+      </w:r>
+      <w:r>
+        <w:t xml:space="preserve"> </w:t>
+      </w:r>
+      <w:r>
+        <w:t xml:space="preserve">+ paired §1.1 mutations. Full text in</w:t>
+      </w:r>
+      <w:r>
+        <w:t xml:space="preserve"> </w:t>
+      </w:r>
+      <w:r>
+        <w:rPr>
+          <w:rStyle w:val="VerbatimChar"/>
         </w:rPr>
         <w:t xml:space="preserve">Constitution.md</w:t>
       </w:r>
       <w:r>
-        <w:rPr>
-          <w:b/>
-          <w:bCs/>
-        </w:rPr>
-        <w:t xml:space="preserve">).</w:t>
-      </w:r>
-      <w:r>
-        <w:t xml:space="preserve"> </w:t>
-      </w:r>
-      <w:r>
-        <w:rPr>
-          <w:b/>
-          <w:bCs/>
-        </w:rPr>
-        <w:t xml:space="preserve">§11.4.194(6)</w:t>
-      </w:r>
-      <w:r>
-        <w:t xml:space="preserve"> </w:t>
-      </w:r>
-      <w:r>
-        <w:t xml:space="preserve">— the quality-harvest review classes: every code-review (§11.4.142 universal / §11.4.125 gate / §11.4.209 Fable-xhigh substrate, iterated to GO per §11.4.134) MUST additionally CHECK, per reviewed change: (a)</w:t>
-      </w:r>
-      <w:r>
-        <w:t xml:space="preserve"> </w:t>
-      </w:r>
-      <w:r>
-        <w:rPr>
-          <w:b/>
-          <w:bCs/>
-        </w:rPr>
-        <w:t xml:space="preserve">closure-evidence class vs defect layer</w:t>
-      </w:r>
-      <w:r>
-        <w:t xml:space="preserve"> </w:t>
-      </w:r>
-      <w:r>
-        <w:t xml:space="preserve">(§11.4.226) — a terminal/ready-class status moving on evidence below the defect layer's floor, a user-visible property "verified" by file-existence + greps, an echo-assertion, or a state-only repair closing a defect as fixed is a FINDING; (b)</w:t>
-      </w:r>
-      <w:r>
-        <w:t xml:space="preserve"> </w:t>
-      </w:r>
-      <w:r>
-        <w:rPr>
-          <w:b/>
-          <w:bCs/>
-        </w:rPr>
-        <w:t xml:space="preserve">needled measurements</w:t>
-      </w:r>
-      <w:r>
-        <w:t xml:space="preserve"> </w:t>
-      </w:r>
-      <w:r>
-        <w:t xml:space="preserve">— every load-bearing measurement in the change/its tests satisfies §11.4.201(6)–(12), and NO count was converted into a finding without reading the underlying lines — a COUNT IS A LEAD, THE LINES ARE THE FINDING (forensic FACT: twice in one measured cycle a count was read as state — a "mixed half-written doc" that was actually coherent, and an inflated FAIL total that counted its own summary line); (c)</w:t>
-      </w:r>
-      <w:r>
-        <w:t xml:space="preserve"> </w:t>
-      </w:r>
-      <w:r>
-        <w:rPr>
-          <w:b/>
-          <w:bCs/>
-        </w:rPr>
-        <w:t xml:space="preserve">governance-and-gate integrity</w:t>
-      </w:r>
-      <w:r>
-        <w:t xml:space="preserve"> </w:t>
-      </w:r>
-      <w:r>
-        <w:t xml:space="preserve">(§11.4.227) — a change NAMING a gate lands its implementation or registered deferral in the same change; a governance edit preserves anchor-block integrity; (d)</w:t>
-      </w:r>
-      <w:r>
-        <w:t xml:space="preserve"> </w:t>
-      </w:r>
-      <w:r>
-        <w:rPr>
-          <w:b/>
-          <w:bCs/>
-        </w:rPr>
-        <w:t xml:space="preserve">reviewer-authored adversarial mutations</w:t>
-      </w:r>
-      <w:r>
-        <w:t xml:space="preserve"> </w:t>
-      </w:r>
-      <w:r>
-        <w:t xml:space="preserve">— the author's self-authored mutation set is NECESSARY but NOT SUFFICIENT (forensic FACT, from the dated forensic corpus cited in the 2026-07-22 root-cause analysis: an author's six self-authored mutations were ALL caught while an independent reviewer's FIRST THREE different mutations ALL sailed through, each restoring a user-visible defect); the reviewer MUST attempt ≥1 mutation the author did not write (or record honest infeasibility per §11.4.3) — a guard whose reviewer-authored mutation survives is unvalidated instrumentation per §11.4.115(F) and a FINDING. The literal</w:t>
-      </w:r>
-      <w:r>
-        <w:t xml:space="preserve"> </w:t>
-      </w:r>
-      <w:r>
-        <w:rPr>
-          <w:rStyle w:val="VerbatimChar"/>
-        </w:rPr>
-        <w:t xml:space="preserve">11.4.194</w:t>
-      </w:r>
-      <w:r>
-        <w:t xml:space="preserve"> </w:t>
-      </w:r>
-      <w:r>
-        <w:t xml:space="preserve">is unchanged — its propagation gate stays GREEN.</w:t>
+        <w:t xml:space="preserve"> </w:t>
+      </w:r>
+      <w:r>
+        <w:t xml:space="preserve">§11.4.228.</w:t>
       </w:r>
     </w:p>
     <w:bookmarkEnd w:id="116"/>

</xml_diff>

<commit_message>
chore(1.2.1-dev): capture §11.4.227 gate-ledger scripts + setup.sh + helix_perf_cache pointer + regenerated doc twins before 1.2.X QA rebuild (operator commit-everything directive 2026-07-27)
New: scripts/gates/cm_gate_ledger_ratchet{,_mutation_test}.sh, gate_ledger.sh + baseline/deferrals/prev_names/removals, scripts/setup.sh, CHANGELOG twins.
helix_perf_cache pointer -> 6adcfb2. Doc twins regenerated (may be stale vs merged-in §11.4.234 .md — no runnable in-repo exporter; §11.4.106(E) honest staleness).

Co-Authored-By: Claude Opus 4.8 <noreply@anthropic.com>
</commit_message>
<xml_diff>
--- a/AGENTS.docx
+++ b/AGENTS.docx
@@ -75,7 +75,7 @@
               <w:pStyle w:val="Compact"/>
             </w:pPr>
             <w:r>
-              <w:t xml:space="preserve">63</w:t>
+              <w:t xml:space="preserve">66</w:t>
             </w:r>
           </w:p>
         </w:tc>
@@ -123,7 +123,7 @@
               <w:pStyle w:val="Compact"/>
             </w:pPr>
             <w:r>
-              <w:t xml:space="preserve">2026-07-23T10:55:33Z</w:t>
+              <w:t xml:space="preserve">2026-07-26T11:48:35Z</w:t>
             </w:r>
           </w:p>
         </w:tc>
@@ -171,7 +171,7 @@
               <w:pStyle w:val="Compact"/>
             </w:pPr>
             <w:r>
-              <w:t xml:space="preserve">Round 2 of 2026-07-23 — the REOPEN/FIRST-TOUCH ROOT-CAUSE harvest (operator mandate 2026-07-23, verbatim: "All checks, all experience we gain from this comprehensive work about issues we are seeking, digging, systhematically debugging and researching and all preventive measures we will take (with all methods we have taken to diagnose, analyse and determine things) MUST BE added itno the constituion Submodule as mandatory steps, guidelines, rules and mandatory contraints to follow, respect and apply during regular development cycles and to check for through all code review processes we perform!"; research inputs already committed at 76e29d5: docs/research/quality/ — ROOT_CAUSE_ANALYSIS PC-1..PC-9 + MU-1..MU-6 + M1..M19, EXTERNAL_RESEARCH (76 sources), two cross-project corpora, solutions SOL-01..SOL-10 with RED-first POCs 65/65 GREEN on a deterministic second iteration). 2 NEW anchors + 1 EXTENSION + the remainder resolved ALREADY-COVERED (cited, never duplicated — the audit that prevents a §11.4.54-class re-mint). NEW §11.4.226 — evidence-class-at-closure + standing detection pressure: machinery presence does NOT predict whether a fix holds — the EVIDENCE CLASS at closure (runtime vs source) under real DETECTION PRESSURE does, prose does not bind, seams do; closed evidence-class ranking {runtime &gt; artifact &gt; source} with a per-defect-layer floor at every closure seam, class proven by MACHINE FIELDS never a label, the ANTI-ECHO rule (a grep-transcript "runtime observable" is WRONG-LAYER), per-status evidence preconditions (FACT: a "ready"-class status parked 42% of the done-claiming population as never-verified — the set the operator sampled 6/6 broken), fix-kind honesty (a state-only repair/mitigation cannot close a defect as fixed), and a per-guard FRESHNESS CONTRACT feeding a standing risk-ordered re-run queue (most-reopened-first §11.4.189) drained by the zero-idle loop — the §11.4.135 release seam is the backstop, never the only executor (FACT: two standing guards, finally executed during the forensics, immediately emitted the latent FAILs; the positive control: every RED→GREEN-flip closure held with zero reopens, every source-green closure bounced; cross-corpus 52% recorded-undercount vs ~0.3% + median attempts-to-stick 1). NEW §11.4.227 — governance-corpus self-custody: the rule corpus is bound by the same custody it imposes (measured on THIS corpus 2026-07-22: 413 named CM-* gates, 241 = 58% unimplemented in the canonical gate sites, 85 literal gate-code deferrals; the custody seam designed 07-17 still prose on 07-22; the propagation-gate family asserts literal-presence &gt;= 1, rewarding restatement over implementation — the corpus measures its health in words present so it grows words); (A) named-gate LEDGER — every CM-* token implemented-or-registered-deferral-with-tracked-item, unimplemented count MONOTONE-DECREASING, vanished names need removal citations (the metric-gaming channel closed), an anchor's done state is its SEAM landing not its TEXT landing; (B) anchor-block INTEGRITY — propagation gates count BLOCK-STARTS never bare literals: exactly-once per anchor per file (&gt;1 = the F7 duplication class), lockstep content-hash equality across the mirror set, carriers never count, zero-blocks = BLIND, anchor-number collisions FAIL (the live §11.4.140/§11.4.141 double-mandate collision independently re-detected — resolution stays operator-owned), dotted sub-anchors never prefix-match parents; (C) semantic inter-anchor contradiction stays honest review territory. EXTENSION §11.4.194(6) — the quality-harvest review classes: every code-review additionally CHECKS (a) closure-evidence class vs defect layer, (b) needled measurements + counts-are-leads-lines-are-findings, (c) governance-and-gate integrity per §11.4.227, (d) reviewer-authored adversarial mutations (FACT: an author's six self-authored mutations all caught while an independent reviewer's first three different mutations all sailed through, each restoring a user-visible defect — the reviewer MUST attempt &gt;= 1 mutation the author did not write). ALREADY-COVERED (cited, not duplicated): status custody -&gt; §11.4.146(D3); verdict coverage/PENDING-blocks -&gt; §11.4.135; source-green-is-not-done -&gt; §11.4.108; instrument traps + control needle + measurement semantics -&gt; §11.4.201(6)-(12) + the shell-footguns standing reference; recurrence dedup -&gt; §11.4.214; inherited-premise decay -&gt; §11.4.205(4); verdict scope leak -&gt; §11.4.112(5); wrong-seam gates -&gt; §11.4.120; systematic-debugging activation -&gt; §11.4.102; exact repro -&gt; §11.4.199; review-before-build family -&gt; §11.4.125/.142/.194/.209/.134; the operator's on-pull apply-and-clear requirement -&gt; AUDITED as already bound by §11.4.32 (post-constitution-pull validation sweep with tracked FAIL entries) + §11.4.164 (auto-propagation hook) — both new anchors cite that binding explicitly instead of inventing a parallel mechanism. Honest gaps stated per §11.4.6: SOL-08 workspace commit-to-tracker scope-coverage NOT minted as an anchor (a universal "trackable commit" definition is a §11.4.66 operator decision; the proven POC remains a tracked §11.4.197 item); SOL-10 is gate-code for EXISTING anchors (§11.4.205(4)/§11.4.112(5)/§11.4.120), not a new rule; the §11.4.140/141 collision re-mint + the coverage-floor adoption remain operator-owned decisions; the governance-context crowding effect stays UNKNOWN (unmeasured — no anchor minted on it, §11.4.6); gate-code for ALL new/extended gates = separate work item, NOT claimed shipped (§11.4.6). All Classification: universal (§11.4.17) — every project literal genericised; consumers supply layer bindings, evidence stores, verdict registries, staleness budgets, gate-site lists, deferral registries, and lockstep mirror sets as DATA per §11.4.35. Propagation gates CM-COVENANT-114-226-PROPAGATION + CM-COVENANT-114-227-PROPAGATION + recommended gates CM-EVIDENCE-CLASS-AT-CLOSURE / CM-GUARD-FRESHNESS-SCHEDULER / CM-GATE-LEDGER-RATCHET / CM-ANCHOR-BLOCK-INTEGRITY + paired §1.1 mutations; the literals 11.4.194 / 11.4.32 / 11.4.164 are unchanged — their propagation gates stay GREEN. CLAUDE.md + AGENTS.md + QWEN.md + GEMINI.md mirrors updated in lockstep (§11.4.157), each new anchor exactly ONCE per mirror, the three new blocks byte-identical across all four mirrors (md5-verified). Generated .html/.pdf/.docx twins NOT regenerated this round — the governance-twin exporter is still not a documented runnable in-repo script (the probed finding, unchanged); twins remain honestly STALE pending the exporter commit (§11.4.106(E), no silent divergence claimed). Prior round: Footgun-5 addendum of 2026-07-23 (HEL-010 harvest delta) — the §11.4.201(12) standing reference docs/guides/shell_instrument_footguns.md gains its FIFTH demonstrated instrument-side class (entry I7): a background watchdog/timeout subshell spawned INSIDE a</w:t>
+              <w:t xml:space="preserve">Amendment of 2026-07-26 — the EFFORT-tiering + 5-field-label batch (operator IMPORTANT mandate 2026-07-26, verbatim: "Besides dynamic determining proper models to use, we MUST decide the effort as well and switch between the effort settings same as we do now for chosen model! Labeling MUST BE extended for this details as well. Example: (T1/main - claude4 - opus - high)."). §11.4.182 EXTENSION amended (in-place, no re-mint): the work-stream label form extends from</w:t>
             </w:r>
             <w:r>
               <w:t xml:space="preserve"> </w:t>
@@ -180,22 +180,13 @@
               <w:rPr>
                 <w:rStyle w:val="VerbatimChar"/>
               </w:rPr>
-              <w:t xml:space="preserve">$(...)</w:t>
+              <w:t xml:space="preserve">(T&lt;N&gt;/&lt;branch&gt; - &lt;alias&gt; - &lt;model&gt;)</w:t>
             </w:r>
             <w:r>
               <w:t xml:space="preserve"> </w:t>
             </w:r>
             <w:r>
-              <w:t xml:space="preserve">command-substitution inherits the substitution's pipe WRITE-END; disarming the watchdog early (</w:t>
-            </w:r>
-            <w:r>
-              <w:rPr>
-                <w:rStyle w:val="VerbatimChar"/>
-              </w:rPr>
-              <w:t xml:space="preserve">kill</w:t>
-            </w:r>
-            <w:r>
-              <w:t xml:space="preserve">) ORPHANS its</w:t>
+              <w:t xml:space="preserve">to</w:t>
             </w:r>
             <w:r>
               <w:t xml:space="preserve"> </w:t>
@@ -204,64 +195,10 @@
               <w:rPr>
                 <w:rStyle w:val="VerbatimChar"/>
               </w:rPr>
-              <w:t xml:space="preserve">sleep &lt;budget&gt;</w:t>
+              <w:t xml:space="preserve">(T&lt;N&gt;/&lt;branch&gt; - &lt;alias&gt; - &lt;model&gt; - &lt;effort&gt;)</w:t>
             </w:r>
             <w:r>
-              <w:t xml:space="preserve"> </w:t>
-            </w:r>
-            <w:r>
-              <w:t xml:space="preserve">grandchild which keeps that write-end OPEN, so the enclosing</w:t>
-            </w:r>
-            <w:r>
-              <w:t xml:space="preserve"> </w:t>
-            </w:r>
-            <w:r>
-              <w:rPr>
-                <w:rStyle w:val="VerbatimChar"/>
-              </w:rPr>
-              <w:t xml:space="preserve">$(...)</w:t>
-            </w:r>
-            <w:r>
-              <w:t xml:space="preserve"> </w:t>
-            </w:r>
-            <w:r>
-              <w:t xml:space="preserve">BLOCKS until the sleep exits — the substitution stalls for the FULL timeout budget even though the real work completed instantly, with every verdict and exit code CORRECT (a pure timing lie no verdict-checking gate can see; the healthy host reads as wedged/slow). Forensic FACT (measured 2026-07-23, a consuming toolchain's install re-review): a fast-stub probe read via command-substitution took 15s — exactly the watchdog budget — while the SAME probe writing to a file took 0s; every install/verify seam stalled +15s on a perfectly healthy host. Hermetically re-demonstrated under control conditions BEFORE codifying (§11.4.201(12)/§11.4.6, 3/3 deterministic iterations, 2026-07-22 UTC): naive</w:t>
-            </w:r>
-            <w:r>
-              <w:t xml:space="preserve"> </w:t>
-            </w:r>
-            <w:r>
-              <w:rPr>
-                <w:rStyle w:val="VerbatimChar"/>
-              </w:rPr>
-              <w:t xml:space="preserve">$(...)</w:t>
-            </w:r>
-            <w:r>
-              <w:t xml:space="preserve"> </w:t>
-            </w:r>
-            <w:r>
-              <w:t xml:space="preserve">capture 5006-5007ms == the full 5000ms budget with instant work; the SAME probe to a file 43-46ms (the pipe IS the mechanism); the fd-redirect countermeasure (</w:t>
-            </w:r>
-            <w:r>
-              <w:rPr>
-                <w:rStyle w:val="VerbatimChar"/>
-              </w:rPr>
-              <w:t xml:space="preserve">( … ) &gt;/dev/null 2&gt;&amp;1 &amp;</w:t>
-            </w:r>
-            <w:r>
-              <w:t xml:space="preserve">) restores 43-45ms with output intact WHILE a genuinely-wedged probe still bounds at rc=124 ~budget — the watchdog's protective function preserved (the §11.4.201(1) false-positive guard). COUNTERMEASURE: redirect the watchdog subshell's fds away from the cmd-subst pipe, or have the probe write to a file instead of being captured via</w:t>
-            </w:r>
-            <w:r>
-              <w:t xml:space="preserve"> </w:t>
-            </w:r>
-            <w:r>
-              <w:rPr>
-                <w:rStyle w:val="VerbatimChar"/>
-              </w:rPr>
-              <w:t xml:space="preserve">$(...)</w:t>
-            </w:r>
-            <w:r>
-              <w:t xml:space="preserve">. The §11.4.201(12) compact retellings' enumeration + count updated in LOCKSTEP across all five governance files ('all five DEMONSTRATED', §11.4.157 md5-verified); the full Constitution.md §11.4.201(12) anchor text is UNCHANGED — its enumeration is explicitly fenced to the FOUNDING classes and delegates new classes to the LIVING-document append mechanism, which this addendum exercises. Guide Revision 3. NO anchor added, removed, strengthened, or weakened; every propagation-gate literal unchanged (gates stay GREEN). Classification: universal (§11.4.17) — pure POSIX shell semantics, no toolchain/project literal. Prior round: Doc-minor remediation of 2026-07-23 — fix-forward on the independent §11.4.209-substrate review of the 2026-07-23 round (review verdict GO: 0 Blocking / 0 Important / 3 Minor, none gating). M1 — docs/guides/shell_instrument_footguns.md header made date-consistent: Created normalized to its UTC creation date 2026-07-22 (the founding commit was authored 2026-07-22T19:31:31Z; the prior 2026-07-23 value was the local +0500 date) and Last modified advanced to the real edit timestamp — §11.4.44 fields valid, no fabricated future timestamp (§11.4.6, current UTC at edit time was still 2026-07-22). M2 — the §11.4.201(9) forensic FACT's Send-Q figure hedged from an over-precise byte range the sampled raw ledgers could not byte-verify to the ledger-verifiable 'a few hundred bytes' (three orders of magnitude below the rcv_wnd capacity reading), applied identically in the full anchor text and every compact retelling across all five governance files (§11.4.157 lockstep preserved, md5-verified); the load-bearing semantics — capacity misread as occupancy, real Send-Q three orders smaller, app_limited — are unchanged and remain twice-confirmed. M3 — the repository's own README.md refreshed from its stale Rev-2 (2026-05-20) state: revision header bumped + the recent-anchor coverage note updated through §11.4.225. Wording-precision + header-freshness only — NO anchor added, removed, strengthened, or weakened; every propagation-gate literal unchanged (gates stay GREEN). Prior round: Round of 2026-07-23 — the SYSTEMATIC-DEBUGGING / MEASUREMENT-SEMANTICS harvest (HEL-010; research-derived from one day's live forensics across a consuming toolchain's debugging + measurement + review streams; every lesson VERIFIED against its captured evidence or re-demonstrated under control conditions BEFORE codifying, §11.4.6 — nothing codified on say-so). 1 NEW anchor + 4 EXTENSIONS + 1 NEW standing reference doc + 2 candidates resolved ALREADY-COVERED. NEW §11.4.225 — scheduler-quota burst-throttling telemetry + interactive-scope isolation: progressive/bursty interactive degradation MUST be diagnosed from the scheduler's THROTTLING ACCOUNTING sampled as DELTAS over time under load with a quiet-phase control (forensic FACT: a session scope at quota 9.6 CPU/100ms on a 64-CPU host, average demand 4.35 — UNDER quota — yet 16.9% of periods throttled, 0% quiet, worsening with session age, the co-located terminal-multiplexer server freezing per throttled period into multi-second stalls; every conventional average read HEALTHY — a §11.4.201(6) false-null), NEVER from averages; and an interactive-latency-sensitive process NEVER shares a fixed-quota no-burst scope with a bursty agent/build fleet — burst allowance, own scope, host-adaptive quota values with a live read-back (sibling FACT: a fixed 2-CPU default quota on a 64-core host → 18.8% of periods throttled, 1757s forced idle; fixed by host-adaptive computation, proven by a four-quadrant polarity test on the live cgroup); the THIRD orthogonal host-exhaustion axis beside §12.6 memory + §12.12 threads. EXTENSION §11.4.115(G) — defect-identity binding for CONSTRUCTED reproductions: a RED whose precondition the investigator BUILT (a hand-made lock holder) rather than TRACED to the reported defect's real evidence mints at most DEFENSIVE HARDENING, never a defect-closing fix — the reported item stays OPEN (§11.4.197); systematic-debugging refutation of every mechanism a pending fix addresses REVOKES its done-claim on the spot (forensic FACT: an exit-hang fix nearly shipped on a synthetic-mechanism RED→GREEN; §11.4.199-shape real-PTY re-driving refuted every addressed mechanism — 6/6 clean exits — and the change was honestly re-labelled in-source "defensive hardening ... NOT a fix for the reported exit-hang"); RED verdicts carry a precondition-provenance field {observed</w:t>
+              <w:t xml:space="preserve">, effort ∈ {low</w:t>
             </w:r>
           </w:p>
         </w:tc>
@@ -59976,6 +59913,3580 @@
       </w:r>
       <w:r>
         <w:t xml:space="preserve">§11.4.228.</w:t>
+      </w:r>
+    </w:p>
+    <w:p>
+      <w:pPr>
+        <w:pStyle w:val="BodyText"/>
+      </w:pPr>
+      <w:r>
+        <w:rPr>
+          <w:b/>
+          <w:bCs/>
+        </w:rPr>
+        <w:t xml:space="preserve">§11.4.229 — Live in-session task/todo tracker MUST always be up to date and fully in sync with the real work state — never stale, never completed-shown-as-pending nor pending-shown-as-done (User mandate, 2026-07-25).</w:t>
+      </w:r>
+      <w:r>
+        <w:t xml:space="preserve"> </w:t>
+      </w:r>
+      <w:r>
+        <w:t xml:space="preserve">Verbatim operator mandate: "make sure it is ALWAYS up to date fully in sync! CRITICAL: This MUST BE one of mandatory rules / constraints! Add it with all relevant details into the constitution Submodule and relevant related files." The agent's LIVE IN-SESSION TASK/TODO TRACKER — the harness-provided task list /</w:t>
+      </w:r>
+      <w:r>
+        <w:t xml:space="preserve"> </w:t>
+      </w:r>
+      <w:r>
+        <w:rPr>
+          <w:rStyle w:val="VerbatimChar"/>
+        </w:rPr>
+        <w:t xml:space="preserve">TodoWrite</w:t>
+      </w:r>
+      <w:r>
+        <w:t xml:space="preserve">-class todo tool / any equivalent moment-to-moment execution-state surface the runtime exposes DURING a session — MUST ALWAYS be kept up to date and FULLY IN SYNC with the real live work state: never stale, never showing completed work as pending, never showing pending / blocked / abandoned work as done or in-progress; updated the MOMENT any tracked task's state changes (started → in-progress, completed → done, blocked, abandoned, split, re-scoped, newly discovered), never batched to a later checkpoint, never reconstructed from memory at the end, never left reflecting a superseded plan — a live tracker that lags the real work is a §11.4 PASS-bluff at the execution-transparency layer (an operator or resuming conductor per §11.4.116 makes decisions on a false picture of what is done / in-flight / owed). (A) every state-change updates it IMMEDIATELY (exactly one in-progress where the surface models that; no completed-marked-pending, no pending-marked-done, no ghost task for dropped work — dropped work is closed with a reason); (B) NEVER stale, NEVER inverted (§11.4.6 — the tracker is captured FACT, falsely-done = PASS-bluff / falsely-pending = §11.4.1 FAIL-bluff, drift corrected the moment observed); (C) DISTINCT artifact that COMPLEMENTS never REPLACES §12.10 (committed CONTINUATION doc) / §11.4.131 (standing committed session-resumption FILE) / §11.4.97 (operator-facing milestone progress cadence) / §11.4.106(F) (doc/DB sync at commit/build/constitution-pull write-seams) / §11.4.202 / §11.4.208 (workable-item DB + request-history ledgers) — those bind committed/cross-session/operator-report/tracked-work artefacts, NONE binds the live in-session tracker itself; it is the in-session analogue of §12.10's always-current mandate applied to the harness task list, the truth those artefacts are materialised FROM; (D) honest boundary §11.4.6 — where no such surface exists this is honestly N/A (§11.4.3 SKIP-with-reason, latent-binding per §11.4.96), and "in sync" = reflects the real work state as the agent knows it now, not omniscience about unobserved work. Classification: universal (§11.4.17). Composes §12.10 / §11.4.131 / §11.4.97 / §11.4.106(F) / §11.4.126 / §11.4.116 / §11.4.202 / §11.4.208 / §11.4.6 / §11.4.1. Propagation gate</w:t>
+      </w:r>
+      <w:r>
+        <w:t xml:space="preserve"> </w:t>
+      </w:r>
+      <w:r>
+        <w:rPr>
+          <w:rStyle w:val="VerbatimChar"/>
+        </w:rPr>
+        <w:t xml:space="preserve">CM-COVENANT-114-229-PROPAGATION</w:t>
+      </w:r>
+      <w:r>
+        <w:t xml:space="preserve"> </w:t>
+      </w:r>
+      <w:r>
+        <w:t xml:space="preserve">(literal</w:t>
+      </w:r>
+      <w:r>
+        <w:t xml:space="preserve"> </w:t>
+      </w:r>
+      <w:r>
+        <w:rPr>
+          <w:rStyle w:val="VerbatimChar"/>
+        </w:rPr>
+        <w:t xml:space="preserve">11.4.229</w:t>
+      </w:r>
+      <w:r>
+        <w:t xml:space="preserve">) + recommended gate</w:t>
+      </w:r>
+      <w:r>
+        <w:t xml:space="preserve"> </w:t>
+      </w:r>
+      <w:r>
+        <w:rPr>
+          <w:rStyle w:val="VerbatimChar"/>
+        </w:rPr>
+        <w:t xml:space="preserve">CM-LIVE-TASK-TRACKER-IN-SYNC</w:t>
+      </w:r>
+      <w:r>
+        <w:t xml:space="preserve"> </w:t>
+      </w:r>
+      <w:r>
+        <w:t xml:space="preserve">+ paired §1.1 mutation (gate-code = separate work item, NOT claimed shipped §11.4.6). No escape hatch — no</w:t>
+      </w:r>
+      <w:r>
+        <w:t xml:space="preserve"> </w:t>
+      </w:r>
+      <w:r>
+        <w:rPr>
+          <w:rStyle w:val="VerbatimChar"/>
+        </w:rPr>
+        <w:t xml:space="preserve">--tracker-may-lag</w:t>
+      </w:r>
+      <w:r>
+        <w:t xml:space="preserve">,</w:t>
+      </w:r>
+      <w:r>
+        <w:t xml:space="preserve"> </w:t>
+      </w:r>
+      <w:r>
+        <w:rPr>
+          <w:rStyle w:val="VerbatimChar"/>
+        </w:rPr>
+        <w:t xml:space="preserve">--batch-todo-updates</w:t>
+      </w:r>
+      <w:r>
+        <w:t xml:space="preserve">,</w:t>
+      </w:r>
+      <w:r>
+        <w:t xml:space="preserve"> </w:t>
+      </w:r>
+      <w:r>
+        <w:rPr>
+          <w:rStyle w:val="VerbatimChar"/>
+        </w:rPr>
+        <w:t xml:space="preserve">--stale-task-list-OK</w:t>
+      </w:r>
+      <w:r>
+        <w:t xml:space="preserve">,</w:t>
+      </w:r>
+      <w:r>
+        <w:t xml:space="preserve"> </w:t>
+      </w:r>
+      <w:r>
+        <w:rPr>
+          <w:rStyle w:val="VerbatimChar"/>
+        </w:rPr>
+        <w:t xml:space="preserve">--reconstruct-todos-at-end</w:t>
+      </w:r>
+      <w:r>
+        <w:t xml:space="preserve">,</w:t>
+      </w:r>
+      <w:r>
+        <w:t xml:space="preserve"> </w:t>
+      </w:r>
+      <w:r>
+        <w:rPr>
+          <w:rStyle w:val="VerbatimChar"/>
+        </w:rPr>
+        <w:t xml:space="preserve">--skip-task-tracker-sync</w:t>
+      </w:r>
+      <w:r>
+        <w:t xml:space="preserve">,</w:t>
+      </w:r>
+      <w:r>
+        <w:t xml:space="preserve"> </w:t>
+      </w:r>
+      <w:r>
+        <w:rPr>
+          <w:rStyle w:val="VerbatimChar"/>
+        </w:rPr>
+        <w:t xml:space="preserve">--pending-may-be-done</w:t>
+      </w:r>
+      <w:r>
+        <w:t xml:space="preserve">,</w:t>
+      </w:r>
+      <w:r>
+        <w:t xml:space="preserve"> </w:t>
+      </w:r>
+      <w:r>
+        <w:rPr>
+          <w:rStyle w:val="VerbatimChar"/>
+        </w:rPr>
+        <w:t xml:space="preserve">--completed-may-stay-pending</w:t>
+      </w:r>
+      <w:r>
+        <w:t xml:space="preserve"> </w:t>
+      </w:r>
+      <w:r>
+        <w:t xml:space="preserve">flag. Full text in</w:t>
+      </w:r>
+      <w:r>
+        <w:t xml:space="preserve"> </w:t>
+      </w:r>
+      <w:r>
+        <w:rPr>
+          <w:rStyle w:val="VerbatimChar"/>
+        </w:rPr>
+        <w:t xml:space="preserve">Constitution.md</w:t>
+      </w:r>
+      <w:r>
+        <w:t xml:space="preserve"> </w:t>
+      </w:r>
+      <w:r>
+        <w:t xml:space="preserve">§11.4.229.</w:t>
+      </w:r>
+    </w:p>
+    <w:p>
+      <w:pPr>
+        <w:pStyle w:val="BodyText"/>
+      </w:pPr>
+      <w:r>
+        <w:rPr>
+          <w:b/>
+          <w:bCs/>
+        </w:rPr>
+        <w:t xml:space="preserve">§11.4.230 — Parallelized-pipeline methodology: build↔validate overlap + affected-stages-only re-run + parallel multi-device testing/recording + fan-out-subagents-always (research-derived, 2026-07-26).</w:t>
+      </w:r>
+    </w:p>
+    <w:p>
+      <w:pPr>
+        <w:pStyle w:val="BodyText"/>
+      </w:pPr>
+      <w:r>
+        <w:t xml:space="preserve">Forensic motivation (genericised): the sequential pipeline shape — build FULLY completes → THEN validation begins → on ANY discovery, restart the WHOLE cycle from scratch → all devices tested one-at-a-time — serialises the operator's wall-clock onto build latency + one-device-at-a-time evidence gathering, so a multi-hour containerised build followed by serial per-device validation and a from-scratch restart-on-discovery makes time-to-a-manual-QA-capable-release a multiple of what the genuinely-parallel work requires. §11.4.58's PWU pipeline already overlaps Stage 1 of round N+1 with Stages 4–5 of round N; §11.4.89 already backgrounds long tests; §11.4.103 already mandates ≥3 auto-backfilled parallel streams; §11.4.119 already partitions shared hardware by single-owner; §11.4.128/§11.4.144 already mandate always-on recording + availability-following. §11.4.230 BINDS those into one operating discipline and adds the three invariants they did not each state on their own: (A) the build↔validate CONCURRENCY seam + affected-stages-only re-run-on-discovery, (B) all-devices-concurrent + worker-pool recording/processing, (C) fan-out-subagents as the standing default. It is the parallelization capstone the way §11.4.103 is the continuous-parallel-stream capstone — a strengthening bind, never a weakening.</w:t>
+      </w:r>
+    </w:p>
+    <w:p>
+      <w:pPr>
+        <w:pStyle w:val="BodyText"/>
+      </w:pPr>
+      <w:r>
+        <w:rPr>
+          <w:b/>
+          <w:bCs/>
+        </w:rPr>
+        <w:t xml:space="preserve">(A) PIPELINE-OVERLAP PARALLELIZATION.</w:t>
+      </w:r>
+      <w:r>
+        <w:t xml:space="preserve"> </w:t>
+      </w:r>
+      <w:r>
+        <w:t xml:space="preserve">Validation/verification work MUST run CONCURRENTLY WITH the build wherever a validation stage does NOT depend on the build's own not-yet-produced artifact — never deferred until the build finishes when it could have run alongside it. Deploy the moment the build is done (build-completion is the deploy trigger, per §11.4.121 no-commit-while-build-writes-tracked-artifacts + §11.4.108 artifact-must-exist ordering — the deploy waits for the artifact, the deploy-independent validation does not). Concretely, WHILE a build runs, the following run in parallel per the §11.4.96 SAFE-during-build catalogue: pre-build source-layer gates + meta-test mutation sweeps + coverage/clash checks (§11.4.110), the §11.4.125/§11.4.142/§11.4.194 independent code-review on the batch's SOURCE, doc/DB sync (§11.4.106), and on-device validation of the PRIOR build (device-independent of the in-flight build, §11.4.119). On any NON-huge-blocker discovery, the cycle MUST: (1) bump the version code (a new, distinctly-identifiable candidate artifact — never re-use the failing artifact's id, §11.4.111 stable-name + §11.4.200 target-identity); (2) fix at the proven root cause (§11.4.102 systematic-debugging first, §11.4.115 RED-on-the-broken-artifact); (3) RE-RUN ONLY THE AFFECTED STAGES, PARALLELIZED — the stages whose inputs the fix changed (its own targeted validation FIRST per §11.4.130, then the affected regression set), NOT a serial restart-from-scratch of the entire cycle. The explicit efficiency target is a</w:t>
+      </w:r>
+      <w:r>
+        <w:t xml:space="preserve"> </w:t>
+      </w:r>
+      <w:r>
+        <w:rPr>
+          <w:b/>
+          <w:bCs/>
+        </w:rPr>
+        <w:t xml:space="preserve">4–5× reduction in time-to-a-manual-QA-capable-release</w:t>
+      </w:r>
+      <w:r>
+        <w:t xml:space="preserve"> </w:t>
+      </w:r>
+      <w:r>
+        <w:t xml:space="preserve">versus the fully-sequential shape — a measured target, tracked as build-and-validate wall-clock deltas (§11.4.24 build-resource stats), never an assumed one (§11.4.6).</w:t>
+      </w:r>
+      <w:r>
+        <w:t xml:space="preserve"> </w:t>
+      </w:r>
+      <w:r>
+        <w:rPr>
+          <w:b/>
+          <w:bCs/>
+        </w:rPr>
+        <w:t xml:space="preserve">HONEST BOUNDARY (§11.4.6 / §11.4.108 / §11.4.120):</w:t>
+      </w:r>
+      <w:r>
+        <w:t xml:space="preserve"> </w:t>
+      </w:r>
+      <w:r>
+        <w:t xml:space="preserve">the CURRENT build's ARTIFACT-layer (§11.4.108 layer 2) and RUNTIME-ON-CLEAN-TARGET-layer (layer 3) validation CANNOT precede its own artifact — a gate whose precondition is the build's output belongs at a post-build seam, never overlapped onto authorship (§11.4.120 seam-placement; §11.4.69</w:t>
+      </w:r>
+      <w:r>
+        <w:t xml:space="preserve"> </w:t>
+      </w:r>
+      <w:r>
+        <w:rPr>
+          <w:rStyle w:val="VerbatimChar"/>
+        </w:rPr>
+        <w:t xml:space="preserve">artifact_not_yet_built</w:t>
+      </w:r>
+      <w:r>
+        <w:t xml:space="preserve">). "Concurrent with the build" therefore means the deploy-INDEPENDENT stages overlap; the CURRENT-artifact runtime validation begins the moment that artifact exists, in parallel across devices per (B).</w:t>
+      </w:r>
+      <w:r>
+        <w:t xml:space="preserve"> </w:t>
+      </w:r>
+      <w:r>
+        <w:rPr>
+          <w:b/>
+          <w:bCs/>
+        </w:rPr>
+        <w:t xml:space="preserve">"Affected-stages-only re-run" is bounded to NON-huge-blocker discovery</w:t>
+      </w:r>
+      <w:r>
+        <w:t xml:space="preserve">: a HUGE BLOCKER (release-blocking-severity defect / regression invalidating the cycle / blast radius reaching the batch's other fixes) still triggers the §11.4.129 STOP → fix-all → full-RESTART protocol (restart, never resume) — §11.4.230(A) does NOT weaken §11.4.129, §11.4.40 full-suite-retest-before-tag, §11.4.130 validate-the-fix-first, §11.4.132 risk-ordered validation, or §11.4.185 manual-QA-final; it narrows the from-scratch restart to exactly the cases those anchors require it, and parallelises everything else.</w:t>
+      </w:r>
+    </w:p>
+    <w:p>
+      <w:pPr>
+        <w:pStyle w:val="BodyText"/>
+      </w:pPr>
+      <w:r>
+        <w:rPr>
+          <w:b/>
+          <w:bCs/>
+        </w:rPr>
+        <w:t xml:space="preserve">(B) PARALLEL MULTI-DEVICE TESTING + RECORDING/PROCESSING.</w:t>
+      </w:r>
+      <w:r>
+        <w:t xml:space="preserve"> </w:t>
+      </w:r>
+      <w:r>
+        <w:t xml:space="preserve">Every available, reachable test device MUST be exercised CONCURRENTLY — one validation stream per device, never one-device-at-a-time when the devices are independent — each stream the SINGLE EXCLUSIVE OWNER of that device's exclusive resources per §11.4.119 (the owner drives; any concurrent stream targeting the same device is read-only), so per-device evidence is never cross-contaminated (§11.4.119 evidence-integrity). Every device is ALWAYS-RECORDED per §11.4.128 (non-invasive, side-effect-free, deterministic layout) and AVAILABILITY-FOLLOWED per §11.4.144 (a dropped device logs an honest offline event + reconnect-and-resume, never a silent corpus hole, never a faked continuity). Recording CAPTURE + ANALYSIS/PROCESSING MUST be fanned out through a BOUNDED WORKER-POOL (a Go worker-pool or platform equivalent) so N devices' recordings are captured + analysed in parallel and per-device evidence never serialises onto a single processor — the pool bounded by §12.6 memory + §12.12 thread headroom. Per-device PASS cites its own captured-evidence artefact (§11.4.5/§11.4.69/§11.4.107) on a CLEAN/fresh deployment (§11.4.108 runtime-signature, §11.4.200 verify-deployed-artifact-identity-per-device); the highest-risk / most-reopened cases (§11.4.132/§11.4.189) get the deepest scrutiny FIRST on every device.</w:t>
+      </w:r>
+      <w:r>
+        <w:t xml:space="preserve"> </w:t>
+      </w:r>
+      <w:r>
+        <w:rPr>
+          <w:b/>
+          <w:bCs/>
+        </w:rPr>
+        <w:t xml:space="preserve">HONEST BOUNDARY (§11.4.6):</w:t>
+      </w:r>
+      <w:r>
+        <w:t xml:space="preserve"> </w:t>
+      </w:r>
+      <w:r>
+        <w:t xml:space="preserve">genuinely-shared exclusive resources (one HDMI/audio sink, one media-playback path) serialise per §11.4.119 single-owner-over-time even across devices; "all devices concurrent" means independent devices, never two owners of one exclusive resource.</w:t>
+      </w:r>
+    </w:p>
+    <w:p>
+      <w:pPr>
+        <w:pStyle w:val="BodyText"/>
+      </w:pPr>
+      <w:r>
+        <w:rPr>
+          <w:b/>
+          <w:bCs/>
+        </w:rPr>
+        <w:t xml:space="preserve">(C) FAN-OUT-SUBAGENTS-ALWAYS.</w:t>
+      </w:r>
+      <w:r>
+        <w:t xml:space="preserve"> </w:t>
+      </w:r>
+      <w:r>
+        <w:t xml:space="preserve">Subagent fan-out (§11.4.20/§11.4.70 subagent-driven; §11.4.187 multi-track ruler; §11.4.192 auto-backfill) is the STANDING DEFAULT for EVERY genuinely-parallelizable effort — batch investigation, test-authoring, gate-authoring, per-device validation (B), per-PWU development (§11.4.58), doc/research work — not a per-request opt-in and not reserved for "big" tasks. A parallelizable effort executed monolithically in the foreground when a fan-out path exists is a §11.4.230(C) violation (the §11.4.94/§11.4.97/§11.4.103 zero-idle discipline applied to HOW work is dispatched, not only WHETHER it runs).</w:t>
+      </w:r>
+      <w:r>
+        <w:t xml:space="preserve"> </w:t>
+      </w:r>
+      <w:r>
+        <w:rPr>
+          <w:b/>
+          <w:bCs/>
+        </w:rPr>
+        <w:t xml:space="preserve">HONEST BOUNDARY (§11.4.6 / §11.4.183):</w:t>
+      </w:r>
+      <w:r>
+        <w:t xml:space="preserve"> </w:t>
+      </w:r>
+      <w:r>
+        <w:t xml:space="preserve">"always fan out" is BOUNDED by (1) genuine parallelizability (contending/redundant/serially-dependent subagents are NOT fan-out — they are waste, and spawning them is NOT maximization per §11.4.183 maximum-USEFUL-throughput); (2) §12.6 60% memory ceiling; (3) §12.12</w:t>
+      </w:r>
+      <w:r>
+        <w:t xml:space="preserve"> </w:t>
+      </w:r>
+      <w:r>
+        <w:rPr>
+          <w:rStyle w:val="VerbatimChar"/>
+        </w:rPr>
+        <w:t xml:space="preserve">RLIMIT_NPROC</w:t>
+      </w:r>
+      <w:r>
+        <w:t xml:space="preserve"> </w:t>
+      </w:r>
+      <w:r>
+        <w:t xml:space="preserve">thread headroom; (4) §11.4.58 ≤6 concurrent-agent cap; (5) §11.4.119 single-resource-owner (two subagents may not both drive one exclusive device); (6) critical-state sequencing (commits/pushes/tags stay serial per §11.4.88/§11.4.113). The bar is maximum USEFUL parallel throughput, never agent count; fan-out that exceeds a host-safety ceiling or contends a single resource is a violation, not compliance.</w:t>
+      </w:r>
+    </w:p>
+    <w:p>
+      <w:pPr>
+        <w:pStyle w:val="BodyText"/>
+      </w:pPr>
+      <w:r>
+        <w:t xml:space="preserve">Classification: universal (§11.4.17) — a platform-neutral parallelization discipline reusable by ANY project that builds an artifact, validates it across multiple targets, and records device evidence; the consuming project supplies its concrete device set + serials, build/flash tooling, recording layout, and worker-pool implementation per §11.4.35. Composes §11.4.20 / §11.4.24 (wall-clock stats prove the 4–5× target) / §11.4.40 / §11.4.58 (the PWU pipeline this binds + extends) / §11.4.69 / §11.4.70 / §11.4.88 / §11.4.89 / §11.4.94 / §11.4.96 (SAFE-during-build catalogue) / §11.4.97 / §11.4.102 / §11.4.103 / §11.4.108 (artifact/runtime layer ordering — the honest boundary) / §11.4.110 / §11.4.115 / §11.4.119 (single-resource-owner — B's load-bearing partition) / §11.4.120 (seam-placement — A's honest boundary) / §11.4.121 / §11.4.125 / §11.4.126 / §11.4.128 (always-on recording — B's evidence source) / §11.4.129 (huge-blocker full-restart — the un-weakened carve-out) / §11.4.130 / §11.4.132 / §11.4.144 (availability-following — B's drop-handling) / §11.4.183 (maximum-USEFUL-parallelism — C's honest boundary) / §11.4.185 (manual-QA-final — the un-weakened terminal gate) / §11.4.187 / §11.4.192 / §11.4.200 (per-device deployed-artifact verification) / §12.6 / §12.12. Propagation gate</w:t>
+      </w:r>
+      <w:r>
+        <w:t xml:space="preserve"> </w:t>
+      </w:r>
+      <w:r>
+        <w:rPr>
+          <w:rStyle w:val="VerbatimChar"/>
+        </w:rPr>
+        <w:t xml:space="preserve">CM-COVENANT-114-230-PROPAGATION</w:t>
+      </w:r>
+      <w:r>
+        <w:t xml:space="preserve"> </w:t>
+      </w:r>
+      <w:r>
+        <w:t xml:space="preserve">(literal</w:t>
+      </w:r>
+      <w:r>
+        <w:t xml:space="preserve"> </w:t>
+      </w:r>
+      <w:r>
+        <w:rPr>
+          <w:rStyle w:val="VerbatimChar"/>
+        </w:rPr>
+        <w:t xml:space="preserve">11.4.230</w:t>
+      </w:r>
+      <w:r>
+        <w:t xml:space="preserve"> </w:t>
+      </w:r>
+      <w:r>
+        <w:t xml:space="preserve">across the consumer fleet) + recommended gates</w:t>
+      </w:r>
+      <w:r>
+        <w:t xml:space="preserve"> </w:t>
+      </w:r>
+      <w:r>
+        <w:rPr>
+          <w:rStyle w:val="VerbatimChar"/>
+        </w:rPr>
+        <w:t xml:space="preserve">CM-PIPELINE-OVERLAP-VALIDATION</w:t>
+      </w:r>
+      <w:r>
+        <w:t xml:space="preserve"> </w:t>
+      </w:r>
+      <w:r>
+        <w:t xml:space="preserve">(a build that runs with zero deploy-independent validation stages running concurrently when SAFE-catalogue work is queued → FAIL; a NON-huge-blocker discovery that restarts the whole cycle from scratch instead of re-running only the affected stages → FAIL) +</w:t>
+      </w:r>
+      <w:r>
+        <w:t xml:space="preserve"> </w:t>
+      </w:r>
+      <w:r>
+        <w:rPr>
+          <w:rStyle w:val="VerbatimChar"/>
+        </w:rPr>
+        <w:t xml:space="preserve">CM-PARALLEL-DEVICE-WORKER-POOL</w:t>
+      </w:r>
+      <w:r>
+        <w:t xml:space="preserve"> </w:t>
+      </w:r>
+      <w:r>
+        <w:t xml:space="preserve">(available independent devices validated serially instead of concurrently, OR recording capture/analysis serialised onto one processor when a worker-pool path exists → FAIL) +</w:t>
+      </w:r>
+      <w:r>
+        <w:t xml:space="preserve"> </w:t>
+      </w:r>
+      <w:r>
+        <w:rPr>
+          <w:rStyle w:val="VerbatimChar"/>
+        </w:rPr>
+        <w:t xml:space="preserve">CM-FAN-OUT-SUBAGENTS-DEFAULT</w:t>
+      </w:r>
+      <w:r>
+        <w:t xml:space="preserve"> </w:t>
+      </w:r>
+      <w:r>
+        <w:t xml:space="preserve">(a genuinely-parallelizable effort run monolithically in the foreground when a fan-out path exists AND all host-safety ceilings have headroom → FAIL) + paired §1.1 meta-test mutations (per §1.1; gate-code = separate work item, NOT claimed shipped §11.4.6).</w:t>
+      </w:r>
+    </w:p>
+    <w:p>
+      <w:pPr>
+        <w:pStyle w:val="BodyText"/>
+      </w:pPr>
+      <w:r>
+        <w:rPr>
+          <w:b/>
+          <w:bCs/>
+        </w:rPr>
+        <w:t xml:space="preserve">Canonical authority:</w:t>
+      </w:r>
+      <w:r>
+        <w:t xml:space="preserve"> </w:t>
+      </w:r>
+      <w:r>
+        <w:t xml:space="preserve">constitution submodule</w:t>
+      </w:r>
+      <w:r>
+        <w:t xml:space="preserve"> </w:t>
+      </w:r>
+      <w:hyperlink r:id="rId70">
+        <w:r>
+          <w:rPr>
+            <w:rStyle w:val="VerbatimChar"/>
+          </w:rPr>
+          <w:t xml:space="preserve">Constitution.md</w:t>
+        </w:r>
+      </w:hyperlink>
+      <w:r>
+        <w:t xml:space="preserve"> </w:t>
+      </w:r>
+      <w:r>
+        <w:t xml:space="preserve">§11.4.230.</w:t>
+      </w:r>
+    </w:p>
+    <w:p>
+      <w:pPr>
+        <w:pStyle w:val="BodyText"/>
+      </w:pPr>
+      <w:r>
+        <w:t xml:space="preserve">Non-compliance is a release blocker regardless of context. No escape hatch — no</w:t>
+      </w:r>
+      <w:r>
+        <w:t xml:space="preserve"> </w:t>
+      </w:r>
+      <w:r>
+        <w:rPr>
+          <w:rStyle w:val="VerbatimChar"/>
+        </w:rPr>
+        <w:t xml:space="preserve">--sequential-build-then-validate</w:t>
+      </w:r>
+      <w:r>
+        <w:t xml:space="preserve">,</w:t>
+      </w:r>
+      <w:r>
+        <w:t xml:space="preserve"> </w:t>
+      </w:r>
+      <w:r>
+        <w:rPr>
+          <w:rStyle w:val="VerbatimChar"/>
+        </w:rPr>
+        <w:t xml:space="preserve">--restart-whole-cycle-on-discovery</w:t>
+      </w:r>
+      <w:r>
+        <w:t xml:space="preserve">,</w:t>
+      </w:r>
+      <w:r>
+        <w:t xml:space="preserve"> </w:t>
+      </w:r>
+      <w:r>
+        <w:rPr>
+          <w:rStyle w:val="VerbatimChar"/>
+        </w:rPr>
+        <w:t xml:space="preserve">--serial-device-testing</w:t>
+      </w:r>
+      <w:r>
+        <w:t xml:space="preserve">,</w:t>
+      </w:r>
+      <w:r>
+        <w:t xml:space="preserve"> </w:t>
+      </w:r>
+      <w:r>
+        <w:rPr>
+          <w:rStyle w:val="VerbatimChar"/>
+        </w:rPr>
+        <w:t xml:space="preserve">--serialise-recording-processing</w:t>
+      </w:r>
+      <w:r>
+        <w:t xml:space="preserve">,</w:t>
+      </w:r>
+      <w:r>
+        <w:t xml:space="preserve"> </w:t>
+      </w:r>
+      <w:r>
+        <w:rPr>
+          <w:rStyle w:val="VerbatimChar"/>
+        </w:rPr>
+        <w:t xml:space="preserve">--no-fan-out</w:t>
+      </w:r>
+      <w:r>
+        <w:t xml:space="preserve">,</w:t>
+      </w:r>
+      <w:r>
+        <w:t xml:space="preserve"> </w:t>
+      </w:r>
+      <w:r>
+        <w:rPr>
+          <w:rStyle w:val="VerbatimChar"/>
+        </w:rPr>
+        <w:t xml:space="preserve">--monolithic-parallelizable-work</w:t>
+      </w:r>
+      <w:r>
+        <w:t xml:space="preserve"> </w:t>
+      </w:r>
+      <w:r>
+        <w:t xml:space="preserve">flag exists.</w:t>
+      </w:r>
+    </w:p>
+    <w:p>
+      <w:pPr>
+        <w:pStyle w:val="BodyText"/>
+      </w:pPr>
+      <w:r>
+        <w:rPr>
+          <w:b/>
+          <w:bCs/>
+        </w:rPr>
+        <w:t xml:space="preserve">§11.4.231 — Nano-precision model-tier selection: lightest-capable-model-first with dynamic mid-task escalation (User mandate, 2026-07-26,</w:t>
+      </w:r>
+      <w:r>
+        <w:rPr>
+          <w:b/>
+          <w:bCs/>
+        </w:rPr>
+        <w:t xml:space="preserve"> </w:t>
+      </w:r>
+      <w:r>
+        <w:rPr>
+          <w:rStyle w:val="VerbatimChar"/>
+          <w:b/>
+          <w:bCs/>
+        </w:rPr>
+        <w:t xml:space="preserve">CRITICAL</w:t>
+      </w:r>
+      <w:r>
+        <w:rPr>
+          <w:b/>
+          <w:bCs/>
+        </w:rPr>
+        <w:t xml:space="preserve">).</w:t>
+      </w:r>
+    </w:p>
+    <w:p>
+      <w:pPr>
+        <w:pStyle w:val="BodyText"/>
+      </w:pPr>
+      <w:r>
+        <w:t xml:space="preserve">Verbatim operator mandate: every work effort MUST use the LIGHTEST CAPABLE model, escalating tier only as complexity rises — a nano-precision, per-task model-tier choice, NOT "everything on the heaviest model." Forensic motivation (genericised, §11.4.6): dispatching every task — a trivial doc-sync, a one-line status read, a mechanical format fix — on the heaviest available model wastes capacity + token budget + wall-clock that a lighter tier would spend identically well, while the OPPOSITE failure (a hard multi-factor root-cause investigation dispatched on a tier too light to reason through it) produces exactly the shallow, guessed, or wrong-conclusion work §11.4.6 / §11.4.102 / §11.4.194 forbid. Neither "always heaviest" nor "always lightest" is compliant; the correct discipline is a PER-TASK, EVIDENCE-BASED tier choice that tracks the task's own complexity, re-evaluated as that complexity becomes known — the nano-precision selection this anchor mandates.</w:t>
+      </w:r>
+    </w:p>
+    <w:p>
+      <w:pPr>
+        <w:pStyle w:val="BodyText"/>
+      </w:pPr>
+      <w:r>
+        <w:rPr>
+          <w:b/>
+          <w:bCs/>
+        </w:rPr>
+        <w:t xml:space="preserve">(A) LIGHTEST-CAPABLE-FIRST + ESCALATE-ON-COMPLEXITY.</w:t>
+      </w:r>
+      <w:r>
+        <w:t xml:space="preserve"> </w:t>
+      </w:r>
+      <w:r>
+        <w:t xml:space="preserve">Every dispatched work effort — main-stream or subagent (§11.4.20/§11.4.70), single-track or multitrack (§11.4.187/§11.4.192) — is assigned the LIGHTEST model tier from the closed, capability-ordered ladder</w:t>
+      </w:r>
+      <w:r>
+        <w:t xml:space="preserve"> </w:t>
+      </w:r>
+      <w:r>
+        <w:rPr>
+          <w:rStyle w:val="VerbatimChar"/>
+        </w:rPr>
+        <w:t xml:space="preserve">haiku &lt; sonnet &lt; opus</w:t>
+      </w:r>
+      <w:r>
+        <w:t xml:space="preserve"> </w:t>
+      </w:r>
+      <w:r>
+        <w:t xml:space="preserve">genuinely sufficient to complete it correctly (the review/merge-conflict-resolution substrate is a SEPARATE, already-pinned tier per clause (E), not a fourth rung of this ladder). Tier selection is a DECIDABLE heuristic, not a guess (§11.4.6) — evaluated against, at minimum: (i)</w:t>
+      </w:r>
+      <w:r>
+        <w:t xml:space="preserve"> </w:t>
+      </w:r>
+      <w:r>
+        <w:rPr>
+          <w:b/>
+          <w:bCs/>
+        </w:rPr>
+        <w:t xml:space="preserve">task scope</w:t>
+      </w:r>
+      <w:r>
+        <w:t xml:space="preserve"> </w:t>
+      </w:r>
+      <w:r>
+        <w:t xml:space="preserve">(single mechanical edit / focused single-file change / multi-file-or-multi-component change); (ii)</w:t>
+      </w:r>
+      <w:r>
+        <w:t xml:space="preserve"> </w:t>
+      </w:r>
+      <w:r>
+        <w:rPr>
+          <w:b/>
+          <w:bCs/>
+        </w:rPr>
+        <w:t xml:space="preserve">reasoning depth</w:t>
+      </w:r>
+      <w:r>
+        <w:t xml:space="preserve"> </w:t>
+      </w:r>
+      <w:r>
+        <w:t xml:space="preserve">(a lookup-and-apply action vs. a multi-factor root-cause investigation per §11.4.102/§11.4.194); (iii)</w:t>
+      </w:r>
+      <w:r>
+        <w:t xml:space="preserve"> </w:t>
+      </w:r>
+      <w:r>
+        <w:rPr>
+          <w:b/>
+          <w:bCs/>
+        </w:rPr>
+        <w:t xml:space="preserve">blast radius</w:t>
+      </w:r>
+      <w:r>
+        <w:t xml:space="preserve"> </w:t>
+      </w:r>
+      <w:r>
+        <w:t xml:space="preserve">(a change touching one isolated file vs. one crossing shared state, hardware safety §11.4.133, or governance/gate seams §11.4.227); (iv)</w:t>
+      </w:r>
+      <w:r>
+        <w:t xml:space="preserve"> </w:t>
+      </w:r>
+      <w:r>
+        <w:rPr>
+          <w:b/>
+          <w:bCs/>
+        </w:rPr>
+        <w:t xml:space="preserve">novelty</w:t>
+      </w:r>
+      <w:r>
+        <w:t xml:space="preserve"> </w:t>
+      </w:r>
+      <w:r>
+        <w:t xml:space="preserve">(a previously-solved, pattern-matched task vs. a genuinely new problem with no established precedent). Closed-set tier bindings (illustrative, non-exhaustive — the consuming project supplies its own precise mapping per §11.4.35):</w:t>
+      </w:r>
+      <w:r>
+        <w:t xml:space="preserve"> </w:t>
+      </w:r>
+      <w:r>
+        <w:rPr>
+          <w:rStyle w:val="VerbatimChar"/>
+          <w:b/>
+          <w:bCs/>
+        </w:rPr>
+        <w:t xml:space="preserve">haiku</w:t>
+      </w:r>
+      <w:r>
+        <w:t xml:space="preserve"> </w:t>
+      </w:r>
+      <w:r>
+        <w:t xml:space="preserve">— trivial/mechanical work (simple greps/searches, doc-sync regeneration, status/field reads, format/lint fixes, boilerplate scaffolding);</w:t>
+      </w:r>
+      <w:r>
+        <w:t xml:space="preserve"> </w:t>
+      </w:r>
+      <w:r>
+        <w:rPr>
+          <w:rStyle w:val="VerbatimChar"/>
+          <w:b/>
+          <w:bCs/>
+        </w:rPr>
+        <w:t xml:space="preserve">sonnet</w:t>
+      </w:r>
+      <w:r>
+        <w:t xml:space="preserve"> </w:t>
+      </w:r>
+      <w:r>
+        <w:t xml:space="preserve">— moderate work (a focused single-component debug, a bounded single-file implementation, straightforward research or audit reads);</w:t>
+      </w:r>
+      <w:r>
+        <w:t xml:space="preserve"> </w:t>
+      </w:r>
+      <w:r>
+        <w:rPr>
+          <w:rStyle w:val="VerbatimChar"/>
+          <w:b/>
+          <w:bCs/>
+        </w:rPr>
+        <w:t xml:space="preserve">opus</w:t>
+      </w:r>
+      <w:r>
+        <w:t xml:space="preserve"> </w:t>
+      </w:r>
+      <w:r>
+        <w:t xml:space="preserve">— complex work (architecture/design decisions, multi-factor reasoning per §11.4.194(1), cross-feature blast-radius analysis per §11.4.92 Pass 2/3, hard root-cause investigation per §11.4.102 that resists a first-pass hypothesis). A task whose complexity is genuinely UNDECIDABLE from available evidence starts at the NEXT tier UP from the best available estimate (the safe-reversible default per §11.4.101) rather than guessed downward.</w:t>
+      </w:r>
+    </w:p>
+    <w:p>
+      <w:pPr>
+        <w:pStyle w:val="BodyText"/>
+      </w:pPr>
+      <w:r>
+        <w:rPr>
+          <w:b/>
+          <w:bCs/>
+        </w:rPr>
+        <w:t xml:space="preserve">(B) DYNAMIC MID-FLIGHT SWITCHING.</w:t>
+      </w:r>
+      <w:r>
+        <w:t xml:space="preserve"> </w:t>
+      </w:r>
+      <w:r>
+        <w:t xml:space="preserve">Tier assignment is NOT a one-time, start-of-task decision — it is RE-ASSESSED continuously as the task's real complexity becomes known during execution. A task DISPATCHED as simple that PROVES harder mid-flight (an unexpected multi-factor interaction surfaces, a root cause resists the first two hypotheses, the blast radius turns out to cross a governance/hardware-safety seam) MUST ESCALATE to the next-heavier tier for its remainder — continuing on an under-powered tier past the point complexity is KNOWN is a clause-(D) false economy, not compliance. Conversely, a task DISPATCHED as heavy that DECOMPOSES into genuinely light, bounded, low-blast-radius subtasks (mechanical file edits following an already-designed pattern, doc regeneration, per-item status reads) dispatches THOSE subtasks on a LIGHTER tier via subagent fan-out (§11.4.20/§11.4.70/§11.4.183) rather than running every subtask on the parent's heavier tier by default — capability-matching applies at EVERY dispatch granularity, not only the top-level task.</w:t>
+      </w:r>
+    </w:p>
+    <w:p>
+      <w:pPr>
+        <w:pStyle w:val="BodyText"/>
+      </w:pPr>
+      <w:r>
+        <w:rPr>
+          <w:b/>
+          <w:bCs/>
+        </w:rPr>
+        <w:t xml:space="preserve">(C) ALWAYS-ON COMPOSITION, NEVER A PER-REQUEST OPT-IN.</w:t>
+      </w:r>
+      <w:r>
+        <w:t xml:space="preserve"> </w:t>
+      </w:r>
+      <w:r>
+        <w:t xml:space="preserve">Nano-precision tier selection is a STANDING DEFAULT mechanism, engaged automatically for EVERY work effort from the first prompt of a session onward (mirrors §11.4.126 default-autonomous-loop / §11.4.198 default-mechanisms-always-on) — applied TOGETHER WITH, never as a substitute for: §11.4.141 (heavy token-optimization — a lighter model dispatched with a bloated context is not the efficiency this anchor targets); §11.4.183 (maximum-USEFUL-parallelism — tier-matching each parallel stream, not merely running more streams on one fixed tier); §11.4.187/§11.4.192 (the multi-track ruler orchestration + continuous auto-backfill — each track's worker is tier-assigned per this anchor, not defaulted to one blanket tier project-wide); and §11.4.196/§11.4.198 (native-alias-first priority + always-on default mechanisms — this anchor governs WHICH TIER within whichever alias/account is selected, composing with, never replacing, §11.4.196's ALIAS-layer priority). None of these five composed anchors is weakened, duplicated, or re-specified by §11.4.231 — this anchor adds the TIER axis to their existing ALIAS/PARALLELISM/TOKEN axes.</w:t>
+      </w:r>
+    </w:p>
+    <w:p>
+      <w:pPr>
+        <w:pStyle w:val="BodyText"/>
+      </w:pPr>
+      <w:r>
+        <w:rPr>
+          <w:b/>
+          <w:bCs/>
+        </w:rPr>
+        <w:t xml:space="preserve">(D) HONEST BOUNDARY (§11.4.6) — "LIGHTEST CAPABLE" MEANS CAPABLE, NOT CHEAPEST-REGARDLESS.</w:t>
+      </w:r>
+      <w:r>
+        <w:t xml:space="preserve"> </w:t>
+      </w:r>
+      <w:r>
+        <w:t xml:space="preserve">"Lightest capable" is a CONJUNCTION, not a discount: a tier choice that fails to actually complete the task correctly — producing a shallow investigation, a guessed root cause, an under-verified fix, or ANY form of bluff per the §11.4 anti-bluff covenant — is NOT "lightest capable," it is UNDER-POWERED, and under-powering a task that then fails, bluffs, or requires costly rework is a FALSE ECONOMY and a §11.4 violation of equal severity to any other PASS-bluff (the token/time saved at dispatch is spent many times over in re-investigation, re-review, and the risk of a shipped defect). Capability determinations are made from the clause-(A) decidable heuristic + observed task outcomes — EVIDENCE-BASED, never guessed (§11.4.6): "this always works fine on</w:t>
+      </w:r>
+      <w:r>
+        <w:t xml:space="preserve"> </w:t>
+      </w:r>
+      <w:r>
+        <w:rPr>
+          <w:rStyle w:val="VerbatimChar"/>
+        </w:rPr>
+        <w:t xml:space="preserve">haiku</w:t>
+      </w:r>
+      <w:r>
+        <w:t xml:space="preserve">" without a captured basis is exactly the guess §11.4.6 forbids, and a tier's genuine capability for a task class is established by the same anti-bluff discipline (§11.4.5/§11.4.69/§11.4.107) that governs every other claim in this constitution. A platform-chosen serving model outside the</w:t>
+      </w:r>
+      <w:r>
+        <w:t xml:space="preserve"> </w:t>
+      </w:r>
+      <w:r>
+        <w:rPr>
+          <w:rStyle w:val="VerbatimChar"/>
+        </w:rPr>
+        <w:t xml:space="preserve">haiku &lt; sonnet &lt; opus</w:t>
+      </w:r>
+      <w:r>
+        <w:t xml:space="preserve"> </w:t>
+      </w:r>
+      <w:r>
+        <w:t xml:space="preserve">ladder (e.g.</w:t>
+      </w:r>
+      <w:r>
+        <w:t xml:space="preserve"> </w:t>
+      </w:r>
+      <w:r>
+        <w:rPr>
+          <w:rStyle w:val="VerbatimChar"/>
+        </w:rPr>
+        <w:t xml:space="preserve">fable</w:t>
+      </w:r>
+      <w:r>
+        <w:t xml:space="preserve"> </w:t>
+      </w:r>
+      <w:r>
+        <w:t xml:space="preserve">served for general non-review work) is NOT a §11.4.231 dispatch-tier violation — the ladder binds the DISPATCHER's tier ASSIGNMENT, not the platform's own per-turn serving choice.</w:t>
+      </w:r>
+    </w:p>
+    <w:p>
+      <w:pPr>
+        <w:pStyle w:val="BodyText"/>
+      </w:pPr>
+      <w:r>
+        <w:rPr>
+          <w:b/>
+          <w:bCs/>
+        </w:rPr>
+        <w:t xml:space="preserve">(E) HARD PINS OVERRIDE THIS DEFAULT FOR THEIR SCOPES.</w:t>
+      </w:r>
+      <w:r>
+        <w:t xml:space="preserve"> </w:t>
+      </w:r>
+      <w:r>
+        <w:t xml:space="preserve">§11.4.231 sets the DEFAULT working tier for NON-review, non-merge-conflict-resolution work. It does NOT relax, override, or compete with the two existing hard model-substrate pins: §11.4.209 (every mandatory independent code-review — §11.4.125/§11.4.142/§11.4.194 iterated to GO per §11.4.134 — runs on</w:t>
+      </w:r>
+      <w:r>
+        <w:t xml:space="preserve"> </w:t>
+      </w:r>
+      <w:r>
+        <w:rPr>
+          <w:b/>
+          <w:bCs/>
+        </w:rPr>
+        <w:t xml:space="preserve">Fable at</w:t>
+      </w:r>
+      <w:r>
+        <w:rPr>
+          <w:b/>
+          <w:bCs/>
+        </w:rPr>
+        <w:t xml:space="preserve"> </w:t>
+      </w:r>
+      <w:r>
+        <w:rPr>
+          <w:rStyle w:val="VerbatimChar"/>
+          <w:b/>
+          <w:bCs/>
+        </w:rPr>
+        <w:t xml:space="preserve">xhigh</w:t>
+      </w:r>
+      <w:r>
+        <w:rPr>
+          <w:b/>
+          <w:bCs/>
+        </w:rPr>
+        <w:t xml:space="preserve"> </w:t>
+      </w:r>
+      <w:r>
+        <w:rPr>
+          <w:b/>
+          <w:bCs/>
+        </w:rPr>
+        <w:t xml:space="preserve">effort</w:t>
+      </w:r>
+      <w:r>
+        <w:t xml:space="preserve">,</w:t>
+      </w:r>
+      <w:r>
+        <w:t xml:space="preserve"> </w:t>
+      </w:r>
+      <w:r>
+        <w:rPr>
+          <w:b/>
+          <w:bCs/>
+        </w:rPr>
+        <w:t xml:space="preserve">Opus at</w:t>
+      </w:r>
+      <w:r>
+        <w:rPr>
+          <w:b/>
+          <w:bCs/>
+        </w:rPr>
+        <w:t xml:space="preserve"> </w:t>
+      </w:r>
+      <w:r>
+        <w:rPr>
+          <w:rStyle w:val="VerbatimChar"/>
+          <w:b/>
+          <w:bCs/>
+        </w:rPr>
+        <w:t xml:space="preserve">xhigh</w:t>
+      </w:r>
+      <w:r>
+        <w:t xml:space="preserve"> </w:t>
+      </w:r>
+      <w:r>
+        <w:t xml:space="preserve">on genuine Fable-unavailability, NEVER a lower tier or lower effort) and §11.4.211 (every main→feature/product/flavor merge-CONFLICT resolution runs on the SAME Fable-xhigh / Opus-xhigh substrate). Those two anchors are STRICTER, SCOPE-SPECIFIC pins that this anchor's general ladder does not reach — review and merge-conflict-resolution are NOT eligible for haiku/sonnet/opus-by-complexity dispatch; they run on their pinned substrate ALWAYS, regardless of how "simple" the reviewed change or the conflict appears. A review or merge-conflict resolution dispatched on any tier other than the §11.4.209/§11.4.211 pin (absent a genuinely-proven Fable-unavailability fallback) is a violation of THOSE anchors, not a valid application of §11.4.231's general ladder.</w:t>
+      </w:r>
+    </w:p>
+    <w:p>
+      <w:pPr>
+        <w:pStyle w:val="BodyText"/>
+      </w:pPr>
+      <w:r>
+        <w:rPr>
+          <w:b/>
+          <w:bCs/>
+        </w:rPr>
+        <w:t xml:space="preserve">(F) EFFORT-TIER SELECTION — the SAME nano-precision discipline applied to the reasoning-EFFORT axis (operator IMPORTANT mandate, 2026-07-26; verbatim: "Besides dynamic determining proper models to use, we MUST decide the effort as well and switch between the effort settings same as we do now for chosen model! Labeling MUST BE extended for this details as well. Example: (T1/main - claude4 - opus - high).").</w:t>
+      </w:r>
+      <w:r>
+        <w:t xml:space="preserve"> </w:t>
+      </w:r>
+      <w:r>
+        <w:t xml:space="preserve">Every dispatched work effort is assigned not only a model tier per clauses (A)-(E) but ALSO the LIGHTEST reasoning-EFFORT setting from the closed ladder</w:t>
+      </w:r>
+      <w:r>
+        <w:t xml:space="preserve"> </w:t>
+      </w:r>
+      <w:r>
+        <w:rPr>
+          <w:rStyle w:val="VerbatimChar"/>
+        </w:rPr>
+        <w:t xml:space="preserve">low &lt; medium &lt; high &lt; xhigh &lt; max</w:t>
+      </w:r>
+      <w:r>
+        <w:t xml:space="preserve"> </w:t>
+      </w:r>
+      <w:r>
+        <w:t xml:space="preserve">genuinely sufficient to complete the task correctly — chosen by the SAME clause-(A) decidable heuristic (scope / reasoning-depth / blast-radius / novelty), NOT a guess (§11.4.6). Illustrative bindings (non-exhaustive; the consuming project supplies its precise mapping per §11.4.35):</w:t>
+      </w:r>
+      <w:r>
+        <w:t xml:space="preserve"> </w:t>
+      </w:r>
+      <w:r>
+        <w:rPr>
+          <w:rStyle w:val="VerbatimChar"/>
+        </w:rPr>
+        <w:t xml:space="preserve">low</w:t>
+      </w:r>
+      <w:r>
+        <w:t xml:space="preserve"> </w:t>
+      </w:r>
+      <w:r>
+        <w:t xml:space="preserve">/</w:t>
+      </w:r>
+      <w:r>
+        <w:t xml:space="preserve"> </w:t>
+      </w:r>
+      <w:r>
+        <w:rPr>
+          <w:rStyle w:val="VerbatimChar"/>
+        </w:rPr>
+        <w:t xml:space="preserve">medium</w:t>
+      </w:r>
+      <w:r>
+        <w:t xml:space="preserve"> </w:t>
+      </w:r>
+      <w:r>
+        <w:t xml:space="preserve">— trivial / mechanical work (doc-sync regeneration, status / field reads, format / lint fixes, boilerplate);</w:t>
+      </w:r>
+      <w:r>
+        <w:t xml:space="preserve"> </w:t>
+      </w:r>
+      <w:r>
+        <w:rPr>
+          <w:rStyle w:val="VerbatimChar"/>
+        </w:rPr>
+        <w:t xml:space="preserve">high</w:t>
+      </w:r>
+      <w:r>
+        <w:t xml:space="preserve"> </w:t>
+      </w:r>
+      <w:r>
+        <w:t xml:space="preserve">— moderate-to-complex reasoning (focused single-component debug, multi-factor analysis per §11.4.102 / §11.4.194);</w:t>
+      </w:r>
+      <w:r>
+        <w:t xml:space="preserve"> </w:t>
+      </w:r>
+      <w:r>
+        <w:rPr>
+          <w:rStyle w:val="VerbatimChar"/>
+        </w:rPr>
+        <w:t xml:space="preserve">xhigh</w:t>
+      </w:r>
+      <w:r>
+        <w:t xml:space="preserve"> </w:t>
+      </w:r>
+      <w:r>
+        <w:t xml:space="preserve">/</w:t>
+      </w:r>
+      <w:r>
+        <w:t xml:space="preserve"> </w:t>
+      </w:r>
+      <w:r>
+        <w:rPr>
+          <w:rStyle w:val="VerbatimChar"/>
+        </w:rPr>
+        <w:t xml:space="preserve">max</w:t>
+      </w:r>
+      <w:r>
+        <w:t xml:space="preserve"> </w:t>
+      </w:r>
+      <w:r>
+        <w:t xml:space="preserve">— the HARDEST verification / merge-conflict / architecture work. (F.1) DYNAMIC MID-TASK ESCALATION — effort, like model tier per clause (B), is RE-ASSESSED continuously as the task's real complexity becomes known; a task dispatched at a lower effort that PROVES harder mid-flight MUST ESCALATE its effort for the remainder (continuing under-effort past the point complexity is KNOWN is the clause-(D) false economy), and a heavy task decomposing into light bounded subtasks dispatches THOSE at a lighter effort — effort-matching applies at EVERY dispatch granularity, not only the top-level task. (F.2) HONEST HARNESS BOUNDARY (§11.4.6, load-bearing — do NOT overstate the mechanism) — effort-tiering is REAL where the execution path exposes an effort control and a DOCUMENTED CAPABILITY-GAP where it does not: the current Claude Code</w:t>
+      </w:r>
+      <w:r>
+        <w:t xml:space="preserve"> </w:t>
+      </w:r>
+      <w:r>
+        <w:rPr>
+          <w:b/>
+          <w:bCs/>
+        </w:rPr>
+        <w:t xml:space="preserve">Agent tool</w:t>
+      </w:r>
+      <w:r>
+        <w:t xml:space="preserve"> </w:t>
+      </w:r>
+      <w:r>
+        <w:t xml:space="preserve">(subagent dispatch) exposes a</w:t>
+      </w:r>
+      <w:r>
+        <w:t xml:space="preserve"> </w:t>
+      </w:r>
+      <w:r>
+        <w:rPr>
+          <w:rStyle w:val="VerbatimChar"/>
+        </w:rPr>
+        <w:t xml:space="preserve">model</w:t>
+      </w:r>
+      <w:r>
+        <w:t xml:space="preserve"> </w:t>
+      </w:r>
+      <w:r>
+        <w:t xml:space="preserve">parameter but</w:t>
+      </w:r>
+      <w:r>
+        <w:t xml:space="preserve"> </w:t>
+      </w:r>
+      <w:r>
+        <w:rPr>
+          <w:b/>
+          <w:bCs/>
+        </w:rPr>
+        <w:t xml:space="preserve">NO</w:t>
+      </w:r>
+      <w:r>
+        <w:rPr>
+          <w:b/>
+          <w:bCs/>
+        </w:rPr>
+        <w:t xml:space="preserve"> </w:t>
+      </w:r>
+      <w:r>
+        <w:rPr>
+          <w:rStyle w:val="VerbatimChar"/>
+          <w:b/>
+          <w:bCs/>
+        </w:rPr>
+        <w:t xml:space="preserve">effort</w:t>
+      </w:r>
+      <w:r>
+        <w:rPr>
+          <w:b/>
+          <w:bCs/>
+        </w:rPr>
+        <w:t xml:space="preserve"> </w:t>
+      </w:r>
+      <w:r>
+        <w:rPr>
+          <w:b/>
+          <w:bCs/>
+        </w:rPr>
+        <w:t xml:space="preserve">parameter</w:t>
+      </w:r>
+      <w:r>
+        <w:t xml:space="preserve">, so a subagent's effort is NOT presently settable via that path (the §11.4.182</w:t>
+      </w:r>
+      <w:r>
+        <w:t xml:space="preserve"> </w:t>
+      </w:r>
+      <w:r>
+        <w:rPr>
+          <w:rStyle w:val="VerbatimChar"/>
+        </w:rPr>
+        <w:t xml:space="preserve">&lt;effort&gt;</w:t>
+      </w:r>
+      <w:r>
+        <w:t xml:space="preserve"> </w:t>
+      </w:r>
+      <w:r>
+        <w:t xml:space="preserve">label field degrades honestly to</w:t>
+      </w:r>
+      <w:r>
+        <w:t xml:space="preserve"> </w:t>
+      </w:r>
+      <w:r>
+        <w:rPr>
+          <w:rStyle w:val="VerbatimChar"/>
+        </w:rPr>
+        <w:t xml:space="preserve">?</w:t>
+      </w:r>
+      <w:r>
+        <w:t xml:space="preserve"> </w:t>
+      </w:r>
+      <w:r>
+        <w:t xml:space="preserve">there); the</w:t>
+      </w:r>
+      <w:r>
+        <w:t xml:space="preserve"> </w:t>
+      </w:r>
+      <w:r>
+        <w:rPr>
+          <w:b/>
+          <w:bCs/>
+        </w:rPr>
+        <w:t xml:space="preserve">Workflow tool's</w:t>
+      </w:r>
+      <w:r>
+        <w:rPr>
+          <w:b/>
+          <w:bCs/>
+        </w:rPr>
+        <w:t xml:space="preserve"> </w:t>
+      </w:r>
+      <w:r>
+        <w:rPr>
+          <w:rStyle w:val="VerbatimChar"/>
+          <w:b/>
+          <w:bCs/>
+        </w:rPr>
+        <w:t xml:space="preserve">agent()</w:t>
+      </w:r>
+      <w:r>
+        <w:t xml:space="preserve"> </w:t>
+      </w:r>
+      <w:r>
+        <w:t xml:space="preserve">DOES take an</w:t>
+      </w:r>
+      <w:r>
+        <w:t xml:space="preserve"> </w:t>
+      </w:r>
+      <w:r>
+        <w:rPr>
+          <w:rStyle w:val="VerbatimChar"/>
+        </w:rPr>
+        <w:t xml:space="preserve">effort</w:t>
+      </w:r>
+      <w:r>
+        <w:t xml:space="preserve"> </w:t>
+      </w:r>
+      <w:r>
+        <w:t xml:space="preserve">argument, so effort IS settable there — the label reports whichever path is live, never fakes one. This is the SAME aspirational-vs-harness state the clause-(E) §11.4.209 / §11.4.211 Fable-</w:t>
+      </w:r>
+      <w:r>
+        <w:rPr>
+          <w:rStyle w:val="VerbatimChar"/>
+        </w:rPr>
+        <w:t xml:space="preserve">xhigh</w:t>
+      </w:r>
+      <w:r>
+        <w:t xml:space="preserve"> </w:t>
+      </w:r>
+      <w:r>
+        <w:t xml:space="preserve">pins already occupy: the pins mandate the effort, and whether a dispatch path can SET it is a harness capability reported honestly, never faked (§11.4.182). (F.3) HARD-PIN FLOOR PRESERVED — clause (E)'s hard pins are ALSO effort pins: every §11.4.209 mandatory independent code-review AND every §11.4.211 merge-conflict resolution runs at</w:t>
+      </w:r>
+      <w:r>
+        <w:t xml:space="preserve"> </w:t>
+      </w:r>
+      <w:r>
+        <w:rPr>
+          <w:rStyle w:val="VerbatimChar"/>
+        </w:rPr>
+        <w:t xml:space="preserve">xhigh</w:t>
+      </w:r>
+      <w:r>
+        <w:t xml:space="preserve"> </w:t>
+      </w:r>
+      <w:r>
+        <w:t xml:space="preserve">effort (Fable, or Opus at</w:t>
+      </w:r>
+      <w:r>
+        <w:t xml:space="preserve"> </w:t>
+      </w:r>
+      <w:r>
+        <w:rPr>
+          <w:rStyle w:val="VerbatimChar"/>
+        </w:rPr>
+        <w:t xml:space="preserve">xhigh</w:t>
+      </w:r>
+      <w:r>
+        <w:t xml:space="preserve"> </w:t>
+      </w:r>
+      <w:r>
+        <w:t xml:space="preserve">on genuine Fable-unavailability), and this general effort ladder NEVER tiers those two scopes below</w:t>
+      </w:r>
+      <w:r>
+        <w:t xml:space="preserve"> </w:t>
+      </w:r>
+      <w:r>
+        <w:rPr>
+          <w:rStyle w:val="VerbatimChar"/>
+        </w:rPr>
+        <w:t xml:space="preserve">xhigh</w:t>
+      </w:r>
+      <w:r>
+        <w:t xml:space="preserve"> </w:t>
+      </w:r>
+      <w:r>
+        <w:t xml:space="preserve">regardless of how "simple" the reviewed change or the conflict appears — a review / merge-conflict resolution run below</w:t>
+      </w:r>
+      <w:r>
+        <w:t xml:space="preserve"> </w:t>
+      </w:r>
+      <w:r>
+        <w:rPr>
+          <w:rStyle w:val="VerbatimChar"/>
+        </w:rPr>
+        <w:t xml:space="preserve">xhigh</w:t>
+      </w:r>
+      <w:r>
+        <w:t xml:space="preserve"> </w:t>
+      </w:r>
+      <w:r>
+        <w:t xml:space="preserve">is a §11.4.209 / §11.4.211 violation, not a valid application of this ladder. (F.4) HONEST BOUNDARY (§11.4.6) — "lightest capable effort" is a CONJUNCTION, not a discount: an effort setting that yields a shallow / guessed / under-verified result is UNDER-POWERED, a FALSE ECONOMY, and a §11.4 violation of PASS-bluff severity, exactly as an under-powered MODEL tier is per clause (D); capability determinations are evidence-based, never guessed (§11.4.6).</w:t>
+      </w:r>
+    </w:p>
+    <w:p>
+      <w:pPr>
+        <w:pStyle w:val="BodyText"/>
+      </w:pPr>
+      <w:r>
+        <w:t xml:space="preserve">Classification: universal (§11.4.17) — a platform-neutral model-capacity-matching discipline reusable by any project dispatching work across a tiered model roster; the consuming project supplies its own precise tier↔task-class mapping and its own model-name ladder per §11.4.35 (the</w:t>
+      </w:r>
+      <w:r>
+        <w:t xml:space="preserve"> </w:t>
+      </w:r>
+      <w:r>
+        <w:rPr>
+          <w:rStyle w:val="VerbatimChar"/>
+        </w:rPr>
+        <w:t xml:space="preserve">haiku</w:t>
+      </w:r>
+      <w:r>
+        <w:t xml:space="preserve">/</w:t>
+      </w:r>
+      <w:r>
+        <w:rPr>
+          <w:rStyle w:val="VerbatimChar"/>
+        </w:rPr>
+        <w:t xml:space="preserve">sonnet</w:t>
+      </w:r>
+      <w:r>
+        <w:t xml:space="preserve">/</w:t>
+      </w:r>
+      <w:r>
+        <w:rPr>
+          <w:rStyle w:val="VerbatimChar"/>
+        </w:rPr>
+        <w:t xml:space="preserve">opus</w:t>
+      </w:r>
+      <w:r>
+        <w:t xml:space="preserve"> </w:t>
+      </w:r>
+      <w:r>
+        <w:t xml:space="preserve">ladder and the Fable/Opus-xhigh pins are this project's current concrete instantiation, not a universally-fixed vocabulary — a consumer with a differently-named tier roster maps its own ladder onto the SAME lightest-capable-first + dynamic-escalation + always-on-composition + honest-boundary + hard-pin-override structure). Composes §11.4.6 (no-guessing — capability determinations are evidence-based) / §11.4.20 / §11.4.70 (subagent-driven dispatch — the granularity at which tier-matching applies) / §11.4.92 (blast-radius analysis feeds the clause-(A) heuristic) / §11.4.101 (safe-reversible default on undecidable complexity — escalate up, never guess down) / §11.4.102 / §11.4.194 (reasoning-depth signals for the heuristic) / §11.4.126 / §11.4.141 / §11.4.183 / §11.4.187 / §11.4.192 / §11.4.196 / §11.4.198 (the always-on composition set, clause (C)) / §11.4.209 / §11.4.211 (the hard-pinned review/merge-conflict substrate this anchor does NOT touch, clause (E)). Propagation gate</w:t>
+      </w:r>
+      <w:r>
+        <w:t xml:space="preserve"> </w:t>
+      </w:r>
+      <w:r>
+        <w:rPr>
+          <w:rStyle w:val="VerbatimChar"/>
+        </w:rPr>
+        <w:t xml:space="preserve">CM-COVENANT-114-231-PROPAGATION</w:t>
+      </w:r>
+      <w:r>
+        <w:t xml:space="preserve"> </w:t>
+      </w:r>
+      <w:r>
+        <w:t xml:space="preserve">(literal</w:t>
+      </w:r>
+      <w:r>
+        <w:t xml:space="preserve"> </w:t>
+      </w:r>
+      <w:r>
+        <w:rPr>
+          <w:rStyle w:val="VerbatimChar"/>
+        </w:rPr>
+        <w:t xml:space="preserve">11.4.231</w:t>
+      </w:r>
+      <w:r>
+        <w:t xml:space="preserve"> </w:t>
+      </w:r>
+      <w:r>
+        <w:t xml:space="preserve">present as a block-start, exactly-once per governance file, lockstep content-hash equality across the consumer fleet per §11.4.227(B)) + recommended gate</w:t>
+      </w:r>
+      <w:r>
+        <w:t xml:space="preserve"> </w:t>
+      </w:r>
+      <w:r>
+        <w:rPr>
+          <w:rStyle w:val="VerbatimChar"/>
+        </w:rPr>
+        <w:t xml:space="preserve">CM-MODEL-TIER-LIGHTEST-CAPABLE</w:t>
+      </w:r>
+      <w:r>
+        <w:t xml:space="preserve"> </w:t>
+      </w:r>
+      <w:r>
+        <w:t xml:space="preserve">(a dispatched effort whose logged/declared model tier exceeds the clause-(A) heuristic's indicated tier for a task later confirmed trivial-and-successful-at-the-lighter-tier is a WARN/candidate finding — never a hard FAIL on tier choice alone, since tier-adequacy is only provable in retrospect per clause (D); the gate instead HARD-FAILS the two decidable violations: (i) a review or merge-conflict-resolution effort NOT run on the §11.4.209/§11.4.211 pinned substrate, and (ii) a task whose complexity was PROVEN mid-flight [an escalation event was logged, or a downstream failure/bluff was traced back to it] that did NOT escalate tier before continuing) + paired §1.1 mutation (gate-code = separate work item, NOT claimed shipped — §11.4.6; mutation plan: (1) dispatch a code-review labeled as running on</w:t>
+      </w:r>
+      <w:r>
+        <w:t xml:space="preserve"> </w:t>
+      </w:r>
+      <w:r>
+        <w:rPr>
+          <w:rStyle w:val="VerbatimChar"/>
+        </w:rPr>
+        <w:t xml:space="preserve">sonnet</w:t>
+      </w:r>
+      <w:r>
+        <w:t xml:space="preserve"> </w:t>
+      </w:r>
+      <w:r>
+        <w:t xml:space="preserve">instead of Fable-xhigh → gate MUST FAIL; (2) inject a logged mid-task complexity-escalation event with NO corresponding tier-escalation record → gate MUST FAIL; (3) golden-FALSE fixture: a task that stays on its initially-assigned tier throughout, with no escalation event logged → gate MUST NOT fire, per §11.4.201(1) the false-positive guard).</w:t>
+      </w:r>
+    </w:p>
+    <w:p>
+      <w:pPr>
+        <w:pStyle w:val="BodyText"/>
+      </w:pPr>
+      <w:r>
+        <w:rPr>
+          <w:b/>
+          <w:bCs/>
+        </w:rPr>
+        <w:t xml:space="preserve">Canonical authority:</w:t>
+      </w:r>
+      <w:r>
+        <w:t xml:space="preserve"> </w:t>
+      </w:r>
+      <w:r>
+        <w:t xml:space="preserve">constitution submodule</w:t>
+      </w:r>
+      <w:r>
+        <w:t xml:space="preserve"> </w:t>
+      </w:r>
+      <w:hyperlink r:id="rId70">
+        <w:r>
+          <w:rPr>
+            <w:rStyle w:val="VerbatimChar"/>
+          </w:rPr>
+          <w:t xml:space="preserve">Constitution.md</w:t>
+        </w:r>
+      </w:hyperlink>
+      <w:r>
+        <w:t xml:space="preserve"> </w:t>
+      </w:r>
+      <w:r>
+        <w:t xml:space="preserve">§11.4.231.</w:t>
+      </w:r>
+    </w:p>
+    <w:p>
+      <w:pPr>
+        <w:pStyle w:val="BodyText"/>
+      </w:pPr>
+      <w:r>
+        <w:t xml:space="preserve">Non-compliance is a release blocker regardless of context. No escape hatch — no</w:t>
+      </w:r>
+      <w:r>
+        <w:t xml:space="preserve"> </w:t>
+      </w:r>
+      <w:r>
+        <w:rPr>
+          <w:rStyle w:val="VerbatimChar"/>
+        </w:rPr>
+        <w:t xml:space="preserve">--always-heaviest-model</w:t>
+      </w:r>
+      <w:r>
+        <w:t xml:space="preserve">,</w:t>
+      </w:r>
+      <w:r>
+        <w:t xml:space="preserve"> </w:t>
+      </w:r>
+      <w:r>
+        <w:rPr>
+          <w:rStyle w:val="VerbatimChar"/>
+        </w:rPr>
+        <w:t xml:space="preserve">--always-lightest-model</w:t>
+      </w:r>
+      <w:r>
+        <w:t xml:space="preserve">,</w:t>
+      </w:r>
+      <w:r>
+        <w:t xml:space="preserve"> </w:t>
+      </w:r>
+      <w:r>
+        <w:rPr>
+          <w:rStyle w:val="VerbatimChar"/>
+        </w:rPr>
+        <w:t xml:space="preserve">--skip-complexity-reassessment</w:t>
+      </w:r>
+      <w:r>
+        <w:t xml:space="preserve">,</w:t>
+      </w:r>
+      <w:r>
+        <w:t xml:space="preserve"> </w:t>
+      </w:r>
+      <w:r>
+        <w:rPr>
+          <w:rStyle w:val="VerbatimChar"/>
+        </w:rPr>
+        <w:t xml:space="preserve">--fixed-tier-per-session</w:t>
+      </w:r>
+      <w:r>
+        <w:t xml:space="preserve">,</w:t>
+      </w:r>
+      <w:r>
+        <w:t xml:space="preserve"> </w:t>
+      </w:r>
+      <w:r>
+        <w:rPr>
+          <w:rStyle w:val="VerbatimChar"/>
+        </w:rPr>
+        <w:t xml:space="preserve">--relax-review-pin</w:t>
+      </w:r>
+      <w:r>
+        <w:t xml:space="preserve">,</w:t>
+      </w:r>
+      <w:r>
+        <w:t xml:space="preserve"> </w:t>
+      </w:r>
+      <w:r>
+        <w:rPr>
+          <w:rStyle w:val="VerbatimChar"/>
+        </w:rPr>
+        <w:t xml:space="preserve">--relax-merge-conflict-pin</w:t>
+      </w:r>
+      <w:r>
+        <w:t xml:space="preserve">,</w:t>
+      </w:r>
+      <w:r>
+        <w:t xml:space="preserve"> </w:t>
+      </w:r>
+      <w:r>
+        <w:rPr>
+          <w:rStyle w:val="VerbatimChar"/>
+        </w:rPr>
+        <w:t xml:space="preserve">--per-request-tier-opt-in</w:t>
+      </w:r>
+      <w:r>
+        <w:t xml:space="preserve"> </w:t>
+      </w:r>
+      <w:r>
+        <w:t xml:space="preserve">flag exists.</w:t>
+      </w:r>
+    </w:p>
+    <w:p>
+      <w:pPr>
+        <w:pStyle w:val="BodyText"/>
+      </w:pPr>
+      <w:r>
+        <w:rPr>
+          <w:b/>
+          <w:bCs/>
+        </w:rPr>
+        <w:t xml:space="preserve">§11.4.232 — Anti-mess long-op orchestration: every long-op is registered, single-owned-per-purpose, liveness-PROVEN, handed-off-on-stop, safely-reaped, consistency-checked, and escape-bounded — the single source of truth for what is running, never inferred (research-derived, 2026-07-26).</w:t>
+      </w:r>
+    </w:p>
+    <w:p>
+      <w:pPr>
+        <w:pStyle w:val="BodyText"/>
+      </w:pPr>
+      <w:r>
+        <w:t xml:space="preserve">Forensic anchor (genericised): in one cycle a verification sweep produced five distinct mess states — (1) multiple concurrent same-purpose sweeps ran unintentionally (no single-owner-per-purpose claim); (2) a sweep HUNG on a consumer-blocked-on-an-unclosed-producer pipeline and was undetected because liveness was inferred from process-alive (a §11.4.201(6) FALSE-NULL: a wedged op and a progressing op returned the identical "process alive" signal); (3) stopping the owning subagent SILENTLY KILLED its child long-op because ownership was implicit (no handoff-on-stop); (4) a stale/non-growing log was read as live progress (the same false-null, reader-side); (5) an un-completable tooling gate blocked a release for hours (no escape to a terminal state). Per §11.4.102 Phase 4.5 these are ONE architectural state-management flaw, not five bugs:</w:t>
+      </w:r>
+      <w:r>
+        <w:t xml:space="preserve"> </w:t>
+      </w:r>
+      <w:r>
+        <w:rPr>
+          <w:b/>
+          <w:bCs/>
+        </w:rPr>
+        <w:t xml:space="preserve">there was no single source of truth for what long-op is running, who owns it, its state, and its PROVEN liveness</w:t>
+      </w:r>
+      <w:r>
+        <w:t xml:space="preserve"> </w:t>
+      </w:r>
+      <w:r>
+        <w:t xml:space="preserve">— the §11.4.196(F) configured≠in-use gap generalised to project long-ops, so every mess state was un-observable, and an un-observable bad state is a §11.4/§11.4.1 bluff at the orchestration layer.</w:t>
+      </w:r>
+    </w:p>
+    <w:p>
+      <w:pPr>
+        <w:pStyle w:val="BodyText"/>
+      </w:pPr>
+      <w:r>
+        <w:t xml:space="preserve">The mandate — a</w:t>
+      </w:r>
+      <w:r>
+        <w:t xml:space="preserve"> </w:t>
+      </w:r>
+      <w:r>
+        <w:rPr>
+          <w:b/>
+          <w:bCs/>
+        </w:rPr>
+        <w:t xml:space="preserve">long-op orchestration layer</w:t>
+      </w:r>
+      <w:r>
+        <w:t xml:space="preserve"> </w:t>
+      </w:r>
+      <w:r>
+        <w:t xml:space="preserve">binding every long-op (any op expected to exceed the runtime background-execution threshold per §11.4.89 — verification sweep, meta-test sweep, build, flash/deploy, test/QA suite, dispatched subagent), ALL of which hold:</w:t>
+      </w:r>
+    </w:p>
+    <w:p>
+      <w:pPr>
+        <w:pStyle w:val="BodyText"/>
+      </w:pPr>
+      <w:r>
+        <w:rPr>
+          <w:b/>
+          <w:bCs/>
+        </w:rPr>
+        <w:t xml:space="preserve">(A) SINGLE SOURCE OF TRUTH — the long-op lifecycle registry.</w:t>
+      </w:r>
+      <w:r>
+        <w:t xml:space="preserve"> </w:t>
+      </w:r>
+      <w:r>
+        <w:t xml:space="preserve">Every long-op MUST register BEFORE it runs and reach a terminal state (</w:t>
+      </w:r>
+      <w:r>
+        <w:rPr>
+          <w:rStyle w:val="VerbatimChar"/>
+        </w:rPr>
+        <w:t xml:space="preserve">complete|failed|reaped|handoff|blocked-escape</w:t>
+      </w:r>
+      <w:r>
+        <w:t xml:space="preserve">) when it ends, in a durable (never-tmpfs, write-temp-then-rename, §11.4.116 append-only event stream + atomic snapshot) registry recording</w:t>
+      </w:r>
+      <w:r>
+        <w:t xml:space="preserve"> </w:t>
+      </w:r>
+      <w:r>
+        <w:rPr>
+          <w:rStyle w:val="VerbatimChar"/>
+        </w:rPr>
+        <w:t xml:space="preserve">{op_id, purpose_key, owner, pid|pgid, cwd, state, last_heartbeat, heartbeat_seq, progress_offset, log_path, verdict, evidence_path}</w:t>
+      </w:r>
+      <w:r>
+        <w:t xml:space="preserve">. Success is read from the op's terminal verdict/</w:t>
+      </w:r>
+      <w:r>
+        <w:rPr>
+          <w:rStyle w:val="VerbatimChar"/>
+        </w:rPr>
+        <w:t xml:space="preserve">result</w:t>
+      </w:r>
+      <w:r>
+        <w:t xml:space="preserve">, NEVER its process exit code. A long-op running with no registry record — or a record with no live op — is a FALSE-READY drift state.</w:t>
+      </w:r>
+    </w:p>
+    <w:p>
+      <w:pPr>
+        <w:pStyle w:val="BodyText"/>
+      </w:pPr>
+      <w:r>
+        <w:rPr>
+          <w:b/>
+          <w:bCs/>
+        </w:rPr>
+        <w:t xml:space="preserve">(B) SINGLE-OWNER-PER-PURPOSE.</w:t>
+      </w:r>
+      <w:r>
+        <w:t xml:space="preserve"> </w:t>
+      </w:r>
+      <w:r>
+        <w:t xml:space="preserve">No two same-</w:t>
+      </w:r>
+      <w:r>
+        <w:rPr>
+          <w:rStyle w:val="VerbatimChar"/>
+        </w:rPr>
+        <w:t xml:space="preserve">purpose_key</w:t>
+      </w:r>
+      <w:r>
+        <w:t xml:space="preserve"> </w:t>
+      </w:r>
+      <w:r>
+        <w:t xml:space="preserve">long-ops run at once; acquisition is a probe-race-safe claim keyed on</w:t>
+      </w:r>
+      <w:r>
+        <w:t xml:space="preserve"> </w:t>
+      </w:r>
+      <w:r>
+        <w:rPr>
+          <w:rStyle w:val="VerbatimChar"/>
+        </w:rPr>
+        <w:t xml:space="preserve">purpose_key</w:t>
+      </w:r>
+      <w:r>
+        <w:t xml:space="preserve"> </w:t>
+      </w:r>
+      <w:r>
+        <w:t xml:space="preserve">(§11.4.119). A live claim forces exactly ONE of REUSE (attach) or explicit SUPERSEDE (graceful handoff of the running owner, logged), never a silent second run.</w:t>
+      </w:r>
+    </w:p>
+    <w:p>
+      <w:pPr>
+        <w:pStyle w:val="BodyText"/>
+      </w:pPr>
+      <w:r>
+        <w:rPr>
+          <w:b/>
+          <w:bCs/>
+        </w:rPr>
+        <w:t xml:space="preserve">(C) LIVENESS TRUTH-SOURCE.</w:t>
+      </w:r>
+      <w:r>
+        <w:t xml:space="preserve"> </w:t>
+      </w:r>
+      <w:r>
+        <w:t xml:space="preserve">Progress is PROVEN, never inferred from process-alive: every long-op emits a monotonic heartbeat and/or an advancing progress offset; a watchdog reads the DELTA over a window and flags HUNG on no-advance past the op's declared no-progress budget (the §11.4.201(6)-(7)/§11.4.89 discipline —</w:t>
+      </w:r>
+      <w:r>
+        <w:t xml:space="preserve"> </w:t>
+      </w:r>
+      <w:r>
+        <w:rPr>
+          <w:rStyle w:val="VerbatimChar"/>
+        </w:rPr>
+        <w:t xml:space="preserve">kill -0</w:t>
+      </w:r>
+      <w:r>
+        <w:t xml:space="preserve"> </w:t>
+      </w:r>
+      <w:r>
+        <w:t xml:space="preserve">is a necessary-not-sufficient pre-filter, a stale heartbeat/non-growing log is NEVER "progressing"). A consumer blocked on an unclosed producer write-end (§11.4.201(12)) is caught by the flat heartbeat regardless of internal state.</w:t>
+      </w:r>
+    </w:p>
+    <w:p>
+      <w:pPr>
+        <w:pStyle w:val="BodyText"/>
+      </w:pPr>
+      <w:r>
+        <w:rPr>
+          <w:b/>
+          <w:bCs/>
+        </w:rPr>
+        <w:t xml:space="preserve">(D) OWNERSHIP-HANDOFF-ON-STOP.</w:t>
+      </w:r>
+      <w:r>
+        <w:t xml:space="preserve"> </w:t>
+      </w:r>
+      <w:r>
+        <w:t xml:space="preserve">Stopping/killing an owner MUST hand its long-ops to the registry (</w:t>
+      </w:r>
+      <w:r>
+        <w:rPr>
+          <w:rStyle w:val="VerbatimChar"/>
+        </w:rPr>
+        <w:t xml:space="preserve">handoff</w:t>
+      </w:r>
+      <w:r>
+        <w:t xml:space="preserve">, re-adoptable per §11.4.147) or deliberately reap them (</w:t>
+      </w:r>
+      <w:r>
+        <w:rPr>
+          <w:rStyle w:val="VerbatimChar"/>
+        </w:rPr>
+        <w:t xml:space="preserve">reaped</w:t>
+      </w:r>
+      <w:r>
+        <w:t xml:space="preserve">, reason logged) — NEVER silently orphan or accidentally cascade-kill; long-ops launch detached (own process-group) so an owner stop does not cascade-signal them, and the stop path records each owned op's disposition. The loop done-condition is not satisfied while a</w:t>
+      </w:r>
+      <w:r>
+        <w:t xml:space="preserve"> </w:t>
+      </w:r>
+      <w:r>
+        <w:rPr>
+          <w:rStyle w:val="VerbatimChar"/>
+        </w:rPr>
+        <w:t xml:space="preserve">handoff</w:t>
+      </w:r>
+      <w:r>
+        <w:t xml:space="preserve"> </w:t>
+      </w:r>
+      <w:r>
+        <w:t xml:space="preserve">op is un-adopted.</w:t>
+      </w:r>
+    </w:p>
+    <w:p>
+      <w:pPr>
+        <w:pStyle w:val="BodyText"/>
+      </w:pPr>
+      <w:r>
+        <w:rPr>
+          <w:b/>
+          <w:bCs/>
+        </w:rPr>
+        <w:t xml:space="preserve">(E) SAFE REAPING.</w:t>
+      </w:r>
+      <w:r>
+        <w:t xml:space="preserve"> </w:t>
+      </w:r>
+      <w:r>
+        <w:t xml:space="preserve">An orphaned/hung op is reaped ONLY on PROVEN staleness — holder PID dead (</w:t>
+      </w:r>
+      <w:r>
+        <w:rPr>
+          <w:rStyle w:val="VerbatimChar"/>
+        </w:rPr>
+        <w:t xml:space="preserve">kill -0</w:t>
+      </w:r>
+      <w:r>
+        <w:t xml:space="preserve"> </w:t>
+      </w:r>
+      <w:r>
+        <w:t xml:space="preserve">fails) OR no-progress-budget exceeded per (C) — resolved by the process's real</w:t>
+      </w:r>
+      <w:r>
+        <w:t xml:space="preserve"> </w:t>
+      </w:r>
+      <w:r>
+        <w:rPr>
+          <w:rStyle w:val="VerbatimChar"/>
+        </w:rPr>
+        <w:t xml:space="preserve">/proc/&lt;pid&gt;/cmdline</w:t>
+      </w:r>
+      <w:r>
+        <w:t xml:space="preserve"> </w:t>
+      </w:r>
+      <w:r>
+        <w:t xml:space="preserve">(§11.4.196(D)/§12.12), never a bare</w:t>
+      </w:r>
+      <w:r>
+        <w:t xml:space="preserve"> </w:t>
+      </w:r>
+      <w:r>
+        <w:rPr>
+          <w:rStyle w:val="VerbatimChar"/>
+        </w:rPr>
+        <w:t xml:space="preserve">pgrep</w:t>
+      </w:r>
+      <w:r>
+        <w:t xml:space="preserve">/substring that could match a carrier or the reaper itself; a LIVE, ADVANCING op is NEVER reaped (§9.2); every REAPED/KEPT decision + resolved evidence is logged (§11.4.180).</w:t>
+      </w:r>
+    </w:p>
+    <w:p>
+      <w:pPr>
+        <w:pStyle w:val="BodyText"/>
+      </w:pPr>
+      <w:r>
+        <w:rPr>
+          <w:b/>
+          <w:bCs/>
+        </w:rPr>
+        <w:t xml:space="preserve">(F) CONSISTENCY INVARIANT SWEEP.</w:t>
+      </w:r>
+      <w:r>
+        <w:t xml:space="preserve"> </w:t>
+      </w:r>
+      <w:r>
+        <w:t xml:space="preserve">A fast invariant check runs before every gated transition (build/flash/tag) and on a standing cadence, asserting: no duplicate owner per purpose, no orphan, no stale lock (§11.4.180), no hung op (C), no registry-vs-reality drift (live-long-op set == registry live rows — the §11.4.196(F) check generalised). Any violation is surfaced (named, actionable) and the gated transition is REFUSED until resolved. The sweep is itself a guard (§11.4.201): golden-TRUE + golden-FALSE-with-carrier fixtures, conservative-safe REFUSE on an unresolvable signal, resolved evidence printed on every refusal.</w:t>
+      </w:r>
+    </w:p>
+    <w:p>
+      <w:pPr>
+        <w:pStyle w:val="BodyText"/>
+      </w:pPr>
+      <w:r>
+        <w:rPr>
+          <w:b/>
+          <w:bCs/>
+        </w:rPr>
+        <w:t xml:space="preserve">(G) UN-COMPLETABLE-BLOCKER ESCAPE.</w:t>
+      </w:r>
+      <w:r>
+        <w:t xml:space="preserve"> </w:t>
+      </w:r>
+      <w:r>
+        <w:t xml:space="preserve">A gate that cannot reach a terminal verdict MUST degrade, after a bounded budget, to an explicit evidence-backed decision — NEVER an indefinite silent block: §11.4.102 first (hung/(C) vs duplicate/(B) vs wrong-seam/§11.4.120 re-seat-at-activation); NOT-YET-RUNNABLE → §11.4.69</w:t>
+      </w:r>
+      <w:r>
+        <w:t xml:space="preserve"> </w:t>
+      </w:r>
+      <w:r>
+        <w:rPr>
+          <w:rStyle w:val="VerbatimChar"/>
+        </w:rPr>
+        <w:t xml:space="preserve">artifact_not_yet_built</w:t>
+      </w:r>
+      <w:r>
+        <w:t xml:space="preserve"> </w:t>
+      </w:r>
+      <w:r>
+        <w:t xml:space="preserve">(non-blocking on an intermediate artifact, blocking only on the release candidate per §11.4.135); genuinely un-completable → §11.4.101 (autonomous reversible SKIP-with-reason + tracked §11.4.197 item, ELSE a bounded §11.4.66 operator decision) — the loop keeps progressing every other non-blocked item, it does not idle, and the escape NEVER fabricates a PASS.</w:t>
+      </w:r>
+    </w:p>
+    <w:p>
+      <w:pPr>
+        <w:pStyle w:val="BodyText"/>
+      </w:pPr>
+      <w:r>
+        <w:rPr>
+          <w:b/>
+          <w:bCs/>
+        </w:rPr>
+        <w:t xml:space="preserve">Honest boundary (§11.4.6).</w:t>
+      </w:r>
+      <w:r>
+        <w:t xml:space="preserve"> </w:t>
+      </w:r>
+      <w:r>
+        <w:t xml:space="preserve">This layer reduces orchestration mess; it does NOT make product bugs impossible, does NOT make a gate correct (§11.4.108/§11.4.201 still bind each gate), and does NOT remove the operator from genuine blocks — it converts an indefinite silent stall into a bounded, evidence-backed, operator-visible decision. A heartbeat proves ADVANCE not CORRECTNESS; the registry proves what CLAIMS to run, (F) proves registry==reality.</w:t>
+      </w:r>
+      <w:r>
+        <w:t xml:space="preserve"> </w:t>
+      </w:r>
+      <w:r>
+        <w:rPr>
+          <w:b/>
+          <w:bCs/>
+        </w:rPr>
+        <w:t xml:space="preserve">Reuse-not-rewrite:</w:t>
+      </w:r>
+      <w:r>
+        <w:t xml:space="preserve"> </w:t>
+      </w:r>
+      <w:r>
+        <w:t xml:space="preserve">it is the multitrack per-track agent registry (§11.4.147/§11.4.116/§11.4.187) generalised from per-track workers to any long-op and bound through, per §11.4.196(F) — no parallel mechanism is invented.</w:t>
+      </w:r>
+    </w:p>
+    <w:p>
+      <w:pPr>
+        <w:pStyle w:val="BodyText"/>
+      </w:pPr>
+      <w:r>
+        <w:t xml:space="preserve">Classification: universal (§11.4.17) — no hardware/vendor/project literal; consumers supply their long-op set, purpose keys, no-progress budgets, and stop-hook wiring as DATA per §11.4.35. Composes §11.4.89 / §11.4.101 / §11.4.116 / §11.4.119 / §11.4.120 / §11.4.135 / §11.4.147 / §11.4.180 / §11.4.187 / §11.4.196(D)(F) / §11.4.201(1)(6)-(12) / §11.4.207 / §11.4.69 / §12.6 / §12.12 / §9.2. Propagation gate</w:t>
+      </w:r>
+      <w:r>
+        <w:t xml:space="preserve"> </w:t>
+      </w:r>
+      <w:r>
+        <w:rPr>
+          <w:rStyle w:val="VerbatimChar"/>
+        </w:rPr>
+        <w:t xml:space="preserve">CM-COVENANT-114-232-PROPAGATION</w:t>
+      </w:r>
+      <w:r>
+        <w:t xml:space="preserve"> </w:t>
+      </w:r>
+      <w:r>
+        <w:t xml:space="preserve">(literal</w:t>
+      </w:r>
+      <w:r>
+        <w:t xml:space="preserve"> </w:t>
+      </w:r>
+      <w:r>
+        <w:rPr>
+          <w:rStyle w:val="VerbatimChar"/>
+        </w:rPr>
+        <w:t xml:space="preserve">11.4.232</w:t>
+      </w:r>
+      <w:r>
+        <w:t xml:space="preserve">) + recommended mechanism gates</w:t>
+      </w:r>
+      <w:r>
+        <w:t xml:space="preserve"> </w:t>
+      </w:r>
+      <w:r>
+        <w:rPr>
+          <w:rStyle w:val="VerbatimChar"/>
+        </w:rPr>
+        <w:t xml:space="preserve">CM-LONGOP-REGISTRY-SINGLE-SOURCE</w:t>
+      </w:r>
+      <w:r>
+        <w:t xml:space="preserve"> </w:t>
+      </w:r>
+      <w:r>
+        <w:t xml:space="preserve">(A) /</w:t>
+      </w:r>
+      <w:r>
+        <w:t xml:space="preserve"> </w:t>
+      </w:r>
+      <w:r>
+        <w:rPr>
+          <w:rStyle w:val="VerbatimChar"/>
+        </w:rPr>
+        <w:t xml:space="preserve">CM-LONGOP-SINGLE-OWNER-PER-PURPOSE</w:t>
+      </w:r>
+      <w:r>
+        <w:t xml:space="preserve"> </w:t>
+      </w:r>
+      <w:r>
+        <w:t xml:space="preserve">(B) /</w:t>
+      </w:r>
+      <w:r>
+        <w:t xml:space="preserve"> </w:t>
+      </w:r>
+      <w:r>
+        <w:rPr>
+          <w:rStyle w:val="VerbatimChar"/>
+        </w:rPr>
+        <w:t xml:space="preserve">CM-LONGOP-LIVENESS-HEARTBEAT</w:t>
+      </w:r>
+      <w:r>
+        <w:t xml:space="preserve"> </w:t>
+      </w:r>
+      <w:r>
+        <w:t xml:space="preserve">(C) /</w:t>
+      </w:r>
+      <w:r>
+        <w:t xml:space="preserve"> </w:t>
+      </w:r>
+      <w:r>
+        <w:rPr>
+          <w:rStyle w:val="VerbatimChar"/>
+        </w:rPr>
+        <w:t xml:space="preserve">CM-LONGOP-OWNERSHIP-HANDOFF-ON-STOP</w:t>
+      </w:r>
+      <w:r>
+        <w:t xml:space="preserve"> </w:t>
+      </w:r>
+      <w:r>
+        <w:t xml:space="preserve">(D) /</w:t>
+      </w:r>
+      <w:r>
+        <w:t xml:space="preserve"> </w:t>
+      </w:r>
+      <w:r>
+        <w:rPr>
+          <w:rStyle w:val="VerbatimChar"/>
+        </w:rPr>
+        <w:t xml:space="preserve">CM-LONGOP-SAFE-REAP-PROVEN-STALE</w:t>
+      </w:r>
+      <w:r>
+        <w:t xml:space="preserve"> </w:t>
+      </w:r>
+      <w:r>
+        <w:t xml:space="preserve">(E) /</w:t>
+      </w:r>
+      <w:r>
+        <w:t xml:space="preserve"> </w:t>
+      </w:r>
+      <w:r>
+        <w:rPr>
+          <w:rStyle w:val="VerbatimChar"/>
+        </w:rPr>
+        <w:t xml:space="preserve">CM-ORCHESTRATION-CONSISTENCY-SWEEP</w:t>
+      </w:r>
+      <w:r>
+        <w:t xml:space="preserve"> </w:t>
+      </w:r>
+      <w:r>
+        <w:t xml:space="preserve">(F) /</w:t>
+      </w:r>
+      <w:r>
+        <w:t xml:space="preserve"> </w:t>
+      </w:r>
+      <w:r>
+        <w:rPr>
+          <w:rStyle w:val="VerbatimChar"/>
+        </w:rPr>
+        <w:t xml:space="preserve">CM-UNCOMPLETABLE-BLOCKER-ESCAPE</w:t>
+      </w:r>
+      <w:r>
+        <w:t xml:space="preserve"> </w:t>
+      </w:r>
+      <w:r>
+        <w:t xml:space="preserve">(G) + paired §1.1 mutations (run two same-purpose sweeps with no reuse/supersede → (B) FAILs; infer liveness from</w:t>
+      </w:r>
+      <w:r>
+        <w:t xml:space="preserve"> </w:t>
+      </w:r>
+      <w:r>
+        <w:rPr>
+          <w:rStyle w:val="VerbatimChar"/>
+        </w:rPr>
+        <w:t xml:space="preserve">kill -0</w:t>
+      </w:r>
+      <w:r>
+        <w:t xml:space="preserve"> </w:t>
+      </w:r>
+      <w:r>
+        <w:t xml:space="preserve">alone / drop the heartbeat-delta check → (C) FAILs; a stop that leaves an owned op with no terminal/handoff record → (D) FAILs; reap a live-advancing op OR reap by bare-</w:t>
+      </w:r>
+      <w:r>
+        <w:rPr>
+          <w:rStyle w:val="VerbatimChar"/>
+        </w:rPr>
+        <w:t xml:space="preserve">pgrep</w:t>
+      </w:r>
+      <w:r>
+        <w:t xml:space="preserve"> </w:t>
+      </w:r>
+      <w:r>
+        <w:t xml:space="preserve">substring → (E) FAILs; a live long-op with no registry row passes the consistency sweep → (F) FAILs; an un-completable gate blocks with no escape/decision → (G) FAILs; strip the literal → propagation FAILs; gate-code = separate work item, NOT claimed shipped §11.4.6). No escape hatch — no</w:t>
+      </w:r>
+      <w:r>
+        <w:t xml:space="preserve"> </w:t>
+      </w:r>
+      <w:r>
+        <w:rPr>
+          <w:rStyle w:val="VerbatimChar"/>
+        </w:rPr>
+        <w:t xml:space="preserve">--allow-duplicate-longop</w:t>
+      </w:r>
+      <w:r>
+        <w:t xml:space="preserve">,</w:t>
+      </w:r>
+      <w:r>
+        <w:t xml:space="preserve"> </w:t>
+      </w:r>
+      <w:r>
+        <w:rPr>
+          <w:rStyle w:val="VerbatimChar"/>
+        </w:rPr>
+        <w:t xml:space="preserve">--infer-liveness-from-pid</w:t>
+      </w:r>
+      <w:r>
+        <w:t xml:space="preserve">,</w:t>
+      </w:r>
+      <w:r>
+        <w:t xml:space="preserve"> </w:t>
+      </w:r>
+      <w:r>
+        <w:rPr>
+          <w:rStyle w:val="VerbatimChar"/>
+        </w:rPr>
+        <w:t xml:space="preserve">--silent-orphan-on-stop</w:t>
+      </w:r>
+      <w:r>
+        <w:t xml:space="preserve">,</w:t>
+      </w:r>
+      <w:r>
+        <w:t xml:space="preserve"> </w:t>
+      </w:r>
+      <w:r>
+        <w:rPr>
+          <w:rStyle w:val="VerbatimChar"/>
+        </w:rPr>
+        <w:t xml:space="preserve">--reap-live-op</w:t>
+      </w:r>
+      <w:r>
+        <w:t xml:space="preserve">,</w:t>
+      </w:r>
+      <w:r>
+        <w:t xml:space="preserve"> </w:t>
+      </w:r>
+      <w:r>
+        <w:rPr>
+          <w:rStyle w:val="VerbatimChar"/>
+        </w:rPr>
+        <w:t xml:space="preserve">--skip-consistency-sweep</w:t>
+      </w:r>
+      <w:r>
+        <w:t xml:space="preserve">,</w:t>
+      </w:r>
+      <w:r>
+        <w:t xml:space="preserve"> </w:t>
+      </w:r>
+      <w:r>
+        <w:rPr>
+          <w:rStyle w:val="VerbatimChar"/>
+        </w:rPr>
+        <w:t xml:space="preserve">--block-without-escape</w:t>
+      </w:r>
+      <w:r>
+        <w:t xml:space="preserve">,</w:t>
+      </w:r>
+      <w:r>
+        <w:t xml:space="preserve"> </w:t>
+      </w:r>
+      <w:r>
+        <w:rPr>
+          <w:rStyle w:val="VerbatimChar"/>
+        </w:rPr>
+        <w:t xml:space="preserve">--longop-without-registry</w:t>
+      </w:r>
+      <w:r>
+        <w:t xml:space="preserve"> </w:t>
+      </w:r>
+      <w:r>
+        <w:t xml:space="preserve">flag.</w:t>
+      </w:r>
+    </w:p>
+    <w:p>
+      <w:pPr>
+        <w:pStyle w:val="BodyText"/>
+      </w:pPr>
+      <w:r>
+        <w:rPr>
+          <w:b/>
+          <w:bCs/>
+        </w:rPr>
+        <w:t xml:space="preserve">EXTENSION landed 2026-07-26 — §11.4.182 model-in-label + flawless alias/provider↔model consistency + real-time always-in-sync (User mandate, 2026-07-26).</w:t>
+      </w:r>
+      <w:r>
+        <w:t xml:space="preserve"> </w:t>
+      </w:r>
+      <w:r>
+        <w:t xml:space="preserve">Verbatim operator mandates (2026-07-26): "Extend our logging to present models used since we will now have dynamic models choice and switching! From (example) (T1/main - claude4) into: (T1/main - claude4 - model_used), model MUST be dynamically obtained so we present name equivalents - short names - like: haiku, opus, sonnet, fable. However we MUST fully support all Claude Toolkit providers aliases, so real model used names MUST BE obtained in this case(s) as well! Examples: (T1/main - claude4 - haiku), (T1/main - claude4 - fable), (T1/main - claude4 - opus), (T1/main - claude4 - deepseek), (T1/main - claude4 - xiaomi) ... Labels MUST BE everywhere ALWAYS up to date in real time and in sync!" and "Adding model names into labels considers that providers names / aliases will be up to date too and in relation to model used since models belong to providers / aliases !!! Consistency MUST BE flawless!" This EXTENDS the §11.4.182 label discipline (it does NOT re-mint the anchor — the literal</w:t>
+      </w:r>
+      <w:r>
+        <w:t xml:space="preserve"> </w:t>
+      </w:r>
+      <w:r>
+        <w:rPr>
+          <w:rStyle w:val="VerbatimChar"/>
+        </w:rPr>
+        <w:t xml:space="preserve">11.4.182</w:t>
+      </w:r>
+      <w:r>
+        <w:t xml:space="preserve"> </w:t>
+      </w:r>
+      <w:r>
+        <w:t xml:space="preserve">and its propagation gate</w:t>
+      </w:r>
+      <w:r>
+        <w:t xml:space="preserve"> </w:t>
+      </w:r>
+      <w:r>
+        <w:rPr>
+          <w:rStyle w:val="VerbatimChar"/>
+        </w:rPr>
+        <w:t xml:space="preserve">CM-COVENANT-114-182-PROPAGATION</w:t>
+      </w:r>
+      <w:r>
+        <w:t xml:space="preserve"> </w:t>
+      </w:r>
+      <w:r>
+        <w:t xml:space="preserve">are UNCHANGED and stay GREEN; this carrier block cites §11.4.182, it is not a second §11.4.182 block-start per §11.4.227(B)). (1)</w:t>
+      </w:r>
+      <w:r>
+        <w:t xml:space="preserve"> </w:t>
+      </w:r>
+      <w:r>
+        <w:rPr>
+          <w:b/>
+          <w:bCs/>
+        </w:rPr>
+        <w:t xml:space="preserve">LABEL FORM EXTENDED</w:t>
+      </w:r>
+      <w:r>
+        <w:t xml:space="preserve"> </w:t>
+      </w:r>
+      <w:r>
+        <w:t xml:space="preserve">— the mandated §11.4.182 label is extended from</w:t>
+      </w:r>
+      <w:r>
+        <w:t xml:space="preserve"> </w:t>
+      </w:r>
+      <w:r>
+        <w:rPr>
+          <w:rStyle w:val="VerbatimChar"/>
+        </w:rPr>
+        <w:t xml:space="preserve">(T&lt;N&gt;/&lt;branch&gt; - &lt;alias&gt;)</w:t>
+      </w:r>
+      <w:r>
+        <w:t xml:space="preserve"> </w:t>
+      </w:r>
+      <w:r>
+        <w:t xml:space="preserve">to</w:t>
+      </w:r>
+      <w:r>
+        <w:t xml:space="preserve"> </w:t>
+      </w:r>
+      <w:r>
+        <w:rPr>
+          <w:rStyle w:val="VerbatimChar"/>
+        </w:rPr>
+        <w:t xml:space="preserve">(T&lt;N&gt;/&lt;branch&gt; - &lt;alias&gt; - &lt;model&gt; - &lt;effort&gt;)</w:t>
+      </w:r>
+      <w:r>
+        <w:t xml:space="preserve"> </w:t>
+      </w:r>
+      <w:r>
+        <w:t xml:space="preserve">(the trailing</w:t>
+      </w:r>
+      <w:r>
+        <w:t xml:space="preserve"> </w:t>
+      </w:r>
+      <w:r>
+        <w:rPr>
+          <w:rStyle w:val="VerbatimChar"/>
+        </w:rPr>
+        <w:t xml:space="preserve">&lt;effort&gt;</w:t>
+      </w:r>
+      <w:r>
+        <w:t xml:space="preserve"> </w:t>
+      </w:r>
+      <w:r>
+        <w:t xml:space="preserve">field added 2026-07-26 per §11.4.231 clause (F) — see the EFFORT-FIELD clause (7) below),</w:t>
+      </w:r>
+      <w:r>
+        <w:t xml:space="preserve"> </w:t>
+      </w:r>
+      <w:r>
+        <w:rPr>
+          <w:rStyle w:val="VerbatimChar"/>
+        </w:rPr>
+        <w:t xml:space="preserve">&lt;model&gt;</w:t>
+      </w:r>
+      <w:r>
+        <w:t xml:space="preserve"> </w:t>
+      </w:r>
+      <w:r>
+        <w:t xml:space="preserve">recording which model is CURRENTLY answering for that alias: for a native Claude alias, the SHORT name (</w:t>
+      </w:r>
+      <w:r>
+        <w:rPr>
+          <w:rStyle w:val="VerbatimChar"/>
+        </w:rPr>
+        <w:t xml:space="preserve">opus</w:t>
+      </w:r>
+      <w:r>
+        <w:t xml:space="preserve"> </w:t>
+      </w:r>
+      <w:r>
+        <w:t xml:space="preserve">/</w:t>
+      </w:r>
+      <w:r>
+        <w:t xml:space="preserve"> </w:t>
+      </w:r>
+      <w:r>
+        <w:rPr>
+          <w:rStyle w:val="VerbatimChar"/>
+        </w:rPr>
+        <w:t xml:space="preserve">sonnet</w:t>
+      </w:r>
+      <w:r>
+        <w:t xml:space="preserve"> </w:t>
+      </w:r>
+      <w:r>
+        <w:t xml:space="preserve">/</w:t>
+      </w:r>
+      <w:r>
+        <w:t xml:space="preserve"> </w:t>
+      </w:r>
+      <w:r>
+        <w:rPr>
+          <w:rStyle w:val="VerbatimChar"/>
+        </w:rPr>
+        <w:t xml:space="preserve">haiku</w:t>
+      </w:r>
+      <w:r>
+        <w:t xml:space="preserve"> </w:t>
+      </w:r>
+      <w:r>
+        <w:t xml:space="preserve">/</w:t>
+      </w:r>
+      <w:r>
+        <w:t xml:space="preserve"> </w:t>
+      </w:r>
+      <w:r>
+        <w:rPr>
+          <w:rStyle w:val="VerbatimChar"/>
+        </w:rPr>
+        <w:t xml:space="preserve">fable</w:t>
+      </w:r>
+      <w:r>
+        <w:t xml:space="preserve">, case-insensitive-substring-derived from the model id the agent platform reports for the most recent turn — DYNAMIC, obtained live at label-emission time, never a fixed/assumed value since native aliases have no persistent per-alias model and the serving model can legitimately switch mid-session per §11.4.231); for a claude-toolkit PROVIDER alias (</w:t>
+      </w:r>
+      <w:r>
+        <w:rPr>
+          <w:rStyle w:val="VerbatimChar"/>
+        </w:rPr>
+        <w:t xml:space="preserve">deepseek</w:t>
+      </w:r>
+      <w:r>
+        <w:t xml:space="preserve">,</w:t>
+      </w:r>
+      <w:r>
+        <w:t xml:space="preserve"> </w:t>
+      </w:r>
+      <w:r>
+        <w:rPr>
+          <w:rStyle w:val="VerbatimChar"/>
+        </w:rPr>
+        <w:t xml:space="preserve">xiaomi</w:t>
+      </w:r>
+      <w:r>
+        <w:t xml:space="preserve">,</w:t>
+      </w:r>
+      <w:r>
+        <w:t xml:space="preserve"> </w:t>
+      </w:r>
+      <w:r>
+        <w:rPr>
+          <w:rStyle w:val="VerbatimChar"/>
+        </w:rPr>
+        <w:t xml:space="preserve">kimi-for-coding</w:t>
+      </w:r>
+      <w:r>
+        <w:t xml:space="preserve">,</w:t>
+      </w:r>
+      <w:r>
+        <w:t xml:space="preserve"> </w:t>
+      </w:r>
+      <w:r>
+        <w:rPr>
+          <w:rStyle w:val="VerbatimChar"/>
+        </w:rPr>
+        <w:t xml:space="preserve">opencode</w:t>
+      </w:r>
+      <w:r>
+        <w:t xml:space="preserve">, ...) the REAL provider model id as declared in that provider's host-config registry (the SAME value the alias's own launch mechanism uses — a single source of truth, never re-derived). (2)</w:t>
+      </w:r>
+      <w:r>
+        <w:t xml:space="preserve"> </w:t>
+      </w:r>
+      <w:r>
+        <w:rPr>
+          <w:b/>
+          <w:bCs/>
+        </w:rPr>
+        <w:t xml:space="preserve">MODEL-FIELD DERIVATION (§11.4.6, never guessed)</w:t>
+      </w:r>
+      <w:r>
+        <w:t xml:space="preserve"> </w:t>
+      </w:r>
+      <w:r>
+        <w:t xml:space="preserve">— a closed two-case split on the SHAPE of the already-derived</w:t>
+      </w:r>
+      <w:r>
+        <w:t xml:space="preserve"> </w:t>
+      </w:r>
+      <w:r>
+        <w:rPr>
+          <w:rStyle w:val="VerbatimChar"/>
+        </w:rPr>
+        <w:t xml:space="preserve">&lt;alias&gt;</w:t>
+      </w:r>
+      <w:r>
+        <w:t xml:space="preserve">: (a) native-alias → read the model id from the CURRENT session's own transcript (the platform's per-project per-session transcript; LAST assistant-turn's reported model → short name); (b) provider-alias → read the model id from the host multi-account-toolkit provider registry (</w:t>
+      </w:r>
+      <w:r>
+        <w:rPr>
+          <w:rStyle w:val="VerbatimChar"/>
+        </w:rPr>
+        <w:t xml:space="preserve">CMA_PROVIDER_MODEL</w:t>
+      </w:r>
+      <w:r>
+        <w:t xml:space="preserve">). Either lookup that cannot resolve yields the honest</w:t>
+      </w:r>
+      <w:r>
+        <w:t xml:space="preserve"> </w:t>
+      </w:r>
+      <w:r>
+        <w:rPr>
+          <w:rStyle w:val="VerbatimChar"/>
+        </w:rPr>
+        <w:t xml:space="preserve">?</w:t>
+      </w:r>
+      <w:r>
+        <w:t xml:space="preserve"> </w:t>
+      </w:r>
+      <w:r>
+        <w:t xml:space="preserve">— NEVER a fabricated or last-known value; an id obtained but matching none of the four native short-names is printed VERBATIM (real-but-unrecognised is more honest than a false</w:t>
+      </w:r>
+      <w:r>
+        <w:t xml:space="preserve"> </w:t>
+      </w:r>
+      <w:r>
+        <w:rPr>
+          <w:rStyle w:val="VerbatimChar"/>
+        </w:rPr>
+        <w:t xml:space="preserve">?</w:t>
+      </w:r>
+      <w:r>
+        <w:t xml:space="preserve">). The 3-field legacy form (no</w:t>
+      </w:r>
+      <w:r>
+        <w:t xml:space="preserve"> </w:t>
+      </w:r>
+      <w:r>
+        <w:rPr>
+          <w:rStyle w:val="VerbatimChar"/>
+        </w:rPr>
+        <w:t xml:space="preserve">&lt;model&gt;</w:t>
+      </w:r>
+      <w:r>
+        <w:t xml:space="preserve">) remains a VALID, ACCEPTED label during migration — the enforcing guard-hook</w:t>
+      </w:r>
+      <w:r>
+        <w:t xml:space="preserve"> </w:t>
+      </w:r>
+      <w:r>
+        <w:rPr>
+          <w:rStyle w:val="VerbatimChar"/>
+        </w:rPr>
+        <w:t xml:space="preserve">LABEL_RE</w:t>
+      </w:r>
+      <w:r>
+        <w:t xml:space="preserve"> </w:t>
+      </w:r>
+      <w:r>
+        <w:t xml:space="preserve">admits both forms, and NEVER treats an honest</w:t>
+      </w:r>
+      <w:r>
+        <w:t xml:space="preserve"> </w:t>
+      </w:r>
+      <w:r>
+        <w:rPr>
+          <w:rStyle w:val="VerbatimChar"/>
+        </w:rPr>
+        <w:t xml:space="preserve">?</w:t>
+      </w:r>
+      <w:r>
+        <w:t xml:space="preserve"> </w:t>
+      </w:r>
+      <w:r>
+        <w:t xml:space="preserve">model, or an absent model field, as a block-cause. (3)</w:t>
+      </w:r>
+      <w:r>
+        <w:t xml:space="preserve"> </w:t>
+      </w:r>
+      <w:r>
+        <w:rPr>
+          <w:b/>
+          <w:bCs/>
+        </w:rPr>
+        <w:t xml:space="preserve">FLAWLESS ALIAS/PROVIDER↔MODEL CONSISTENCY INVARIANT (operator NOTE, load-bearing)</w:t>
+      </w:r>
+      <w:r>
+        <w:t xml:space="preserve"> </w:t>
+      </w:r>
+      <w:r>
+        <w:t xml:space="preserve">— the</w:t>
+      </w:r>
+      <w:r>
+        <w:t xml:space="preserve"> </w:t>
+      </w:r>
+      <w:r>
+        <w:rPr>
+          <w:rStyle w:val="VerbatimChar"/>
+        </w:rPr>
+        <w:t xml:space="preserve">&lt;alias&gt;</w:t>
+      </w:r>
+      <w:r>
+        <w:t xml:space="preserve">/provider field and the</w:t>
+      </w:r>
+      <w:r>
+        <w:t xml:space="preserve"> </w:t>
+      </w:r>
+      <w:r>
+        <w:rPr>
+          <w:rStyle w:val="VerbatimChar"/>
+        </w:rPr>
+        <w:t xml:space="preserve">&lt;model&gt;</w:t>
+      </w:r>
+      <w:r>
+        <w:t xml:space="preserve"> </w:t>
+      </w:r>
+      <w:r>
+        <w:t xml:space="preserve">field MUST be MUTUALLY CONSISTENT AT ALL TIMES: the model shown MUST be a model that genuinely BELONGS to the alias/provider shown (models belong to providers/aliases), and the alias/provider name MUST itself be current — never a stale alias beside a fresh model, never a model that does not belong to the shown alias. This is guaranteed BY CONSTRUCTION, not by coincidence: the native model is read from THAT alias's own live session transcript, and the provider model is read from THAT provider's own registry entry — so the derived</w:t>
+      </w:r>
+      <w:r>
+        <w:t xml:space="preserve"> </w:t>
+      </w:r>
+      <w:r>
+        <w:rPr>
+          <w:rStyle w:val="VerbatimChar"/>
+        </w:rPr>
+        <w:t xml:space="preserve">&lt;model&gt;</w:t>
+      </w:r>
+      <w:r>
+        <w:t xml:space="preserve"> </w:t>
+      </w:r>
+      <w:r>
+        <w:t xml:space="preserve">is definitionally a model of the shown</w:t>
+      </w:r>
+      <w:r>
+        <w:t xml:space="preserve"> </w:t>
+      </w:r>
+      <w:r>
+        <w:rPr>
+          <w:rStyle w:val="VerbatimChar"/>
+        </w:rPr>
+        <w:t xml:space="preserve">&lt;alias&gt;</w:t>
+      </w:r>
+      <w:r>
+        <w:t xml:space="preserve">; a derivation that ever emits a model not belonging to the shown alias is a §11.4.6 / §11.4.182 consistency violation, never a valid label. (4)</w:t>
+      </w:r>
+      <w:r>
+        <w:t xml:space="preserve"> </w:t>
+      </w:r>
+      <w:r>
+        <w:rPr>
+          <w:b/>
+          <w:bCs/>
+        </w:rPr>
+        <w:t xml:space="preserve">REAL-TIME, ALWAYS-IN-SYNC (§11.4.229/§11.4.106(F))</w:t>
+      </w:r>
+      <w:r>
+        <w:t xml:space="preserve"> </w:t>
+      </w:r>
+      <w:r>
+        <w:t xml:space="preserve">— the label is STATELESS and RE-COMPUTED at EVERY emission (every human-invoked labeler run AND every synchronous PreToolUse guard-hook firing on every Agent/Task/TaskCreate dispatch) against the LIVE environment (current</w:t>
+      </w:r>
+      <w:r>
+        <w:t xml:space="preserve"> </w:t>
+      </w:r>
+      <w:r>
+        <w:rPr>
+          <w:rStyle w:val="VerbatimChar"/>
+        </w:rPr>
+        <w:t xml:space="preserve">CLAUDE_CONFIG_DIR</w:t>
+      </w:r>
+      <w:r>
+        <w:t xml:space="preserve">, current session id, current transcript tail, current provider</w:t>
+      </w:r>
+      <w:r>
+        <w:t xml:space="preserve"> </w:t>
+      </w:r>
+      <w:r>
+        <w:rPr>
+          <w:rStyle w:val="VerbatimChar"/>
+        </w:rPr>
+        <w:t xml:space="preserve">.env</w:t>
+      </w:r>
+      <w:r>
+        <w:t xml:space="preserve">) — so a mid-session model switch (</w:t>
+      </w:r>
+      <w:r>
+        <w:rPr>
+          <w:rStyle w:val="VerbatimChar"/>
+        </w:rPr>
+        <w:t xml:space="preserve">/model</w:t>
+      </w:r>
+      <w:r>
+        <w:t xml:space="preserve">, an autonomous §11.4.231 escalation) is reflected in the VERY NEXT emission with no cache to go stale: real-time BY CONSTRUCTION, not by a sync daemon. Honest boundary (§11.4.6): the live label has NO persisted artifact that could drift, so the Docs-Chain (§11.4.106) sync engine — which propagates PERSISTED documents/DBs — does not apply to the stateless label itself; the operator's "use/extend Docs Chain for real-time responsiveness" ask attaches to any PERSISTED label-history / model-switch LOG surface (a §11.4.197 follow-up to be tracked), which, if adopted, IS §11.4.106-Docs-Chain-synced and §11.4.208-request-history-adjacent — never faked as already-shipped. (5)</w:t>
+      </w:r>
+      <w:r>
+        <w:t xml:space="preserve"> </w:t>
+      </w:r>
+      <w:r>
+        <w:rPr>
+          <w:b/>
+          <w:bCs/>
+        </w:rPr>
+        <w:t xml:space="preserve">HONEST SUBAGENT-INTROSPECTION LIMIT (§11.4.6/§11.4.197)</w:t>
+      </w:r>
+      <w:r>
+        <w:t xml:space="preserve"> </w:t>
+      </w:r>
+      <w:r>
+        <w:t xml:space="preserve">— the native-alias transcript lookup is proven reliable when invoked from the DISPATCHING process's own shell (the guard-hook's actual execution context at dispatch time); it is NOT proven reliable when a background-dispatched subagent introspects its OWN model from inside its own subprocess on hosts where the subagent shares its parent's session-transcript with no subagent-vs-conductor marker — recorded as an open limitation to be tracked, never silently claimed solved. (6)</w:t>
+      </w:r>
+      <w:r>
+        <w:t xml:space="preserve"> </w:t>
+      </w:r>
+      <w:r>
+        <w:rPr>
+          <w:b/>
+          <w:bCs/>
+        </w:rPr>
+        <w:t xml:space="preserve">DIVERGENT-LABELER RECONCILIATION (§11.4.227)</w:t>
+      </w:r>
+      <w:r>
+        <w:t xml:space="preserve"> </w:t>
+      </w:r>
+      <w:r>
+        <w:t xml:space="preserve">— the LIVE labeler wired via</w:t>
+      </w:r>
+      <w:r>
+        <w:t xml:space="preserve"> </w:t>
+      </w:r>
+      <w:r>
+        <w:rPr>
+          <w:rStyle w:val="VerbatimChar"/>
+        </w:rPr>
+        <w:t xml:space="preserve">.claude/settings.json</w:t>
+      </w:r>
+      <w:r>
+        <w:t xml:space="preserve"> </w:t>
+      </w:r>
+      <w:r>
+        <w:t xml:space="preserve">is</w:t>
+      </w:r>
+      <w:r>
+        <w:t xml:space="preserve"> </w:t>
+      </w:r>
+      <w:r>
+        <w:rPr>
+          <w:rStyle w:val="VerbatimChar"/>
+        </w:rPr>
+        <w:t xml:space="preserve">constitution/scripts/multitrack/track_branch_label.sh</w:t>
+      </w:r>
+      <w:r>
+        <w:t xml:space="preserve"> </w:t>
+      </w:r>
+      <w:r>
+        <w:t xml:space="preserve">(both it and the top-level</w:t>
+      </w:r>
+      <w:r>
+        <w:t xml:space="preserve"> </w:t>
+      </w:r>
+      <w:r>
+        <w:rPr>
+          <w:rStyle w:val="VerbatimChar"/>
+        </w:rPr>
+        <w:t xml:space="preserve">scripts/multitrack/</w:t>
+      </w:r>
+      <w:r>
+        <w:t xml:space="preserve"> </w:t>
+      </w:r>
+      <w:r>
+        <w:t xml:space="preserve">duplicate carry the model-field extension (functionally equivalent on the alias+model fields, not byte-identical — the constitution copy additionally carries the 2026-07-26 effort field the top-level copy does not yet mirror)); the two copies are reconciled to a single source of truth (top-level a thin wrapper exec-ing the constitution copy, §11.4.177 inherited-by-reference) as a reconciliation to be tracked, never a silent divergence. (7)</w:t>
+      </w:r>
+      <w:r>
+        <w:t xml:space="preserve"> </w:t>
+      </w:r>
+      <w:r>
+        <w:rPr>
+          <w:b/>
+          <w:bCs/>
+        </w:rPr>
+        <w:t xml:space="preserve">EFFORT FIELD (added 2026-07-26 per the operator IMPORTANT mandate — verbatim: "Besides dynamic determining proper models to use, we MUST decide the effort as well and switch between the effort settings same as we do now for chosen model! Labeling MUST BE extended for this details as well. Example: (T1/main - claude4 - opus - high).").</w:t>
+      </w:r>
+      <w:r>
+        <w:t xml:space="preserve"> </w:t>
+      </w:r>
+      <w:r>
+        <w:t xml:space="preserve">The 5-field label appends</w:t>
+      </w:r>
+      <w:r>
+        <w:t xml:space="preserve"> </w:t>
+      </w:r>
+      <w:r>
+        <w:rPr>
+          <w:rStyle w:val="VerbatimChar"/>
+        </w:rPr>
+        <w:t xml:space="preserve">&lt;effort&gt;</w:t>
+      </w:r>
+      <w:r>
+        <w:t xml:space="preserve"> </w:t>
+      </w:r>
+      <w:r>
+        <w:t xml:space="preserve">after</w:t>
+      </w:r>
+      <w:r>
+        <w:t xml:space="preserve"> </w:t>
+      </w:r>
+      <w:r>
+        <w:rPr>
+          <w:rStyle w:val="VerbatimChar"/>
+        </w:rPr>
+        <w:t xml:space="preserve">&lt;model&gt;</w:t>
+      </w:r>
+      <w:r>
+        <w:t xml:space="preserve">, recording which reasoning-EFFORT setting is CURRENTLY in force for that work-stream, drawn from the closed set</w:t>
+      </w:r>
+      <w:r>
+        <w:t xml:space="preserve"> </w:t>
+      </w:r>
+      <w:r>
+        <w:rPr>
+          <w:rStyle w:val="VerbatimChar"/>
+        </w:rPr>
+        <w:t xml:space="preserve">{low | medium | high | xhigh | max}</w:t>
+      </w:r>
+      <w:r>
+        <w:t xml:space="preserve"> </w:t>
+      </w:r>
+      <w:r>
+        <w:t xml:space="preserve">(the SAME effort ladder §11.4.231 clause (F) selects). (a) DERIVATION (§11.4.6, never guessed) —</w:t>
+      </w:r>
+      <w:r>
+        <w:t xml:space="preserve"> </w:t>
+      </w:r>
+      <w:r>
+        <w:rPr>
+          <w:rStyle w:val="VerbatimChar"/>
+        </w:rPr>
+        <w:t xml:space="preserve">&lt;effort&gt;</w:t>
+      </w:r>
+      <w:r>
+        <w:t xml:space="preserve"> </w:t>
+      </w:r>
+      <w:r>
+        <w:t xml:space="preserve">is read from whatever LIVE effort signal the execution path exposes (the Workflow-tool</w:t>
+      </w:r>
+      <w:r>
+        <w:t xml:space="preserve"> </w:t>
+      </w:r>
+      <w:r>
+        <w:rPr>
+          <w:rStyle w:val="VerbatimChar"/>
+        </w:rPr>
+        <w:t xml:space="preserve">agent()</w:t>
+      </w:r>
+      <w:r>
+        <w:t xml:space="preserve"> </w:t>
+      </w:r>
+      <w:r>
+        <w:rPr>
+          <w:rStyle w:val="VerbatimChar"/>
+        </w:rPr>
+        <w:t xml:space="preserve">effort</w:t>
+      </w:r>
+      <w:r>
+        <w:t xml:space="preserve"> </w:t>
+      </w:r>
+      <w:r>
+        <w:t xml:space="preserve">argument, a future Agent-tool effort parameter, an env/config effort setting); a path exposing NO effort signal, OR any value outside the closed set, yields the honest</w:t>
+      </w:r>
+      <w:r>
+        <w:t xml:space="preserve"> </w:t>
+      </w:r>
+      <w:r>
+        <w:rPr>
+          <w:rStyle w:val="VerbatimChar"/>
+        </w:rPr>
+        <w:t xml:space="preserve">?</w:t>
+      </w:r>
+      <w:r>
+        <w:t xml:space="preserve"> </w:t>
+      </w:r>
+      <w:r>
+        <w:t xml:space="preserve">— EXACTLY like the</w:t>
+      </w:r>
+      <w:r>
+        <w:t xml:space="preserve"> </w:t>
+      </w:r>
+      <w:r>
+        <w:rPr>
+          <w:rStyle w:val="VerbatimChar"/>
+        </w:rPr>
+        <w:t xml:space="preserve">&lt;model&gt;</w:t>
+      </w:r>
+      <w:r>
+        <w:t xml:space="preserve"> </w:t>
+      </w:r>
+      <w:r>
+        <w:t xml:space="preserve">field's</w:t>
+      </w:r>
+      <w:r>
+        <w:t xml:space="preserve"> </w:t>
+      </w:r>
+      <w:r>
+        <w:rPr>
+          <w:rStyle w:val="VerbatimChar"/>
+        </w:rPr>
+        <w:t xml:space="preserve">?</w:t>
+      </w:r>
+      <w:r>
+        <w:t xml:space="preserve"> </w:t>
+      </w:r>
+      <w:r>
+        <w:t xml:space="preserve">fallback, NEVER a fabricated / assumed / last-known value. (b) HONEST HARNESS BOUNDARY (§11.4.6, load-bearing — do NOT overstate the mechanism) — effort-tiering is REAL where the execution path exposes it and a DOCUMENTED CAPABILITY-GAP where it does not: the current Claude Code</w:t>
+      </w:r>
+      <w:r>
+        <w:t xml:space="preserve"> </w:t>
+      </w:r>
+      <w:r>
+        <w:rPr>
+          <w:b/>
+          <w:bCs/>
+        </w:rPr>
+        <w:t xml:space="preserve">Agent tool</w:t>
+      </w:r>
+      <w:r>
+        <w:t xml:space="preserve"> </w:t>
+      </w:r>
+      <w:r>
+        <w:t xml:space="preserve">(subagent dispatch) exposes a</w:t>
+      </w:r>
+      <w:r>
+        <w:t xml:space="preserve"> </w:t>
+      </w:r>
+      <w:r>
+        <w:rPr>
+          <w:rStyle w:val="VerbatimChar"/>
+        </w:rPr>
+        <w:t xml:space="preserve">model</w:t>
+      </w:r>
+      <w:r>
+        <w:t xml:space="preserve"> </w:t>
+      </w:r>
+      <w:r>
+        <w:t xml:space="preserve">parameter but</w:t>
+      </w:r>
+      <w:r>
+        <w:t xml:space="preserve"> </w:t>
+      </w:r>
+      <w:r>
+        <w:rPr>
+          <w:b/>
+          <w:bCs/>
+        </w:rPr>
+        <w:t xml:space="preserve">NO</w:t>
+      </w:r>
+      <w:r>
+        <w:rPr>
+          <w:b/>
+          <w:bCs/>
+        </w:rPr>
+        <w:t xml:space="preserve"> </w:t>
+      </w:r>
+      <w:r>
+        <w:rPr>
+          <w:rStyle w:val="VerbatimChar"/>
+          <w:b/>
+          <w:bCs/>
+        </w:rPr>
+        <w:t xml:space="preserve">effort</w:t>
+      </w:r>
+      <w:r>
+        <w:rPr>
+          <w:b/>
+          <w:bCs/>
+        </w:rPr>
+        <w:t xml:space="preserve"> </w:t>
+      </w:r>
+      <w:r>
+        <w:rPr>
+          <w:b/>
+          <w:bCs/>
+        </w:rPr>
+        <w:t xml:space="preserve">parameter</w:t>
+      </w:r>
+      <w:r>
+        <w:t xml:space="preserve">, so a subagent's effort is NOT currently settable via that path and its</w:t>
+      </w:r>
+      <w:r>
+        <w:t xml:space="preserve"> </w:t>
+      </w:r>
+      <w:r>
+        <w:rPr>
+          <w:rStyle w:val="VerbatimChar"/>
+        </w:rPr>
+        <w:t xml:space="preserve">&lt;effort&gt;</w:t>
+      </w:r>
+      <w:r>
+        <w:t xml:space="preserve"> </w:t>
+      </w:r>
+      <w:r>
+        <w:t xml:space="preserve">field degrades honestly to</w:t>
+      </w:r>
+      <w:r>
+        <w:t xml:space="preserve"> </w:t>
+      </w:r>
+      <w:r>
+        <w:rPr>
+          <w:rStyle w:val="VerbatimChar"/>
+        </w:rPr>
+        <w:t xml:space="preserve">?</w:t>
+      </w:r>
+      <w:r>
+        <w:t xml:space="preserve">; the</w:t>
+      </w:r>
+      <w:r>
+        <w:t xml:space="preserve"> </w:t>
+      </w:r>
+      <w:r>
+        <w:rPr>
+          <w:b/>
+          <w:bCs/>
+        </w:rPr>
+        <w:t xml:space="preserve">Workflow tool's</w:t>
+      </w:r>
+      <w:r>
+        <w:rPr>
+          <w:b/>
+          <w:bCs/>
+        </w:rPr>
+        <w:t xml:space="preserve"> </w:t>
+      </w:r>
+      <w:r>
+        <w:rPr>
+          <w:rStyle w:val="VerbatimChar"/>
+          <w:b/>
+          <w:bCs/>
+        </w:rPr>
+        <w:t xml:space="preserve">agent()</w:t>
+      </w:r>
+      <w:r>
+        <w:t xml:space="preserve"> </w:t>
+      </w:r>
+      <w:r>
+        <w:t xml:space="preserve">DOES take an</w:t>
+      </w:r>
+      <w:r>
+        <w:t xml:space="preserve"> </w:t>
+      </w:r>
+      <w:r>
+        <w:rPr>
+          <w:rStyle w:val="VerbatimChar"/>
+        </w:rPr>
+        <w:t xml:space="preserve">effort</w:t>
+      </w:r>
+      <w:r>
+        <w:t xml:space="preserve"> </w:t>
+      </w:r>
+      <w:r>
+        <w:t xml:space="preserve">argument, so effort IS settable + derivable there — the label reports whichever path is live, never invents one. This is the SAME aspirational-vs-harness state the §11.4.209 / §11.4.211 Fable-</w:t>
+      </w:r>
+      <w:r>
+        <w:rPr>
+          <w:rStyle w:val="VerbatimChar"/>
+        </w:rPr>
+        <w:t xml:space="preserve">xhigh</w:t>
+      </w:r>
+      <w:r>
+        <w:t xml:space="preserve"> </w:t>
+      </w:r>
+      <w:r>
+        <w:t xml:space="preserve">review/merge pins already occupy: the pins mandate the effort, and whether a given dispatch path can SET it is a harness capability the label reports honestly and NEVER fakes. (c) LEGACY-FORM ACCEPTANCE (migration) — the 3-field</w:t>
+      </w:r>
+      <w:r>
+        <w:t xml:space="preserve"> </w:t>
+      </w:r>
+      <w:r>
+        <w:rPr>
+          <w:rStyle w:val="VerbatimChar"/>
+        </w:rPr>
+        <w:t xml:space="preserve">(T&lt;N&gt;/&lt;branch&gt; - &lt;alias&gt;)</w:t>
+      </w:r>
+      <w:r>
+        <w:t xml:space="preserve"> </w:t>
+      </w:r>
+      <w:r>
+        <w:t xml:space="preserve">and 4-field</w:t>
+      </w:r>
+      <w:r>
+        <w:t xml:space="preserve"> </w:t>
+      </w:r>
+      <w:r>
+        <w:rPr>
+          <w:rStyle w:val="VerbatimChar"/>
+        </w:rPr>
+        <w:t xml:space="preserve">(T&lt;N&gt;/&lt;branch&gt; - &lt;alias&gt; - &lt;model&gt;)</w:t>
+      </w:r>
+      <w:r>
+        <w:t xml:space="preserve"> </w:t>
+      </w:r>
+      <w:r>
+        <w:t xml:space="preserve">label forms remain VALID and ACCEPTED; the guard</w:t>
+      </w:r>
+      <w:r>
+        <w:t xml:space="preserve"> </w:t>
+      </w:r>
+      <w:r>
+        <w:rPr>
+          <w:rStyle w:val="VerbatimChar"/>
+        </w:rPr>
+        <w:t xml:space="preserve">LABEL_RE</w:t>
+      </w:r>
+      <w:r>
+        <w:t xml:space="preserve"> </w:t>
+      </w:r>
+      <w:r>
+        <w:t xml:space="preserve">admits all three shapes and NEVER treats an absent</w:t>
+      </w:r>
+      <w:r>
+        <w:t xml:space="preserve"> </w:t>
+      </w:r>
+      <w:r>
+        <w:rPr>
+          <w:rStyle w:val="VerbatimChar"/>
+        </w:rPr>
+        <w:t xml:space="preserve">&lt;effort&gt;</w:t>
+      </w:r>
+      <w:r>
+        <w:t xml:space="preserve"> </w:t>
+      </w:r>
+      <w:r>
+        <w:t xml:space="preserve">field, or an honest</w:t>
+      </w:r>
+      <w:r>
+        <w:t xml:space="preserve"> </w:t>
+      </w:r>
+      <w:r>
+        <w:rPr>
+          <w:rStyle w:val="VerbatimChar"/>
+        </w:rPr>
+        <w:t xml:space="preserve">?</w:t>
+      </w:r>
+      <w:r>
+        <w:t xml:space="preserve"> </w:t>
+      </w:r>
+      <w:r>
+        <w:t xml:space="preserve">effort, as a block-cause (§11.4.6 — mirroring the §11.4.182 track/alias/model honest-</w:t>
+      </w:r>
+      <w:r>
+        <w:rPr>
+          <w:rStyle w:val="VerbatimChar"/>
+        </w:rPr>
+        <w:t xml:space="preserve">?</w:t>
+      </w:r>
+      <w:r>
+        <w:t xml:space="preserve"> </w:t>
+      </w:r>
+      <w:r>
+        <w:t xml:space="preserve">rule). (d) CONSISTENCY — the effort field is selected TOGETHER WITH the model by §11.4.231 (both tiers chosen for one task) and never contradicts it; a stale effort beside a fresh model, or an effort outside the closed set, is a §11.4.6 / §11.4.182 consistency violation, never a valid label. (e) REAL-TIME, ALWAYS-IN-SYNC (§11.4.229) — like</w:t>
+      </w:r>
+      <w:r>
+        <w:t xml:space="preserve"> </w:t>
+      </w:r>
+      <w:r>
+        <w:rPr>
+          <w:rStyle w:val="VerbatimChar"/>
+        </w:rPr>
+        <w:t xml:space="preserve">&lt;model&gt;</w:t>
+      </w:r>
+      <w:r>
+        <w:t xml:space="preserve">,</w:t>
+      </w:r>
+      <w:r>
+        <w:t xml:space="preserve"> </w:t>
+      </w:r>
+      <w:r>
+        <w:rPr>
+          <w:rStyle w:val="VerbatimChar"/>
+        </w:rPr>
+        <w:t xml:space="preserve">&lt;effort&gt;</w:t>
+      </w:r>
+      <w:r>
+        <w:t xml:space="preserve"> </w:t>
+      </w:r>
+      <w:r>
+        <w:t xml:space="preserve">is STATELESS and RE-COMPUTED at EVERY label emission against the LIVE environment, so a mid-task §11.4.231 effort escalation is reflected in the VERY NEXT emission with no cache to go stale. Propagation:</w:t>
+      </w:r>
+      <w:r>
+        <w:t xml:space="preserve"> </w:t>
+      </w:r>
+      <w:r>
+        <w:rPr>
+          <w:rStyle w:val="VerbatimChar"/>
+        </w:rPr>
+        <w:t xml:space="preserve">CM-TRACK-BRANCH-LABEL</w:t>
+      </w:r>
+      <w:r>
+        <w:t xml:space="preserve"> </w:t>
+      </w:r>
+      <w:r>
+        <w:t xml:space="preserve">is EXTENDED to also assert the labeler emits a parseable</w:t>
+      </w:r>
+      <w:r>
+        <w:t xml:space="preserve"> </w:t>
+      </w:r>
+      <w:r>
+        <w:rPr>
+          <w:rStyle w:val="VerbatimChar"/>
+        </w:rPr>
+        <w:t xml:space="preserve">&lt;model&gt;</w:t>
+      </w:r>
+      <w:r>
+        <w:t xml:space="preserve"> </w:t>
+      </w:r>
+      <w:r>
+        <w:t xml:space="preserve">field AND a parseable</w:t>
+      </w:r>
+      <w:r>
+        <w:t xml:space="preserve"> </w:t>
+      </w:r>
+      <w:r>
+        <w:rPr>
+          <w:rStyle w:val="VerbatimChar"/>
+        </w:rPr>
+        <w:t xml:space="preserve">&lt;effort&gt;</w:t>
+      </w:r>
+      <w:r>
+        <w:t xml:space="preserve"> </w:t>
+      </w:r>
+      <w:r>
+        <w:t xml:space="preserve">field, the guard</w:t>
+      </w:r>
+      <w:r>
+        <w:t xml:space="preserve"> </w:t>
+      </w:r>
+      <w:r>
+        <w:rPr>
+          <w:rStyle w:val="VerbatimChar"/>
+        </w:rPr>
+        <w:t xml:space="preserve">LABEL_RE</w:t>
+      </w:r>
+      <w:r>
+        <w:t xml:space="preserve"> </w:t>
+      </w:r>
+      <w:r>
+        <w:t xml:space="preserve">accepts the 3-field / 4-field / 5-field label forms (legacy 3-field and 4-field ALWAYS remain accepted during migration; a</w:t>
+      </w:r>
+      <w:r>
+        <w:t xml:space="preserve"> </w:t>
+      </w:r>
+      <w:r>
+        <w:rPr>
+          <w:rStyle w:val="VerbatimChar"/>
+        </w:rPr>
+        <w:t xml:space="preserve">?</w:t>
+      </w:r>
+      <w:r>
+        <w:t xml:space="preserve"> </w:t>
+      </w:r>
+      <w:r>
+        <w:t xml:space="preserve">effort is NEVER a block-cause), and the alias/provider↔model consistency holds; paired §1.1 mutation: strip the</w:t>
+      </w:r>
+      <w:r>
+        <w:t xml:space="preserve"> </w:t>
+      </w:r>
+      <w:r>
+        <w:rPr>
+          <w:rStyle w:val="VerbatimChar"/>
+        </w:rPr>
+        <w:t xml:space="preserve">&lt;model&gt;</w:t>
+      </w:r>
+      <w:r>
+        <w:t xml:space="preserve"> </w:t>
+      </w:r>
+      <w:r>
+        <w:t xml:space="preserve">derivation OR emit a model not belonging to the shown alias → the extended gate FAILs (gate-code = separate work item, NOT claimed shipped §11.4.6). No new escape hatch — the existing §11.4.182 "no escape hatch" list applies to the extended label unchanged.</w:t>
+      </w:r>
+    </w:p>
+    <w:p>
+      <w:pPr>
+        <w:pStyle w:val="BodyText"/>
+      </w:pPr>
+      <w:r>
+        <w:rPr>
+          <w:b/>
+          <w:bCs/>
+        </w:rPr>
+        <w:t xml:space="preserve">§11.4.233 — Standing anti-mess control plane: a level-triggered, idempotent, invariant-catalogue reconciliation loop over the WHOLE persistent System state, orchestrating every per-domain enforcer, refusing gated transitions on un-reconciled drift (research-derived, 2026-07-26).</w:t>
+      </w:r>
+    </w:p>
+    <w:p>
+      <w:pPr>
+        <w:pStyle w:val="BodyText"/>
+      </w:pPr>
+      <w:r>
+        <w:t xml:space="preserve">Forensic anchor (genericised): every existing consistency enforcer in a multi-track / multi-agent / multi-submodule / multi-upstream System is EDGE-TRIGGERED — a PreToolUse hook fires on an action, a check runs at a seam (lock-acquisition / merge-time / build-time / commit-time), a gate runs when a build runs — so a mess that arises WITHOUT an edge firing is un-observed until it causes harm (two live examples captured 2026-07-26: a large uncommitted-batch pile-up sat unreconciled through a session, and multiple provably-stale VCS/wrapper locks were held by dead holders with no acquisition attempt to reap them — the §11.4.205 "a hook never installed / a check that runs only when asked" forensic generalised to the whole persistent state). Per §11.4.102 Phase 4.5 the ~19 persistent-state mess classes (Plane R repository: uncommitted pile-up, stale/duplicate locks, orphaned worktrees, half-applied cross-repo commits, drifted submodule pointers, partial merges, divergent mirrors, mis-placed work; Plane G governance: divergent mirrors, pointer drift, gate-ledger drift, anchor-number collision; Plane S tracking: doc/DB drift, cross-track SSoT divergence, ledger drift, handoff-doc drift; Plane P runtime: the §11.4.232 long-op set + un-reaped streams + dangling review state) are ONE architectural flaw — there is no LEVEL-TRIGGERED control plane that re-derives the actual persistent state and reconciles it against a declared clean state; an un-observed drift is a §11.4/§11.4.1 bluff at the organization layer ("the System is clean" while a mess silently accumulates).</w:t>
+      </w:r>
+    </w:p>
+    <w:p>
+      <w:pPr>
+        <w:pStyle w:val="BodyText"/>
+      </w:pPr>
+      <w:r>
+        <w:t xml:space="preserve">The mandate — a standing</w:t>
+      </w:r>
+      <w:r>
+        <w:t xml:space="preserve"> </w:t>
+      </w:r>
+      <w:r>
+        <w:rPr>
+          <w:b/>
+          <w:bCs/>
+        </w:rPr>
+        <w:t xml:space="preserve">anti-mess control plane</w:t>
+      </w:r>
+      <w:r>
+        <w:t xml:space="preserve"> </w:t>
+      </w:r>
+      <w:r>
+        <w:t xml:space="preserve">(the desired-state/actual-state reconciliation-loop + control-plane/data-plane pattern of distributed systems), ALL of which hold:</w:t>
+      </w:r>
+    </w:p>
+    <w:p>
+      <w:pPr>
+        <w:pStyle w:val="BodyText"/>
+      </w:pPr>
+      <w:r>
+        <w:rPr>
+          <w:b/>
+          <w:bCs/>
+        </w:rPr>
+        <w:t xml:space="preserve">(A) DECLARED INVARIANT CATALOGUE.</w:t>
+      </w:r>
+      <w:r>
+        <w:t xml:space="preserve"> </w:t>
+      </w:r>
+      <w:r>
+        <w:t xml:space="preserve">A single machine-readable consumer-owned catalogue (DATA per §11.4.28/§11.4.35) enumerating every consistency invariant across the persistent planes, each carrying</w:t>
+      </w:r>
+      <w:r>
+        <w:t xml:space="preserve"> </w:t>
+      </w:r>
+      <w:r>
+        <w:rPr>
+          <w:rStyle w:val="VerbatimChar"/>
+        </w:rPr>
+        <w:t xml:space="preserve">{id, plane, desired-condition, detector, reconcile-class ∈ {auto-safe | operator-gated | owned-by &lt;anchor&gt;}, evidence-shape}</w:t>
+      </w:r>
+      <w:r>
+        <w:t xml:space="preserve">; the catalogue IS the desired clean state; an un-catalogued mess class is an honest tracked GAP (§11.4.6/§11.4.197), never silently claimed covered.</w:t>
+      </w:r>
+    </w:p>
+    <w:p>
+      <w:pPr>
+        <w:pStyle w:val="BodyText"/>
+      </w:pPr>
+      <w:r>
+        <w:rPr>
+          <w:b/>
+          <w:bCs/>
+        </w:rPr>
+        <w:t xml:space="preserve">(B) LEVEL-TRIGGERED LOOP.</w:t>
+      </w:r>
+      <w:r>
+        <w:t xml:space="preserve"> </w:t>
+      </w:r>
+      <w:r>
+        <w:t xml:space="preserve">The loop re-derives the ACTUAL state (not an event) and diffs it against the catalogue BEFORE every gated transition (commit-batch/build/flash/merge-to-trunk/tag/constitution-pull) AND on a standing cadence (§11.4.94/§11.4.103) — catching drift regardless of how it arose (the Kubernetes level-triggered property); actual-vs-desired uses a §11.4.86 fingerprint diff drilling to the offending record (anti-entropy), never a whole-scan where a fingerprint suffices.</w:t>
+      </w:r>
+    </w:p>
+    <w:p>
+      <w:pPr>
+        <w:pStyle w:val="BodyText"/>
+      </w:pPr>
+      <w:r>
+        <w:rPr>
+          <w:b/>
+          <w:bCs/>
+        </w:rPr>
+        <w:t xml:space="preserve">(C) IDEMPOTENT RECONCILE-OR-REFUSE.</w:t>
+      </w:r>
+      <w:r>
+        <w:t xml:space="preserve"> </w:t>
+      </w:r>
+      <w:r>
+        <w:t xml:space="preserve">Each drift takes exactly one dedup-keyed action: RECONCILE-AUTO-SAFE (reversible + evidence-determinable + bounded-blast per §11.4.101 — reap a provably-dead lock §11.4.180, regen a stale derived doc §11.4.106, scope-group-commit a placement-clean batch §11.4.191, retire a merged worktree §11.4.167), idempotent (a no-op on a clean state); OR REFUSE-THE-GATE + a bounded operator decision (irreversible/high-blast/indeterminate — id-colliding SSoT §11.4.206, anchor collision §11.4.227, partial cross-repo merge, divergent mirror) per §11.4.101/§11.4.66; a gated transition NEVER proceeds while a catalogued invariant is violated and un-reconciled; the loop keeps progressing every other non-blocked item (park-one-not-the-loop).</w:t>
+      </w:r>
+    </w:p>
+    <w:p>
+      <w:pPr>
+        <w:pStyle w:val="BodyText"/>
+      </w:pPr>
+      <w:r>
+        <w:rPr>
+          <w:b/>
+          <w:bCs/>
+        </w:rPr>
+        <w:t xml:space="preserve">(D) SAGA FORWARD-RECONCILE (no-loss).</w:t>
+      </w:r>
+      <w:r>
+        <w:t xml:space="preserve"> </w:t>
+      </w:r>
+      <w:r>
+        <w:t xml:space="preserve">A partially-applied cross-repo operation is reconciled complete-forward under a §9.2 pre-op backup (finish the remaining legs / bump the pointer / complete the merge zero-markers-zero-drop §11.4.41 step 3 / ff the lagging mirror) — NEVER force-push/reset/</w:t>
+      </w:r>
+      <w:r>
+        <w:rPr>
+          <w:rStyle w:val="VerbatimChar"/>
+        </w:rPr>
+        <w:t xml:space="preserve">-s ours</w:t>
+      </w:r>
+      <w:r>
+        <w:t xml:space="preserve"> </w:t>
+      </w:r>
+      <w:r>
+        <w:t xml:space="preserve">(§11.4.113/§9.2); compensation is §9.2 backup-restore only; the saga reaches fully-completed, never rolled-back-with-loss.</w:t>
+      </w:r>
+    </w:p>
+    <w:p>
+      <w:pPr>
+        <w:pStyle w:val="BodyText"/>
+      </w:pPr>
+      <w:r>
+        <w:rPr>
+          <w:b/>
+          <w:bCs/>
+        </w:rPr>
+        <w:t xml:space="preserve">(E) THE LOOP IS A GUARD (§11.4.201).</w:t>
+      </w:r>
+      <w:r>
+        <w:t xml:space="preserve"> </w:t>
+      </w:r>
+      <w:r>
+        <w:t xml:space="preserve">Every detector ships golden-TRUE + golden-FALSE-with-carrier fixtures (§11.4.107(10)); a false-positive REFUSAL of a clean state is a §11.4.201(1) FAIL-bluff exactly as a false-negative PASS is a §11.4 PASS-bluff; every "no drift" null is control-needle-proven (§11.4.201(6)-(12)); conservative-safe REFUSE on an unresolvable signal, resolved evidence printed on every refusal.</w:t>
+      </w:r>
+    </w:p>
+    <w:p>
+      <w:pPr>
+        <w:pStyle w:val="BodyText"/>
+      </w:pPr>
+      <w:r>
+        <w:rPr>
+          <w:b/>
+          <w:bCs/>
+        </w:rPr>
+        <w:t xml:space="preserve">(F) CONTROL-PLANE / DATA-PLANE SEPARATION.</w:t>
+      </w:r>
+      <w:r>
+        <w:t xml:space="preserve"> </w:t>
+      </w:r>
+      <w:r>
+        <w:t xml:space="preserve">The control plane DETECTS + RECONCILES state and NEVER performs the data-plane work (the actual build/commit/merge/long-op — §11.4.232 + the build/flash/commit wrappers); the two never merge; the control plane's own state is durable (§11.4.205(6) temp→fsync→rename, never tmpfs, may reuse §11.4.207).</w:t>
+      </w:r>
+    </w:p>
+    <w:p>
+      <w:pPr>
+        <w:pStyle w:val="BodyText"/>
+      </w:pPr>
+      <w:r>
+        <w:rPr>
+          <w:b/>
+          <w:bCs/>
+        </w:rPr>
+        <w:t xml:space="preserve">Honest boundary (§11.4.6).</w:t>
+      </w:r>
+      <w:r>
+        <w:t xml:space="preserve"> </w:t>
+      </w:r>
+      <w:r>
+        <w:t xml:space="preserve">Converges the CATALOGUED invariants; does NOT make an un-catalogued mess class impossible (extensible catalogue, never "provably mess-free"), does NOT make a gate correct (§11.4.108/§11.4.201), does NOT auto-fix irreversible drift (operator-gated §11.4.101/§11.4.66), and is eventual-consistency-at-every-gate-and-cadence NOT a real-time daemon (§11.4.205(7)).</w:t>
+      </w:r>
+      <w:r>
+        <w:t xml:space="preserve"> </w:t>
+      </w:r>
+      <w:r>
+        <w:rPr>
+          <w:b/>
+          <w:bCs/>
+        </w:rPr>
+        <w:t xml:space="preserve">Reuse-not-rewrite:</w:t>
+      </w:r>
+      <w:r>
+        <w:t xml:space="preserve"> </w:t>
+      </w:r>
+      <w:r>
+        <w:t xml:space="preserve">it is the level-triggered COMPOSER over the existing per-domain enforcers (§11.4.180/§11.4.186/§11.4.106/§11.4.191/§11.4.206/§11.4.227/§11.4.232/§11.4.147/§11.4.167), inheriting each's detector — no parallel enforcer is invented (§11.4.227). It composes §11.4.232 (the RUNTIME data-plane long-op orchestrator — §11.4.232 clause (F) is Plane P of this catalogue) as the plane it does not touch.</w:t>
+      </w:r>
+    </w:p>
+    <w:p>
+      <w:pPr>
+        <w:pStyle w:val="BodyText"/>
+      </w:pPr>
+      <w:r>
+        <w:t xml:space="preserve">Classification: universal (§11.4.17) — no hardware/vendor/project literal; consumers supply their invariant catalogue, plane detectors, gated-transition list, cadence, and reconcile-class bindings as DATA per §11.4.35. Composes §11.4.6 / §11.4.26 / §11.4.28 / §11.4.32 / §11.4.84 / §11.4.86 / §11.4.101 / §11.4.106 / §11.4.108 / §11.4.116 / §11.4.121 / §11.4.147 / §11.4.164 / §11.4.167 / §11.4.176 / §11.4.179 / §11.4.180 / §11.4.181 / §11.4.186 / §11.4.191 / §11.4.196(F) / §11.4.201 / §11.4.205 / §11.4.206 / §11.4.207 / §11.4.227 / §11.4.232 / §12.6 / §9.2 / §2.1. Propagation gate</w:t>
+      </w:r>
+      <w:r>
+        <w:t xml:space="preserve"> </w:t>
+      </w:r>
+      <w:r>
+        <w:rPr>
+          <w:rStyle w:val="VerbatimChar"/>
+        </w:rPr>
+        <w:t xml:space="preserve">CM-COVENANT-114-233-PROPAGATION</w:t>
+      </w:r>
+      <w:r>
+        <w:t xml:space="preserve"> </w:t>
+      </w:r>
+      <w:r>
+        <w:t xml:space="preserve">(literal</w:t>
+      </w:r>
+      <w:r>
+        <w:t xml:space="preserve"> </w:t>
+      </w:r>
+      <w:r>
+        <w:rPr>
+          <w:rStyle w:val="VerbatimChar"/>
+        </w:rPr>
+        <w:t xml:space="preserve">11.4.233</w:t>
+      </w:r>
+      <w:r>
+        <w:t xml:space="preserve">) + recommended mechanism gates</w:t>
+      </w:r>
+      <w:r>
+        <w:t xml:space="preserve"> </w:t>
+      </w:r>
+      <w:r>
+        <w:rPr>
+          <w:rStyle w:val="VerbatimChar"/>
+        </w:rPr>
+        <w:t xml:space="preserve">CM-ANTIMESS-INVARIANT-CATALOGUE</w:t>
+      </w:r>
+      <w:r>
+        <w:t xml:space="preserve"> </w:t>
+      </w:r>
+      <w:r>
+        <w:t xml:space="preserve">(A) /</w:t>
+      </w:r>
+      <w:r>
+        <w:t xml:space="preserve"> </w:t>
+      </w:r>
+      <w:r>
+        <w:rPr>
+          <w:rStyle w:val="VerbatimChar"/>
+        </w:rPr>
+        <w:t xml:space="preserve">CM-ANTIMESS-LEVEL-TRIGGERED-LOOP</w:t>
+      </w:r>
+      <w:r>
+        <w:t xml:space="preserve"> </w:t>
+      </w:r>
+      <w:r>
+        <w:t xml:space="preserve">(B) /</w:t>
+      </w:r>
+      <w:r>
+        <w:t xml:space="preserve"> </w:t>
+      </w:r>
+      <w:r>
+        <w:rPr>
+          <w:rStyle w:val="VerbatimChar"/>
+        </w:rPr>
+        <w:t xml:space="preserve">CM-ANTIMESS-RECONCILE-OR-REFUSE</w:t>
+      </w:r>
+      <w:r>
+        <w:t xml:space="preserve"> </w:t>
+      </w:r>
+      <w:r>
+        <w:t xml:space="preserve">(C) /</w:t>
+      </w:r>
+      <w:r>
+        <w:t xml:space="preserve"> </w:t>
+      </w:r>
+      <w:r>
+        <w:rPr>
+          <w:rStyle w:val="VerbatimChar"/>
+        </w:rPr>
+        <w:t xml:space="preserve">CM-ANTIMESS-SAGA-FORWARD-NO-LOSS</w:t>
+      </w:r>
+      <w:r>
+        <w:t xml:space="preserve"> </w:t>
+      </w:r>
+      <w:r>
+        <w:t xml:space="preserve">(D) /</w:t>
+      </w:r>
+      <w:r>
+        <w:t xml:space="preserve"> </w:t>
+      </w:r>
+      <w:r>
+        <w:rPr>
+          <w:rStyle w:val="VerbatimChar"/>
+        </w:rPr>
+        <w:t xml:space="preserve">CM-ANTIMESS-LOOP-IS-A-GUARD</w:t>
+      </w:r>
+      <w:r>
+        <w:t xml:space="preserve"> </w:t>
+      </w:r>
+      <w:r>
+        <w:t xml:space="preserve">(E) /</w:t>
+      </w:r>
+      <w:r>
+        <w:t xml:space="preserve"> </w:t>
+      </w:r>
+      <w:r>
+        <w:rPr>
+          <w:rStyle w:val="VerbatimChar"/>
+        </w:rPr>
+        <w:t xml:space="preserve">CM-ANTIMESS-CONTROL-DATA-PLANE-SPLIT</w:t>
+      </w:r>
+      <w:r>
+        <w:t xml:space="preserve"> </w:t>
+      </w:r>
+      <w:r>
+        <w:t xml:space="preserve">(F) + paired §1.1 mutations (drop the standing-cadence trigger so the loop is edge-only → (B) FAILs on the pile-up/stale-lock fixture; let a gated transition proceed on a catalogued un-reconciled drift → (C) FAILs; a saga that force-pushes/resets to reconcile a mirror → (D) FAILs; a detector that REFUSES a clean golden-TRUE fixture, or PASSes a golden-FALSE-with-carrier → (E) FAILs; the control plane invokes a data-plane build/commit → (F) FAILs; strip the literal → propagation FAILs; gate-code = separate work item, NOT claimed shipped §11.4.6/§11.4.227). No escape hatch — no</w:t>
+      </w:r>
+      <w:r>
+        <w:t xml:space="preserve"> </w:t>
+      </w:r>
+      <w:r>
+        <w:rPr>
+          <w:rStyle w:val="VerbatimChar"/>
+        </w:rPr>
+        <w:t xml:space="preserve">--edge-triggered-only</w:t>
+      </w:r>
+      <w:r>
+        <w:t xml:space="preserve">,</w:t>
+      </w:r>
+      <w:r>
+        <w:t xml:space="preserve"> </w:t>
+      </w:r>
+      <w:r>
+        <w:rPr>
+          <w:rStyle w:val="VerbatimChar"/>
+        </w:rPr>
+        <w:t xml:space="preserve">--skip-consistency-catalogue</w:t>
+      </w:r>
+      <w:r>
+        <w:t xml:space="preserve">,</w:t>
+      </w:r>
+      <w:r>
+        <w:t xml:space="preserve"> </w:t>
+      </w:r>
+      <w:r>
+        <w:rPr>
+          <w:rStyle w:val="VerbatimChar"/>
+        </w:rPr>
+        <w:t xml:space="preserve">--proceed-on-drift</w:t>
+      </w:r>
+      <w:r>
+        <w:t xml:space="preserve">,</w:t>
+      </w:r>
+      <w:r>
+        <w:t xml:space="preserve"> </w:t>
+      </w:r>
+      <w:r>
+        <w:rPr>
+          <w:rStyle w:val="VerbatimChar"/>
+        </w:rPr>
+        <w:t xml:space="preserve">--reconcile-with-force-push</w:t>
+      </w:r>
+      <w:r>
+        <w:t xml:space="preserve">,</w:t>
+      </w:r>
+      <w:r>
+        <w:t xml:space="preserve"> </w:t>
+      </w:r>
+      <w:r>
+        <w:rPr>
+          <w:rStyle w:val="VerbatimChar"/>
+        </w:rPr>
+        <w:t xml:space="preserve">--unvalidated-detector</w:t>
+      </w:r>
+      <w:r>
+        <w:t xml:space="preserve">,</w:t>
+      </w:r>
+      <w:r>
+        <w:t xml:space="preserve"> </w:t>
+      </w:r>
+      <w:r>
+        <w:rPr>
+          <w:rStyle w:val="VerbatimChar"/>
+        </w:rPr>
+        <w:t xml:space="preserve">--control-plane-does-work</w:t>
+      </w:r>
+      <w:r>
+        <w:t xml:space="preserve">,</w:t>
+      </w:r>
+      <w:r>
+        <w:t xml:space="preserve"> </w:t>
+      </w:r>
+      <w:r>
+        <w:rPr>
+          <w:rStyle w:val="VerbatimChar"/>
+        </w:rPr>
+        <w:t xml:space="preserve">--assume-clean-without-reconcile</w:t>
+      </w:r>
+      <w:r>
+        <w:t xml:space="preserve"> </w:t>
+      </w:r>
+      <w:r>
+        <w:t xml:space="preserve">flag.</w:t>
       </w:r>
     </w:p>
     <w:bookmarkEnd w:id="116"/>

</xml_diff>